<commit_message>
aggiunti purpose, scope, e objectives of the system, current system , e iniziati i functional requirements
</commit_message>
<xml_diff>
--- a/Deliverables/RAD_GGEyewear.docx
+++ b/Deliverables/RAD_GGEyewear.docx
@@ -153,7 +153,7 @@
           <w:sz w:val="36"/>
           <w:lang w:val="en-US"/>
         </w:rPr>
-        <w:t>1</w:t>
+        <w:t>2</w:t>
       </w:r>
       <w:r>
         <w:rPr>
@@ -1239,6 +1239,12 @@
                 <w:sz w:val="20"/>
               </w:rPr>
             </w:pPr>
+            <w:r>
+              <w:rPr>
+                <w:sz w:val="20"/>
+              </w:rPr>
+              <w:t>20/10/2026</w:t>
+            </w:r>
           </w:p>
         </w:tc>
         <w:tc>
@@ -1257,6 +1263,12 @@
                 <w:sz w:val="20"/>
               </w:rPr>
             </w:pPr>
+            <w:r>
+              <w:rPr>
+                <w:sz w:val="20"/>
+              </w:rPr>
+              <w:t>2.0</w:t>
+            </w:r>
           </w:p>
         </w:tc>
         <w:tc>
@@ -1275,6 +1287,12 @@
                 <w:sz w:val="20"/>
               </w:rPr>
             </w:pPr>
+            <w:r>
+              <w:rPr>
+                <w:sz w:val="20"/>
+              </w:rPr>
+              <w:t>Aggiunta purpose, scope, objectives (1.1, 1.2, 1.3), current system (2), functional requirements (3.2)</w:t>
+            </w:r>
           </w:p>
         </w:tc>
         <w:tc>
@@ -1294,6 +1312,12 @@
                 <w:sz w:val="20"/>
               </w:rPr>
             </w:pPr>
+            <w:r>
+              <w:rPr>
+                <w:sz w:val="20"/>
+              </w:rPr>
+              <w:t>Angelica D’Aquila</w:t>
+            </w:r>
           </w:p>
         </w:tc>
       </w:tr>
@@ -1859,7 +1883,7 @@
       <w:r>
         <w:fldChar w:fldCharType="separate"/>
       </w:r>
-      <w:hyperlink w:anchor="_Toc243336388" w:history="1">
+      <w:hyperlink w:anchor="_Toc243380166" w:history="1">
         <w:r>
           <w:rPr>
             <w:rStyle w:val="Collegamentoipertestuale"/>
@@ -1902,7 +1926,7 @@
             <w:noProof/>
             <w:webHidden/>
           </w:rPr>
-          <w:instrText xml:space="preserve"> PAGEREF _Toc243336388 \h </w:instrText>
+          <w:instrText xml:space="preserve"> PAGEREF _Toc243380166 \h </w:instrText>
         </w:r>
         <w:r>
           <w:rPr>
@@ -1946,7 +1970,7 @@
           <w14:ligatures w14:val="standardContextual"/>
         </w:rPr>
       </w:pPr>
-      <w:hyperlink w:anchor="_Toc243336389" w:history="1">
+      <w:hyperlink w:anchor="_Toc243380167" w:history="1">
         <w:r>
           <w:rPr>
             <w:rStyle w:val="Collegamentoipertestuale"/>
@@ -1989,7 +2013,7 @@
             <w:noProof/>
             <w:webHidden/>
           </w:rPr>
-          <w:instrText xml:space="preserve"> PAGEREF _Toc243336389 \h </w:instrText>
+          <w:instrText xml:space="preserve"> PAGEREF _Toc243380167 \h </w:instrText>
         </w:r>
         <w:r>
           <w:rPr>
@@ -2033,7 +2057,7 @@
           <w14:ligatures w14:val="standardContextual"/>
         </w:rPr>
       </w:pPr>
-      <w:hyperlink w:anchor="_Toc243336390" w:history="1">
+      <w:hyperlink w:anchor="_Toc243380168" w:history="1">
         <w:r>
           <w:rPr>
             <w:rStyle w:val="Collegamentoipertestuale"/>
@@ -2076,7 +2100,7 @@
             <w:noProof/>
             <w:webHidden/>
           </w:rPr>
-          <w:instrText xml:space="preserve"> PAGEREF _Toc243336390 \h </w:instrText>
+          <w:instrText xml:space="preserve"> PAGEREF _Toc243380168 \h </w:instrText>
         </w:r>
         <w:r>
           <w:rPr>
@@ -2120,7 +2144,7 @@
           <w14:ligatures w14:val="standardContextual"/>
         </w:rPr>
       </w:pPr>
-      <w:hyperlink w:anchor="_Toc243336391" w:history="1">
+      <w:hyperlink w:anchor="_Toc243380169" w:history="1">
         <w:r>
           <w:rPr>
             <w:rStyle w:val="Collegamentoipertestuale"/>
@@ -2165,7 +2189,7 @@
             <w:noProof/>
             <w:webHidden/>
           </w:rPr>
-          <w:instrText xml:space="preserve"> PAGEREF _Toc243336391 \h </w:instrText>
+          <w:instrText xml:space="preserve"> PAGEREF _Toc243380169 \h </w:instrText>
         </w:r>
         <w:r>
           <w:rPr>
@@ -2209,7 +2233,7 @@
           <w14:ligatures w14:val="standardContextual"/>
         </w:rPr>
       </w:pPr>
-      <w:hyperlink w:anchor="_Toc243336392" w:history="1">
+      <w:hyperlink w:anchor="_Toc243380170" w:history="1">
         <w:r>
           <w:rPr>
             <w:rStyle w:val="Collegamentoipertestuale"/>
@@ -2252,7 +2276,7 @@
             <w:noProof/>
             <w:webHidden/>
           </w:rPr>
-          <w:instrText xml:space="preserve"> PAGEREF _Toc243336392 \h </w:instrText>
+          <w:instrText xml:space="preserve"> PAGEREF _Toc243380170 \h </w:instrText>
         </w:r>
         <w:r>
           <w:rPr>
@@ -2272,7 +2296,7 @@
             <w:noProof/>
             <w:webHidden/>
           </w:rPr>
-          <w:t>4</w:t>
+          <w:t>5</w:t>
         </w:r>
         <w:r>
           <w:rPr>
@@ -2296,7 +2320,7 @@
           <w14:ligatures w14:val="standardContextual"/>
         </w:rPr>
       </w:pPr>
-      <w:hyperlink w:anchor="_Toc243336393" w:history="1">
+      <w:hyperlink w:anchor="_Toc243380171" w:history="1">
         <w:r>
           <w:rPr>
             <w:rStyle w:val="Collegamentoipertestuale"/>
@@ -2339,7 +2363,7 @@
             <w:noProof/>
             <w:webHidden/>
           </w:rPr>
-          <w:instrText xml:space="preserve"> PAGEREF _Toc243336393 \h </w:instrText>
+          <w:instrText xml:space="preserve"> PAGEREF _Toc243380171 \h </w:instrText>
         </w:r>
         <w:r>
           <w:rPr>
@@ -2359,7 +2383,7 @@
             <w:noProof/>
             <w:webHidden/>
           </w:rPr>
-          <w:t>4</w:t>
+          <w:t>5</w:t>
         </w:r>
         <w:r>
           <w:rPr>
@@ -2383,7 +2407,7 @@
           <w14:ligatures w14:val="standardContextual"/>
         </w:rPr>
       </w:pPr>
-      <w:hyperlink w:anchor="_Toc243336394" w:history="1">
+      <w:hyperlink w:anchor="_Toc243380172" w:history="1">
         <w:r>
           <w:rPr>
             <w:rStyle w:val="Collegamentoipertestuale"/>
@@ -2426,7 +2450,7 @@
             <w:noProof/>
             <w:webHidden/>
           </w:rPr>
-          <w:instrText xml:space="preserve"> PAGEREF _Toc243336394 \h </w:instrText>
+          <w:instrText xml:space="preserve"> PAGEREF _Toc243380172 \h </w:instrText>
         </w:r>
         <w:r>
           <w:rPr>
@@ -2446,7 +2470,7 @@
             <w:noProof/>
             <w:webHidden/>
           </w:rPr>
-          <w:t>4</w:t>
+          <w:t>5</w:t>
         </w:r>
         <w:r>
           <w:rPr>
@@ -2470,7 +2494,7 @@
           <w14:ligatures w14:val="standardContextual"/>
         </w:rPr>
       </w:pPr>
-      <w:hyperlink w:anchor="_Toc243336395" w:history="1">
+      <w:hyperlink w:anchor="_Toc243380173" w:history="1">
         <w:r>
           <w:rPr>
             <w:rStyle w:val="Collegamentoipertestuale"/>
@@ -2492,7 +2516,7 @@
             <w:rStyle w:val="Collegamentoipertestuale"/>
             <w:noProof/>
           </w:rPr>
-          <w:t>SCENARIOS</w:t>
+          <w:t>CURRENT SYSTEM</w:t>
         </w:r>
         <w:r>
           <w:rPr>
@@ -2513,7 +2537,7 @@
             <w:noProof/>
             <w:webHidden/>
           </w:rPr>
-          <w:instrText xml:space="preserve"> PAGEREF _Toc243336395 \h </w:instrText>
+          <w:instrText xml:space="preserve"> PAGEREF _Toc243380173 \h </w:instrText>
         </w:r>
         <w:r>
           <w:rPr>
@@ -2533,7 +2557,7 @@
             <w:noProof/>
             <w:webHidden/>
           </w:rPr>
-          <w:t>4</w:t>
+          <w:t>5</w:t>
         </w:r>
         <w:r>
           <w:rPr>
@@ -2557,7 +2581,7 @@
           <w14:ligatures w14:val="standardContextual"/>
         </w:rPr>
       </w:pPr>
-      <w:hyperlink w:anchor="_Toc243336396" w:history="1">
+      <w:hyperlink w:anchor="_Toc243380174" w:history="1">
         <w:r>
           <w:rPr>
             <w:rStyle w:val="Collegamentoipertestuale"/>
@@ -2579,7 +2603,7 @@
             <w:rStyle w:val="Collegamentoipertestuale"/>
             <w:noProof/>
           </w:rPr>
-          <w:t>FUNCTIONAL REQUIREMENTS</w:t>
+          <w:t>PROPOSED SYSTEM</w:t>
         </w:r>
         <w:r>
           <w:rPr>
@@ -2600,7 +2624,7 @@
             <w:noProof/>
             <w:webHidden/>
           </w:rPr>
-          <w:instrText xml:space="preserve"> PAGEREF _Toc243336396 \h </w:instrText>
+          <w:instrText xml:space="preserve"> PAGEREF _Toc243380174 \h </w:instrText>
         </w:r>
         <w:r>
           <w:rPr>
@@ -2620,7 +2644,7 @@
             <w:noProof/>
             <w:webHidden/>
           </w:rPr>
-          <w:t>4</w:t>
+          <w:t>5</w:t>
         </w:r>
         <w:r>
           <w:rPr>
@@ -2644,7 +2668,7 @@
           <w14:ligatures w14:val="standardContextual"/>
         </w:rPr>
       </w:pPr>
-      <w:hyperlink w:anchor="_Toc243336397" w:history="1">
+      <w:hyperlink w:anchor="_Toc243380175" w:history="1">
         <w:r>
           <w:rPr>
             <w:rStyle w:val="Collegamentoipertestuale"/>
@@ -2666,7 +2690,7 @@
             <w:rStyle w:val="Collegamentoipertestuale"/>
             <w:noProof/>
           </w:rPr>
-          <w:t>Functional requirements</w:t>
+          <w:t>Overview</w:t>
         </w:r>
         <w:r>
           <w:rPr>
@@ -2687,7 +2711,7 @@
             <w:noProof/>
             <w:webHidden/>
           </w:rPr>
-          <w:instrText xml:space="preserve"> PAGEREF _Toc243336397 \h </w:instrText>
+          <w:instrText xml:space="preserve"> PAGEREF _Toc243380175 \h </w:instrText>
         </w:r>
         <w:r>
           <w:rPr>
@@ -2707,7 +2731,7 @@
             <w:noProof/>
             <w:webHidden/>
           </w:rPr>
-          <w:t>4</w:t>
+          <w:t>5</w:t>
         </w:r>
         <w:r>
           <w:rPr>
@@ -2731,7 +2755,7 @@
           <w14:ligatures w14:val="standardContextual"/>
         </w:rPr>
       </w:pPr>
-      <w:hyperlink w:anchor="_Toc243336398" w:history="1">
+      <w:hyperlink w:anchor="_Toc243380176" w:history="1">
         <w:r>
           <w:rPr>
             <w:rStyle w:val="Collegamentoipertestuale"/>
@@ -2753,7 +2777,7 @@
             <w:rStyle w:val="Collegamentoipertestuale"/>
             <w:noProof/>
           </w:rPr>
-          <w:t>Nonfunctional requirements</w:t>
+          <w:t>Functional requirements</w:t>
         </w:r>
         <w:r>
           <w:rPr>
@@ -2774,7 +2798,7 @@
             <w:noProof/>
             <w:webHidden/>
           </w:rPr>
-          <w:instrText xml:space="preserve"> PAGEREF _Toc243336398 \h </w:instrText>
+          <w:instrText xml:space="preserve"> PAGEREF _Toc243380176 \h </w:instrText>
         </w:r>
         <w:r>
           <w:rPr>
@@ -2794,7 +2818,7 @@
             <w:noProof/>
             <w:webHidden/>
           </w:rPr>
-          <w:t>4</w:t>
+          <w:t>5</w:t>
         </w:r>
         <w:r>
           <w:rPr>
@@ -2818,7 +2842,7 @@
           <w14:ligatures w14:val="standardContextual"/>
         </w:rPr>
       </w:pPr>
-      <w:hyperlink w:anchor="_Toc243336399" w:history="1">
+      <w:hyperlink w:anchor="_Toc243380177" w:history="1">
         <w:r>
           <w:rPr>
             <w:rStyle w:val="Collegamentoipertestuale"/>
@@ -2840,7 +2864,7 @@
             <w:rStyle w:val="Collegamentoipertestuale"/>
             <w:noProof/>
           </w:rPr>
-          <w:t>System models</w:t>
+          <w:t>Nonfunctional requirements</w:t>
         </w:r>
         <w:r>
           <w:rPr>
@@ -2861,7 +2885,7 @@
             <w:noProof/>
             <w:webHidden/>
           </w:rPr>
-          <w:instrText xml:space="preserve"> PAGEREF _Toc243336399 \h </w:instrText>
+          <w:instrText xml:space="preserve"> PAGEREF _Toc243380177 \h </w:instrText>
         </w:r>
         <w:r>
           <w:rPr>
@@ -2881,7 +2905,703 @@
             <w:noProof/>
             <w:webHidden/>
           </w:rPr>
-          <w:t>4</w:t>
+          <w:t>5</w:t>
+        </w:r>
+        <w:r>
+          <w:rPr>
+            <w:noProof/>
+            <w:webHidden/>
+          </w:rPr>
+          <w:fldChar w:fldCharType="end"/>
+        </w:r>
+      </w:hyperlink>
+    </w:p>
+    <w:p>
+      <w:pPr>
+        <w:pStyle w:val="Sommario2"/>
+        <w:tabs>
+          <w:tab w:val="left" w:pos="1132"/>
+        </w:tabs>
+        <w:rPr>
+          <w:rFonts w:asciiTheme="minorHAnsi" w:eastAsiaTheme="minorEastAsia" w:hAnsiTheme="minorHAnsi" w:cstheme="minorBidi"/>
+          <w:noProof/>
+          <w:kern w:val="2"/>
+          <w14:ligatures w14:val="standardContextual"/>
+        </w:rPr>
+      </w:pPr>
+      <w:hyperlink w:anchor="_Toc243380178" w:history="1">
+        <w:r>
+          <w:rPr>
+            <w:rStyle w:val="Collegamentoipertestuale"/>
+            <w:noProof/>
+          </w:rPr>
+          <w:t>3.3.1</w:t>
+        </w:r>
+        <w:r>
+          <w:rPr>
+            <w:rFonts w:asciiTheme="minorHAnsi" w:eastAsiaTheme="minorEastAsia" w:hAnsiTheme="minorHAnsi" w:cstheme="minorBidi"/>
+            <w:noProof/>
+            <w:kern w:val="2"/>
+            <w14:ligatures w14:val="standardContextual"/>
+          </w:rPr>
+          <w:tab/>
+        </w:r>
+        <w:r>
+          <w:rPr>
+            <w:rStyle w:val="Collegamentoipertestuale"/>
+            <w:noProof/>
+          </w:rPr>
+          <w:t>Usability</w:t>
+        </w:r>
+        <w:r>
+          <w:rPr>
+            <w:noProof/>
+            <w:webHidden/>
+          </w:rPr>
+          <w:tab/>
+        </w:r>
+        <w:r>
+          <w:rPr>
+            <w:noProof/>
+            <w:webHidden/>
+          </w:rPr>
+          <w:fldChar w:fldCharType="begin"/>
+        </w:r>
+        <w:r>
+          <w:rPr>
+            <w:noProof/>
+            <w:webHidden/>
+          </w:rPr>
+          <w:instrText xml:space="preserve"> PAGEREF _Toc243380178 \h </w:instrText>
+        </w:r>
+        <w:r>
+          <w:rPr>
+            <w:noProof/>
+            <w:webHidden/>
+          </w:rPr>
+        </w:r>
+        <w:r>
+          <w:rPr>
+            <w:noProof/>
+            <w:webHidden/>
+          </w:rPr>
+          <w:fldChar w:fldCharType="separate"/>
+        </w:r>
+        <w:r>
+          <w:rPr>
+            <w:noProof/>
+            <w:webHidden/>
+          </w:rPr>
+          <w:t>5</w:t>
+        </w:r>
+        <w:r>
+          <w:rPr>
+            <w:noProof/>
+            <w:webHidden/>
+          </w:rPr>
+          <w:fldChar w:fldCharType="end"/>
+        </w:r>
+      </w:hyperlink>
+    </w:p>
+    <w:p>
+      <w:pPr>
+        <w:pStyle w:val="Sommario2"/>
+        <w:tabs>
+          <w:tab w:val="left" w:pos="1132"/>
+        </w:tabs>
+        <w:rPr>
+          <w:rFonts w:asciiTheme="minorHAnsi" w:eastAsiaTheme="minorEastAsia" w:hAnsiTheme="minorHAnsi" w:cstheme="minorBidi"/>
+          <w:noProof/>
+          <w:kern w:val="2"/>
+          <w14:ligatures w14:val="standardContextual"/>
+        </w:rPr>
+      </w:pPr>
+      <w:hyperlink w:anchor="_Toc243380179" w:history="1">
+        <w:r>
+          <w:rPr>
+            <w:rStyle w:val="Collegamentoipertestuale"/>
+            <w:noProof/>
+          </w:rPr>
+          <w:t>3.3.2</w:t>
+        </w:r>
+        <w:r>
+          <w:rPr>
+            <w:rFonts w:asciiTheme="minorHAnsi" w:eastAsiaTheme="minorEastAsia" w:hAnsiTheme="minorHAnsi" w:cstheme="minorBidi"/>
+            <w:noProof/>
+            <w:kern w:val="2"/>
+            <w14:ligatures w14:val="standardContextual"/>
+          </w:rPr>
+          <w:tab/>
+        </w:r>
+        <w:r>
+          <w:rPr>
+            <w:rStyle w:val="Collegamentoipertestuale"/>
+            <w:noProof/>
+          </w:rPr>
+          <w:t>Reliability</w:t>
+        </w:r>
+        <w:r>
+          <w:rPr>
+            <w:noProof/>
+            <w:webHidden/>
+          </w:rPr>
+          <w:tab/>
+        </w:r>
+        <w:r>
+          <w:rPr>
+            <w:noProof/>
+            <w:webHidden/>
+          </w:rPr>
+          <w:fldChar w:fldCharType="begin"/>
+        </w:r>
+        <w:r>
+          <w:rPr>
+            <w:noProof/>
+            <w:webHidden/>
+          </w:rPr>
+          <w:instrText xml:space="preserve"> PAGEREF _Toc243380179 \h </w:instrText>
+        </w:r>
+        <w:r>
+          <w:rPr>
+            <w:noProof/>
+            <w:webHidden/>
+          </w:rPr>
+        </w:r>
+        <w:r>
+          <w:rPr>
+            <w:noProof/>
+            <w:webHidden/>
+          </w:rPr>
+          <w:fldChar w:fldCharType="separate"/>
+        </w:r>
+        <w:r>
+          <w:rPr>
+            <w:noProof/>
+            <w:webHidden/>
+          </w:rPr>
+          <w:t>5</w:t>
+        </w:r>
+        <w:r>
+          <w:rPr>
+            <w:noProof/>
+            <w:webHidden/>
+          </w:rPr>
+          <w:fldChar w:fldCharType="end"/>
+        </w:r>
+      </w:hyperlink>
+    </w:p>
+    <w:p>
+      <w:pPr>
+        <w:pStyle w:val="Sommario2"/>
+        <w:tabs>
+          <w:tab w:val="left" w:pos="1132"/>
+        </w:tabs>
+        <w:rPr>
+          <w:rFonts w:asciiTheme="minorHAnsi" w:eastAsiaTheme="minorEastAsia" w:hAnsiTheme="minorHAnsi" w:cstheme="minorBidi"/>
+          <w:noProof/>
+          <w:kern w:val="2"/>
+          <w14:ligatures w14:val="standardContextual"/>
+        </w:rPr>
+      </w:pPr>
+      <w:hyperlink w:anchor="_Toc243380180" w:history="1">
+        <w:r>
+          <w:rPr>
+            <w:rStyle w:val="Collegamentoipertestuale"/>
+            <w:noProof/>
+          </w:rPr>
+          <w:t>3.3.3</w:t>
+        </w:r>
+        <w:r>
+          <w:rPr>
+            <w:rFonts w:asciiTheme="minorHAnsi" w:eastAsiaTheme="minorEastAsia" w:hAnsiTheme="minorHAnsi" w:cstheme="minorBidi"/>
+            <w:noProof/>
+            <w:kern w:val="2"/>
+            <w14:ligatures w14:val="standardContextual"/>
+          </w:rPr>
+          <w:tab/>
+        </w:r>
+        <w:r>
+          <w:rPr>
+            <w:rStyle w:val="Collegamentoipertestuale"/>
+            <w:noProof/>
+          </w:rPr>
+          <w:t>Performance</w:t>
+        </w:r>
+        <w:r>
+          <w:rPr>
+            <w:noProof/>
+            <w:webHidden/>
+          </w:rPr>
+          <w:tab/>
+        </w:r>
+        <w:r>
+          <w:rPr>
+            <w:noProof/>
+            <w:webHidden/>
+          </w:rPr>
+          <w:fldChar w:fldCharType="begin"/>
+        </w:r>
+        <w:r>
+          <w:rPr>
+            <w:noProof/>
+            <w:webHidden/>
+          </w:rPr>
+          <w:instrText xml:space="preserve"> PAGEREF _Toc243380180 \h </w:instrText>
+        </w:r>
+        <w:r>
+          <w:rPr>
+            <w:noProof/>
+            <w:webHidden/>
+          </w:rPr>
+        </w:r>
+        <w:r>
+          <w:rPr>
+            <w:noProof/>
+            <w:webHidden/>
+          </w:rPr>
+          <w:fldChar w:fldCharType="separate"/>
+        </w:r>
+        <w:r>
+          <w:rPr>
+            <w:noProof/>
+            <w:webHidden/>
+          </w:rPr>
+          <w:t>5</w:t>
+        </w:r>
+        <w:r>
+          <w:rPr>
+            <w:noProof/>
+            <w:webHidden/>
+          </w:rPr>
+          <w:fldChar w:fldCharType="end"/>
+        </w:r>
+      </w:hyperlink>
+    </w:p>
+    <w:p>
+      <w:pPr>
+        <w:pStyle w:val="Sommario2"/>
+        <w:tabs>
+          <w:tab w:val="left" w:pos="1132"/>
+        </w:tabs>
+        <w:rPr>
+          <w:rFonts w:asciiTheme="minorHAnsi" w:eastAsiaTheme="minorEastAsia" w:hAnsiTheme="minorHAnsi" w:cstheme="minorBidi"/>
+          <w:noProof/>
+          <w:kern w:val="2"/>
+          <w14:ligatures w14:val="standardContextual"/>
+        </w:rPr>
+      </w:pPr>
+      <w:hyperlink w:anchor="_Toc243380181" w:history="1">
+        <w:r>
+          <w:rPr>
+            <w:rStyle w:val="Collegamentoipertestuale"/>
+            <w:noProof/>
+          </w:rPr>
+          <w:t>3.3.4</w:t>
+        </w:r>
+        <w:r>
+          <w:rPr>
+            <w:rFonts w:asciiTheme="minorHAnsi" w:eastAsiaTheme="minorEastAsia" w:hAnsiTheme="minorHAnsi" w:cstheme="minorBidi"/>
+            <w:noProof/>
+            <w:kern w:val="2"/>
+            <w14:ligatures w14:val="standardContextual"/>
+          </w:rPr>
+          <w:tab/>
+        </w:r>
+        <w:r>
+          <w:rPr>
+            <w:rStyle w:val="Collegamentoipertestuale"/>
+            <w:noProof/>
+          </w:rPr>
+          <w:t>Supportability</w:t>
+        </w:r>
+        <w:r>
+          <w:rPr>
+            <w:noProof/>
+            <w:webHidden/>
+          </w:rPr>
+          <w:tab/>
+        </w:r>
+        <w:r>
+          <w:rPr>
+            <w:noProof/>
+            <w:webHidden/>
+          </w:rPr>
+          <w:fldChar w:fldCharType="begin"/>
+        </w:r>
+        <w:r>
+          <w:rPr>
+            <w:noProof/>
+            <w:webHidden/>
+          </w:rPr>
+          <w:instrText xml:space="preserve"> PAGEREF _Toc243380181 \h </w:instrText>
+        </w:r>
+        <w:r>
+          <w:rPr>
+            <w:noProof/>
+            <w:webHidden/>
+          </w:rPr>
+        </w:r>
+        <w:r>
+          <w:rPr>
+            <w:noProof/>
+            <w:webHidden/>
+          </w:rPr>
+          <w:fldChar w:fldCharType="separate"/>
+        </w:r>
+        <w:r>
+          <w:rPr>
+            <w:noProof/>
+            <w:webHidden/>
+          </w:rPr>
+          <w:t>5</w:t>
+        </w:r>
+        <w:r>
+          <w:rPr>
+            <w:noProof/>
+            <w:webHidden/>
+          </w:rPr>
+          <w:fldChar w:fldCharType="end"/>
+        </w:r>
+      </w:hyperlink>
+    </w:p>
+    <w:p>
+      <w:pPr>
+        <w:pStyle w:val="Sommario2"/>
+        <w:tabs>
+          <w:tab w:val="left" w:pos="1132"/>
+        </w:tabs>
+        <w:rPr>
+          <w:rFonts w:asciiTheme="minorHAnsi" w:eastAsiaTheme="minorEastAsia" w:hAnsiTheme="minorHAnsi" w:cstheme="minorBidi"/>
+          <w:noProof/>
+          <w:kern w:val="2"/>
+          <w14:ligatures w14:val="standardContextual"/>
+        </w:rPr>
+      </w:pPr>
+      <w:hyperlink w:anchor="_Toc243380182" w:history="1">
+        <w:r>
+          <w:rPr>
+            <w:rStyle w:val="Collegamentoipertestuale"/>
+            <w:noProof/>
+          </w:rPr>
+          <w:t>3.3.5</w:t>
+        </w:r>
+        <w:r>
+          <w:rPr>
+            <w:rFonts w:asciiTheme="minorHAnsi" w:eastAsiaTheme="minorEastAsia" w:hAnsiTheme="minorHAnsi" w:cstheme="minorBidi"/>
+            <w:noProof/>
+            <w:kern w:val="2"/>
+            <w14:ligatures w14:val="standardContextual"/>
+          </w:rPr>
+          <w:tab/>
+        </w:r>
+        <w:r>
+          <w:rPr>
+            <w:rStyle w:val="Collegamentoipertestuale"/>
+            <w:noProof/>
+          </w:rPr>
+          <w:t>Implementation</w:t>
+        </w:r>
+        <w:r>
+          <w:rPr>
+            <w:noProof/>
+            <w:webHidden/>
+          </w:rPr>
+          <w:tab/>
+        </w:r>
+        <w:r>
+          <w:rPr>
+            <w:noProof/>
+            <w:webHidden/>
+          </w:rPr>
+          <w:fldChar w:fldCharType="begin"/>
+        </w:r>
+        <w:r>
+          <w:rPr>
+            <w:noProof/>
+            <w:webHidden/>
+          </w:rPr>
+          <w:instrText xml:space="preserve"> PAGEREF _Toc243380182 \h </w:instrText>
+        </w:r>
+        <w:r>
+          <w:rPr>
+            <w:noProof/>
+            <w:webHidden/>
+          </w:rPr>
+        </w:r>
+        <w:r>
+          <w:rPr>
+            <w:noProof/>
+            <w:webHidden/>
+          </w:rPr>
+          <w:fldChar w:fldCharType="separate"/>
+        </w:r>
+        <w:r>
+          <w:rPr>
+            <w:noProof/>
+            <w:webHidden/>
+          </w:rPr>
+          <w:t>6</w:t>
+        </w:r>
+        <w:r>
+          <w:rPr>
+            <w:noProof/>
+            <w:webHidden/>
+          </w:rPr>
+          <w:fldChar w:fldCharType="end"/>
+        </w:r>
+      </w:hyperlink>
+    </w:p>
+    <w:p>
+      <w:pPr>
+        <w:pStyle w:val="Sommario2"/>
+        <w:tabs>
+          <w:tab w:val="left" w:pos="1132"/>
+        </w:tabs>
+        <w:rPr>
+          <w:rFonts w:asciiTheme="minorHAnsi" w:eastAsiaTheme="minorEastAsia" w:hAnsiTheme="minorHAnsi" w:cstheme="minorBidi"/>
+          <w:noProof/>
+          <w:kern w:val="2"/>
+          <w14:ligatures w14:val="standardContextual"/>
+        </w:rPr>
+      </w:pPr>
+      <w:hyperlink w:anchor="_Toc243380183" w:history="1">
+        <w:r>
+          <w:rPr>
+            <w:rStyle w:val="Collegamentoipertestuale"/>
+            <w:noProof/>
+          </w:rPr>
+          <w:t>3.3.6</w:t>
+        </w:r>
+        <w:r>
+          <w:rPr>
+            <w:rFonts w:asciiTheme="minorHAnsi" w:eastAsiaTheme="minorEastAsia" w:hAnsiTheme="minorHAnsi" w:cstheme="minorBidi"/>
+            <w:noProof/>
+            <w:kern w:val="2"/>
+            <w14:ligatures w14:val="standardContextual"/>
+          </w:rPr>
+          <w:tab/>
+        </w:r>
+        <w:r>
+          <w:rPr>
+            <w:rStyle w:val="Collegamentoipertestuale"/>
+            <w:noProof/>
+          </w:rPr>
+          <w:t>Interface</w:t>
+        </w:r>
+        <w:r>
+          <w:rPr>
+            <w:noProof/>
+            <w:webHidden/>
+          </w:rPr>
+          <w:tab/>
+        </w:r>
+        <w:r>
+          <w:rPr>
+            <w:noProof/>
+            <w:webHidden/>
+          </w:rPr>
+          <w:fldChar w:fldCharType="begin"/>
+        </w:r>
+        <w:r>
+          <w:rPr>
+            <w:noProof/>
+            <w:webHidden/>
+          </w:rPr>
+          <w:instrText xml:space="preserve"> PAGEREF _Toc243380183 \h </w:instrText>
+        </w:r>
+        <w:r>
+          <w:rPr>
+            <w:noProof/>
+            <w:webHidden/>
+          </w:rPr>
+        </w:r>
+        <w:r>
+          <w:rPr>
+            <w:noProof/>
+            <w:webHidden/>
+          </w:rPr>
+          <w:fldChar w:fldCharType="separate"/>
+        </w:r>
+        <w:r>
+          <w:rPr>
+            <w:noProof/>
+            <w:webHidden/>
+          </w:rPr>
+          <w:t>6</w:t>
+        </w:r>
+        <w:r>
+          <w:rPr>
+            <w:noProof/>
+            <w:webHidden/>
+          </w:rPr>
+          <w:fldChar w:fldCharType="end"/>
+        </w:r>
+      </w:hyperlink>
+    </w:p>
+    <w:p>
+      <w:pPr>
+        <w:pStyle w:val="Sommario2"/>
+        <w:tabs>
+          <w:tab w:val="left" w:pos="1132"/>
+        </w:tabs>
+        <w:rPr>
+          <w:rFonts w:asciiTheme="minorHAnsi" w:eastAsiaTheme="minorEastAsia" w:hAnsiTheme="minorHAnsi" w:cstheme="minorBidi"/>
+          <w:noProof/>
+          <w:kern w:val="2"/>
+          <w14:ligatures w14:val="standardContextual"/>
+        </w:rPr>
+      </w:pPr>
+      <w:hyperlink w:anchor="_Toc243380184" w:history="1">
+        <w:r>
+          <w:rPr>
+            <w:rStyle w:val="Collegamentoipertestuale"/>
+            <w:noProof/>
+          </w:rPr>
+          <w:t>3.3.7</w:t>
+        </w:r>
+        <w:r>
+          <w:rPr>
+            <w:rFonts w:asciiTheme="minorHAnsi" w:eastAsiaTheme="minorEastAsia" w:hAnsiTheme="minorHAnsi" w:cstheme="minorBidi"/>
+            <w:noProof/>
+            <w:kern w:val="2"/>
+            <w14:ligatures w14:val="standardContextual"/>
+          </w:rPr>
+          <w:tab/>
+        </w:r>
+        <w:r>
+          <w:rPr>
+            <w:rStyle w:val="Collegamentoipertestuale"/>
+            <w:noProof/>
+          </w:rPr>
+          <w:t>Packaging</w:t>
+        </w:r>
+        <w:r>
+          <w:rPr>
+            <w:noProof/>
+            <w:webHidden/>
+          </w:rPr>
+          <w:tab/>
+        </w:r>
+        <w:r>
+          <w:rPr>
+            <w:noProof/>
+            <w:webHidden/>
+          </w:rPr>
+          <w:fldChar w:fldCharType="begin"/>
+        </w:r>
+        <w:r>
+          <w:rPr>
+            <w:noProof/>
+            <w:webHidden/>
+          </w:rPr>
+          <w:instrText xml:space="preserve"> PAGEREF _Toc243380184 \h </w:instrText>
+        </w:r>
+        <w:r>
+          <w:rPr>
+            <w:noProof/>
+            <w:webHidden/>
+          </w:rPr>
+        </w:r>
+        <w:r>
+          <w:rPr>
+            <w:noProof/>
+            <w:webHidden/>
+          </w:rPr>
+          <w:fldChar w:fldCharType="separate"/>
+        </w:r>
+        <w:r>
+          <w:rPr>
+            <w:noProof/>
+            <w:webHidden/>
+          </w:rPr>
+          <w:t>6</w:t>
+        </w:r>
+        <w:r>
+          <w:rPr>
+            <w:noProof/>
+            <w:webHidden/>
+          </w:rPr>
+          <w:fldChar w:fldCharType="end"/>
+        </w:r>
+      </w:hyperlink>
+    </w:p>
+    <w:p>
+      <w:pPr>
+        <w:pStyle w:val="Sommario2"/>
+        <w:tabs>
+          <w:tab w:val="left" w:pos="1132"/>
+        </w:tabs>
+        <w:rPr>
+          <w:rFonts w:asciiTheme="minorHAnsi" w:eastAsiaTheme="minorEastAsia" w:hAnsiTheme="minorHAnsi" w:cstheme="minorBidi"/>
+          <w:noProof/>
+          <w:kern w:val="2"/>
+          <w14:ligatures w14:val="standardContextual"/>
+        </w:rPr>
+      </w:pPr>
+      <w:hyperlink w:anchor="_Toc243380185" w:history="1">
+        <w:r>
+          <w:rPr>
+            <w:rStyle w:val="Collegamentoipertestuale"/>
+            <w:noProof/>
+          </w:rPr>
+          <w:t>3.3.8</w:t>
+        </w:r>
+        <w:r>
+          <w:rPr>
+            <w:rFonts w:asciiTheme="minorHAnsi" w:eastAsiaTheme="minorEastAsia" w:hAnsiTheme="minorHAnsi" w:cstheme="minorBidi"/>
+            <w:noProof/>
+            <w:kern w:val="2"/>
+            <w14:ligatures w14:val="standardContextual"/>
+          </w:rPr>
+          <w:tab/>
+        </w:r>
+        <w:r>
+          <w:rPr>
+            <w:rStyle w:val="Collegamentoipertestuale"/>
+            <w:noProof/>
+          </w:rPr>
+          <w:t>Legal</w:t>
+        </w:r>
+        <w:r>
+          <w:rPr>
+            <w:noProof/>
+            <w:webHidden/>
+          </w:rPr>
+          <w:tab/>
+        </w:r>
+        <w:r>
+          <w:rPr>
+            <w:noProof/>
+            <w:webHidden/>
+          </w:rPr>
+          <w:fldChar w:fldCharType="begin"/>
+        </w:r>
+        <w:r>
+          <w:rPr>
+            <w:noProof/>
+            <w:webHidden/>
+          </w:rPr>
+          <w:instrText xml:space="preserve"> PAGEREF _Toc243380185 \h </w:instrText>
+        </w:r>
+        <w:r>
+          <w:rPr>
+            <w:noProof/>
+            <w:webHidden/>
+          </w:rPr>
+        </w:r>
+        <w:r>
+          <w:rPr>
+            <w:noProof/>
+            <w:webHidden/>
+          </w:rPr>
+          <w:fldChar w:fldCharType="separate"/>
+        </w:r>
+        <w:r>
+          <w:rPr>
+            <w:noProof/>
+            <w:webHidden/>
+          </w:rPr>
+          <w:t>6</w:t>
         </w:r>
         <w:r>
           <w:rPr>
@@ -2905,7 +3625,7 @@
           <w14:ligatures w14:val="standardContextual"/>
         </w:rPr>
       </w:pPr>
-      <w:hyperlink w:anchor="_Toc243336400" w:history="1">
+      <w:hyperlink w:anchor="_Toc243380186" w:history="1">
         <w:r>
           <w:rPr>
             <w:rStyle w:val="Collegamentoipertestuale"/>
@@ -2927,7 +3647,7 @@
             <w:rStyle w:val="Collegamentoipertestuale"/>
             <w:noProof/>
           </w:rPr>
-          <w:t>Nonfunctional requirements</w:t>
+          <w:t>System models</w:t>
         </w:r>
         <w:r>
           <w:rPr>
@@ -2948,7 +3668,7 @@
             <w:noProof/>
             <w:webHidden/>
           </w:rPr>
-          <w:instrText xml:space="preserve"> PAGEREF _Toc243336400 \h </w:instrText>
+          <w:instrText xml:space="preserve"> PAGEREF _Toc243380186 \h </w:instrText>
         </w:r>
         <w:r>
           <w:rPr>
@@ -2968,7 +3688,444 @@
             <w:noProof/>
             <w:webHidden/>
           </w:rPr>
-          <w:t>4</w:t>
+          <w:t>6</w:t>
+        </w:r>
+        <w:r>
+          <w:rPr>
+            <w:noProof/>
+            <w:webHidden/>
+          </w:rPr>
+          <w:fldChar w:fldCharType="end"/>
+        </w:r>
+      </w:hyperlink>
+    </w:p>
+    <w:p>
+      <w:pPr>
+        <w:pStyle w:val="Sommario2"/>
+        <w:tabs>
+          <w:tab w:val="left" w:pos="1132"/>
+        </w:tabs>
+        <w:rPr>
+          <w:rFonts w:asciiTheme="minorHAnsi" w:eastAsiaTheme="minorEastAsia" w:hAnsiTheme="minorHAnsi" w:cstheme="minorBidi"/>
+          <w:noProof/>
+          <w:kern w:val="2"/>
+          <w14:ligatures w14:val="standardContextual"/>
+        </w:rPr>
+      </w:pPr>
+      <w:hyperlink w:anchor="_Toc243380187" w:history="1">
+        <w:r>
+          <w:rPr>
+            <w:rStyle w:val="Collegamentoipertestuale"/>
+            <w:noProof/>
+          </w:rPr>
+          <w:t>3.4.1</w:t>
+        </w:r>
+        <w:r>
+          <w:rPr>
+            <w:rFonts w:asciiTheme="minorHAnsi" w:eastAsiaTheme="minorEastAsia" w:hAnsiTheme="minorHAnsi" w:cstheme="minorBidi"/>
+            <w:noProof/>
+            <w:kern w:val="2"/>
+            <w14:ligatures w14:val="standardContextual"/>
+          </w:rPr>
+          <w:tab/>
+        </w:r>
+        <w:r>
+          <w:rPr>
+            <w:rStyle w:val="Collegamentoipertestuale"/>
+            <w:noProof/>
+          </w:rPr>
+          <w:t>Scenarios</w:t>
+        </w:r>
+        <w:r>
+          <w:rPr>
+            <w:noProof/>
+            <w:webHidden/>
+          </w:rPr>
+          <w:tab/>
+        </w:r>
+        <w:r>
+          <w:rPr>
+            <w:noProof/>
+            <w:webHidden/>
+          </w:rPr>
+          <w:fldChar w:fldCharType="begin"/>
+        </w:r>
+        <w:r>
+          <w:rPr>
+            <w:noProof/>
+            <w:webHidden/>
+          </w:rPr>
+          <w:instrText xml:space="preserve"> PAGEREF _Toc243380187 \h </w:instrText>
+        </w:r>
+        <w:r>
+          <w:rPr>
+            <w:noProof/>
+            <w:webHidden/>
+          </w:rPr>
+        </w:r>
+        <w:r>
+          <w:rPr>
+            <w:noProof/>
+            <w:webHidden/>
+          </w:rPr>
+          <w:fldChar w:fldCharType="separate"/>
+        </w:r>
+        <w:r>
+          <w:rPr>
+            <w:noProof/>
+            <w:webHidden/>
+          </w:rPr>
+          <w:t>6</w:t>
+        </w:r>
+        <w:r>
+          <w:rPr>
+            <w:noProof/>
+            <w:webHidden/>
+          </w:rPr>
+          <w:fldChar w:fldCharType="end"/>
+        </w:r>
+      </w:hyperlink>
+    </w:p>
+    <w:p>
+      <w:pPr>
+        <w:pStyle w:val="Sommario2"/>
+        <w:tabs>
+          <w:tab w:val="left" w:pos="1132"/>
+        </w:tabs>
+        <w:rPr>
+          <w:rFonts w:asciiTheme="minorHAnsi" w:eastAsiaTheme="minorEastAsia" w:hAnsiTheme="minorHAnsi" w:cstheme="minorBidi"/>
+          <w:noProof/>
+          <w:kern w:val="2"/>
+          <w14:ligatures w14:val="standardContextual"/>
+        </w:rPr>
+      </w:pPr>
+      <w:hyperlink w:anchor="_Toc243380188" w:history="1">
+        <w:r>
+          <w:rPr>
+            <w:rStyle w:val="Collegamentoipertestuale"/>
+            <w:noProof/>
+          </w:rPr>
+          <w:t>3.4.2</w:t>
+        </w:r>
+        <w:r>
+          <w:rPr>
+            <w:rFonts w:asciiTheme="minorHAnsi" w:eastAsiaTheme="minorEastAsia" w:hAnsiTheme="minorHAnsi" w:cstheme="minorBidi"/>
+            <w:noProof/>
+            <w:kern w:val="2"/>
+            <w14:ligatures w14:val="standardContextual"/>
+          </w:rPr>
+          <w:tab/>
+        </w:r>
+        <w:r>
+          <w:rPr>
+            <w:rStyle w:val="Collegamentoipertestuale"/>
+            <w:noProof/>
+          </w:rPr>
+          <w:t>Use case model</w:t>
+        </w:r>
+        <w:r>
+          <w:rPr>
+            <w:noProof/>
+            <w:webHidden/>
+          </w:rPr>
+          <w:tab/>
+        </w:r>
+        <w:r>
+          <w:rPr>
+            <w:noProof/>
+            <w:webHidden/>
+          </w:rPr>
+          <w:fldChar w:fldCharType="begin"/>
+        </w:r>
+        <w:r>
+          <w:rPr>
+            <w:noProof/>
+            <w:webHidden/>
+          </w:rPr>
+          <w:instrText xml:space="preserve"> PAGEREF _Toc243380188 \h </w:instrText>
+        </w:r>
+        <w:r>
+          <w:rPr>
+            <w:noProof/>
+            <w:webHidden/>
+          </w:rPr>
+        </w:r>
+        <w:r>
+          <w:rPr>
+            <w:noProof/>
+            <w:webHidden/>
+          </w:rPr>
+          <w:fldChar w:fldCharType="separate"/>
+        </w:r>
+        <w:r>
+          <w:rPr>
+            <w:noProof/>
+            <w:webHidden/>
+          </w:rPr>
+          <w:t>6</w:t>
+        </w:r>
+        <w:r>
+          <w:rPr>
+            <w:noProof/>
+            <w:webHidden/>
+          </w:rPr>
+          <w:fldChar w:fldCharType="end"/>
+        </w:r>
+      </w:hyperlink>
+    </w:p>
+    <w:p>
+      <w:pPr>
+        <w:pStyle w:val="Sommario2"/>
+        <w:tabs>
+          <w:tab w:val="left" w:pos="1132"/>
+        </w:tabs>
+        <w:rPr>
+          <w:rFonts w:asciiTheme="minorHAnsi" w:eastAsiaTheme="minorEastAsia" w:hAnsiTheme="minorHAnsi" w:cstheme="minorBidi"/>
+          <w:noProof/>
+          <w:kern w:val="2"/>
+          <w14:ligatures w14:val="standardContextual"/>
+        </w:rPr>
+      </w:pPr>
+      <w:hyperlink w:anchor="_Toc243380189" w:history="1">
+        <w:r>
+          <w:rPr>
+            <w:rStyle w:val="Collegamentoipertestuale"/>
+            <w:noProof/>
+          </w:rPr>
+          <w:t>3.4.3</w:t>
+        </w:r>
+        <w:r>
+          <w:rPr>
+            <w:rFonts w:asciiTheme="minorHAnsi" w:eastAsiaTheme="minorEastAsia" w:hAnsiTheme="minorHAnsi" w:cstheme="minorBidi"/>
+            <w:noProof/>
+            <w:kern w:val="2"/>
+            <w14:ligatures w14:val="standardContextual"/>
+          </w:rPr>
+          <w:tab/>
+        </w:r>
+        <w:r>
+          <w:rPr>
+            <w:rStyle w:val="Collegamentoipertestuale"/>
+            <w:noProof/>
+          </w:rPr>
+          <w:t>Object model</w:t>
+        </w:r>
+        <w:r>
+          <w:rPr>
+            <w:noProof/>
+            <w:webHidden/>
+          </w:rPr>
+          <w:tab/>
+        </w:r>
+        <w:r>
+          <w:rPr>
+            <w:noProof/>
+            <w:webHidden/>
+          </w:rPr>
+          <w:fldChar w:fldCharType="begin"/>
+        </w:r>
+        <w:r>
+          <w:rPr>
+            <w:noProof/>
+            <w:webHidden/>
+          </w:rPr>
+          <w:instrText xml:space="preserve"> PAGEREF _Toc243380189 \h </w:instrText>
+        </w:r>
+        <w:r>
+          <w:rPr>
+            <w:noProof/>
+            <w:webHidden/>
+          </w:rPr>
+        </w:r>
+        <w:r>
+          <w:rPr>
+            <w:noProof/>
+            <w:webHidden/>
+          </w:rPr>
+          <w:fldChar w:fldCharType="separate"/>
+        </w:r>
+        <w:r>
+          <w:rPr>
+            <w:noProof/>
+            <w:webHidden/>
+          </w:rPr>
+          <w:t>6</w:t>
+        </w:r>
+        <w:r>
+          <w:rPr>
+            <w:noProof/>
+            <w:webHidden/>
+          </w:rPr>
+          <w:fldChar w:fldCharType="end"/>
+        </w:r>
+      </w:hyperlink>
+    </w:p>
+    <w:p>
+      <w:pPr>
+        <w:pStyle w:val="Sommario2"/>
+        <w:tabs>
+          <w:tab w:val="left" w:pos="1132"/>
+        </w:tabs>
+        <w:rPr>
+          <w:rFonts w:asciiTheme="minorHAnsi" w:eastAsiaTheme="minorEastAsia" w:hAnsiTheme="minorHAnsi" w:cstheme="minorBidi"/>
+          <w:noProof/>
+          <w:kern w:val="2"/>
+          <w14:ligatures w14:val="standardContextual"/>
+        </w:rPr>
+      </w:pPr>
+      <w:hyperlink w:anchor="_Toc243380190" w:history="1">
+        <w:r>
+          <w:rPr>
+            <w:rStyle w:val="Collegamentoipertestuale"/>
+            <w:noProof/>
+          </w:rPr>
+          <w:t>3.4.4</w:t>
+        </w:r>
+        <w:r>
+          <w:rPr>
+            <w:rFonts w:asciiTheme="minorHAnsi" w:eastAsiaTheme="minorEastAsia" w:hAnsiTheme="minorHAnsi" w:cstheme="minorBidi"/>
+            <w:noProof/>
+            <w:kern w:val="2"/>
+            <w14:ligatures w14:val="standardContextual"/>
+          </w:rPr>
+          <w:tab/>
+        </w:r>
+        <w:r>
+          <w:rPr>
+            <w:rStyle w:val="Collegamentoipertestuale"/>
+            <w:noProof/>
+          </w:rPr>
+          <w:t>Dynamic model</w:t>
+        </w:r>
+        <w:r>
+          <w:rPr>
+            <w:noProof/>
+            <w:webHidden/>
+          </w:rPr>
+          <w:tab/>
+        </w:r>
+        <w:r>
+          <w:rPr>
+            <w:noProof/>
+            <w:webHidden/>
+          </w:rPr>
+          <w:fldChar w:fldCharType="begin"/>
+        </w:r>
+        <w:r>
+          <w:rPr>
+            <w:noProof/>
+            <w:webHidden/>
+          </w:rPr>
+          <w:instrText xml:space="preserve"> PAGEREF _Toc243380190 \h </w:instrText>
+        </w:r>
+        <w:r>
+          <w:rPr>
+            <w:noProof/>
+            <w:webHidden/>
+          </w:rPr>
+        </w:r>
+        <w:r>
+          <w:rPr>
+            <w:noProof/>
+            <w:webHidden/>
+          </w:rPr>
+          <w:fldChar w:fldCharType="separate"/>
+        </w:r>
+        <w:r>
+          <w:rPr>
+            <w:noProof/>
+            <w:webHidden/>
+          </w:rPr>
+          <w:t>6</w:t>
+        </w:r>
+        <w:r>
+          <w:rPr>
+            <w:noProof/>
+            <w:webHidden/>
+          </w:rPr>
+          <w:fldChar w:fldCharType="end"/>
+        </w:r>
+      </w:hyperlink>
+    </w:p>
+    <w:p>
+      <w:pPr>
+        <w:pStyle w:val="Sommario2"/>
+        <w:tabs>
+          <w:tab w:val="left" w:pos="1132"/>
+        </w:tabs>
+        <w:rPr>
+          <w:rFonts w:asciiTheme="minorHAnsi" w:eastAsiaTheme="minorEastAsia" w:hAnsiTheme="minorHAnsi" w:cstheme="minorBidi"/>
+          <w:noProof/>
+          <w:kern w:val="2"/>
+          <w14:ligatures w14:val="standardContextual"/>
+        </w:rPr>
+      </w:pPr>
+      <w:hyperlink w:anchor="_Toc243380191" w:history="1">
+        <w:r>
+          <w:rPr>
+            <w:rStyle w:val="Collegamentoipertestuale"/>
+            <w:noProof/>
+            <w:lang w:val="en-US"/>
+          </w:rPr>
+          <w:t>3.4.5</w:t>
+        </w:r>
+        <w:r>
+          <w:rPr>
+            <w:rFonts w:asciiTheme="minorHAnsi" w:eastAsiaTheme="minorEastAsia" w:hAnsiTheme="minorHAnsi" w:cstheme="minorBidi"/>
+            <w:noProof/>
+            <w:kern w:val="2"/>
+            <w14:ligatures w14:val="standardContextual"/>
+          </w:rPr>
+          <w:tab/>
+        </w:r>
+        <w:r>
+          <w:rPr>
+            <w:rStyle w:val="Collegamentoipertestuale"/>
+            <w:noProof/>
+            <w:lang w:val="en-US"/>
+          </w:rPr>
+          <w:t>User interface—navigational paths and screen mock-ups</w:t>
+        </w:r>
+        <w:r>
+          <w:rPr>
+            <w:noProof/>
+            <w:webHidden/>
+          </w:rPr>
+          <w:tab/>
+        </w:r>
+        <w:r>
+          <w:rPr>
+            <w:noProof/>
+            <w:webHidden/>
+          </w:rPr>
+          <w:fldChar w:fldCharType="begin"/>
+        </w:r>
+        <w:r>
+          <w:rPr>
+            <w:noProof/>
+            <w:webHidden/>
+          </w:rPr>
+          <w:instrText xml:space="preserve"> PAGEREF _Toc243380191 \h </w:instrText>
+        </w:r>
+        <w:r>
+          <w:rPr>
+            <w:noProof/>
+            <w:webHidden/>
+          </w:rPr>
+        </w:r>
+        <w:r>
+          <w:rPr>
+            <w:noProof/>
+            <w:webHidden/>
+          </w:rPr>
+          <w:fldChar w:fldCharType="separate"/>
+        </w:r>
+        <w:r>
+          <w:rPr>
+            <w:noProof/>
+            <w:webHidden/>
+          </w:rPr>
+          <w:t>6</w:t>
         </w:r>
         <w:r>
           <w:rPr>
@@ -2992,7 +4149,7 @@
           <w14:ligatures w14:val="standardContextual"/>
         </w:rPr>
       </w:pPr>
-      <w:hyperlink w:anchor="_Toc243336401" w:history="1">
+      <w:hyperlink w:anchor="_Toc243380192" w:history="1">
         <w:r>
           <w:rPr>
             <w:rStyle w:val="Collegamentoipertestuale"/>
@@ -3014,7 +4171,7 @@
             <w:rStyle w:val="Collegamentoipertestuale"/>
             <w:noProof/>
           </w:rPr>
-          <w:t>NONFUNCTIONAL REQUIREMENTS</w:t>
+          <w:t>GLOSSARY</w:t>
         </w:r>
         <w:r>
           <w:rPr>
@@ -3035,529 +4192,7 @@
             <w:noProof/>
             <w:webHidden/>
           </w:rPr>
-          <w:instrText xml:space="preserve"> PAGEREF _Toc243336401 \h </w:instrText>
-        </w:r>
-        <w:r>
-          <w:rPr>
-            <w:noProof/>
-            <w:webHidden/>
-          </w:rPr>
-        </w:r>
-        <w:r>
-          <w:rPr>
-            <w:noProof/>
-            <w:webHidden/>
-          </w:rPr>
-          <w:fldChar w:fldCharType="separate"/>
-        </w:r>
-        <w:r>
-          <w:rPr>
-            <w:noProof/>
-            <w:webHidden/>
-          </w:rPr>
-          <w:t>5</w:t>
-        </w:r>
-        <w:r>
-          <w:rPr>
-            <w:noProof/>
-            <w:webHidden/>
-          </w:rPr>
-          <w:fldChar w:fldCharType="end"/>
-        </w:r>
-      </w:hyperlink>
-    </w:p>
-    <w:p>
-      <w:pPr>
-        <w:pStyle w:val="Sommario2"/>
-        <w:tabs>
-          <w:tab w:val="left" w:pos="1132"/>
-        </w:tabs>
-        <w:rPr>
-          <w:rFonts w:asciiTheme="minorHAnsi" w:eastAsiaTheme="minorEastAsia" w:hAnsiTheme="minorHAnsi" w:cstheme="minorBidi"/>
-          <w:noProof/>
-          <w:kern w:val="2"/>
-          <w14:ligatures w14:val="standardContextual"/>
-        </w:rPr>
-      </w:pPr>
-      <w:hyperlink w:anchor="_Toc243336402" w:history="1">
-        <w:r>
-          <w:rPr>
-            <w:rStyle w:val="Collegamentoipertestuale"/>
-            <w:noProof/>
-          </w:rPr>
-          <w:t>4.1.</w:t>
-        </w:r>
-        <w:r>
-          <w:rPr>
-            <w:rFonts w:asciiTheme="minorHAnsi" w:eastAsiaTheme="minorEastAsia" w:hAnsiTheme="minorHAnsi" w:cstheme="minorBidi"/>
-            <w:noProof/>
-            <w:kern w:val="2"/>
-            <w14:ligatures w14:val="standardContextual"/>
-          </w:rPr>
-          <w:tab/>
-        </w:r>
-        <w:r>
-          <w:rPr>
-            <w:rStyle w:val="Collegamentoipertestuale"/>
-            <w:noProof/>
-          </w:rPr>
-          <w:t>Usability</w:t>
-        </w:r>
-        <w:r>
-          <w:rPr>
-            <w:noProof/>
-            <w:webHidden/>
-          </w:rPr>
-          <w:tab/>
-        </w:r>
-        <w:r>
-          <w:rPr>
-            <w:noProof/>
-            <w:webHidden/>
-          </w:rPr>
-          <w:fldChar w:fldCharType="begin"/>
-        </w:r>
-        <w:r>
-          <w:rPr>
-            <w:noProof/>
-            <w:webHidden/>
-          </w:rPr>
-          <w:instrText xml:space="preserve"> PAGEREF _Toc243336402 \h </w:instrText>
-        </w:r>
-        <w:r>
-          <w:rPr>
-            <w:noProof/>
-            <w:webHidden/>
-          </w:rPr>
-        </w:r>
-        <w:r>
-          <w:rPr>
-            <w:noProof/>
-            <w:webHidden/>
-          </w:rPr>
-          <w:fldChar w:fldCharType="separate"/>
-        </w:r>
-        <w:r>
-          <w:rPr>
-            <w:noProof/>
-            <w:webHidden/>
-          </w:rPr>
-          <w:t>5</w:t>
-        </w:r>
-        <w:r>
-          <w:rPr>
-            <w:noProof/>
-            <w:webHidden/>
-          </w:rPr>
-          <w:fldChar w:fldCharType="end"/>
-        </w:r>
-      </w:hyperlink>
-    </w:p>
-    <w:p>
-      <w:pPr>
-        <w:pStyle w:val="Sommario2"/>
-        <w:tabs>
-          <w:tab w:val="left" w:pos="1132"/>
-        </w:tabs>
-        <w:rPr>
-          <w:rFonts w:asciiTheme="minorHAnsi" w:eastAsiaTheme="minorEastAsia" w:hAnsiTheme="minorHAnsi" w:cstheme="minorBidi"/>
-          <w:noProof/>
-          <w:kern w:val="2"/>
-          <w14:ligatures w14:val="standardContextual"/>
-        </w:rPr>
-      </w:pPr>
-      <w:hyperlink w:anchor="_Toc243336403" w:history="1">
-        <w:r>
-          <w:rPr>
-            <w:rStyle w:val="Collegamentoipertestuale"/>
-            <w:noProof/>
-          </w:rPr>
-          <w:t>4.2.</w:t>
-        </w:r>
-        <w:r>
-          <w:rPr>
-            <w:rFonts w:asciiTheme="minorHAnsi" w:eastAsiaTheme="minorEastAsia" w:hAnsiTheme="minorHAnsi" w:cstheme="minorBidi"/>
-            <w:noProof/>
-            <w:kern w:val="2"/>
-            <w14:ligatures w14:val="standardContextual"/>
-          </w:rPr>
-          <w:tab/>
-        </w:r>
-        <w:r>
-          <w:rPr>
-            <w:rStyle w:val="Collegamentoipertestuale"/>
-            <w:noProof/>
-          </w:rPr>
-          <w:t>Performance</w:t>
-        </w:r>
-        <w:r>
-          <w:rPr>
-            <w:noProof/>
-            <w:webHidden/>
-          </w:rPr>
-          <w:tab/>
-        </w:r>
-        <w:r>
-          <w:rPr>
-            <w:noProof/>
-            <w:webHidden/>
-          </w:rPr>
-          <w:fldChar w:fldCharType="begin"/>
-        </w:r>
-        <w:r>
-          <w:rPr>
-            <w:noProof/>
-            <w:webHidden/>
-          </w:rPr>
-          <w:instrText xml:space="preserve"> PAGEREF _Toc243336403 \h </w:instrText>
-        </w:r>
-        <w:r>
-          <w:rPr>
-            <w:noProof/>
-            <w:webHidden/>
-          </w:rPr>
-        </w:r>
-        <w:r>
-          <w:rPr>
-            <w:noProof/>
-            <w:webHidden/>
-          </w:rPr>
-          <w:fldChar w:fldCharType="separate"/>
-        </w:r>
-        <w:r>
-          <w:rPr>
-            <w:noProof/>
-            <w:webHidden/>
-          </w:rPr>
-          <w:t>6</w:t>
-        </w:r>
-        <w:r>
-          <w:rPr>
-            <w:noProof/>
-            <w:webHidden/>
-          </w:rPr>
-          <w:fldChar w:fldCharType="end"/>
-        </w:r>
-      </w:hyperlink>
-    </w:p>
-    <w:p>
-      <w:pPr>
-        <w:pStyle w:val="Sommario2"/>
-        <w:tabs>
-          <w:tab w:val="left" w:pos="1132"/>
-        </w:tabs>
-        <w:rPr>
-          <w:rFonts w:asciiTheme="minorHAnsi" w:eastAsiaTheme="minorEastAsia" w:hAnsiTheme="minorHAnsi" w:cstheme="minorBidi"/>
-          <w:noProof/>
-          <w:kern w:val="2"/>
-          <w14:ligatures w14:val="standardContextual"/>
-        </w:rPr>
-      </w:pPr>
-      <w:hyperlink w:anchor="_Toc243336404" w:history="1">
-        <w:r>
-          <w:rPr>
-            <w:rStyle w:val="Collegamentoipertestuale"/>
-            <w:noProof/>
-          </w:rPr>
-          <w:t>4.3.</w:t>
-        </w:r>
-        <w:r>
-          <w:rPr>
-            <w:rFonts w:asciiTheme="minorHAnsi" w:eastAsiaTheme="minorEastAsia" w:hAnsiTheme="minorHAnsi" w:cstheme="minorBidi"/>
-            <w:noProof/>
-            <w:kern w:val="2"/>
-            <w14:ligatures w14:val="standardContextual"/>
-          </w:rPr>
-          <w:tab/>
-        </w:r>
-        <w:r>
-          <w:rPr>
-            <w:rStyle w:val="Collegamentoipertestuale"/>
-            <w:noProof/>
-          </w:rPr>
-          <w:t>Reliability</w:t>
-        </w:r>
-        <w:r>
-          <w:rPr>
-            <w:noProof/>
-            <w:webHidden/>
-          </w:rPr>
-          <w:tab/>
-        </w:r>
-        <w:r>
-          <w:rPr>
-            <w:noProof/>
-            <w:webHidden/>
-          </w:rPr>
-          <w:fldChar w:fldCharType="begin"/>
-        </w:r>
-        <w:r>
-          <w:rPr>
-            <w:noProof/>
-            <w:webHidden/>
-          </w:rPr>
-          <w:instrText xml:space="preserve"> PAGEREF _Toc243336404 \h </w:instrText>
-        </w:r>
-        <w:r>
-          <w:rPr>
-            <w:noProof/>
-            <w:webHidden/>
-          </w:rPr>
-        </w:r>
-        <w:r>
-          <w:rPr>
-            <w:noProof/>
-            <w:webHidden/>
-          </w:rPr>
-          <w:fldChar w:fldCharType="separate"/>
-        </w:r>
-        <w:r>
-          <w:rPr>
-            <w:noProof/>
-            <w:webHidden/>
-          </w:rPr>
-          <w:t>6</w:t>
-        </w:r>
-        <w:r>
-          <w:rPr>
-            <w:noProof/>
-            <w:webHidden/>
-          </w:rPr>
-          <w:fldChar w:fldCharType="end"/>
-        </w:r>
-      </w:hyperlink>
-    </w:p>
-    <w:p>
-      <w:pPr>
-        <w:pStyle w:val="Sommario2"/>
-        <w:tabs>
-          <w:tab w:val="left" w:pos="1132"/>
-        </w:tabs>
-        <w:rPr>
-          <w:rFonts w:asciiTheme="minorHAnsi" w:eastAsiaTheme="minorEastAsia" w:hAnsiTheme="minorHAnsi" w:cstheme="minorBidi"/>
-          <w:noProof/>
-          <w:kern w:val="2"/>
-          <w14:ligatures w14:val="standardContextual"/>
-        </w:rPr>
-      </w:pPr>
-      <w:hyperlink w:anchor="_Toc243336405" w:history="1">
-        <w:r>
-          <w:rPr>
-            <w:rStyle w:val="Collegamentoipertestuale"/>
-            <w:noProof/>
-          </w:rPr>
-          <w:t>4.4.</w:t>
-        </w:r>
-        <w:r>
-          <w:rPr>
-            <w:rFonts w:asciiTheme="minorHAnsi" w:eastAsiaTheme="minorEastAsia" w:hAnsiTheme="minorHAnsi" w:cstheme="minorBidi"/>
-            <w:noProof/>
-            <w:kern w:val="2"/>
-            <w14:ligatures w14:val="standardContextual"/>
-          </w:rPr>
-          <w:tab/>
-        </w:r>
-        <w:r>
-          <w:rPr>
-            <w:rStyle w:val="Collegamentoipertestuale"/>
-            <w:noProof/>
-          </w:rPr>
-          <w:t>Supportability</w:t>
-        </w:r>
-        <w:r>
-          <w:rPr>
-            <w:noProof/>
-            <w:webHidden/>
-          </w:rPr>
-          <w:tab/>
-        </w:r>
-        <w:r>
-          <w:rPr>
-            <w:noProof/>
-            <w:webHidden/>
-          </w:rPr>
-          <w:fldChar w:fldCharType="begin"/>
-        </w:r>
-        <w:r>
-          <w:rPr>
-            <w:noProof/>
-            <w:webHidden/>
-          </w:rPr>
-          <w:instrText xml:space="preserve"> PAGEREF _Toc243336405 \h </w:instrText>
-        </w:r>
-        <w:r>
-          <w:rPr>
-            <w:noProof/>
-            <w:webHidden/>
-          </w:rPr>
-        </w:r>
-        <w:r>
-          <w:rPr>
-            <w:noProof/>
-            <w:webHidden/>
-          </w:rPr>
-          <w:fldChar w:fldCharType="separate"/>
-        </w:r>
-        <w:r>
-          <w:rPr>
-            <w:noProof/>
-            <w:webHidden/>
-          </w:rPr>
-          <w:t>6</w:t>
-        </w:r>
-        <w:r>
-          <w:rPr>
-            <w:noProof/>
-            <w:webHidden/>
-          </w:rPr>
-          <w:fldChar w:fldCharType="end"/>
-        </w:r>
-      </w:hyperlink>
-    </w:p>
-    <w:p>
-      <w:pPr>
-        <w:pStyle w:val="Sommario1"/>
-        <w:tabs>
-          <w:tab w:val="left" w:pos="566"/>
-        </w:tabs>
-        <w:rPr>
-          <w:rFonts w:asciiTheme="minorHAnsi" w:eastAsiaTheme="minorEastAsia" w:hAnsiTheme="minorHAnsi" w:cstheme="minorBidi"/>
-          <w:noProof/>
-          <w:kern w:val="2"/>
-          <w14:ligatures w14:val="standardContextual"/>
-        </w:rPr>
-      </w:pPr>
-      <w:hyperlink w:anchor="_Toc243336406" w:history="1">
-        <w:r>
-          <w:rPr>
-            <w:rStyle w:val="Collegamentoipertestuale"/>
-            <w:noProof/>
-          </w:rPr>
-          <w:t>5.</w:t>
-        </w:r>
-        <w:r>
-          <w:rPr>
-            <w:rFonts w:asciiTheme="minorHAnsi" w:eastAsiaTheme="minorEastAsia" w:hAnsiTheme="minorHAnsi" w:cstheme="minorBidi"/>
-            <w:noProof/>
-            <w:kern w:val="2"/>
-            <w14:ligatures w14:val="standardContextual"/>
-          </w:rPr>
-          <w:tab/>
-        </w:r>
-        <w:r>
-          <w:rPr>
-            <w:rStyle w:val="Collegamentoipertestuale"/>
-            <w:noProof/>
-          </w:rPr>
-          <w:t>TARGET ENVIRONMENT</w:t>
-        </w:r>
-        <w:r>
-          <w:rPr>
-            <w:noProof/>
-            <w:webHidden/>
-          </w:rPr>
-          <w:tab/>
-        </w:r>
-        <w:r>
-          <w:rPr>
-            <w:noProof/>
-            <w:webHidden/>
-          </w:rPr>
-          <w:fldChar w:fldCharType="begin"/>
-        </w:r>
-        <w:r>
-          <w:rPr>
-            <w:noProof/>
-            <w:webHidden/>
-          </w:rPr>
-          <w:instrText xml:space="preserve"> PAGEREF _Toc243336406 \h </w:instrText>
-        </w:r>
-        <w:r>
-          <w:rPr>
-            <w:noProof/>
-            <w:webHidden/>
-          </w:rPr>
-        </w:r>
-        <w:r>
-          <w:rPr>
-            <w:noProof/>
-            <w:webHidden/>
-          </w:rPr>
-          <w:fldChar w:fldCharType="separate"/>
-        </w:r>
-        <w:r>
-          <w:rPr>
-            <w:noProof/>
-            <w:webHidden/>
-          </w:rPr>
-          <w:t>6</w:t>
-        </w:r>
-        <w:r>
-          <w:rPr>
-            <w:noProof/>
-            <w:webHidden/>
-          </w:rPr>
-          <w:fldChar w:fldCharType="end"/>
-        </w:r>
-      </w:hyperlink>
-    </w:p>
-    <w:p>
-      <w:pPr>
-        <w:pStyle w:val="Sommario1"/>
-        <w:tabs>
-          <w:tab w:val="left" w:pos="566"/>
-        </w:tabs>
-        <w:rPr>
-          <w:rFonts w:asciiTheme="minorHAnsi" w:eastAsiaTheme="minorEastAsia" w:hAnsiTheme="minorHAnsi" w:cstheme="minorBidi"/>
-          <w:noProof/>
-          <w:kern w:val="2"/>
-          <w14:ligatures w14:val="standardContextual"/>
-        </w:rPr>
-      </w:pPr>
-      <w:hyperlink w:anchor="_Toc243336407" w:history="1">
-        <w:r>
-          <w:rPr>
-            <w:rStyle w:val="Collegamentoipertestuale"/>
-            <w:noProof/>
-          </w:rPr>
-          <w:t>6.</w:t>
-        </w:r>
-        <w:r>
-          <w:rPr>
-            <w:rFonts w:asciiTheme="minorHAnsi" w:eastAsiaTheme="minorEastAsia" w:hAnsiTheme="minorHAnsi" w:cstheme="minorBidi"/>
-            <w:noProof/>
-            <w:kern w:val="2"/>
-            <w14:ligatures w14:val="standardContextual"/>
-          </w:rPr>
-          <w:tab/>
-        </w:r>
-        <w:r>
-          <w:rPr>
-            <w:rStyle w:val="Collegamentoipertestuale"/>
-            <w:noProof/>
-          </w:rPr>
-          <w:t>DELIVERABLE &amp; DEADLINES</w:t>
-        </w:r>
-        <w:r>
-          <w:rPr>
-            <w:noProof/>
-            <w:webHidden/>
-          </w:rPr>
-          <w:tab/>
-        </w:r>
-        <w:r>
-          <w:rPr>
-            <w:noProof/>
-            <w:webHidden/>
-          </w:rPr>
-          <w:fldChar w:fldCharType="begin"/>
-        </w:r>
-        <w:r>
-          <w:rPr>
-            <w:noProof/>
-            <w:webHidden/>
-          </w:rPr>
-          <w:instrText xml:space="preserve"> PAGEREF _Toc243336407 \h </w:instrText>
+          <w:instrText xml:space="preserve"> PAGEREF _Toc243380192 \h </w:instrText>
         </w:r>
         <w:r>
           <w:rPr>
@@ -3634,7 +4269,7 @@
         <w:jc w:val="left"/>
       </w:pPr>
       <w:bookmarkStart w:id="0" w:name="_Hlk243298281"/>
-      <w:bookmarkStart w:id="1" w:name="_Toc243336388"/>
+      <w:bookmarkStart w:id="1" w:name="_Toc243380166"/>
       <w:r>
         <w:lastRenderedPageBreak/>
         <w:t>INTRODUCTION</w:t>
@@ -3650,7 +4285,7 @@
         </w:numPr>
         <w:ind w:left="716" w:hanging="432"/>
       </w:pPr>
-      <w:bookmarkStart w:id="2" w:name="_Toc243336389"/>
+      <w:bookmarkStart w:id="2" w:name="_Toc243380167"/>
       <w:bookmarkEnd w:id="0"/>
       <w:r>
         <w:t>Purpose of the system</w:t>
@@ -3661,9 +4296,25 @@
       <w:pPr>
         <w:spacing w:after="100"/>
         <w:ind w:left="709"/>
-      </w:pPr>
-      <w:r>
-        <w:t>L’obiettivo del sistema è di fornire un negozio online che permette ai clienti di avere un’esperienza di acquisto fluida e semplice, e dare alcuni strumenti a delle figure specifiche identificate dal negozio per fare analisi di marketing e di conseguenza capire quali prodotti hanno una maggiore possibilità di essere acquistati</w:t>
+        <w:jc w:val="both"/>
+      </w:pPr>
+      <w:r>
+        <w:t xml:space="preserve">L’obiettivo </w:t>
+      </w:r>
+      <w:r>
+        <w:t xml:space="preserve">del sistema di ecommerce GG-Eyeware è di estendere la </w:t>
+      </w:r>
+      <w:r>
+        <w:t xml:space="preserve">percentuale di </w:t>
+      </w:r>
+      <w:r>
+        <w:t>clientela che viene servita attualmente, andando oltre i confini del territorio locale, e permettere ai dipendenti del negozio di avere dei ruoli specifici identificabili all’interno del sito</w:t>
+      </w:r>
+      <w:r>
+        <w:t>,</w:t>
+      </w:r>
+      <w:r>
+        <w:t xml:space="preserve"> ognuno con le proprie responsabilità disponibili solo dopo un’autenticazione; in particolar modo queste figure saranno il Product Manager, il Market Analyzer, e l’Order Manager</w:t>
       </w:r>
     </w:p>
     <w:p>
@@ -3675,7 +4326,7 @@
         </w:numPr>
         <w:ind w:left="716" w:hanging="432"/>
       </w:pPr>
-      <w:bookmarkStart w:id="3" w:name="_Toc243336390"/>
+      <w:bookmarkStart w:id="3" w:name="_Toc243380168"/>
       <w:r>
         <w:t>Scope of the system</w:t>
       </w:r>
@@ -3688,10 +4339,311 @@
       <w:pPr>
         <w:spacing w:after="100"/>
         <w:ind w:left="709"/>
-      </w:pPr>
-      <w:r>
-        <w:t>a</w:t>
-      </w:r>
+        <w:jc w:val="both"/>
+      </w:pPr>
+      <w:r>
+        <w:t>L</w:t>
+      </w:r>
+      <w:r>
+        <w:t>e funzionalità incluse nell’ambito del sistema sono:</w:t>
+      </w:r>
+    </w:p>
+    <w:p>
+      <w:pPr>
+        <w:pStyle w:val="Paragrafoelenco"/>
+        <w:numPr>
+          <w:ilvl w:val="0"/>
+          <w:numId w:val="38"/>
+        </w:numPr>
+        <w:spacing w:after="100"/>
+        <w:jc w:val="both"/>
+        <w:rPr>
+          <w:rFonts w:ascii="Times New Roman" w:hAnsi="Times New Roman" w:cs="Times New Roman"/>
+        </w:rPr>
+      </w:pPr>
+      <w:r>
+        <w:rPr>
+          <w:rFonts w:ascii="Times New Roman" w:hAnsi="Times New Roman" w:cs="Times New Roman"/>
+        </w:rPr>
+        <w:t>Area utenti registrati / utenti non registrati</w:t>
+      </w:r>
+    </w:p>
+    <w:p>
+      <w:pPr>
+        <w:pStyle w:val="Paragrafoelenco"/>
+        <w:numPr>
+          <w:ilvl w:val="0"/>
+          <w:numId w:val="37"/>
+        </w:numPr>
+        <w:spacing w:after="100"/>
+        <w:jc w:val="both"/>
+        <w:rPr>
+          <w:rFonts w:ascii="Times New Roman" w:hAnsi="Times New Roman" w:cs="Times New Roman"/>
+        </w:rPr>
+      </w:pPr>
+      <w:r>
+        <w:rPr>
+          <w:rFonts w:ascii="Times New Roman" w:hAnsi="Times New Roman" w:cs="Times New Roman"/>
+        </w:rPr>
+        <w:t>Possibilità di autenticarsi al proprio account e registrarsi se no</w:t>
+      </w:r>
+      <w:r>
+        <w:rPr>
+          <w:rFonts w:ascii="Times New Roman" w:hAnsi="Times New Roman" w:cs="Times New Roman"/>
+        </w:rPr>
+        <w:t>n se n’è possiede già uno</w:t>
+      </w:r>
+    </w:p>
+    <w:p>
+      <w:pPr>
+        <w:pStyle w:val="Paragrafoelenco"/>
+        <w:numPr>
+          <w:ilvl w:val="0"/>
+          <w:numId w:val="37"/>
+        </w:numPr>
+        <w:spacing w:after="100"/>
+        <w:jc w:val="both"/>
+        <w:rPr>
+          <w:rFonts w:ascii="Times New Roman" w:hAnsi="Times New Roman" w:cs="Times New Roman"/>
+        </w:rPr>
+      </w:pPr>
+      <w:r>
+        <w:rPr>
+          <w:rFonts w:ascii="Times New Roman" w:hAnsi="Times New Roman" w:cs="Times New Roman"/>
+        </w:rPr>
+        <w:t>Visualizzazione del catalogo con tutti gli occhiali, ricercare occhiali per nome con una barra di ricerca, cliccare sul paio desiderato per leggerne il prezzo e i colori disponibili</w:t>
+      </w:r>
+    </w:p>
+    <w:p>
+      <w:pPr>
+        <w:pStyle w:val="Paragrafoelenco"/>
+        <w:numPr>
+          <w:ilvl w:val="0"/>
+          <w:numId w:val="37"/>
+        </w:numPr>
+        <w:spacing w:after="100"/>
+        <w:jc w:val="both"/>
+        <w:rPr>
+          <w:rFonts w:ascii="Times New Roman" w:hAnsi="Times New Roman" w:cs="Times New Roman"/>
+        </w:rPr>
+      </w:pPr>
+      <w:r>
+        <w:rPr>
+          <w:rFonts w:ascii="Times New Roman" w:hAnsi="Times New Roman" w:cs="Times New Roman"/>
+        </w:rPr>
+        <w:t>Gestione del carrello (inserimento prodotti e visualizzazione degli occhiali gi</w:t>
+      </w:r>
+      <w:r>
+        <w:rPr>
+          <w:rFonts w:ascii="Times New Roman" w:hAnsi="Times New Roman" w:cs="Times New Roman"/>
+        </w:rPr>
+        <w:t>à</w:t>
+      </w:r>
+      <w:r>
+        <w:rPr>
+          <w:rFonts w:ascii="Times New Roman" w:hAnsi="Times New Roman" w:cs="Times New Roman"/>
+        </w:rPr>
+        <w:t xml:space="preserve"> inseriti), effettuare il checkout inserendo i dati necessari</w:t>
+      </w:r>
+    </w:p>
+    <w:p>
+      <w:pPr>
+        <w:pStyle w:val="Paragrafoelenco"/>
+        <w:numPr>
+          <w:ilvl w:val="0"/>
+          <w:numId w:val="37"/>
+        </w:numPr>
+        <w:spacing w:after="100"/>
+        <w:jc w:val="both"/>
+        <w:rPr>
+          <w:rFonts w:ascii="Times New Roman" w:hAnsi="Times New Roman" w:cs="Times New Roman"/>
+        </w:rPr>
+      </w:pPr>
+      <w:r>
+        <w:rPr>
+          <w:rFonts w:ascii="Times New Roman" w:hAnsi="Times New Roman" w:cs="Times New Roman"/>
+        </w:rPr>
+        <w:t>Possibilità di accedere a delle aree personali intese per il singolo utente (gestione del profilo e storico ordini)</w:t>
+      </w:r>
+    </w:p>
+    <w:p>
+      <w:pPr>
+        <w:pStyle w:val="Paragrafoelenco"/>
+        <w:numPr>
+          <w:ilvl w:val="0"/>
+          <w:numId w:val="38"/>
+        </w:numPr>
+        <w:spacing w:after="100"/>
+        <w:jc w:val="both"/>
+        <w:rPr>
+          <w:rFonts w:ascii="Times New Roman" w:hAnsi="Times New Roman" w:cs="Times New Roman"/>
+        </w:rPr>
+      </w:pPr>
+      <w:r>
+        <w:rPr>
+          <w:rFonts w:ascii="Times New Roman" w:hAnsi="Times New Roman" w:cs="Times New Roman"/>
+        </w:rPr>
+        <w:t xml:space="preserve">Aree per i dipendenti </w:t>
+      </w:r>
+    </w:p>
+    <w:p>
+      <w:pPr>
+        <w:pStyle w:val="Paragrafoelenco"/>
+        <w:numPr>
+          <w:ilvl w:val="0"/>
+          <w:numId w:val="40"/>
+        </w:numPr>
+        <w:spacing w:after="100"/>
+        <w:ind w:left="2127"/>
+        <w:jc w:val="both"/>
+        <w:rPr>
+          <w:rFonts w:ascii="Times New Roman" w:hAnsi="Times New Roman" w:cs="Times New Roman"/>
+        </w:rPr>
+      </w:pPr>
+      <w:r>
+        <w:rPr>
+          <w:rFonts w:ascii="Times New Roman" w:hAnsi="Times New Roman" w:cs="Times New Roman"/>
+        </w:rPr>
+        <w:t>Product Manager: accesso ad un’area dove ha la possibilità di aggiungere occhiali al catalogo con le relative informazioni necessarie, deciderne la scorta presente nel magazzino al momento dell’inserimento, o decidere di nasconderlo per i clienti</w:t>
+      </w:r>
+    </w:p>
+    <w:p>
+      <w:pPr>
+        <w:pStyle w:val="Paragrafoelenco"/>
+        <w:numPr>
+          <w:ilvl w:val="0"/>
+          <w:numId w:val="40"/>
+        </w:numPr>
+        <w:spacing w:after="100"/>
+        <w:ind w:left="2127"/>
+        <w:jc w:val="both"/>
+        <w:rPr>
+          <w:rFonts w:ascii="Times New Roman" w:hAnsi="Times New Roman" w:cs="Times New Roman"/>
+        </w:rPr>
+      </w:pPr>
+      <w:r>
+        <w:rPr>
+          <w:rFonts w:ascii="Times New Roman" w:hAnsi="Times New Roman" w:cs="Times New Roman"/>
+        </w:rPr>
+        <w:t xml:space="preserve">Market Analyzer: accesso a una sezione con gli ordini effettuati dai clienti senza i dati personali, potendo visualizzare quindi solo gli occhiali ordinati, e la possibilità di filtrare questi ordini per un periodo di tempo scelto </w:t>
+      </w:r>
+    </w:p>
+    <w:p>
+      <w:pPr>
+        <w:pStyle w:val="Paragrafoelenco"/>
+        <w:numPr>
+          <w:ilvl w:val="0"/>
+          <w:numId w:val="40"/>
+        </w:numPr>
+        <w:spacing w:after="100"/>
+        <w:ind w:left="2127"/>
+        <w:jc w:val="both"/>
+        <w:rPr>
+          <w:rFonts w:ascii="Times New Roman" w:hAnsi="Times New Roman" w:cs="Times New Roman"/>
+        </w:rPr>
+      </w:pPr>
+      <w:r>
+        <w:rPr>
+          <w:rFonts w:ascii="Times New Roman" w:hAnsi="Times New Roman" w:cs="Times New Roman"/>
+        </w:rPr>
+        <w:t xml:space="preserve">Order Manager: accesso a un’area dove è possibile visualizzare gli ordini effettuati dai clienti con tutti i dati associati, filtrarli all’occorrenza per una determinata data o cliente </w:t>
+      </w:r>
+      <w:r>
+        <w:rPr>
+          <w:rFonts w:ascii="Times New Roman" w:hAnsi="Times New Roman" w:cs="Times New Roman"/>
+          <w:b/>
+          <w:bCs/>
+          <w:color w:val="EE0000"/>
+        </w:rPr>
+        <w:t>(DICI AGLI ALTRI) (forse metti in problem statement)?</w:t>
+      </w:r>
+      <w:r>
+        <w:rPr>
+          <w:rFonts w:ascii="Times New Roman" w:hAnsi="Times New Roman" w:cs="Times New Roman"/>
+        </w:rPr>
+        <w:t>, e la possibilità di cambiare lo stato dell’ordine da “in lavorazione”, a “spedito”, successivamente “in consegna”, infine “consegnato”</w:t>
+      </w:r>
+    </w:p>
+    <w:p>
+      <w:pPr>
+        <w:spacing w:after="100"/>
+        <w:ind w:left="709"/>
+        <w:jc w:val="both"/>
+      </w:pPr>
+      <w:r>
+        <w:t>Le funzionalità che NON sono incluse nell’ambito del sistema sono:</w:t>
+      </w:r>
+    </w:p>
+    <w:p>
+      <w:pPr>
+        <w:pStyle w:val="Paragrafoelenco"/>
+        <w:numPr>
+          <w:ilvl w:val="0"/>
+          <w:numId w:val="38"/>
+        </w:numPr>
+        <w:spacing w:after="100"/>
+        <w:jc w:val="both"/>
+        <w:rPr>
+          <w:rFonts w:ascii="Times New Roman" w:hAnsi="Times New Roman" w:cs="Times New Roman"/>
+        </w:rPr>
+      </w:pPr>
+      <w:r>
+        <w:rPr>
+          <w:rFonts w:ascii="Times New Roman" w:hAnsi="Times New Roman" w:cs="Times New Roman"/>
+        </w:rPr>
+        <w:t>Gestione automatica degli ordini (lo stato viene aggiornato manualmente dall’Order Manager)</w:t>
+      </w:r>
+    </w:p>
+    <w:p>
+      <w:pPr>
+        <w:pStyle w:val="Paragrafoelenco"/>
+        <w:numPr>
+          <w:ilvl w:val="0"/>
+          <w:numId w:val="38"/>
+        </w:numPr>
+        <w:spacing w:after="100"/>
+        <w:jc w:val="both"/>
+        <w:rPr>
+          <w:rFonts w:ascii="Times New Roman" w:hAnsi="Times New Roman" w:cs="Times New Roman"/>
+        </w:rPr>
+      </w:pPr>
+      <w:r>
+        <w:rPr>
+          <w:rFonts w:ascii="Times New Roman" w:hAnsi="Times New Roman" w:cs="Times New Roman"/>
+        </w:rPr>
+        <w:t>Gestione della paga dei dipendenti (</w:t>
+      </w:r>
+      <w:r>
+        <w:rPr>
+          <w:rFonts w:ascii="Times New Roman" w:hAnsi="Times New Roman" w:cs="Times New Roman"/>
+        </w:rPr>
+        <w:t>è un aspetto che si preferisce tenere lontano dal sito utilizzato anche dai consumer)</w:t>
+      </w:r>
+    </w:p>
+    <w:p>
+      <w:pPr>
+        <w:pStyle w:val="Paragrafoelenco"/>
+        <w:numPr>
+          <w:ilvl w:val="0"/>
+          <w:numId w:val="38"/>
+        </w:numPr>
+        <w:spacing w:after="100"/>
+        <w:jc w:val="both"/>
+        <w:rPr>
+          <w:rFonts w:ascii="Times New Roman" w:hAnsi="Times New Roman" w:cs="Times New Roman"/>
+        </w:rPr>
+      </w:pPr>
+      <w:r>
+        <w:rPr>
+          <w:rFonts w:ascii="Times New Roman" w:hAnsi="Times New Roman" w:cs="Times New Roman"/>
+        </w:rPr>
+        <w:t>Applicazione mobile (sarà possibile l’accesso solo attraverso il sito ufficiale del negozio)</w:t>
+      </w:r>
+    </w:p>
+    <w:p>
+      <w:pPr>
+        <w:spacing w:after="100"/>
+      </w:pPr>
     </w:p>
     <w:p>
       <w:pPr>
@@ -3710,36 +4662,72 @@
         </w:rPr>
         <w:t xml:space="preserve"> </w:t>
       </w:r>
-      <w:bookmarkStart w:id="4" w:name="_Toc243336391"/>
+      <w:bookmarkStart w:id="4" w:name="_Toc243380169"/>
       <w:r>
         <w:rPr>
           <w:lang w:val="en-US"/>
         </w:rPr>
-        <w:t xml:space="preserve">Objectives and success criteria </w:t>
-      </w:r>
-      <w:proofErr w:type="gramStart"/>
-      <w:r>
-        <w:rPr>
-          <w:lang w:val="en-US"/>
-        </w:rPr>
-        <w:t>of</w:t>
-      </w:r>
-      <w:proofErr w:type="gramEnd"/>
-      <w:r>
-        <w:rPr>
-          <w:lang w:val="en-US"/>
-        </w:rPr>
-        <w:t xml:space="preserve"> the project</w:t>
+        <w:t>Objectives and success criteria of the project</w:t>
       </w:r>
       <w:bookmarkEnd w:id="4"/>
     </w:p>
     <w:p>
       <w:pPr>
+        <w:pStyle w:val="Paragrafoelenco"/>
+        <w:numPr>
+          <w:ilvl w:val="0"/>
+          <w:numId w:val="41"/>
+        </w:numPr>
         <w:spacing w:after="100"/>
-        <w:ind w:left="709"/>
-      </w:pPr>
-      <w:r>
-        <w:t>a</w:t>
+        <w:rPr>
+          <w:rFonts w:ascii="Times New Roman" w:hAnsi="Times New Roman" w:cs="Times New Roman"/>
+        </w:rPr>
+      </w:pPr>
+      <w:r>
+        <w:rPr>
+          <w:rFonts w:ascii="Times New Roman" w:hAnsi="Times New Roman" w:cs="Times New Roman"/>
+        </w:rPr>
+        <w:t>E</w:t>
+      </w:r>
+      <w:r>
+        <w:rPr>
+          <w:rFonts w:ascii="Times New Roman" w:hAnsi="Times New Roman" w:cs="Times New Roman"/>
+        </w:rPr>
+        <w:t xml:space="preserve">spansione territoriale dell’area di influenza del negozio: rendere il catalogo disponibile anche per persone che sono impossibilitate a recarsi al negozio fisico, </w:t>
+      </w:r>
+      <w:r>
+        <w:rPr>
+          <w:rFonts w:ascii="Times New Roman" w:hAnsi="Times New Roman" w:cs="Times New Roman"/>
+        </w:rPr>
+        <w:lastRenderedPageBreak/>
+        <w:t>permettendo a futuri clienti da acquistare da negozi locali basati in Italia anche se lontano dalla loro zona</w:t>
+      </w:r>
+    </w:p>
+    <w:p>
+      <w:pPr>
+        <w:pStyle w:val="Paragrafoelenco"/>
+        <w:numPr>
+          <w:ilvl w:val="0"/>
+          <w:numId w:val="41"/>
+        </w:numPr>
+        <w:spacing w:after="100"/>
+      </w:pPr>
+      <w:r>
+        <w:rPr>
+          <w:b/>
+          <w:bCs/>
+          <w:color w:val="EE0000"/>
+        </w:rPr>
+        <w:t>DAI UN NOME</w:t>
+      </w:r>
+      <w:r>
+        <w:rPr>
+          <w:color w:val="EE0000"/>
+        </w:rPr>
+        <w:t xml:space="preserve"> </w:t>
+      </w:r>
+      <w:r>
+        <w:t>dato che il sito è per un negozio italiano il cliente non ha nessun problema per quanto riguarda tasse di dogana o spese di spedizione alte a causa di spedizioni provenienti da un altro paese</w:t>
       </w:r>
     </w:p>
     <w:p>
@@ -3750,40 +4738,29 @@
           <w:numId w:val="6"/>
         </w:numPr>
       </w:pPr>
-      <w:r>
-        <w:t xml:space="preserve"> </w:t>
-      </w:r>
-      <w:bookmarkStart w:id="5" w:name="_Toc243336392"/>
-      <w:proofErr w:type="spellStart"/>
-      <w:r>
-        <w:t>Definitions</w:t>
-      </w:r>
-      <w:proofErr w:type="spellEnd"/>
-      <w:r>
-        <w:t xml:space="preserve">, </w:t>
-      </w:r>
-      <w:proofErr w:type="spellStart"/>
-      <w:r>
-        <w:t>acronyms</w:t>
-      </w:r>
-      <w:proofErr w:type="spellEnd"/>
-      <w:r>
-        <w:t xml:space="preserve">, and </w:t>
-      </w:r>
-      <w:proofErr w:type="spellStart"/>
-      <w:r>
-        <w:t>abbreviations</w:t>
+      <w:bookmarkStart w:id="5" w:name="_Toc243380170"/>
+      <w:r>
+        <w:t>Definitions, acronyms, and abbreviations</w:t>
       </w:r>
       <w:bookmarkEnd w:id="5"/>
-      <w:proofErr w:type="spellEnd"/>
     </w:p>
     <w:p>
       <w:pPr>
         <w:spacing w:after="100"/>
         <w:ind w:left="709"/>
-      </w:pPr>
-      <w:r>
-        <w:t>a</w:t>
+        <w:rPr>
+          <w:b/>
+          <w:bCs/>
+          <w:color w:val="EE0000"/>
+        </w:rPr>
+      </w:pPr>
+      <w:r>
+        <w:rPr>
+          <w:b/>
+          <w:bCs/>
+          <w:color w:val="EE0000"/>
+        </w:rPr>
+        <w:t>DA FARE</w:t>
       </w:r>
     </w:p>
     <w:p>
@@ -3797,21 +4774,29 @@
       <w:r>
         <w:t xml:space="preserve"> </w:t>
       </w:r>
-      <w:bookmarkStart w:id="6" w:name="_Toc243336393"/>
-      <w:proofErr w:type="spellStart"/>
+      <w:bookmarkStart w:id="6" w:name="_Toc243380171"/>
       <w:r>
         <w:t>References</w:t>
       </w:r>
       <w:bookmarkEnd w:id="6"/>
-      <w:proofErr w:type="spellEnd"/>
     </w:p>
     <w:p>
       <w:pPr>
         <w:spacing w:after="100"/>
         <w:ind w:left="709"/>
-      </w:pPr>
-      <w:r>
-        <w:t>a</w:t>
+        <w:rPr>
+          <w:b/>
+          <w:bCs/>
+          <w:color w:val="EE0000"/>
+        </w:rPr>
+      </w:pPr>
+      <w:r>
+        <w:rPr>
+          <w:b/>
+          <w:bCs/>
+          <w:color w:val="EE0000"/>
+        </w:rPr>
+        <w:t>DA FARE</w:t>
       </w:r>
     </w:p>
     <w:p>
@@ -3825,21 +4810,29 @@
       <w:r>
         <w:t xml:space="preserve"> </w:t>
       </w:r>
-      <w:bookmarkStart w:id="7" w:name="_Toc243336394"/>
-      <w:proofErr w:type="spellStart"/>
+      <w:bookmarkStart w:id="7" w:name="_Toc243380172"/>
       <w:r>
         <w:t>Overview</w:t>
       </w:r>
       <w:bookmarkEnd w:id="7"/>
-      <w:proofErr w:type="spellEnd"/>
     </w:p>
     <w:p>
       <w:pPr>
         <w:spacing w:after="100"/>
         <w:ind w:left="709"/>
-      </w:pPr>
-      <w:r>
-        <w:t>a</w:t>
+        <w:rPr>
+          <w:b/>
+          <w:bCs/>
+          <w:color w:val="EE0000"/>
+        </w:rPr>
+      </w:pPr>
+      <w:r>
+        <w:rPr>
+          <w:b/>
+          <w:bCs/>
+          <w:color w:val="EE0000"/>
+        </w:rPr>
+        <w:t>DA FARE</w:t>
       </w:r>
     </w:p>
     <w:p>
@@ -3852,8 +4845,29 @@
         <w:ind w:left="426" w:hanging="426"/>
         <w:jc w:val="left"/>
       </w:pPr>
+      <w:bookmarkStart w:id="8" w:name="_Toc243380173"/>
       <w:r>
         <w:t>CURRENT SYSTEM</w:t>
+      </w:r>
+      <w:bookmarkEnd w:id="8"/>
+    </w:p>
+    <w:p>
+      <w:pPr>
+        <w:pStyle w:val="NormaleWeb"/>
+        <w:ind w:left="426"/>
+        <w:jc w:val="both"/>
+      </w:pPr>
+      <w:r>
+        <w:t>A</w:t>
+      </w:r>
+      <w:r>
+        <w:t>ttualmente i clienti possono solo visitare il negozio fisicamente e acquistare i prodotti da l</w:t>
+      </w:r>
+      <w:r>
+        <w:t xml:space="preserve">ì: </w:t>
+      </w:r>
+      <w:r>
+        <w:t>non c’è alcun modo per vedere il catalogo con i relativi prezzi online e il negozio non offre spedizioni a casa neanche di prodotti acquistati dal negozio.</w:t>
       </w:r>
     </w:p>
     <w:p>
@@ -3861,9 +4875,16 @@
         <w:pStyle w:val="NormaleWeb"/>
         <w:spacing w:after="0" w:afterAutospacing="0"/>
         <w:ind w:left="426"/>
-      </w:pPr>
-      <w:r>
-        <w:t>d</w:t>
+        <w:jc w:val="both"/>
+      </w:pPr>
+      <w:r>
+        <w:t xml:space="preserve">I ruoli del PM e MA esistono e hanno le stesse funzioni, ma applicate a uno scenario </w:t>
+      </w:r>
+      <w:r>
+        <w:t>fisico</w:t>
+      </w:r>
+      <w:r>
+        <w:t>. Quindi il PM ha il ruolo di incontrare i rappresentanti di Brand che il negozio è interessato a vendere, stipulare accordi, mettersi d’accordo sui prezzi e gestire l’arrivo della nuova linea al negozio. Il MA ha il ruolo di analizzare i prodotti acquistati, avendo accesso anche all’inventario e a scontrini passati, all’occorrenza può fare grafici e statistiche per aiutarsi; in seguito si relazione con il PM per riferirgli quale prodotti hanno avuto più successo rispetto ad altri, cosi che esso possa decidere se ne vale la pena riordinare determinati paia di occhiali oppure no. L’OM invece nel negozio attuale non esiste dato che è una figura prettamente necessaria al trattamento di spedizioni</w:t>
       </w:r>
     </w:p>
     <w:p>
@@ -3876,11 +4897,11 @@
         <w:ind w:left="426" w:hanging="426"/>
         <w:jc w:val="left"/>
       </w:pPr>
-      <w:bookmarkStart w:id="8" w:name="_Toc243336396"/>
+      <w:bookmarkStart w:id="9" w:name="_Toc243380174"/>
       <w:r>
         <w:t>PROPOSED SYSTEM</w:t>
       </w:r>
-      <w:bookmarkEnd w:id="8"/>
+      <w:bookmarkEnd w:id="9"/>
     </w:p>
     <w:p>
       <w:pPr>
@@ -3890,16 +4911,14 @@
           <w:numId w:val="6"/>
         </w:numPr>
       </w:pPr>
-      <w:bookmarkStart w:id="9" w:name="_Toc243336397"/>
       <w:r>
         <w:t xml:space="preserve"> </w:t>
       </w:r>
-      <w:proofErr w:type="spellStart"/>
+      <w:bookmarkStart w:id="10" w:name="_Toc243380175"/>
       <w:r>
         <w:t>Overview</w:t>
       </w:r>
-      <w:bookmarkEnd w:id="9"/>
-      <w:proofErr w:type="spellEnd"/>
+      <w:bookmarkEnd w:id="10"/>
     </w:p>
     <w:p>
       <w:pPr>
@@ -3908,9 +4927,19 @@
         </w:tabs>
         <w:spacing w:after="100"/>
         <w:ind w:left="709"/>
-      </w:pPr>
-      <w:r>
-        <w:t>F</w:t>
+        <w:rPr>
+          <w:b/>
+          <w:bCs/>
+          <w:color w:val="EE0000"/>
+        </w:rPr>
+      </w:pPr>
+      <w:r>
+        <w:rPr>
+          <w:b/>
+          <w:bCs/>
+          <w:color w:val="EE0000"/>
+        </w:rPr>
+        <w:t>DA FARE</w:t>
       </w:r>
     </w:p>
     <w:p>
@@ -3921,27 +4950,17 @@
           <w:numId w:val="6"/>
         </w:numPr>
       </w:pPr>
-      <w:bookmarkStart w:id="10" w:name="_Toc243336398"/>
       <w:r>
         <w:t xml:space="preserve"> </w:t>
       </w:r>
-      <w:proofErr w:type="spellStart"/>
+      <w:bookmarkStart w:id="11" w:name="_Toc243380176"/>
       <w:r>
         <w:t>F</w:t>
       </w:r>
       <w:r>
-        <w:t>unctional</w:t>
-      </w:r>
-      <w:proofErr w:type="spellEnd"/>
-      <w:r>
-        <w:t xml:space="preserve"> </w:t>
-      </w:r>
-      <w:proofErr w:type="spellStart"/>
-      <w:r>
-        <w:t>requirements</w:t>
-      </w:r>
-      <w:bookmarkEnd w:id="10"/>
-      <w:proofErr w:type="spellEnd"/>
+        <w:t>unctional requirements</w:t>
+      </w:r>
+      <w:bookmarkEnd w:id="11"/>
     </w:p>
     <w:p>
       <w:pPr>
@@ -3952,7 +4971,211 @@
         <w:ind w:left="709"/>
       </w:pPr>
       <w:r>
-        <w:t>a</w:t>
+        <w:t>RF1.1: il sistema deve consentire ai nuovi clienti di creare un account personale compilando un form di registrazione che richiede obbligatoriamente nome, cognome, indirizzo email, password</w:t>
+      </w:r>
+    </w:p>
+    <w:p>
+      <w:pPr>
+        <w:tabs>
+          <w:tab w:val="left" w:pos="8580"/>
+        </w:tabs>
+        <w:spacing w:after="100"/>
+        <w:ind w:left="709"/>
+      </w:pPr>
+      <w:r>
+        <w:t>RF1.2: il sistema deve verificare che l’email inserita sia univoca (non gi</w:t>
+      </w:r>
+      <w:r>
+        <w:t>à</w:t>
+      </w:r>
+      <w:r>
+        <w:t xml:space="preserve"> presente nel </w:t>
+      </w:r>
+      <w:r>
+        <w:t>database</w:t>
+      </w:r>
+      <w:r>
+        <w:t>) e sintatticamente valida, e che la password rispetti i vincoli di sicurezza definiti</w:t>
+      </w:r>
+    </w:p>
+    <w:p>
+      <w:pPr>
+        <w:tabs>
+          <w:tab w:val="left" w:pos="8580"/>
+        </w:tabs>
+        <w:spacing w:after="100"/>
+        <w:ind w:left="709"/>
+      </w:pPr>
+      <w:r>
+        <w:t>RF1.3: il sistema deve consentire agli utenti registrati di accedere al proprio account fornendo le credenziali email e password scelte in fase di registrazione</w:t>
+      </w:r>
+    </w:p>
+    <w:p>
+      <w:pPr>
+        <w:tabs>
+          <w:tab w:val="left" w:pos="8580"/>
+        </w:tabs>
+        <w:spacing w:after="100"/>
+        <w:ind w:left="709"/>
+      </w:pPr>
+      <w:r>
+        <w:t xml:space="preserve">RF 2.1: il sistema deve consentire all’utente autenticato di </w:t>
+      </w:r>
+      <w:r>
+        <w:t>visualizzare</w:t>
+      </w:r>
+      <w:r>
+        <w:t xml:space="preserve"> un’area personale contenente i propri dati</w:t>
+      </w:r>
+    </w:p>
+    <w:p>
+      <w:pPr>
+        <w:tabs>
+          <w:tab w:val="left" w:pos="8580"/>
+        </w:tabs>
+        <w:spacing w:after="100"/>
+        <w:ind w:left="709"/>
+      </w:pPr>
+      <w:r>
+        <w:t>RF2.2: il sistema deve consentire all’utente di apportare modifiche ai suoi dati personali dall’area</w:t>
+      </w:r>
+    </w:p>
+    <w:p>
+      <w:pPr>
+        <w:tabs>
+          <w:tab w:val="left" w:pos="8580"/>
+        </w:tabs>
+        <w:spacing w:after="100"/>
+        <w:ind w:left="709"/>
+      </w:pPr>
+      <w:r>
+        <w:t xml:space="preserve">RF3.1: il sistema deve consentire all’utente la visualizzazione di un’area dedicata agli ordini </w:t>
+      </w:r>
+      <w:r>
+        <w:lastRenderedPageBreak/>
+        <w:t>effettuati, dove per ogni ordine sono presenti gli occhiali ordinati, l’indirizzo di spedizione al quale va recapitato il pacco, l’intestatario, e lo stato dell’ordine</w:t>
+      </w:r>
+    </w:p>
+    <w:p>
+      <w:pPr>
+        <w:tabs>
+          <w:tab w:val="left" w:pos="8580"/>
+        </w:tabs>
+        <w:spacing w:after="100"/>
+        <w:ind w:left="709"/>
+      </w:pPr>
+      <w:r>
+        <w:t>RF3.2: il sistema deve consentire l’aggiornamento dello stato dell’ordine nell’area personale dell’utente basandosi sullo stato che viene inserito dall’OM</w:t>
+      </w:r>
+    </w:p>
+    <w:p>
+      <w:pPr>
+        <w:tabs>
+          <w:tab w:val="left" w:pos="8580"/>
+        </w:tabs>
+        <w:spacing w:after="100"/>
+        <w:ind w:left="709"/>
+      </w:pPr>
+      <w:r>
+        <w:t>RF3.3: il sistema deve assicurarsi che la visualizzazione dello stato dell’ordine del cliente deve avvenire in modalità di sola lettura, quindi quest’ultimo non può autonomamente modificare lo stato del proprio ordine</w:t>
+      </w:r>
+    </w:p>
+    <w:p>
+      <w:pPr>
+        <w:tabs>
+          <w:tab w:val="left" w:pos="8580"/>
+        </w:tabs>
+        <w:spacing w:after="100"/>
+        <w:ind w:left="709"/>
+        <w:rPr>
+          <w:b/>
+          <w:bCs/>
+          <w:color w:val="EE0000"/>
+        </w:rPr>
+      </w:pPr>
+      <w:r>
+        <w:rPr>
+          <w:b/>
+          <w:bCs/>
+          <w:color w:val="EE0000"/>
+        </w:rPr>
+        <w:t>SALTATO RF4 DEL PROBLEM STATEMENT</w:t>
+      </w:r>
+      <w:r>
+        <w:rPr>
+          <w:b/>
+          <w:bCs/>
+          <w:color w:val="EE0000"/>
+        </w:rPr>
+        <w:t>, FARE</w:t>
+      </w:r>
+    </w:p>
+    <w:p>
+      <w:pPr>
+        <w:tabs>
+          <w:tab w:val="left" w:pos="8580"/>
+        </w:tabs>
+        <w:spacing w:after="100"/>
+        <w:ind w:left="709"/>
+        <w:rPr>
+          <w:color w:val="000000" w:themeColor="text1"/>
+        </w:rPr>
+      </w:pPr>
+      <w:r>
+        <w:rPr>
+          <w:color w:val="000000" w:themeColor="text1"/>
+        </w:rPr>
+        <w:t>RF5.1 il sistema deve consentire la possibilità di cliccare su un prodotto provenendo dal catalogo, e all’atto di questo evento vengano mostrate le due foto del prodotto selezionato, il nome, il prezzo, e gli altri colori disponibili (se presenti)</w:t>
+      </w:r>
+    </w:p>
+    <w:p>
+      <w:pPr>
+        <w:tabs>
+          <w:tab w:val="left" w:pos="8580"/>
+        </w:tabs>
+        <w:spacing w:after="100"/>
+        <w:ind w:left="709"/>
+        <w:rPr>
+          <w:color w:val="000000" w:themeColor="text1"/>
+        </w:rPr>
+      </w:pPr>
+      <w:r>
+        <w:rPr>
+          <w:b/>
+          <w:bCs/>
+          <w:color w:val="EE0000"/>
+        </w:rPr>
+        <w:t>POSSIBILE</w:t>
+      </w:r>
+      <w:r>
+        <w:rPr>
+          <w:color w:val="EE0000"/>
+        </w:rPr>
+        <w:t xml:space="preserve"> </w:t>
+      </w:r>
+      <w:r>
+        <w:rPr>
+          <w:color w:val="000000" w:themeColor="text1"/>
+        </w:rPr>
+        <w:t xml:space="preserve">RF5.2: </w:t>
+      </w:r>
+      <w:r>
+        <w:rPr>
+          <w:color w:val="EE0000"/>
+        </w:rPr>
+        <w:t>da chiarire con gli altri</w:t>
+      </w:r>
+      <w:r>
+        <w:rPr>
+          <w:color w:val="EE0000"/>
+        </w:rPr>
+        <w:t xml:space="preserve">. </w:t>
+      </w:r>
+      <w:r>
+        <w:rPr>
+          <w:color w:val="000000" w:themeColor="text1"/>
+        </w:rPr>
+        <w:t>Il sistema deve aggiornare la pagina del dettaglio del prodotto con il colore selezionato, indicando chiaramente quale esso sia con un messaggio visibile a schermo</w:t>
       </w:r>
     </w:p>
     <w:p>
@@ -3963,30 +5186,17 @@
           <w:numId w:val="6"/>
         </w:numPr>
       </w:pPr>
-      <w:bookmarkStart w:id="11" w:name="_Toc243336399"/>
       <w:r>
         <w:t xml:space="preserve"> </w:t>
       </w:r>
-      <w:proofErr w:type="spellStart"/>
-      <w:r>
-        <w:t>Non</w:t>
-      </w:r>
-      <w:bookmarkEnd w:id="11"/>
-      <w:r>
-        <w:t>f</w:t>
-      </w:r>
-      <w:r>
-        <w:t>unctional</w:t>
-      </w:r>
-      <w:proofErr w:type="spellEnd"/>
-      <w:r>
-        <w:t xml:space="preserve"> </w:t>
-      </w:r>
-      <w:proofErr w:type="spellStart"/>
-      <w:r>
-        <w:t>requirements</w:t>
-      </w:r>
-      <w:proofErr w:type="spellEnd"/>
+      <w:bookmarkStart w:id="12" w:name="_Toc243380177"/>
+      <w:r>
+        <w:t>Nonf</w:t>
+      </w:r>
+      <w:r>
+        <w:t>unctional requirements</w:t>
+      </w:r>
+      <w:bookmarkEnd w:id="12"/>
     </w:p>
     <w:p>
       <w:pPr>
@@ -4001,6 +5211,7 @@
           <w:bCs w:val="0"/>
         </w:rPr>
       </w:pPr>
+      <w:bookmarkStart w:id="13" w:name="_Toc243380178"/>
       <w:r>
         <w:rPr>
           <w:b w:val="0"/>
@@ -4010,6 +5221,7 @@
         </w:rPr>
         <w:t>Usability</w:t>
       </w:r>
+      <w:bookmarkEnd w:id="13"/>
     </w:p>
     <w:p>
       <w:pPr>
@@ -4037,6 +5249,7 @@
           <w:bCs w:val="0"/>
         </w:rPr>
       </w:pPr>
+      <w:bookmarkStart w:id="14" w:name="_Toc243380179"/>
       <w:r>
         <w:rPr>
           <w:b w:val="0"/>
@@ -4046,6 +5259,7 @@
         </w:rPr>
         <w:t>Reliability</w:t>
       </w:r>
+      <w:bookmarkEnd w:id="14"/>
     </w:p>
     <w:p>
       <w:pPr>
@@ -4073,6 +5287,7 @@
           <w:bCs w:val="0"/>
         </w:rPr>
       </w:pPr>
+      <w:bookmarkStart w:id="15" w:name="_Toc243380180"/>
       <w:r>
         <w:rPr>
           <w:b w:val="0"/>
@@ -4082,6 +5297,7 @@
         </w:rPr>
         <w:t>Performance</w:t>
       </w:r>
+      <w:bookmarkEnd w:id="15"/>
     </w:p>
     <w:p>
       <w:pPr>
@@ -4109,6 +5325,7 @@
           <w:bCs w:val="0"/>
         </w:rPr>
       </w:pPr>
+      <w:bookmarkStart w:id="16" w:name="_Toc243380181"/>
       <w:r>
         <w:rPr>
           <w:b w:val="0"/>
@@ -4118,6 +5335,7 @@
         </w:rPr>
         <w:t>Supportability</w:t>
       </w:r>
+      <w:bookmarkEnd w:id="16"/>
     </w:p>
     <w:p>
       <w:pPr>
@@ -4145,7 +5363,7 @@
           <w:bCs w:val="0"/>
         </w:rPr>
       </w:pPr>
-      <w:proofErr w:type="spellStart"/>
+      <w:bookmarkStart w:id="17" w:name="_Toc243380182"/>
       <w:r>
         <w:rPr>
           <w:b w:val="0"/>
@@ -4155,7 +5373,7 @@
         </w:rPr>
         <w:t>Implementation</w:t>
       </w:r>
-      <w:proofErr w:type="spellEnd"/>
+      <w:bookmarkEnd w:id="17"/>
     </w:p>
     <w:p>
       <w:pPr>
@@ -4183,6 +5401,7 @@
           <w:bCs w:val="0"/>
         </w:rPr>
       </w:pPr>
+      <w:bookmarkStart w:id="18" w:name="_Toc243380183"/>
       <w:r>
         <w:rPr>
           <w:b w:val="0"/>
@@ -4192,6 +5411,7 @@
         </w:rPr>
         <w:t>Interface</w:t>
       </w:r>
+      <w:bookmarkEnd w:id="18"/>
     </w:p>
     <w:p>
       <w:pPr>
@@ -4219,6 +5439,7 @@
           <w:bCs w:val="0"/>
         </w:rPr>
       </w:pPr>
+      <w:bookmarkStart w:id="19" w:name="_Toc243380184"/>
       <w:r>
         <w:rPr>
           <w:b w:val="0"/>
@@ -4226,9 +5447,9 @@
           <w:sz w:val="26"/>
           <w:szCs w:val="26"/>
         </w:rPr>
-        <w:lastRenderedPageBreak/>
         <w:t>Packaging</w:t>
       </w:r>
+      <w:bookmarkEnd w:id="19"/>
     </w:p>
     <w:p>
       <w:pPr>
@@ -4256,6 +5477,7 @@
           <w:bCs w:val="0"/>
         </w:rPr>
       </w:pPr>
+      <w:bookmarkStart w:id="20" w:name="_Toc243380185"/>
       <w:r>
         <w:rPr>
           <w:b w:val="0"/>
@@ -4265,6 +5487,7 @@
         </w:rPr>
         <w:t>Legal</w:t>
       </w:r>
+      <w:bookmarkEnd w:id="20"/>
     </w:p>
     <w:p>
       <w:pPr>
@@ -4287,11 +5510,14 @@
           <w:numId w:val="6"/>
         </w:numPr>
       </w:pPr>
-      <w:bookmarkStart w:id="12" w:name="_Toc243336400"/>
-      <w:r>
-        <w:t xml:space="preserve"> System models</w:t>
-      </w:r>
-      <w:bookmarkEnd w:id="12"/>
+      <w:r>
+        <w:t xml:space="preserve"> </w:t>
+      </w:r>
+      <w:bookmarkStart w:id="21" w:name="_Toc243380186"/>
+      <w:r>
+        <w:t>System models</w:t>
+      </w:r>
+      <w:bookmarkEnd w:id="21"/>
     </w:p>
     <w:p>
       <w:pPr>
@@ -4306,7 +5532,7 @@
           <w:bCs w:val="0"/>
         </w:rPr>
       </w:pPr>
-      <w:proofErr w:type="spellStart"/>
+      <w:bookmarkStart w:id="22" w:name="_Toc243380187"/>
       <w:r>
         <w:rPr>
           <w:b w:val="0"/>
@@ -4314,7 +5540,7 @@
         </w:rPr>
         <w:t>Scenarios</w:t>
       </w:r>
-      <w:proofErr w:type="spellEnd"/>
+      <w:bookmarkEnd w:id="22"/>
     </w:p>
     <w:p>
       <w:pPr>
@@ -4341,6 +5567,7 @@
           <w:bCs w:val="0"/>
         </w:rPr>
       </w:pPr>
+      <w:bookmarkStart w:id="23" w:name="_Toc243380188"/>
       <w:r>
         <w:rPr>
           <w:b w:val="0"/>
@@ -4348,6 +5575,7 @@
         </w:rPr>
         <w:t>Use case model</w:t>
       </w:r>
+      <w:bookmarkEnd w:id="23"/>
     </w:p>
     <w:p>
       <w:pPr>
@@ -4374,6 +5602,7 @@
           <w:bCs w:val="0"/>
         </w:rPr>
       </w:pPr>
+      <w:bookmarkStart w:id="24" w:name="_Toc243380189"/>
       <w:r>
         <w:rPr>
           <w:b w:val="0"/>
@@ -4381,6 +5610,7 @@
         </w:rPr>
         <w:t>Object model</w:t>
       </w:r>
+      <w:bookmarkEnd w:id="24"/>
     </w:p>
     <w:p>
       <w:pPr>
@@ -4407,6 +5637,7 @@
           <w:bCs w:val="0"/>
         </w:rPr>
       </w:pPr>
+      <w:bookmarkStart w:id="25" w:name="_Toc243380190"/>
       <w:r>
         <w:rPr>
           <w:b w:val="0"/>
@@ -4414,6 +5645,7 @@
         </w:rPr>
         <w:t>Dynamic model</w:t>
       </w:r>
+      <w:bookmarkEnd w:id="25"/>
     </w:p>
     <w:p>
       <w:pPr>
@@ -4441,14 +5673,17 @@
           <w:lang w:val="en-US"/>
         </w:rPr>
       </w:pPr>
+      <w:bookmarkStart w:id="26" w:name="_Toc243380191"/>
       <w:r>
         <w:rPr>
           <w:b w:val="0"/>
           <w:bCs w:val="0"/>
           <w:lang w:val="en-US"/>
         </w:rPr>
+        <w:lastRenderedPageBreak/>
         <w:t>User interface—navigational paths and screen mock-ups</w:t>
       </w:r>
+      <w:bookmarkEnd w:id="26"/>
     </w:p>
     <w:p>
       <w:pPr>
@@ -4472,9 +5707,11 @@
         <w:ind w:left="426" w:hanging="426"/>
         <w:jc w:val="left"/>
       </w:pPr>
+      <w:bookmarkStart w:id="27" w:name="_Toc243380192"/>
       <w:r>
         <w:t>GLOSSARY</w:t>
       </w:r>
+      <w:bookmarkEnd w:id="27"/>
     </w:p>
     <w:p>
       <w:r>
@@ -4986,7 +6223,7 @@
         <v:path o:extrusionok="f" gradientshapeok="t" o:connecttype="rect"/>
         <o:lock v:ext="edit" aspectratio="t"/>
       </v:shapetype>
-      <v:shape id="_x0000_i1025" type="#_x0000_t75" style="width:320.65pt;height:249.5pt" o:bullet="t" filled="t">
+      <v:shape id="_x0000_i1132" type="#_x0000_t75" style="width:320.4pt;height:249.6pt" o:bullet="t" filled="t">
         <v:fill color2="black"/>
         <v:imagedata r:id="rId1" o:title=""/>
       </v:shape>
@@ -5602,6 +6839,119 @@
     </w:lvl>
   </w:abstractNum>
   <w:abstractNum w:abstractNumId="9" w15:restartNumberingAfterBreak="0">
+    <w:nsid w:val="17874D3B"/>
+    <w:multiLevelType w:val="hybridMultilevel"/>
+    <w:tmpl w:val="2F040706"/>
+    <w:lvl w:ilvl="0" w:tplc="04100003">
+      <w:start w:val="1"/>
+      <w:numFmt w:val="bullet"/>
+      <w:lvlText w:val="o"/>
+      <w:lvlJc w:val="left"/>
+      <w:pPr>
+        <w:ind w:left="1789" w:hanging="360"/>
+      </w:pPr>
+      <w:rPr>
+        <w:rFonts w:ascii="Courier New" w:hAnsi="Courier New" w:cs="Courier New" w:hint="default"/>
+      </w:rPr>
+    </w:lvl>
+    <w:lvl w:ilvl="1" w:tplc="04100003" w:tentative="1">
+      <w:start w:val="1"/>
+      <w:numFmt w:val="bullet"/>
+      <w:lvlText w:val="o"/>
+      <w:lvlJc w:val="left"/>
+      <w:pPr>
+        <w:ind w:left="2509" w:hanging="360"/>
+      </w:pPr>
+      <w:rPr>
+        <w:rFonts w:ascii="Courier New" w:hAnsi="Courier New" w:cs="Courier New" w:hint="default"/>
+      </w:rPr>
+    </w:lvl>
+    <w:lvl w:ilvl="2" w:tplc="04100005" w:tentative="1">
+      <w:start w:val="1"/>
+      <w:numFmt w:val="bullet"/>
+      <w:lvlText w:val=""/>
+      <w:lvlJc w:val="left"/>
+      <w:pPr>
+        <w:ind w:left="3229" w:hanging="360"/>
+      </w:pPr>
+      <w:rPr>
+        <w:rFonts w:ascii="Wingdings" w:hAnsi="Wingdings" w:hint="default"/>
+      </w:rPr>
+    </w:lvl>
+    <w:lvl w:ilvl="3" w:tplc="04100001" w:tentative="1">
+      <w:start w:val="1"/>
+      <w:numFmt w:val="bullet"/>
+      <w:lvlText w:val=""/>
+      <w:lvlJc w:val="left"/>
+      <w:pPr>
+        <w:ind w:left="3949" w:hanging="360"/>
+      </w:pPr>
+      <w:rPr>
+        <w:rFonts w:ascii="Symbol" w:hAnsi="Symbol" w:hint="default"/>
+      </w:rPr>
+    </w:lvl>
+    <w:lvl w:ilvl="4" w:tplc="04100003" w:tentative="1">
+      <w:start w:val="1"/>
+      <w:numFmt w:val="bullet"/>
+      <w:lvlText w:val="o"/>
+      <w:lvlJc w:val="left"/>
+      <w:pPr>
+        <w:ind w:left="4669" w:hanging="360"/>
+      </w:pPr>
+      <w:rPr>
+        <w:rFonts w:ascii="Courier New" w:hAnsi="Courier New" w:cs="Courier New" w:hint="default"/>
+      </w:rPr>
+    </w:lvl>
+    <w:lvl w:ilvl="5" w:tplc="04100005" w:tentative="1">
+      <w:start w:val="1"/>
+      <w:numFmt w:val="bullet"/>
+      <w:lvlText w:val=""/>
+      <w:lvlJc w:val="left"/>
+      <w:pPr>
+        <w:ind w:left="5389" w:hanging="360"/>
+      </w:pPr>
+      <w:rPr>
+        <w:rFonts w:ascii="Wingdings" w:hAnsi="Wingdings" w:hint="default"/>
+      </w:rPr>
+    </w:lvl>
+    <w:lvl w:ilvl="6" w:tplc="04100001" w:tentative="1">
+      <w:start w:val="1"/>
+      <w:numFmt w:val="bullet"/>
+      <w:lvlText w:val=""/>
+      <w:lvlJc w:val="left"/>
+      <w:pPr>
+        <w:ind w:left="6109" w:hanging="360"/>
+      </w:pPr>
+      <w:rPr>
+        <w:rFonts w:ascii="Symbol" w:hAnsi="Symbol" w:hint="default"/>
+      </w:rPr>
+    </w:lvl>
+    <w:lvl w:ilvl="7" w:tplc="04100003" w:tentative="1">
+      <w:start w:val="1"/>
+      <w:numFmt w:val="bullet"/>
+      <w:lvlText w:val="o"/>
+      <w:lvlJc w:val="left"/>
+      <w:pPr>
+        <w:ind w:left="6829" w:hanging="360"/>
+      </w:pPr>
+      <w:rPr>
+        <w:rFonts w:ascii="Courier New" w:hAnsi="Courier New" w:cs="Courier New" w:hint="default"/>
+      </w:rPr>
+    </w:lvl>
+    <w:lvl w:ilvl="8" w:tplc="04100005" w:tentative="1">
+      <w:start w:val="1"/>
+      <w:numFmt w:val="bullet"/>
+      <w:lvlText w:val=""/>
+      <w:lvlJc w:val="left"/>
+      <w:pPr>
+        <w:ind w:left="7549" w:hanging="360"/>
+      </w:pPr>
+      <w:rPr>
+        <w:rFonts w:ascii="Wingdings" w:hAnsi="Wingdings" w:hint="default"/>
+      </w:rPr>
+    </w:lvl>
+  </w:abstractNum>
+  <w:abstractNum w:abstractNumId="10" w15:restartNumberingAfterBreak="0">
     <w:nsid w:val="1BB53537"/>
     <w:multiLevelType w:val="hybridMultilevel"/>
     <w:tmpl w:val="5596C15C"/>
@@ -5714,7 +7064,7 @@
       </w:rPr>
     </w:lvl>
   </w:abstractNum>
-  <w:abstractNum w:abstractNumId="10" w15:restartNumberingAfterBreak="0">
+  <w:abstractNum w:abstractNumId="11" w15:restartNumberingAfterBreak="0">
     <w:nsid w:val="1F8433D7"/>
     <w:multiLevelType w:val="multilevel"/>
     <w:tmpl w:val="FB6871AA"/>
@@ -5804,7 +7154,7 @@
       </w:pPr>
     </w:lvl>
   </w:abstractNum>
-  <w:abstractNum w:abstractNumId="11" w15:restartNumberingAfterBreak="0">
+  <w:abstractNum w:abstractNumId="12" w15:restartNumberingAfterBreak="0">
     <w:nsid w:val="228F79FB"/>
     <w:multiLevelType w:val="hybridMultilevel"/>
     <w:tmpl w:val="CE6CA2D0"/>
@@ -5893,7 +7243,7 @@
       </w:pPr>
     </w:lvl>
   </w:abstractNum>
-  <w:abstractNum w:abstractNumId="12" w15:restartNumberingAfterBreak="0">
+  <w:abstractNum w:abstractNumId="13" w15:restartNumberingAfterBreak="0">
     <w:nsid w:val="237F6CD5"/>
     <w:multiLevelType w:val="hybridMultilevel"/>
     <w:tmpl w:val="FBE6734A"/>
@@ -6006,7 +7356,7 @@
       </w:rPr>
     </w:lvl>
   </w:abstractNum>
-  <w:abstractNum w:abstractNumId="13" w15:restartNumberingAfterBreak="0">
+  <w:abstractNum w:abstractNumId="14" w15:restartNumberingAfterBreak="0">
     <w:nsid w:val="25D50884"/>
     <w:multiLevelType w:val="hybridMultilevel"/>
     <w:tmpl w:val="B022966A"/>
@@ -6119,7 +7469,7 @@
       </w:rPr>
     </w:lvl>
   </w:abstractNum>
-  <w:abstractNum w:abstractNumId="14" w15:restartNumberingAfterBreak="0">
+  <w:abstractNum w:abstractNumId="15" w15:restartNumberingAfterBreak="0">
     <w:nsid w:val="282C65A4"/>
     <w:multiLevelType w:val="hybridMultilevel"/>
     <w:tmpl w:val="9D3ECF24"/>
@@ -6232,7 +7582,120 @@
       </w:rPr>
     </w:lvl>
   </w:abstractNum>
-  <w:abstractNum w:abstractNumId="15" w15:restartNumberingAfterBreak="0">
+  <w:abstractNum w:abstractNumId="16" w15:restartNumberingAfterBreak="0">
+    <w:nsid w:val="287C4892"/>
+    <w:multiLevelType w:val="hybridMultilevel"/>
+    <w:tmpl w:val="58DE98D4"/>
+    <w:lvl w:ilvl="0" w:tplc="04100003">
+      <w:start w:val="1"/>
+      <w:numFmt w:val="bullet"/>
+      <w:lvlText w:val="o"/>
+      <w:lvlJc w:val="left"/>
+      <w:pPr>
+        <w:ind w:left="2847" w:hanging="360"/>
+      </w:pPr>
+      <w:rPr>
+        <w:rFonts w:ascii="Courier New" w:hAnsi="Courier New" w:cs="Courier New" w:hint="default"/>
+      </w:rPr>
+    </w:lvl>
+    <w:lvl w:ilvl="1" w:tplc="04100003" w:tentative="1">
+      <w:start w:val="1"/>
+      <w:numFmt w:val="bullet"/>
+      <w:lvlText w:val="o"/>
+      <w:lvlJc w:val="left"/>
+      <w:pPr>
+        <w:ind w:left="3567" w:hanging="360"/>
+      </w:pPr>
+      <w:rPr>
+        <w:rFonts w:ascii="Courier New" w:hAnsi="Courier New" w:cs="Courier New" w:hint="default"/>
+      </w:rPr>
+    </w:lvl>
+    <w:lvl w:ilvl="2" w:tplc="04100005" w:tentative="1">
+      <w:start w:val="1"/>
+      <w:numFmt w:val="bullet"/>
+      <w:lvlText w:val=""/>
+      <w:lvlJc w:val="left"/>
+      <w:pPr>
+        <w:ind w:left="4287" w:hanging="360"/>
+      </w:pPr>
+      <w:rPr>
+        <w:rFonts w:ascii="Wingdings" w:hAnsi="Wingdings" w:hint="default"/>
+      </w:rPr>
+    </w:lvl>
+    <w:lvl w:ilvl="3" w:tplc="04100001" w:tentative="1">
+      <w:start w:val="1"/>
+      <w:numFmt w:val="bullet"/>
+      <w:lvlText w:val=""/>
+      <w:lvlJc w:val="left"/>
+      <w:pPr>
+        <w:ind w:left="5007" w:hanging="360"/>
+      </w:pPr>
+      <w:rPr>
+        <w:rFonts w:ascii="Symbol" w:hAnsi="Symbol" w:hint="default"/>
+      </w:rPr>
+    </w:lvl>
+    <w:lvl w:ilvl="4" w:tplc="04100003" w:tentative="1">
+      <w:start w:val="1"/>
+      <w:numFmt w:val="bullet"/>
+      <w:lvlText w:val="o"/>
+      <w:lvlJc w:val="left"/>
+      <w:pPr>
+        <w:ind w:left="5727" w:hanging="360"/>
+      </w:pPr>
+      <w:rPr>
+        <w:rFonts w:ascii="Courier New" w:hAnsi="Courier New" w:cs="Courier New" w:hint="default"/>
+      </w:rPr>
+    </w:lvl>
+    <w:lvl w:ilvl="5" w:tplc="04100005" w:tentative="1">
+      <w:start w:val="1"/>
+      <w:numFmt w:val="bullet"/>
+      <w:lvlText w:val=""/>
+      <w:lvlJc w:val="left"/>
+      <w:pPr>
+        <w:ind w:left="6447" w:hanging="360"/>
+      </w:pPr>
+      <w:rPr>
+        <w:rFonts w:ascii="Wingdings" w:hAnsi="Wingdings" w:hint="default"/>
+      </w:rPr>
+    </w:lvl>
+    <w:lvl w:ilvl="6" w:tplc="04100001" w:tentative="1">
+      <w:start w:val="1"/>
+      <w:numFmt w:val="bullet"/>
+      <w:lvlText w:val=""/>
+      <w:lvlJc w:val="left"/>
+      <w:pPr>
+        <w:ind w:left="7167" w:hanging="360"/>
+      </w:pPr>
+      <w:rPr>
+        <w:rFonts w:ascii="Symbol" w:hAnsi="Symbol" w:hint="default"/>
+      </w:rPr>
+    </w:lvl>
+    <w:lvl w:ilvl="7" w:tplc="04100003" w:tentative="1">
+      <w:start w:val="1"/>
+      <w:numFmt w:val="bullet"/>
+      <w:lvlText w:val="o"/>
+      <w:lvlJc w:val="left"/>
+      <w:pPr>
+        <w:ind w:left="7887" w:hanging="360"/>
+      </w:pPr>
+      <w:rPr>
+        <w:rFonts w:ascii="Courier New" w:hAnsi="Courier New" w:cs="Courier New" w:hint="default"/>
+      </w:rPr>
+    </w:lvl>
+    <w:lvl w:ilvl="8" w:tplc="04100005" w:tentative="1">
+      <w:start w:val="1"/>
+      <w:numFmt w:val="bullet"/>
+      <w:lvlText w:val=""/>
+      <w:lvlJc w:val="left"/>
+      <w:pPr>
+        <w:ind w:left="8607" w:hanging="360"/>
+      </w:pPr>
+      <w:rPr>
+        <w:rFonts w:ascii="Wingdings" w:hAnsi="Wingdings" w:hint="default"/>
+      </w:rPr>
+    </w:lvl>
+  </w:abstractNum>
+  <w:abstractNum w:abstractNumId="17" w15:restartNumberingAfterBreak="0">
     <w:nsid w:val="29821C42"/>
     <w:multiLevelType w:val="hybridMultilevel"/>
     <w:tmpl w:val="64C2F46C"/>
@@ -6321,7 +7784,7 @@
       </w:pPr>
     </w:lvl>
   </w:abstractNum>
-  <w:abstractNum w:abstractNumId="16" w15:restartNumberingAfterBreak="0">
+  <w:abstractNum w:abstractNumId="18" w15:restartNumberingAfterBreak="0">
     <w:nsid w:val="31204FF6"/>
     <w:multiLevelType w:val="multilevel"/>
     <w:tmpl w:val="C8F4DA3C"/>
@@ -6443,7 +7906,120 @@
       </w:rPr>
     </w:lvl>
   </w:abstractNum>
-  <w:abstractNum w:abstractNumId="17" w15:restartNumberingAfterBreak="0">
+  <w:abstractNum w:abstractNumId="19" w15:restartNumberingAfterBreak="0">
+    <w:nsid w:val="38C345BE"/>
+    <w:multiLevelType w:val="hybridMultilevel"/>
+    <w:tmpl w:val="4AD8CAA8"/>
+    <w:lvl w:ilvl="0" w:tplc="04100001">
+      <w:start w:val="1"/>
+      <w:numFmt w:val="bullet"/>
+      <w:lvlText w:val=""/>
+      <w:lvlJc w:val="left"/>
+      <w:pPr>
+        <w:ind w:left="1429" w:hanging="360"/>
+      </w:pPr>
+      <w:rPr>
+        <w:rFonts w:ascii="Symbol" w:hAnsi="Symbol" w:hint="default"/>
+      </w:rPr>
+    </w:lvl>
+    <w:lvl w:ilvl="1" w:tplc="04100003" w:tentative="1">
+      <w:start w:val="1"/>
+      <w:numFmt w:val="bullet"/>
+      <w:lvlText w:val="o"/>
+      <w:lvlJc w:val="left"/>
+      <w:pPr>
+        <w:ind w:left="2149" w:hanging="360"/>
+      </w:pPr>
+      <w:rPr>
+        <w:rFonts w:ascii="Courier New" w:hAnsi="Courier New" w:cs="Courier New" w:hint="default"/>
+      </w:rPr>
+    </w:lvl>
+    <w:lvl w:ilvl="2" w:tplc="04100005" w:tentative="1">
+      <w:start w:val="1"/>
+      <w:numFmt w:val="bullet"/>
+      <w:lvlText w:val=""/>
+      <w:lvlJc w:val="left"/>
+      <w:pPr>
+        <w:ind w:left="2869" w:hanging="360"/>
+      </w:pPr>
+      <w:rPr>
+        <w:rFonts w:ascii="Wingdings" w:hAnsi="Wingdings" w:hint="default"/>
+      </w:rPr>
+    </w:lvl>
+    <w:lvl w:ilvl="3" w:tplc="04100001" w:tentative="1">
+      <w:start w:val="1"/>
+      <w:numFmt w:val="bullet"/>
+      <w:lvlText w:val=""/>
+      <w:lvlJc w:val="left"/>
+      <w:pPr>
+        <w:ind w:left="3589" w:hanging="360"/>
+      </w:pPr>
+      <w:rPr>
+        <w:rFonts w:ascii="Symbol" w:hAnsi="Symbol" w:hint="default"/>
+      </w:rPr>
+    </w:lvl>
+    <w:lvl w:ilvl="4" w:tplc="04100003" w:tentative="1">
+      <w:start w:val="1"/>
+      <w:numFmt w:val="bullet"/>
+      <w:lvlText w:val="o"/>
+      <w:lvlJc w:val="left"/>
+      <w:pPr>
+        <w:ind w:left="4309" w:hanging="360"/>
+      </w:pPr>
+      <w:rPr>
+        <w:rFonts w:ascii="Courier New" w:hAnsi="Courier New" w:cs="Courier New" w:hint="default"/>
+      </w:rPr>
+    </w:lvl>
+    <w:lvl w:ilvl="5" w:tplc="04100005" w:tentative="1">
+      <w:start w:val="1"/>
+      <w:numFmt w:val="bullet"/>
+      <w:lvlText w:val=""/>
+      <w:lvlJc w:val="left"/>
+      <w:pPr>
+        <w:ind w:left="5029" w:hanging="360"/>
+      </w:pPr>
+      <w:rPr>
+        <w:rFonts w:ascii="Wingdings" w:hAnsi="Wingdings" w:hint="default"/>
+      </w:rPr>
+    </w:lvl>
+    <w:lvl w:ilvl="6" w:tplc="04100001" w:tentative="1">
+      <w:start w:val="1"/>
+      <w:numFmt w:val="bullet"/>
+      <w:lvlText w:val=""/>
+      <w:lvlJc w:val="left"/>
+      <w:pPr>
+        <w:ind w:left="5749" w:hanging="360"/>
+      </w:pPr>
+      <w:rPr>
+        <w:rFonts w:ascii="Symbol" w:hAnsi="Symbol" w:hint="default"/>
+      </w:rPr>
+    </w:lvl>
+    <w:lvl w:ilvl="7" w:tplc="04100003" w:tentative="1">
+      <w:start w:val="1"/>
+      <w:numFmt w:val="bullet"/>
+      <w:lvlText w:val="o"/>
+      <w:lvlJc w:val="left"/>
+      <w:pPr>
+        <w:ind w:left="6469" w:hanging="360"/>
+      </w:pPr>
+      <w:rPr>
+        <w:rFonts w:ascii="Courier New" w:hAnsi="Courier New" w:cs="Courier New" w:hint="default"/>
+      </w:rPr>
+    </w:lvl>
+    <w:lvl w:ilvl="8" w:tplc="04100005" w:tentative="1">
+      <w:start w:val="1"/>
+      <w:numFmt w:val="bullet"/>
+      <w:lvlText w:val=""/>
+      <w:lvlJc w:val="left"/>
+      <w:pPr>
+        <w:ind w:left="7189" w:hanging="360"/>
+      </w:pPr>
+      <w:rPr>
+        <w:rFonts w:ascii="Wingdings" w:hAnsi="Wingdings" w:hint="default"/>
+      </w:rPr>
+    </w:lvl>
+  </w:abstractNum>
+  <w:abstractNum w:abstractNumId="20" w15:restartNumberingAfterBreak="0">
     <w:nsid w:val="3A6A4225"/>
     <w:multiLevelType w:val="hybridMultilevel"/>
     <w:tmpl w:val="A57E53A0"/>
@@ -6556,7 +8132,7 @@
       </w:rPr>
     </w:lvl>
   </w:abstractNum>
-  <w:abstractNum w:abstractNumId="18" w15:restartNumberingAfterBreak="0">
+  <w:abstractNum w:abstractNumId="21" w15:restartNumberingAfterBreak="0">
     <w:nsid w:val="3AA20608"/>
     <w:multiLevelType w:val="hybridMultilevel"/>
     <w:tmpl w:val="FD741812"/>
@@ -6669,7 +8245,7 @@
       </w:rPr>
     </w:lvl>
   </w:abstractNum>
-  <w:abstractNum w:abstractNumId="19" w15:restartNumberingAfterBreak="0">
+  <w:abstractNum w:abstractNumId="22" w15:restartNumberingAfterBreak="0">
     <w:nsid w:val="3B934199"/>
     <w:multiLevelType w:val="hybridMultilevel"/>
     <w:tmpl w:val="A2503E10"/>
@@ -6782,7 +8358,7 @@
       </w:rPr>
     </w:lvl>
   </w:abstractNum>
-  <w:abstractNum w:abstractNumId="20" w15:restartNumberingAfterBreak="0">
+  <w:abstractNum w:abstractNumId="23" w15:restartNumberingAfterBreak="0">
     <w:nsid w:val="3D134C94"/>
     <w:multiLevelType w:val="multilevel"/>
     <w:tmpl w:val="C8F4DA3C"/>
@@ -6903,7 +8479,7 @@
       </w:rPr>
     </w:lvl>
   </w:abstractNum>
-  <w:abstractNum w:abstractNumId="21" w15:restartNumberingAfterBreak="0">
+  <w:abstractNum w:abstractNumId="24" w15:restartNumberingAfterBreak="0">
     <w:nsid w:val="3DF2400F"/>
     <w:multiLevelType w:val="hybridMultilevel"/>
     <w:tmpl w:val="9CB690B4"/>
@@ -7016,7 +8592,7 @@
       </w:rPr>
     </w:lvl>
   </w:abstractNum>
-  <w:abstractNum w:abstractNumId="22" w15:restartNumberingAfterBreak="0">
+  <w:abstractNum w:abstractNumId="25" w15:restartNumberingAfterBreak="0">
     <w:nsid w:val="42073C55"/>
     <w:multiLevelType w:val="hybridMultilevel"/>
     <w:tmpl w:val="493ABF76"/>
@@ -7129,7 +8705,7 @@
       </w:rPr>
     </w:lvl>
   </w:abstractNum>
-  <w:abstractNum w:abstractNumId="23" w15:restartNumberingAfterBreak="0">
+  <w:abstractNum w:abstractNumId="26" w15:restartNumberingAfterBreak="0">
     <w:nsid w:val="42F31A3D"/>
     <w:multiLevelType w:val="multilevel"/>
     <w:tmpl w:val="C8F4DA3C"/>
@@ -7250,7 +8826,7 @@
       </w:rPr>
     </w:lvl>
   </w:abstractNum>
-  <w:abstractNum w:abstractNumId="24" w15:restartNumberingAfterBreak="0">
+  <w:abstractNum w:abstractNumId="27" w15:restartNumberingAfterBreak="0">
     <w:nsid w:val="4E351B2A"/>
     <w:multiLevelType w:val="hybridMultilevel"/>
     <w:tmpl w:val="E5E62C26"/>
@@ -7339,7 +8915,7 @@
       </w:pPr>
     </w:lvl>
   </w:abstractNum>
-  <w:abstractNum w:abstractNumId="25" w15:restartNumberingAfterBreak="0">
+  <w:abstractNum w:abstractNumId="28" w15:restartNumberingAfterBreak="0">
     <w:nsid w:val="4F954ED4"/>
     <w:multiLevelType w:val="hybridMultilevel"/>
     <w:tmpl w:val="DE9A52BA"/>
@@ -7452,7 +9028,7 @@
       </w:rPr>
     </w:lvl>
   </w:abstractNum>
-  <w:abstractNum w:abstractNumId="26" w15:restartNumberingAfterBreak="0">
+  <w:abstractNum w:abstractNumId="29" w15:restartNumberingAfterBreak="0">
     <w:nsid w:val="5DE27B61"/>
     <w:multiLevelType w:val="multilevel"/>
     <w:tmpl w:val="C8F4DA3C"/>
@@ -7573,7 +9149,7 @@
       </w:rPr>
     </w:lvl>
   </w:abstractNum>
-  <w:abstractNum w:abstractNumId="27" w15:restartNumberingAfterBreak="0">
+  <w:abstractNum w:abstractNumId="30" w15:restartNumberingAfterBreak="0">
     <w:nsid w:val="63D3517E"/>
     <w:multiLevelType w:val="hybridMultilevel"/>
     <w:tmpl w:val="420E8CF2"/>
@@ -7686,7 +9262,120 @@
       </w:rPr>
     </w:lvl>
   </w:abstractNum>
-  <w:abstractNum w:abstractNumId="28" w15:restartNumberingAfterBreak="0">
+  <w:abstractNum w:abstractNumId="31" w15:restartNumberingAfterBreak="0">
+    <w:nsid w:val="67D07244"/>
+    <w:multiLevelType w:val="hybridMultilevel"/>
+    <w:tmpl w:val="D9F4121E"/>
+    <w:lvl w:ilvl="0" w:tplc="04100001">
+      <w:start w:val="1"/>
+      <w:numFmt w:val="bullet"/>
+      <w:lvlText w:val=""/>
+      <w:lvlJc w:val="left"/>
+      <w:pPr>
+        <w:ind w:left="1429" w:hanging="360"/>
+      </w:pPr>
+      <w:rPr>
+        <w:rFonts w:ascii="Symbol" w:hAnsi="Symbol" w:hint="default"/>
+      </w:rPr>
+    </w:lvl>
+    <w:lvl w:ilvl="1" w:tplc="04100003" w:tentative="1">
+      <w:start w:val="1"/>
+      <w:numFmt w:val="bullet"/>
+      <w:lvlText w:val="o"/>
+      <w:lvlJc w:val="left"/>
+      <w:pPr>
+        <w:ind w:left="2149" w:hanging="360"/>
+      </w:pPr>
+      <w:rPr>
+        <w:rFonts w:ascii="Courier New" w:hAnsi="Courier New" w:cs="Courier New" w:hint="default"/>
+      </w:rPr>
+    </w:lvl>
+    <w:lvl w:ilvl="2" w:tplc="04100005" w:tentative="1">
+      <w:start w:val="1"/>
+      <w:numFmt w:val="bullet"/>
+      <w:lvlText w:val=""/>
+      <w:lvlJc w:val="left"/>
+      <w:pPr>
+        <w:ind w:left="2869" w:hanging="360"/>
+      </w:pPr>
+      <w:rPr>
+        <w:rFonts w:ascii="Wingdings" w:hAnsi="Wingdings" w:hint="default"/>
+      </w:rPr>
+    </w:lvl>
+    <w:lvl w:ilvl="3" w:tplc="04100001" w:tentative="1">
+      <w:start w:val="1"/>
+      <w:numFmt w:val="bullet"/>
+      <w:lvlText w:val=""/>
+      <w:lvlJc w:val="left"/>
+      <w:pPr>
+        <w:ind w:left="3589" w:hanging="360"/>
+      </w:pPr>
+      <w:rPr>
+        <w:rFonts w:ascii="Symbol" w:hAnsi="Symbol" w:hint="default"/>
+      </w:rPr>
+    </w:lvl>
+    <w:lvl w:ilvl="4" w:tplc="04100003" w:tentative="1">
+      <w:start w:val="1"/>
+      <w:numFmt w:val="bullet"/>
+      <w:lvlText w:val="o"/>
+      <w:lvlJc w:val="left"/>
+      <w:pPr>
+        <w:ind w:left="4309" w:hanging="360"/>
+      </w:pPr>
+      <w:rPr>
+        <w:rFonts w:ascii="Courier New" w:hAnsi="Courier New" w:cs="Courier New" w:hint="default"/>
+      </w:rPr>
+    </w:lvl>
+    <w:lvl w:ilvl="5" w:tplc="04100005" w:tentative="1">
+      <w:start w:val="1"/>
+      <w:numFmt w:val="bullet"/>
+      <w:lvlText w:val=""/>
+      <w:lvlJc w:val="left"/>
+      <w:pPr>
+        <w:ind w:left="5029" w:hanging="360"/>
+      </w:pPr>
+      <w:rPr>
+        <w:rFonts w:ascii="Wingdings" w:hAnsi="Wingdings" w:hint="default"/>
+      </w:rPr>
+    </w:lvl>
+    <w:lvl w:ilvl="6" w:tplc="04100001" w:tentative="1">
+      <w:start w:val="1"/>
+      <w:numFmt w:val="bullet"/>
+      <w:lvlText w:val=""/>
+      <w:lvlJc w:val="left"/>
+      <w:pPr>
+        <w:ind w:left="5749" w:hanging="360"/>
+      </w:pPr>
+      <w:rPr>
+        <w:rFonts w:ascii="Symbol" w:hAnsi="Symbol" w:hint="default"/>
+      </w:rPr>
+    </w:lvl>
+    <w:lvl w:ilvl="7" w:tplc="04100003" w:tentative="1">
+      <w:start w:val="1"/>
+      <w:numFmt w:val="bullet"/>
+      <w:lvlText w:val="o"/>
+      <w:lvlJc w:val="left"/>
+      <w:pPr>
+        <w:ind w:left="6469" w:hanging="360"/>
+      </w:pPr>
+      <w:rPr>
+        <w:rFonts w:ascii="Courier New" w:hAnsi="Courier New" w:cs="Courier New" w:hint="default"/>
+      </w:rPr>
+    </w:lvl>
+    <w:lvl w:ilvl="8" w:tplc="04100005" w:tentative="1">
+      <w:start w:val="1"/>
+      <w:numFmt w:val="bullet"/>
+      <w:lvlText w:val=""/>
+      <w:lvlJc w:val="left"/>
+      <w:pPr>
+        <w:ind w:left="7189" w:hanging="360"/>
+      </w:pPr>
+      <w:rPr>
+        <w:rFonts w:ascii="Wingdings" w:hAnsi="Wingdings" w:hint="default"/>
+      </w:rPr>
+    </w:lvl>
+  </w:abstractNum>
+  <w:abstractNum w:abstractNumId="32" w15:restartNumberingAfterBreak="0">
     <w:nsid w:val="68491594"/>
     <w:multiLevelType w:val="multilevel"/>
     <w:tmpl w:val="C8F4DA3C"/>
@@ -7807,7 +9496,7 @@
       </w:rPr>
     </w:lvl>
   </w:abstractNum>
-  <w:abstractNum w:abstractNumId="29" w15:restartNumberingAfterBreak="0">
+  <w:abstractNum w:abstractNumId="33" w15:restartNumberingAfterBreak="0">
     <w:nsid w:val="687E0260"/>
     <w:multiLevelType w:val="multilevel"/>
     <w:tmpl w:val="00000001"/>
@@ -7920,7 +9609,120 @@
       </w:pPr>
     </w:lvl>
   </w:abstractNum>
-  <w:abstractNum w:abstractNumId="30" w15:restartNumberingAfterBreak="0">
+  <w:abstractNum w:abstractNumId="34" w15:restartNumberingAfterBreak="0">
+    <w:nsid w:val="6B9B6A93"/>
+    <w:multiLevelType w:val="hybridMultilevel"/>
+    <w:tmpl w:val="16286834"/>
+    <w:lvl w:ilvl="0" w:tplc="04100003">
+      <w:start w:val="1"/>
+      <w:numFmt w:val="bullet"/>
+      <w:lvlText w:val="o"/>
+      <w:lvlJc w:val="left"/>
+      <w:pPr>
+        <w:ind w:left="2138" w:hanging="360"/>
+      </w:pPr>
+      <w:rPr>
+        <w:rFonts w:ascii="Courier New" w:hAnsi="Courier New" w:cs="Courier New" w:hint="default"/>
+      </w:rPr>
+    </w:lvl>
+    <w:lvl w:ilvl="1" w:tplc="04100003" w:tentative="1">
+      <w:start w:val="1"/>
+      <w:numFmt w:val="bullet"/>
+      <w:lvlText w:val="o"/>
+      <w:lvlJc w:val="left"/>
+      <w:pPr>
+        <w:ind w:left="2858" w:hanging="360"/>
+      </w:pPr>
+      <w:rPr>
+        <w:rFonts w:ascii="Courier New" w:hAnsi="Courier New" w:cs="Courier New" w:hint="default"/>
+      </w:rPr>
+    </w:lvl>
+    <w:lvl w:ilvl="2" w:tplc="04100005" w:tentative="1">
+      <w:start w:val="1"/>
+      <w:numFmt w:val="bullet"/>
+      <w:lvlText w:val=""/>
+      <w:lvlJc w:val="left"/>
+      <w:pPr>
+        <w:ind w:left="3578" w:hanging="360"/>
+      </w:pPr>
+      <w:rPr>
+        <w:rFonts w:ascii="Wingdings" w:hAnsi="Wingdings" w:hint="default"/>
+      </w:rPr>
+    </w:lvl>
+    <w:lvl w:ilvl="3" w:tplc="04100001" w:tentative="1">
+      <w:start w:val="1"/>
+      <w:numFmt w:val="bullet"/>
+      <w:lvlText w:val=""/>
+      <w:lvlJc w:val="left"/>
+      <w:pPr>
+        <w:ind w:left="4298" w:hanging="360"/>
+      </w:pPr>
+      <w:rPr>
+        <w:rFonts w:ascii="Symbol" w:hAnsi="Symbol" w:hint="default"/>
+      </w:rPr>
+    </w:lvl>
+    <w:lvl w:ilvl="4" w:tplc="04100003" w:tentative="1">
+      <w:start w:val="1"/>
+      <w:numFmt w:val="bullet"/>
+      <w:lvlText w:val="o"/>
+      <w:lvlJc w:val="left"/>
+      <w:pPr>
+        <w:ind w:left="5018" w:hanging="360"/>
+      </w:pPr>
+      <w:rPr>
+        <w:rFonts w:ascii="Courier New" w:hAnsi="Courier New" w:cs="Courier New" w:hint="default"/>
+      </w:rPr>
+    </w:lvl>
+    <w:lvl w:ilvl="5" w:tplc="04100005" w:tentative="1">
+      <w:start w:val="1"/>
+      <w:numFmt w:val="bullet"/>
+      <w:lvlText w:val=""/>
+      <w:lvlJc w:val="left"/>
+      <w:pPr>
+        <w:ind w:left="5738" w:hanging="360"/>
+      </w:pPr>
+      <w:rPr>
+        <w:rFonts w:ascii="Wingdings" w:hAnsi="Wingdings" w:hint="default"/>
+      </w:rPr>
+    </w:lvl>
+    <w:lvl w:ilvl="6" w:tplc="04100001" w:tentative="1">
+      <w:start w:val="1"/>
+      <w:numFmt w:val="bullet"/>
+      <w:lvlText w:val=""/>
+      <w:lvlJc w:val="left"/>
+      <w:pPr>
+        <w:ind w:left="6458" w:hanging="360"/>
+      </w:pPr>
+      <w:rPr>
+        <w:rFonts w:ascii="Symbol" w:hAnsi="Symbol" w:hint="default"/>
+      </w:rPr>
+    </w:lvl>
+    <w:lvl w:ilvl="7" w:tplc="04100003" w:tentative="1">
+      <w:start w:val="1"/>
+      <w:numFmt w:val="bullet"/>
+      <w:lvlText w:val="o"/>
+      <w:lvlJc w:val="left"/>
+      <w:pPr>
+        <w:ind w:left="7178" w:hanging="360"/>
+      </w:pPr>
+      <w:rPr>
+        <w:rFonts w:ascii="Courier New" w:hAnsi="Courier New" w:cs="Courier New" w:hint="default"/>
+      </w:rPr>
+    </w:lvl>
+    <w:lvl w:ilvl="8" w:tplc="04100005" w:tentative="1">
+      <w:start w:val="1"/>
+      <w:numFmt w:val="bullet"/>
+      <w:lvlText w:val=""/>
+      <w:lvlJc w:val="left"/>
+      <w:pPr>
+        <w:ind w:left="7898" w:hanging="360"/>
+      </w:pPr>
+      <w:rPr>
+        <w:rFonts w:ascii="Wingdings" w:hAnsi="Wingdings" w:hint="default"/>
+      </w:rPr>
+    </w:lvl>
+  </w:abstractNum>
+  <w:abstractNum w:abstractNumId="35" w15:restartNumberingAfterBreak="0">
     <w:nsid w:val="74E12702"/>
     <w:multiLevelType w:val="hybridMultilevel"/>
     <w:tmpl w:val="60F880AA"/>
@@ -8006,7 +9808,7 @@
       </w:pPr>
     </w:lvl>
   </w:abstractNum>
-  <w:abstractNum w:abstractNumId="31" w15:restartNumberingAfterBreak="0">
+  <w:abstractNum w:abstractNumId="36" w15:restartNumberingAfterBreak="0">
     <w:nsid w:val="74FA6749"/>
     <w:multiLevelType w:val="multilevel"/>
     <w:tmpl w:val="C8F4DA3C"/>
@@ -8127,7 +9929,7 @@
       </w:rPr>
     </w:lvl>
   </w:abstractNum>
-  <w:abstractNum w:abstractNumId="32" w15:restartNumberingAfterBreak="0">
+  <w:abstractNum w:abstractNumId="37" w15:restartNumberingAfterBreak="0">
     <w:nsid w:val="7659093E"/>
     <w:multiLevelType w:val="multilevel"/>
     <w:tmpl w:val="C8F4DA3C"/>
@@ -8248,7 +10050,7 @@
       </w:rPr>
     </w:lvl>
   </w:abstractNum>
-  <w:abstractNum w:abstractNumId="33" w15:restartNumberingAfterBreak="0">
+  <w:abstractNum w:abstractNumId="38" w15:restartNumberingAfterBreak="0">
     <w:nsid w:val="7CCE2BA3"/>
     <w:multiLevelType w:val="hybridMultilevel"/>
     <w:tmpl w:val="A20AD9D2"/>
@@ -8350,67 +10152,67 @@
     <w:abstractNumId w:val="4"/>
   </w:num>
   <w:num w:numId="6" w16cid:durableId="1681200572">
-    <w:abstractNumId w:val="23"/>
+    <w:abstractNumId w:val="26"/>
   </w:num>
   <w:num w:numId="7" w16cid:durableId="2071003935">
-    <w:abstractNumId w:val="29"/>
+    <w:abstractNumId w:val="33"/>
   </w:num>
   <w:num w:numId="8" w16cid:durableId="1540438857">
-    <w:abstractNumId w:val="10"/>
+    <w:abstractNumId w:val="11"/>
   </w:num>
   <w:num w:numId="9" w16cid:durableId="354161101">
-    <w:abstractNumId w:val="10"/>
+    <w:abstractNumId w:val="11"/>
   </w:num>
   <w:num w:numId="10" w16cid:durableId="636185670">
-    <w:abstractNumId w:val="17"/>
+    <w:abstractNumId w:val="20"/>
   </w:num>
   <w:num w:numId="11" w16cid:durableId="2026519637">
-    <w:abstractNumId w:val="12"/>
+    <w:abstractNumId w:val="13"/>
   </w:num>
   <w:num w:numId="12" w16cid:durableId="1443572107">
     <w:abstractNumId w:val="7"/>
   </w:num>
   <w:num w:numId="13" w16cid:durableId="1680347482">
-    <w:abstractNumId w:val="24"/>
+    <w:abstractNumId w:val="27"/>
   </w:num>
   <w:num w:numId="14" w16cid:durableId="1266769575">
-    <w:abstractNumId w:val="18"/>
+    <w:abstractNumId w:val="21"/>
   </w:num>
   <w:num w:numId="15" w16cid:durableId="16659908">
-    <w:abstractNumId w:val="27"/>
+    <w:abstractNumId w:val="30"/>
   </w:num>
   <w:num w:numId="16" w16cid:durableId="1862696292">
-    <w:abstractNumId w:val="25"/>
+    <w:abstractNumId w:val="28"/>
   </w:num>
   <w:num w:numId="17" w16cid:durableId="646474099">
-    <w:abstractNumId w:val="9"/>
+    <w:abstractNumId w:val="10"/>
   </w:num>
   <w:num w:numId="18" w16cid:durableId="1793285127">
-    <w:abstractNumId w:val="19"/>
+    <w:abstractNumId w:val="22"/>
   </w:num>
   <w:num w:numId="19" w16cid:durableId="202911112">
-    <w:abstractNumId w:val="33"/>
+    <w:abstractNumId w:val="38"/>
   </w:num>
   <w:num w:numId="20" w16cid:durableId="4943408">
     <w:abstractNumId w:val="6"/>
   </w:num>
   <w:num w:numId="21" w16cid:durableId="709576782">
-    <w:abstractNumId w:val="13"/>
+    <w:abstractNumId w:val="14"/>
   </w:num>
   <w:num w:numId="22" w16cid:durableId="510147163">
-    <w:abstractNumId w:val="30"/>
+    <w:abstractNumId w:val="35"/>
   </w:num>
   <w:num w:numId="23" w16cid:durableId="1096175075">
-    <w:abstractNumId w:val="21"/>
+    <w:abstractNumId w:val="24"/>
   </w:num>
   <w:num w:numId="24" w16cid:durableId="353848472">
-    <w:abstractNumId w:val="14"/>
+    <w:abstractNumId w:val="15"/>
   </w:num>
   <w:num w:numId="25" w16cid:durableId="43260700">
-    <w:abstractNumId w:val="22"/>
+    <w:abstractNumId w:val="25"/>
   </w:num>
   <w:num w:numId="26" w16cid:durableId="741872924">
-    <w:abstractNumId w:val="10"/>
+    <w:abstractNumId w:val="11"/>
     <w:lvlOverride w:ilvl="0">
       <w:startOverride w:val="1"/>
     </w:lvlOverride>
@@ -8440,13 +10242,13 @@
     </w:lvlOverride>
   </w:num>
   <w:num w:numId="27" w16cid:durableId="216474933">
-    <w:abstractNumId w:val="11"/>
+    <w:abstractNumId w:val="12"/>
   </w:num>
   <w:num w:numId="28" w16cid:durableId="2068606240">
-    <w:abstractNumId w:val="15"/>
+    <w:abstractNumId w:val="17"/>
   </w:num>
   <w:num w:numId="29" w16cid:durableId="1952475793">
-    <w:abstractNumId w:val="28"/>
+    <w:abstractNumId w:val="32"/>
   </w:num>
   <w:num w:numId="30" w16cid:durableId="1598706192">
     <w:abstractNumId w:val="5"/>
@@ -8455,19 +10257,34 @@
     <w:abstractNumId w:val="8"/>
   </w:num>
   <w:num w:numId="32" w16cid:durableId="854459494">
-    <w:abstractNumId w:val="32"/>
+    <w:abstractNumId w:val="37"/>
   </w:num>
   <w:num w:numId="33" w16cid:durableId="2102329784">
-    <w:abstractNumId w:val="26"/>
+    <w:abstractNumId w:val="29"/>
   </w:num>
   <w:num w:numId="34" w16cid:durableId="787314231">
-    <w:abstractNumId w:val="31"/>
+    <w:abstractNumId w:val="36"/>
   </w:num>
   <w:num w:numId="35" w16cid:durableId="6254848">
-    <w:abstractNumId w:val="20"/>
+    <w:abstractNumId w:val="23"/>
   </w:num>
   <w:num w:numId="36" w16cid:durableId="1758937890">
+    <w:abstractNumId w:val="18"/>
+  </w:num>
+  <w:num w:numId="37" w16cid:durableId="1870869743">
+    <w:abstractNumId w:val="34"/>
+  </w:num>
+  <w:num w:numId="38" w16cid:durableId="153184791">
+    <w:abstractNumId w:val="19"/>
+  </w:num>
+  <w:num w:numId="39" w16cid:durableId="26684535">
+    <w:abstractNumId w:val="9"/>
+  </w:num>
+  <w:num w:numId="40" w16cid:durableId="272713800">
     <w:abstractNumId w:val="16"/>
+  </w:num>
+  <w:num w:numId="41" w16cid:durableId="1547715577">
+    <w:abstractNumId w:val="31"/>
   </w:num>
 </w:numbering>
 </file>
@@ -8944,6 +10761,7 @@
   <w:style w:type="character" w:default="1" w:styleId="Carpredefinitoparagrafo">
     <w:name w:val="Default Paragraph Font"/>
     <w:uiPriority w:val="1"/>
+    <w:semiHidden/>
     <w:unhideWhenUsed/>
   </w:style>
   <w:style w:type="table" w:default="1" w:styleId="Tabellanormale">

</xml_diff>

<commit_message>
Aggiunta dei requisiti non funzionali secondo le nuove categorie
</commit_message>
<xml_diff>
--- a/Deliverables/RAD_GGEyewear.docx
+++ b/Deliverables/RAD_GGEyewear.docx
@@ -1,6 +1,6 @@
 
 <file path=word/document.xml><?xml version="1.0" encoding="utf-8"?>
-<w:document xmlns:wpc="http://schemas.microsoft.com/office/word/2010/wordprocessingCanvas" xmlns:cx="http://schemas.microsoft.com/office/drawing/2014/chartex" xmlns:cx1="http://schemas.microsoft.com/office/drawing/2015/9/8/chartex" xmlns:cx2="http://schemas.microsoft.com/office/drawing/2015/10/21/chartex" xmlns:cx3="http://schemas.microsoft.com/office/drawing/2016/5/9/chartex" xmlns:cx4="http://schemas.microsoft.com/office/drawing/2016/5/10/chartex" xmlns:cx5="http://schemas.microsoft.com/office/drawing/2016/5/11/chartex" xmlns:cx6="http://schemas.microsoft.com/office/drawing/2016/5/12/chartex" xmlns:cx7="http://schemas.microsoft.com/office/drawing/2016/5/13/chartex" xmlns:cx8="http://schemas.microsoft.com/office/drawing/2016/5/14/chartex" xmlns:mc="http://schemas.openxmlformats.org/markup-compatibility/2006" xmlns:aink="http://schemas.microsoft.com/office/drawing/2016/ink" xmlns:am3d="http://schemas.microsoft.com/office/drawing/2017/model3d" xmlns:o="urn:schemas-microsoft-com:office:office" xmlns:oel="http://schemas.microsoft.com/office/2019/extlst" xmlns:r="http://schemas.openxmlformats.org/officeDocument/2006/relationships" xmlns:m="http://schemas.openxmlformats.org/officeDocument/2006/math" xmlns:v="urn:schemas-microsoft-com:vml" xmlns:wp14="http://schemas.microsoft.com/office/word/2010/wordprocessingDrawing" xmlns:wp="http://schemas.openxmlformats.org/drawingml/2006/wordprocessingDrawing" xmlns:w10="urn:schemas-microsoft-com:office:word" xmlns:w="http://schemas.openxmlformats.org/wordprocessingml/2006/main" xmlns:w14="http://schemas.microsoft.com/office/word/2010/wordml" xmlns:w15="http://schemas.microsoft.com/office/word/2012/wordml" xmlns:w16cex="http://schemas.microsoft.com/office/word/2018/wordml/cex" xmlns:w16cid="http://schemas.microsoft.com/office/word/2016/wordml/cid" xmlns:w16="http://schemas.microsoft.com/office/word/2018/wordml" xmlns:w16du="http://schemas.microsoft.com/office/word/2023/wordml/word16du" xmlns:w16sdtdh="http://schemas.microsoft.com/office/word/2020/wordml/sdtdatahash" xmlns:w16sdtfl="http://schemas.microsoft.com/office/word/2024/wordml/sdtformatlock" xmlns:w16se="http://schemas.microsoft.com/office/word/2015/wordml/symex" xmlns:wpg="http://schemas.microsoft.com/office/word/2010/wordprocessingGroup" xmlns:wpi="http://schemas.microsoft.com/office/word/2010/wordprocessingInk" xmlns:wne="http://schemas.microsoft.com/office/word/2006/wordml" xmlns:wps="http://schemas.microsoft.com/office/word/2010/wordprocessingShape" mc:Ignorable="w14 w15 w16se w16cid w16 w16cex w16sdtdh w16sdtfl w16du wp14">
+<w:document xmlns:wpc="http://schemas.microsoft.com/office/word/2010/wordprocessingCanvas" xmlns:cx="http://schemas.microsoft.com/office/drawing/2014/chartex" xmlns:cx1="http://schemas.microsoft.com/office/drawing/2015/9/8/chartex" xmlns:cx2="http://schemas.microsoft.com/office/drawing/2015/10/21/chartex" xmlns:cx3="http://schemas.microsoft.com/office/drawing/2016/5/9/chartex" xmlns:cx4="http://schemas.microsoft.com/office/drawing/2016/5/10/chartex" xmlns:cx5="http://schemas.microsoft.com/office/drawing/2016/5/11/chartex" xmlns:cx6="http://schemas.microsoft.com/office/drawing/2016/5/12/chartex" xmlns:cx7="http://schemas.microsoft.com/office/drawing/2016/5/13/chartex" xmlns:cx8="http://schemas.microsoft.com/office/drawing/2016/5/14/chartex" xmlns:mc="http://schemas.openxmlformats.org/markup-compatibility/2006" xmlns:m="http://schemas.openxmlformats.org/officeDocument/2006/math" xmlns:aink="http://schemas.microsoft.com/office/drawing/2016/ink" xmlns:am3d="http://schemas.microsoft.com/office/drawing/2017/model3d" xmlns:oel="http://schemas.microsoft.com/office/2019/extlst" xmlns:r="http://schemas.openxmlformats.org/officeDocument/2006/relationships" xmlns:wp14="http://schemas.microsoft.com/office/word/2010/wordprocessingDrawing" xmlns:wp="http://schemas.openxmlformats.org/drawingml/2006/wordprocessingDrawing" xmlns:wpg="http://schemas.microsoft.com/office/word/2010/wordprocessingGroup" xmlns:wpi="http://schemas.microsoft.com/office/word/2010/wordprocessingInk" xmlns:wps="http://schemas.microsoft.com/office/word/2010/wordprocessingShape" xmlns:o="urn:schemas-microsoft-com:office:office" xmlns:v="urn:schemas-microsoft-com:vml" xmlns:w10="urn:schemas-microsoft-com:office:word" xmlns:w="http://schemas.openxmlformats.org/wordprocessingml/2006/main" xmlns:w14="http://schemas.microsoft.com/office/word/2010/wordml" xmlns:w15="http://schemas.microsoft.com/office/word/2012/wordml" xmlns:w16cex="http://schemas.microsoft.com/office/word/2018/wordml/cex" xmlns:w16cid="http://schemas.microsoft.com/office/word/2016/wordml/cid" xmlns:w16="http://schemas.microsoft.com/office/word/2018/wordml" xmlns:w16sdtdh="http://schemas.microsoft.com/office/word/2020/wordml/sdtdatahash" xmlns:w16sdtfl="http://schemas.microsoft.com/office/word/2024/wordml/sdtformatlock" xmlns:w16se="http://schemas.microsoft.com/office/word/2015/wordml/symex" xmlns:w16du="http://schemas.microsoft.com/office/word/2023/wordml/word16du" xmlns:wne="http://schemas.microsoft.com/office/word/2006/wordml" mc:Ignorable="w14 w15 w16se w16cid w16 w16cex w16sdtdh w16sdtfl w16du wp14">
   <w:body>
     <w:p/>
     <w:tbl>
@@ -144,8 +144,8 @@
           <w:lang w:val="en-US"/>
         </w:rPr>
         <w:br/>
-        <w:t xml:space="preserve">Versione </w:t>
-      </w:r>
+      </w:r>
+      <w:proofErr w:type="spellStart"/>
       <w:r>
         <w:rPr>
           <w:rFonts w:ascii="Arial" w:hAnsi="Arial"/>
@@ -153,8 +153,9 @@
           <w:sz w:val="36"/>
           <w:lang w:val="en-US"/>
         </w:rPr>
-        <w:t>2</w:t>
-      </w:r>
+        <w:t>Versione</w:t>
+      </w:r>
+      <w:proofErr w:type="spellEnd"/>
       <w:r>
         <w:rPr>
           <w:rFonts w:ascii="Arial" w:hAnsi="Arial"/>
@@ -162,7 +163,7 @@
           <w:sz w:val="36"/>
           <w:lang w:val="en-US"/>
         </w:rPr>
-        <w:t>.</w:t>
+        <w:t xml:space="preserve"> </w:t>
       </w:r>
       <w:r>
         <w:rPr>
@@ -171,7 +172,25 @@
           <w:sz w:val="36"/>
           <w:lang w:val="en-US"/>
         </w:rPr>
-        <w:t>1</w:t>
+        <w:t>2</w:t>
+      </w:r>
+      <w:r>
+        <w:rPr>
+          <w:rFonts w:ascii="Arial" w:hAnsi="Arial"/>
+          <w:b/>
+          <w:sz w:val="36"/>
+          <w:lang w:val="en-US"/>
+        </w:rPr>
+        <w:t>.</w:t>
+      </w:r>
+      <w:r>
+        <w:rPr>
+          <w:rFonts w:ascii="Arial" w:hAnsi="Arial"/>
+          <w:b/>
+          <w:sz w:val="36"/>
+          <w:lang w:val="en-US"/>
+        </w:rPr>
+        <w:t>2</w:t>
       </w:r>
       <w:r>
         <w:rPr>
@@ -397,13 +416,7 @@
         <w:rPr>
           <w:sz w:val="32"/>
         </w:rPr>
-        <w:t>1</w:t>
-      </w:r>
-      <w:r>
-        <w:rPr>
-          <w:sz w:val="32"/>
-        </w:rPr>
-        <w:t>9</w:t>
+        <w:t>23</w:t>
       </w:r>
       <w:r>
         <w:rPr>
@@ -963,13 +976,23 @@
           <w:sz w:val="32"/>
         </w:rPr>
       </w:pPr>
+      <w:proofErr w:type="spellStart"/>
       <w:r>
         <w:rPr>
           <w:rFonts w:ascii="Arial" w:hAnsi="Arial"/>
           <w:b/>
           <w:sz w:val="32"/>
         </w:rPr>
-        <w:t>Revision History</w:t>
+        <w:t>Revision</w:t>
+      </w:r>
+      <w:proofErr w:type="spellEnd"/>
+      <w:r>
+        <w:rPr>
+          <w:rFonts w:ascii="Arial" w:hAnsi="Arial"/>
+          <w:b/>
+          <w:sz w:val="32"/>
+        </w:rPr>
+        <w:t xml:space="preserve"> History</w:t>
       </w:r>
     </w:p>
     <w:tbl>
@@ -1291,7 +1314,49 @@
               <w:rPr>
                 <w:sz w:val="20"/>
               </w:rPr>
-              <w:t>Aggiunta purpose, scope, objectives (1.1, 1.2, 1.3), current system (2), functional requirements (3.2)</w:t>
+              <w:t xml:space="preserve">Aggiunta purpose, scope, </w:t>
+            </w:r>
+            <w:proofErr w:type="spellStart"/>
+            <w:r>
+              <w:rPr>
+                <w:sz w:val="20"/>
+              </w:rPr>
+              <w:t>objectives</w:t>
+            </w:r>
+            <w:proofErr w:type="spellEnd"/>
+            <w:r>
+              <w:rPr>
+                <w:sz w:val="20"/>
+              </w:rPr>
+              <w:t xml:space="preserve"> (1.1, 1.2, 1.3), </w:t>
+            </w:r>
+            <w:proofErr w:type="spellStart"/>
+            <w:r>
+              <w:rPr>
+                <w:sz w:val="20"/>
+              </w:rPr>
+              <w:t>current</w:t>
+            </w:r>
+            <w:proofErr w:type="spellEnd"/>
+            <w:r>
+              <w:rPr>
+                <w:sz w:val="20"/>
+              </w:rPr>
+              <w:t xml:space="preserve"> system (2), </w:t>
+            </w:r>
+            <w:proofErr w:type="spellStart"/>
+            <w:r>
+              <w:rPr>
+                <w:sz w:val="20"/>
+              </w:rPr>
+              <w:t>functional</w:t>
+            </w:r>
+            <w:proofErr w:type="spellEnd"/>
+            <w:r>
+              <w:rPr>
+                <w:sz w:val="20"/>
+              </w:rPr>
+              <w:t xml:space="preserve"> requirements (3.2)</w:t>
             </w:r>
           </w:p>
         </w:tc>
@@ -1443,6 +1508,12 @@
                 <w:sz w:val="20"/>
               </w:rPr>
             </w:pPr>
+            <w:r>
+              <w:rPr>
+                <w:sz w:val="20"/>
+              </w:rPr>
+              <w:t>23/10/2026</w:t>
+            </w:r>
           </w:p>
         </w:tc>
         <w:tc>
@@ -1461,6 +1532,12 @@
                 <w:sz w:val="20"/>
               </w:rPr>
             </w:pPr>
+            <w:r>
+              <w:rPr>
+                <w:sz w:val="20"/>
+              </w:rPr>
+              <w:t>2.2</w:t>
+            </w:r>
           </w:p>
         </w:tc>
         <w:tc>
@@ -1479,6 +1556,12 @@
                 <w:sz w:val="20"/>
               </w:rPr>
             </w:pPr>
+            <w:r>
+              <w:rPr>
+                <w:sz w:val="20"/>
+              </w:rPr>
+              <w:t>Aggiunta dei requisiti non funzionali secondo le nuove categorie</w:t>
+            </w:r>
           </w:p>
         </w:tc>
         <w:tc>
@@ -1498,6 +1581,12 @@
                 <w:sz w:val="20"/>
               </w:rPr>
             </w:pPr>
+            <w:r>
+              <w:rPr>
+                <w:sz w:val="20"/>
+              </w:rPr>
+              <w:t>Gerardo Vertolomo</w:t>
+            </w:r>
           </w:p>
         </w:tc>
       </w:tr>
@@ -1907,7 +1996,7 @@
       <w:r>
         <w:fldChar w:fldCharType="separate"/>
       </w:r>
-      <w:hyperlink w:anchor="_Toc243380166" w:history="1">
+      <w:hyperlink w:anchor="_Toc243657062" w:history="1">
         <w:r>
           <w:rPr>
             <w:rStyle w:val="Collegamentoipertestuale"/>
@@ -1950,7 +2039,7 @@
             <w:noProof/>
             <w:webHidden/>
           </w:rPr>
-          <w:instrText xml:space="preserve"> PAGEREF _Toc243380166 \h </w:instrText>
+          <w:instrText xml:space="preserve"> PAGEREF _Toc243657062 \h </w:instrText>
         </w:r>
         <w:r>
           <w:rPr>
@@ -1994,7 +2083,7 @@
           <w14:ligatures w14:val="standardContextual"/>
         </w:rPr>
       </w:pPr>
-      <w:hyperlink w:anchor="_Toc243380167" w:history="1">
+      <w:hyperlink w:anchor="_Toc243657063" w:history="1">
         <w:r>
           <w:rPr>
             <w:rStyle w:val="Collegamentoipertestuale"/>
@@ -2037,7 +2126,7 @@
             <w:noProof/>
             <w:webHidden/>
           </w:rPr>
-          <w:instrText xml:space="preserve"> PAGEREF _Toc243380167 \h </w:instrText>
+          <w:instrText xml:space="preserve"> PAGEREF _Toc243657063 \h </w:instrText>
         </w:r>
         <w:r>
           <w:rPr>
@@ -2081,7 +2170,7 @@
           <w14:ligatures w14:val="standardContextual"/>
         </w:rPr>
       </w:pPr>
-      <w:hyperlink w:anchor="_Toc243380168" w:history="1">
+      <w:hyperlink w:anchor="_Toc243657064" w:history="1">
         <w:r>
           <w:rPr>
             <w:rStyle w:val="Collegamentoipertestuale"/>
@@ -2124,7 +2213,7 @@
             <w:noProof/>
             <w:webHidden/>
           </w:rPr>
-          <w:instrText xml:space="preserve"> PAGEREF _Toc243380168 \h </w:instrText>
+          <w:instrText xml:space="preserve"> PAGEREF _Toc243657064 \h </w:instrText>
         </w:r>
         <w:r>
           <w:rPr>
@@ -2168,7 +2257,7 @@
           <w14:ligatures w14:val="standardContextual"/>
         </w:rPr>
       </w:pPr>
-      <w:hyperlink w:anchor="_Toc243380169" w:history="1">
+      <w:hyperlink w:anchor="_Toc243657065" w:history="1">
         <w:r>
           <w:rPr>
             <w:rStyle w:val="Collegamentoipertestuale"/>
@@ -2213,7 +2302,7 @@
             <w:noProof/>
             <w:webHidden/>
           </w:rPr>
-          <w:instrText xml:space="preserve"> PAGEREF _Toc243380169 \h </w:instrText>
+          <w:instrText xml:space="preserve"> PAGEREF _Toc243657065 \h </w:instrText>
         </w:r>
         <w:r>
           <w:rPr>
@@ -2257,7 +2346,7 @@
           <w14:ligatures w14:val="standardContextual"/>
         </w:rPr>
       </w:pPr>
-      <w:hyperlink w:anchor="_Toc243380170" w:history="1">
+      <w:hyperlink w:anchor="_Toc243657066" w:history="1">
         <w:r>
           <w:rPr>
             <w:rStyle w:val="Collegamentoipertestuale"/>
@@ -2300,7 +2389,7 @@
             <w:noProof/>
             <w:webHidden/>
           </w:rPr>
-          <w:instrText xml:space="preserve"> PAGEREF _Toc243380170 \h </w:instrText>
+          <w:instrText xml:space="preserve"> PAGEREF _Toc243657066 \h </w:instrText>
         </w:r>
         <w:r>
           <w:rPr>
@@ -2344,7 +2433,7 @@
           <w14:ligatures w14:val="standardContextual"/>
         </w:rPr>
       </w:pPr>
-      <w:hyperlink w:anchor="_Toc243380171" w:history="1">
+      <w:hyperlink w:anchor="_Toc243657067" w:history="1">
         <w:r>
           <w:rPr>
             <w:rStyle w:val="Collegamentoipertestuale"/>
@@ -2387,7 +2476,7 @@
             <w:noProof/>
             <w:webHidden/>
           </w:rPr>
-          <w:instrText xml:space="preserve"> PAGEREF _Toc243380171 \h </w:instrText>
+          <w:instrText xml:space="preserve"> PAGEREF _Toc243657067 \h </w:instrText>
         </w:r>
         <w:r>
           <w:rPr>
@@ -2431,7 +2520,7 @@
           <w14:ligatures w14:val="standardContextual"/>
         </w:rPr>
       </w:pPr>
-      <w:hyperlink w:anchor="_Toc243380172" w:history="1">
+      <w:hyperlink w:anchor="_Toc243657068" w:history="1">
         <w:r>
           <w:rPr>
             <w:rStyle w:val="Collegamentoipertestuale"/>
@@ -2474,7 +2563,7 @@
             <w:noProof/>
             <w:webHidden/>
           </w:rPr>
-          <w:instrText xml:space="preserve"> PAGEREF _Toc243380172 \h </w:instrText>
+          <w:instrText xml:space="preserve"> PAGEREF _Toc243657068 \h </w:instrText>
         </w:r>
         <w:r>
           <w:rPr>
@@ -2518,7 +2607,7 @@
           <w14:ligatures w14:val="standardContextual"/>
         </w:rPr>
       </w:pPr>
-      <w:hyperlink w:anchor="_Toc243380173" w:history="1">
+      <w:hyperlink w:anchor="_Toc243657069" w:history="1">
         <w:r>
           <w:rPr>
             <w:rStyle w:val="Collegamentoipertestuale"/>
@@ -2561,7 +2650,7 @@
             <w:noProof/>
             <w:webHidden/>
           </w:rPr>
-          <w:instrText xml:space="preserve"> PAGEREF _Toc243380173 \h </w:instrText>
+          <w:instrText xml:space="preserve"> PAGEREF _Toc243657069 \h </w:instrText>
         </w:r>
         <w:r>
           <w:rPr>
@@ -2605,7 +2694,7 @@
           <w14:ligatures w14:val="standardContextual"/>
         </w:rPr>
       </w:pPr>
-      <w:hyperlink w:anchor="_Toc243380174" w:history="1">
+      <w:hyperlink w:anchor="_Toc243657070" w:history="1">
         <w:r>
           <w:rPr>
             <w:rStyle w:val="Collegamentoipertestuale"/>
@@ -2648,7 +2737,7 @@
             <w:noProof/>
             <w:webHidden/>
           </w:rPr>
-          <w:instrText xml:space="preserve"> PAGEREF _Toc243380174 \h </w:instrText>
+          <w:instrText xml:space="preserve"> PAGEREF _Toc243657070 \h </w:instrText>
         </w:r>
         <w:r>
           <w:rPr>
@@ -2692,7 +2781,7 @@
           <w14:ligatures w14:val="standardContextual"/>
         </w:rPr>
       </w:pPr>
-      <w:hyperlink w:anchor="_Toc243380175" w:history="1">
+      <w:hyperlink w:anchor="_Toc243657071" w:history="1">
         <w:r>
           <w:rPr>
             <w:rStyle w:val="Collegamentoipertestuale"/>
@@ -2735,7 +2824,7 @@
             <w:noProof/>
             <w:webHidden/>
           </w:rPr>
-          <w:instrText xml:space="preserve"> PAGEREF _Toc243380175 \h </w:instrText>
+          <w:instrText xml:space="preserve"> PAGEREF _Toc243657071 \h </w:instrText>
         </w:r>
         <w:r>
           <w:rPr>
@@ -2779,7 +2868,7 @@
           <w14:ligatures w14:val="standardContextual"/>
         </w:rPr>
       </w:pPr>
-      <w:hyperlink w:anchor="_Toc243380176" w:history="1">
+      <w:hyperlink w:anchor="_Toc243657072" w:history="1">
         <w:r>
           <w:rPr>
             <w:rStyle w:val="Collegamentoipertestuale"/>
@@ -2822,7 +2911,7 @@
             <w:noProof/>
             <w:webHidden/>
           </w:rPr>
-          <w:instrText xml:space="preserve"> PAGEREF _Toc243380176 \h </w:instrText>
+          <w:instrText xml:space="preserve"> PAGEREF _Toc243657072 \h </w:instrText>
         </w:r>
         <w:r>
           <w:rPr>
@@ -2866,7 +2955,7 @@
           <w14:ligatures w14:val="standardContextual"/>
         </w:rPr>
       </w:pPr>
-      <w:hyperlink w:anchor="_Toc243380177" w:history="1">
+      <w:hyperlink w:anchor="_Toc243657073" w:history="1">
         <w:r>
           <w:rPr>
             <w:rStyle w:val="Collegamentoipertestuale"/>
@@ -2909,7 +2998,7 @@
             <w:noProof/>
             <w:webHidden/>
           </w:rPr>
-          <w:instrText xml:space="preserve"> PAGEREF _Toc243380177 \h </w:instrText>
+          <w:instrText xml:space="preserve"> PAGEREF _Toc243657073 \h </w:instrText>
         </w:r>
         <w:r>
           <w:rPr>
@@ -2929,7 +3018,7 @@
             <w:noProof/>
             <w:webHidden/>
           </w:rPr>
-          <w:t>5</w:t>
+          <w:t>7</w:t>
         </w:r>
         <w:r>
           <w:rPr>
@@ -2953,7 +3042,7 @@
           <w14:ligatures w14:val="standardContextual"/>
         </w:rPr>
       </w:pPr>
-      <w:hyperlink w:anchor="_Toc243380178" w:history="1">
+      <w:hyperlink w:anchor="_Toc243657074" w:history="1">
         <w:r>
           <w:rPr>
             <w:rStyle w:val="Collegamentoipertestuale"/>
@@ -2975,7 +3064,7 @@
             <w:rStyle w:val="Collegamentoipertestuale"/>
             <w:noProof/>
           </w:rPr>
-          <w:t>Usability</w:t>
+          <w:t>User interface and human factors</w:t>
         </w:r>
         <w:r>
           <w:rPr>
@@ -2996,7 +3085,7 @@
             <w:noProof/>
             <w:webHidden/>
           </w:rPr>
-          <w:instrText xml:space="preserve"> PAGEREF _Toc243380178 \h </w:instrText>
+          <w:instrText xml:space="preserve"> PAGEREF _Toc243657074 \h </w:instrText>
         </w:r>
         <w:r>
           <w:rPr>
@@ -3016,7 +3105,7 @@
             <w:noProof/>
             <w:webHidden/>
           </w:rPr>
-          <w:t>5</w:t>
+          <w:t>7</w:t>
         </w:r>
         <w:r>
           <w:rPr>
@@ -3040,7 +3129,7 @@
           <w14:ligatures w14:val="standardContextual"/>
         </w:rPr>
       </w:pPr>
-      <w:hyperlink w:anchor="_Toc243380179" w:history="1">
+      <w:hyperlink w:anchor="_Toc243657075" w:history="1">
         <w:r>
           <w:rPr>
             <w:rStyle w:val="Collegamentoipertestuale"/>
@@ -3062,7 +3151,7 @@
             <w:rStyle w:val="Collegamentoipertestuale"/>
             <w:noProof/>
           </w:rPr>
-          <w:t>Reliability</w:t>
+          <w:t>Documentation</w:t>
         </w:r>
         <w:r>
           <w:rPr>
@@ -3083,7 +3172,7 @@
             <w:noProof/>
             <w:webHidden/>
           </w:rPr>
-          <w:instrText xml:space="preserve"> PAGEREF _Toc243380179 \h </w:instrText>
+          <w:instrText xml:space="preserve"> PAGEREF _Toc243657075 \h </w:instrText>
         </w:r>
         <w:r>
           <w:rPr>
@@ -3103,7 +3192,7 @@
             <w:noProof/>
             <w:webHidden/>
           </w:rPr>
-          <w:t>5</w:t>
+          <w:t>7</w:t>
         </w:r>
         <w:r>
           <w:rPr>
@@ -3127,7 +3216,7 @@
           <w14:ligatures w14:val="standardContextual"/>
         </w:rPr>
       </w:pPr>
-      <w:hyperlink w:anchor="_Toc243380180" w:history="1">
+      <w:hyperlink w:anchor="_Toc243657076" w:history="1">
         <w:r>
           <w:rPr>
             <w:rStyle w:val="Collegamentoipertestuale"/>
@@ -3149,7 +3238,7 @@
             <w:rStyle w:val="Collegamentoipertestuale"/>
             <w:noProof/>
           </w:rPr>
-          <w:t>Performance</w:t>
+          <w:t>Hardware considerations</w:t>
         </w:r>
         <w:r>
           <w:rPr>
@@ -3170,7 +3259,7 @@
             <w:noProof/>
             <w:webHidden/>
           </w:rPr>
-          <w:instrText xml:space="preserve"> PAGEREF _Toc243380180 \h </w:instrText>
+          <w:instrText xml:space="preserve"> PAGEREF _Toc243657076 \h </w:instrText>
         </w:r>
         <w:r>
           <w:rPr>
@@ -3190,7 +3279,7 @@
             <w:noProof/>
             <w:webHidden/>
           </w:rPr>
-          <w:t>5</w:t>
+          <w:t>8</w:t>
         </w:r>
         <w:r>
           <w:rPr>
@@ -3214,7 +3303,7 @@
           <w14:ligatures w14:val="standardContextual"/>
         </w:rPr>
       </w:pPr>
-      <w:hyperlink w:anchor="_Toc243380181" w:history="1">
+      <w:hyperlink w:anchor="_Toc243657077" w:history="1">
         <w:r>
           <w:rPr>
             <w:rStyle w:val="Collegamentoipertestuale"/>
@@ -3236,7 +3325,7 @@
             <w:rStyle w:val="Collegamentoipertestuale"/>
             <w:noProof/>
           </w:rPr>
-          <w:t>Supportability</w:t>
+          <w:t>Performance characteristics</w:t>
         </w:r>
         <w:r>
           <w:rPr>
@@ -3257,7 +3346,7 @@
             <w:noProof/>
             <w:webHidden/>
           </w:rPr>
-          <w:instrText xml:space="preserve"> PAGEREF _Toc243380181 \h </w:instrText>
+          <w:instrText xml:space="preserve"> PAGEREF _Toc243657077 \h </w:instrText>
         </w:r>
         <w:r>
           <w:rPr>
@@ -3277,7 +3366,7 @@
             <w:noProof/>
             <w:webHidden/>
           </w:rPr>
-          <w:t>5</w:t>
+          <w:t>8</w:t>
         </w:r>
         <w:r>
           <w:rPr>
@@ -3301,7 +3390,7 @@
           <w14:ligatures w14:val="standardContextual"/>
         </w:rPr>
       </w:pPr>
-      <w:hyperlink w:anchor="_Toc243380182" w:history="1">
+      <w:hyperlink w:anchor="_Toc243657078" w:history="1">
         <w:r>
           <w:rPr>
             <w:rStyle w:val="Collegamentoipertestuale"/>
@@ -3323,7 +3412,7 @@
             <w:rStyle w:val="Collegamentoipertestuale"/>
             <w:noProof/>
           </w:rPr>
-          <w:t>Implementation</w:t>
+          <w:t>Error handling and extreme conditions</w:t>
         </w:r>
         <w:r>
           <w:rPr>
@@ -3344,7 +3433,7 @@
             <w:noProof/>
             <w:webHidden/>
           </w:rPr>
-          <w:instrText xml:space="preserve"> PAGEREF _Toc243380182 \h </w:instrText>
+          <w:instrText xml:space="preserve"> PAGEREF _Toc243657078 \h </w:instrText>
         </w:r>
         <w:r>
           <w:rPr>
@@ -3364,7 +3453,7 @@
             <w:noProof/>
             <w:webHidden/>
           </w:rPr>
-          <w:t>6</w:t>
+          <w:t>8</w:t>
         </w:r>
         <w:r>
           <w:rPr>
@@ -3388,7 +3477,7 @@
           <w14:ligatures w14:val="standardContextual"/>
         </w:rPr>
       </w:pPr>
-      <w:hyperlink w:anchor="_Toc243380183" w:history="1">
+      <w:hyperlink w:anchor="_Toc243657079" w:history="1">
         <w:r>
           <w:rPr>
             <w:rStyle w:val="Collegamentoipertestuale"/>
@@ -3410,7 +3499,7 @@
             <w:rStyle w:val="Collegamentoipertestuale"/>
             <w:noProof/>
           </w:rPr>
-          <w:t>Interface</w:t>
+          <w:t>System interfacing</w:t>
         </w:r>
         <w:r>
           <w:rPr>
@@ -3431,7 +3520,7 @@
             <w:noProof/>
             <w:webHidden/>
           </w:rPr>
-          <w:instrText xml:space="preserve"> PAGEREF _Toc243380183 \h </w:instrText>
+          <w:instrText xml:space="preserve"> PAGEREF _Toc243657079 \h </w:instrText>
         </w:r>
         <w:r>
           <w:rPr>
@@ -3451,7 +3540,7 @@
             <w:noProof/>
             <w:webHidden/>
           </w:rPr>
-          <w:t>6</w:t>
+          <w:t>8</w:t>
         </w:r>
         <w:r>
           <w:rPr>
@@ -3475,7 +3564,7 @@
           <w14:ligatures w14:val="standardContextual"/>
         </w:rPr>
       </w:pPr>
-      <w:hyperlink w:anchor="_Toc243380184" w:history="1">
+      <w:hyperlink w:anchor="_Toc243657080" w:history="1">
         <w:r>
           <w:rPr>
             <w:rStyle w:val="Collegamentoipertestuale"/>
@@ -3497,7 +3586,7 @@
             <w:rStyle w:val="Collegamentoipertestuale"/>
             <w:noProof/>
           </w:rPr>
-          <w:t>Packaging</w:t>
+          <w:t>Quality issues</w:t>
         </w:r>
         <w:r>
           <w:rPr>
@@ -3518,7 +3607,7 @@
             <w:noProof/>
             <w:webHidden/>
           </w:rPr>
-          <w:instrText xml:space="preserve"> PAGEREF _Toc243380184 \h </w:instrText>
+          <w:instrText xml:space="preserve"> PAGEREF _Toc243657080 \h </w:instrText>
         </w:r>
         <w:r>
           <w:rPr>
@@ -3538,7 +3627,7 @@
             <w:noProof/>
             <w:webHidden/>
           </w:rPr>
-          <w:t>6</w:t>
+          <w:t>8</w:t>
         </w:r>
         <w:r>
           <w:rPr>
@@ -3562,7 +3651,7 @@
           <w14:ligatures w14:val="standardContextual"/>
         </w:rPr>
       </w:pPr>
-      <w:hyperlink w:anchor="_Toc243380185" w:history="1">
+      <w:hyperlink w:anchor="_Toc243657081" w:history="1">
         <w:r>
           <w:rPr>
             <w:rStyle w:val="Collegamentoipertestuale"/>
@@ -3584,7 +3673,7 @@
             <w:rStyle w:val="Collegamentoipertestuale"/>
             <w:noProof/>
           </w:rPr>
-          <w:t>Legal</w:t>
+          <w:t>System modifications</w:t>
         </w:r>
         <w:r>
           <w:rPr>
@@ -3605,7 +3694,7 @@
             <w:noProof/>
             <w:webHidden/>
           </w:rPr>
-          <w:instrText xml:space="preserve"> PAGEREF _Toc243380185 \h </w:instrText>
+          <w:instrText xml:space="preserve"> PAGEREF _Toc243657081 \h </w:instrText>
         </w:r>
         <w:r>
           <w:rPr>
@@ -3625,7 +3714,268 @@
             <w:noProof/>
             <w:webHidden/>
           </w:rPr>
-          <w:t>6</w:t>
+          <w:t>8</w:t>
+        </w:r>
+        <w:r>
+          <w:rPr>
+            <w:noProof/>
+            <w:webHidden/>
+          </w:rPr>
+          <w:fldChar w:fldCharType="end"/>
+        </w:r>
+      </w:hyperlink>
+    </w:p>
+    <w:p>
+      <w:pPr>
+        <w:pStyle w:val="Sommario2"/>
+        <w:tabs>
+          <w:tab w:val="left" w:pos="1132"/>
+        </w:tabs>
+        <w:rPr>
+          <w:rFonts w:asciiTheme="minorHAnsi" w:eastAsiaTheme="minorEastAsia" w:hAnsiTheme="minorHAnsi" w:cstheme="minorBidi"/>
+          <w:noProof/>
+          <w:kern w:val="2"/>
+          <w14:ligatures w14:val="standardContextual"/>
+        </w:rPr>
+      </w:pPr>
+      <w:hyperlink w:anchor="_Toc243657082" w:history="1">
+        <w:r>
+          <w:rPr>
+            <w:rStyle w:val="Collegamentoipertestuale"/>
+            <w:noProof/>
+          </w:rPr>
+          <w:t>3.3.9</w:t>
+        </w:r>
+        <w:r>
+          <w:rPr>
+            <w:rFonts w:asciiTheme="minorHAnsi" w:eastAsiaTheme="minorEastAsia" w:hAnsiTheme="minorHAnsi" w:cstheme="minorBidi"/>
+            <w:noProof/>
+            <w:kern w:val="2"/>
+            <w14:ligatures w14:val="standardContextual"/>
+          </w:rPr>
+          <w:tab/>
+        </w:r>
+        <w:r>
+          <w:rPr>
+            <w:rStyle w:val="Collegamentoipertestuale"/>
+            <w:noProof/>
+          </w:rPr>
+          <w:t>Physical environment</w:t>
+        </w:r>
+        <w:r>
+          <w:rPr>
+            <w:noProof/>
+            <w:webHidden/>
+          </w:rPr>
+          <w:tab/>
+        </w:r>
+        <w:r>
+          <w:rPr>
+            <w:noProof/>
+            <w:webHidden/>
+          </w:rPr>
+          <w:fldChar w:fldCharType="begin"/>
+        </w:r>
+        <w:r>
+          <w:rPr>
+            <w:noProof/>
+            <w:webHidden/>
+          </w:rPr>
+          <w:instrText xml:space="preserve"> PAGEREF _Toc243657082 \h </w:instrText>
+        </w:r>
+        <w:r>
+          <w:rPr>
+            <w:noProof/>
+            <w:webHidden/>
+          </w:rPr>
+        </w:r>
+        <w:r>
+          <w:rPr>
+            <w:noProof/>
+            <w:webHidden/>
+          </w:rPr>
+          <w:fldChar w:fldCharType="separate"/>
+        </w:r>
+        <w:r>
+          <w:rPr>
+            <w:noProof/>
+            <w:webHidden/>
+          </w:rPr>
+          <w:t>9</w:t>
+        </w:r>
+        <w:r>
+          <w:rPr>
+            <w:noProof/>
+            <w:webHidden/>
+          </w:rPr>
+          <w:fldChar w:fldCharType="end"/>
+        </w:r>
+      </w:hyperlink>
+    </w:p>
+    <w:p>
+      <w:pPr>
+        <w:pStyle w:val="Sommario2"/>
+        <w:tabs>
+          <w:tab w:val="left" w:pos="1132"/>
+        </w:tabs>
+        <w:rPr>
+          <w:rFonts w:asciiTheme="minorHAnsi" w:eastAsiaTheme="minorEastAsia" w:hAnsiTheme="minorHAnsi" w:cstheme="minorBidi"/>
+          <w:noProof/>
+          <w:kern w:val="2"/>
+          <w14:ligatures w14:val="standardContextual"/>
+        </w:rPr>
+      </w:pPr>
+      <w:hyperlink w:anchor="_Toc243657083" w:history="1">
+        <w:r>
+          <w:rPr>
+            <w:rStyle w:val="Collegamentoipertestuale"/>
+            <w:noProof/>
+          </w:rPr>
+          <w:t>3.3.10</w:t>
+        </w:r>
+        <w:r>
+          <w:rPr>
+            <w:rFonts w:asciiTheme="minorHAnsi" w:eastAsiaTheme="minorEastAsia" w:hAnsiTheme="minorHAnsi" w:cstheme="minorBidi"/>
+            <w:noProof/>
+            <w:kern w:val="2"/>
+            <w14:ligatures w14:val="standardContextual"/>
+          </w:rPr>
+          <w:tab/>
+        </w:r>
+        <w:r>
+          <w:rPr>
+            <w:rStyle w:val="Collegamentoipertestuale"/>
+            <w:noProof/>
+          </w:rPr>
+          <w:t>Security issues</w:t>
+        </w:r>
+        <w:r>
+          <w:rPr>
+            <w:noProof/>
+            <w:webHidden/>
+          </w:rPr>
+          <w:tab/>
+        </w:r>
+        <w:r>
+          <w:rPr>
+            <w:noProof/>
+            <w:webHidden/>
+          </w:rPr>
+          <w:fldChar w:fldCharType="begin"/>
+        </w:r>
+        <w:r>
+          <w:rPr>
+            <w:noProof/>
+            <w:webHidden/>
+          </w:rPr>
+          <w:instrText xml:space="preserve"> PAGEREF _Toc243657083 \h </w:instrText>
+        </w:r>
+        <w:r>
+          <w:rPr>
+            <w:noProof/>
+            <w:webHidden/>
+          </w:rPr>
+        </w:r>
+        <w:r>
+          <w:rPr>
+            <w:noProof/>
+            <w:webHidden/>
+          </w:rPr>
+          <w:fldChar w:fldCharType="separate"/>
+        </w:r>
+        <w:r>
+          <w:rPr>
+            <w:noProof/>
+            <w:webHidden/>
+          </w:rPr>
+          <w:t>9</w:t>
+        </w:r>
+        <w:r>
+          <w:rPr>
+            <w:noProof/>
+            <w:webHidden/>
+          </w:rPr>
+          <w:fldChar w:fldCharType="end"/>
+        </w:r>
+      </w:hyperlink>
+    </w:p>
+    <w:p>
+      <w:pPr>
+        <w:pStyle w:val="Sommario2"/>
+        <w:tabs>
+          <w:tab w:val="left" w:pos="1132"/>
+        </w:tabs>
+        <w:rPr>
+          <w:rFonts w:asciiTheme="minorHAnsi" w:eastAsiaTheme="minorEastAsia" w:hAnsiTheme="minorHAnsi" w:cstheme="minorBidi"/>
+          <w:noProof/>
+          <w:kern w:val="2"/>
+          <w14:ligatures w14:val="standardContextual"/>
+        </w:rPr>
+      </w:pPr>
+      <w:hyperlink w:anchor="_Toc243657084" w:history="1">
+        <w:r>
+          <w:rPr>
+            <w:rStyle w:val="Collegamentoipertestuale"/>
+            <w:noProof/>
+          </w:rPr>
+          <w:t>3.3.11</w:t>
+        </w:r>
+        <w:r>
+          <w:rPr>
+            <w:rFonts w:asciiTheme="minorHAnsi" w:eastAsiaTheme="minorEastAsia" w:hAnsiTheme="minorHAnsi" w:cstheme="minorBidi"/>
+            <w:noProof/>
+            <w:kern w:val="2"/>
+            <w14:ligatures w14:val="standardContextual"/>
+          </w:rPr>
+          <w:tab/>
+        </w:r>
+        <w:r>
+          <w:rPr>
+            <w:rStyle w:val="Collegamentoipertestuale"/>
+            <w:noProof/>
+          </w:rPr>
+          <w:t>Resources and management issues</w:t>
+        </w:r>
+        <w:r>
+          <w:rPr>
+            <w:noProof/>
+            <w:webHidden/>
+          </w:rPr>
+          <w:tab/>
+        </w:r>
+        <w:r>
+          <w:rPr>
+            <w:noProof/>
+            <w:webHidden/>
+          </w:rPr>
+          <w:fldChar w:fldCharType="begin"/>
+        </w:r>
+        <w:r>
+          <w:rPr>
+            <w:noProof/>
+            <w:webHidden/>
+          </w:rPr>
+          <w:instrText xml:space="preserve"> PAGEREF _Toc243657084 \h </w:instrText>
+        </w:r>
+        <w:r>
+          <w:rPr>
+            <w:noProof/>
+            <w:webHidden/>
+          </w:rPr>
+        </w:r>
+        <w:r>
+          <w:rPr>
+            <w:noProof/>
+            <w:webHidden/>
+          </w:rPr>
+          <w:fldChar w:fldCharType="separate"/>
+        </w:r>
+        <w:r>
+          <w:rPr>
+            <w:noProof/>
+            <w:webHidden/>
+          </w:rPr>
+          <w:t>9</w:t>
         </w:r>
         <w:r>
           <w:rPr>
@@ -3649,7 +3999,7 @@
           <w14:ligatures w14:val="standardContextual"/>
         </w:rPr>
       </w:pPr>
-      <w:hyperlink w:anchor="_Toc243380186" w:history="1">
+      <w:hyperlink w:anchor="_Toc243657085" w:history="1">
         <w:r>
           <w:rPr>
             <w:rStyle w:val="Collegamentoipertestuale"/>
@@ -3692,7 +4042,7 @@
             <w:noProof/>
             <w:webHidden/>
           </w:rPr>
-          <w:instrText xml:space="preserve"> PAGEREF _Toc243380186 \h </w:instrText>
+          <w:instrText xml:space="preserve"> PAGEREF _Toc243657085 \h </w:instrText>
         </w:r>
         <w:r>
           <w:rPr>
@@ -3712,7 +4062,7 @@
             <w:noProof/>
             <w:webHidden/>
           </w:rPr>
-          <w:t>6</w:t>
+          <w:t>9</w:t>
         </w:r>
         <w:r>
           <w:rPr>
@@ -3736,7 +4086,7 @@
           <w14:ligatures w14:val="standardContextual"/>
         </w:rPr>
       </w:pPr>
-      <w:hyperlink w:anchor="_Toc243380187" w:history="1">
+      <w:hyperlink w:anchor="_Toc243657086" w:history="1">
         <w:r>
           <w:rPr>
             <w:rStyle w:val="Collegamentoipertestuale"/>
@@ -3779,7 +4129,7 @@
             <w:noProof/>
             <w:webHidden/>
           </w:rPr>
-          <w:instrText xml:space="preserve"> PAGEREF _Toc243380187 \h </w:instrText>
+          <w:instrText xml:space="preserve"> PAGEREF _Toc243657086 \h </w:instrText>
         </w:r>
         <w:r>
           <w:rPr>
@@ -3799,7 +4149,7 @@
             <w:noProof/>
             <w:webHidden/>
           </w:rPr>
-          <w:t>6</w:t>
+          <w:t>9</w:t>
         </w:r>
         <w:r>
           <w:rPr>
@@ -3823,7 +4173,7 @@
           <w14:ligatures w14:val="standardContextual"/>
         </w:rPr>
       </w:pPr>
-      <w:hyperlink w:anchor="_Toc243380188" w:history="1">
+      <w:hyperlink w:anchor="_Toc243657087" w:history="1">
         <w:r>
           <w:rPr>
             <w:rStyle w:val="Collegamentoipertestuale"/>
@@ -3866,7 +4216,7 @@
             <w:noProof/>
             <w:webHidden/>
           </w:rPr>
-          <w:instrText xml:space="preserve"> PAGEREF _Toc243380188 \h </w:instrText>
+          <w:instrText xml:space="preserve"> PAGEREF _Toc243657087 \h </w:instrText>
         </w:r>
         <w:r>
           <w:rPr>
@@ -3886,7 +4236,7 @@
             <w:noProof/>
             <w:webHidden/>
           </w:rPr>
-          <w:t>6</w:t>
+          <w:t>9</w:t>
         </w:r>
         <w:r>
           <w:rPr>
@@ -3910,7 +4260,7 @@
           <w14:ligatures w14:val="standardContextual"/>
         </w:rPr>
       </w:pPr>
-      <w:hyperlink w:anchor="_Toc243380189" w:history="1">
+      <w:hyperlink w:anchor="_Toc243657088" w:history="1">
         <w:r>
           <w:rPr>
             <w:rStyle w:val="Collegamentoipertestuale"/>
@@ -3953,7 +4303,7 @@
             <w:noProof/>
             <w:webHidden/>
           </w:rPr>
-          <w:instrText xml:space="preserve"> PAGEREF _Toc243380189 \h </w:instrText>
+          <w:instrText xml:space="preserve"> PAGEREF _Toc243657088 \h </w:instrText>
         </w:r>
         <w:r>
           <w:rPr>
@@ -3973,7 +4323,7 @@
             <w:noProof/>
             <w:webHidden/>
           </w:rPr>
-          <w:t>6</w:t>
+          <w:t>9</w:t>
         </w:r>
         <w:r>
           <w:rPr>
@@ -3997,7 +4347,7 @@
           <w14:ligatures w14:val="standardContextual"/>
         </w:rPr>
       </w:pPr>
-      <w:hyperlink w:anchor="_Toc243380190" w:history="1">
+      <w:hyperlink w:anchor="_Toc243657089" w:history="1">
         <w:r>
           <w:rPr>
             <w:rStyle w:val="Collegamentoipertestuale"/>
@@ -4040,7 +4390,7 @@
             <w:noProof/>
             <w:webHidden/>
           </w:rPr>
-          <w:instrText xml:space="preserve"> PAGEREF _Toc243380190 \h </w:instrText>
+          <w:instrText xml:space="preserve"> PAGEREF _Toc243657089 \h </w:instrText>
         </w:r>
         <w:r>
           <w:rPr>
@@ -4060,7 +4410,7 @@
             <w:noProof/>
             <w:webHidden/>
           </w:rPr>
-          <w:t>6</w:t>
+          <w:t>9</w:t>
         </w:r>
         <w:r>
           <w:rPr>
@@ -4084,7 +4434,7 @@
           <w14:ligatures w14:val="standardContextual"/>
         </w:rPr>
       </w:pPr>
-      <w:hyperlink w:anchor="_Toc243380191" w:history="1">
+      <w:hyperlink w:anchor="_Toc243657090" w:history="1">
         <w:r>
           <w:rPr>
             <w:rStyle w:val="Collegamentoipertestuale"/>
@@ -4129,7 +4479,7 @@
             <w:noProof/>
             <w:webHidden/>
           </w:rPr>
-          <w:instrText xml:space="preserve"> PAGEREF _Toc243380191 \h </w:instrText>
+          <w:instrText xml:space="preserve"> PAGEREF _Toc243657090 \h </w:instrText>
         </w:r>
         <w:r>
           <w:rPr>
@@ -4149,7 +4499,7 @@
             <w:noProof/>
             <w:webHidden/>
           </w:rPr>
-          <w:t>6</w:t>
+          <w:t>9</w:t>
         </w:r>
         <w:r>
           <w:rPr>
@@ -4173,7 +4523,7 @@
           <w14:ligatures w14:val="standardContextual"/>
         </w:rPr>
       </w:pPr>
-      <w:hyperlink w:anchor="_Toc243380192" w:history="1">
+      <w:hyperlink w:anchor="_Toc243657091" w:history="1">
         <w:r>
           <w:rPr>
             <w:rStyle w:val="Collegamentoipertestuale"/>
@@ -4216,7 +4566,7 @@
             <w:noProof/>
             <w:webHidden/>
           </w:rPr>
-          <w:instrText xml:space="preserve"> PAGEREF _Toc243380192 \h </w:instrText>
+          <w:instrText xml:space="preserve"> PAGEREF _Toc243657091 \h </w:instrText>
         </w:r>
         <w:r>
           <w:rPr>
@@ -4236,7 +4586,7 @@
             <w:noProof/>
             <w:webHidden/>
           </w:rPr>
-          <w:t>6</w:t>
+          <w:t>9</w:t>
         </w:r>
         <w:r>
           <w:rPr>
@@ -4292,13 +4642,13 @@
         <w:ind w:left="426" w:hanging="426"/>
         <w:jc w:val="left"/>
       </w:pPr>
-      <w:bookmarkStart w:id="0" w:name="_Toc243380166"/>
-      <w:bookmarkStart w:id="1" w:name="_Hlk243298281"/>
+      <w:bookmarkStart w:id="0" w:name="_Hlk243298281"/>
+      <w:bookmarkStart w:id="1" w:name="_Toc243657062"/>
       <w:r>
         <w:lastRenderedPageBreak/>
         <w:t>INTRODUCTION</w:t>
       </w:r>
-      <w:bookmarkEnd w:id="0"/>
+      <w:bookmarkEnd w:id="1"/>
     </w:p>
     <w:p>
       <w:pPr>
@@ -4309,8 +4659,8 @@
         </w:numPr>
         <w:ind w:left="716" w:hanging="432"/>
       </w:pPr>
-      <w:bookmarkStart w:id="2" w:name="_Toc243380167"/>
-      <w:bookmarkEnd w:id="1"/>
+      <w:bookmarkStart w:id="2" w:name="_Toc243657063"/>
+      <w:bookmarkEnd w:id="0"/>
       <w:r>
         <w:t>Purpose of the system</w:t>
       </w:r>
@@ -4326,7 +4676,23 @@
         <w:t xml:space="preserve">L’obiettivo </w:t>
       </w:r>
       <w:r>
-        <w:t xml:space="preserve">del sistema di ecommerce GG-Eyeware è di estendere la </w:t>
+        <w:t xml:space="preserve">del sistema di </w:t>
+      </w:r>
+      <w:proofErr w:type="spellStart"/>
+      <w:r>
+        <w:t>ecommerce</w:t>
+      </w:r>
+      <w:proofErr w:type="spellEnd"/>
+      <w:r>
+        <w:t xml:space="preserve"> GG-</w:t>
+      </w:r>
+      <w:proofErr w:type="spellStart"/>
+      <w:r>
+        <w:t>Eyeware</w:t>
+      </w:r>
+      <w:proofErr w:type="spellEnd"/>
+      <w:r>
+        <w:t xml:space="preserve"> è di estendere la </w:t>
       </w:r>
       <w:r>
         <w:t xml:space="preserve">percentuale di </w:t>
@@ -4350,7 +4716,7 @@
         </w:numPr>
         <w:ind w:left="716" w:hanging="432"/>
       </w:pPr>
-      <w:bookmarkStart w:id="3" w:name="_Toc243380168"/>
+      <w:bookmarkStart w:id="3" w:name="_Toc243657064"/>
       <w:r>
         <w:t>Scope of the system</w:t>
       </w:r>
@@ -4656,7 +5022,7 @@
         </w:rPr>
         <w:t xml:space="preserve"> </w:t>
       </w:r>
-      <w:bookmarkStart w:id="4" w:name="_Toc243380169"/>
+      <w:bookmarkStart w:id="4" w:name="_Toc243657065"/>
       <w:r>
         <w:rPr>
           <w:lang w:val="en-US"/>
@@ -4714,11 +5080,29 @@
           <w:numId w:val="6"/>
         </w:numPr>
       </w:pPr>
-      <w:bookmarkStart w:id="5" w:name="_Toc243380170"/>
-      <w:r>
-        <w:t>Definitions, acronyms, and abbreviations</w:t>
+      <w:bookmarkStart w:id="5" w:name="_Toc243657066"/>
+      <w:proofErr w:type="spellStart"/>
+      <w:r>
+        <w:t>Definitions</w:t>
+      </w:r>
+      <w:proofErr w:type="spellEnd"/>
+      <w:r>
+        <w:t xml:space="preserve">, </w:t>
+      </w:r>
+      <w:proofErr w:type="spellStart"/>
+      <w:r>
+        <w:t>acronyms</w:t>
+      </w:r>
+      <w:proofErr w:type="spellEnd"/>
+      <w:r>
+        <w:t xml:space="preserve">, and </w:t>
+      </w:r>
+      <w:proofErr w:type="spellStart"/>
+      <w:r>
+        <w:t>abbreviations</w:t>
       </w:r>
       <w:bookmarkEnd w:id="5"/>
+      <w:proofErr w:type="spellEnd"/>
     </w:p>
     <w:p>
       <w:pPr>
@@ -4758,11 +5142,13 @@
       <w:r>
         <w:t xml:space="preserve"> </w:t>
       </w:r>
-      <w:bookmarkStart w:id="6" w:name="_Toc243380171"/>
+      <w:bookmarkStart w:id="6" w:name="_Toc243657067"/>
+      <w:proofErr w:type="spellStart"/>
       <w:r>
         <w:t>References</w:t>
       </w:r>
       <w:bookmarkEnd w:id="6"/>
+      <w:proofErr w:type="spellEnd"/>
     </w:p>
     <w:p>
       <w:pPr>
@@ -4794,11 +5180,13 @@
       <w:r>
         <w:t xml:space="preserve"> </w:t>
       </w:r>
-      <w:bookmarkStart w:id="7" w:name="_Toc243380172"/>
+      <w:bookmarkStart w:id="7" w:name="_Toc243657068"/>
+      <w:proofErr w:type="spellStart"/>
       <w:r>
         <w:t>Overview</w:t>
       </w:r>
       <w:bookmarkEnd w:id="7"/>
+      <w:proofErr w:type="spellEnd"/>
     </w:p>
     <w:p>
       <w:pPr>
@@ -4829,7 +5217,7 @@
         <w:ind w:left="426" w:hanging="426"/>
         <w:jc w:val="left"/>
       </w:pPr>
-      <w:bookmarkStart w:id="8" w:name="_Toc243380173"/>
+      <w:bookmarkStart w:id="8" w:name="_Toc243657069"/>
       <w:r>
         <w:t>CURRENT SYSTEM</w:t>
       </w:r>
@@ -4866,7 +5254,7 @@
         <w:ind w:left="426" w:hanging="426"/>
         <w:jc w:val="left"/>
       </w:pPr>
-      <w:bookmarkStart w:id="9" w:name="_Toc243380174"/>
+      <w:bookmarkStart w:id="9" w:name="_Toc243657070"/>
       <w:r>
         <w:t>PROPOSED SYSTEM</w:t>
       </w:r>
@@ -4883,11 +5271,13 @@
       <w:r>
         <w:t xml:space="preserve"> </w:t>
       </w:r>
-      <w:bookmarkStart w:id="10" w:name="_Toc243380175"/>
+      <w:bookmarkStart w:id="10" w:name="_Toc243657071"/>
+      <w:proofErr w:type="spellStart"/>
       <w:r>
         <w:t>Overview</w:t>
       </w:r>
       <w:bookmarkEnd w:id="10"/>
+      <w:proofErr w:type="spellEnd"/>
     </w:p>
     <w:p>
       <w:pPr>
@@ -4922,7 +5312,7 @@
       <w:r>
         <w:t xml:space="preserve"> </w:t>
       </w:r>
-      <w:bookmarkStart w:id="11" w:name="_Toc243380176"/>
+      <w:bookmarkStart w:id="11" w:name="_Toc243657072"/>
       <w:r>
         <w:t>F</w:t>
       </w:r>
@@ -5247,13 +5637,7 @@
         <w:rPr>
           <w:color w:val="000000" w:themeColor="text1"/>
         </w:rPr>
-        <w:t>(associati al profilo con il quale è loggato)</w:t>
-      </w:r>
-      <w:r>
-        <w:rPr>
-          <w:color w:val="000000" w:themeColor="text1"/>
-        </w:rPr>
-        <w:t xml:space="preserve"> </w:t>
+        <w:t xml:space="preserve">(associati al profilo con il quale è loggato) </w:t>
       </w:r>
       <w:r>
         <w:rPr>
@@ -5493,7 +5877,7 @@
           <w:numId w:val="6"/>
         </w:numPr>
       </w:pPr>
-      <w:bookmarkStart w:id="12" w:name="_Toc243380177"/>
+      <w:bookmarkStart w:id="12" w:name="_Toc243657073"/>
       <w:r>
         <w:t>Nonf</w:t>
       </w:r>
@@ -5515,7 +5899,7 @@
           <w:bCs w:val="0"/>
         </w:rPr>
       </w:pPr>
-      <w:bookmarkStart w:id="13" w:name="_Toc243380178"/>
+      <w:bookmarkStart w:id="13" w:name="_Toc243657074"/>
       <w:r>
         <w:rPr>
           <w:b w:val="0"/>
@@ -5523,21 +5907,73 @@
           <w:sz w:val="26"/>
           <w:szCs w:val="26"/>
         </w:rPr>
-        <w:t>Usability</w:t>
+        <w:t>User interface and human factors</w:t>
       </w:r>
       <w:bookmarkEnd w:id="13"/>
     </w:p>
     <w:p>
       <w:pPr>
-        <w:tabs>
-          <w:tab w:val="left" w:pos="993"/>
-          <w:tab w:val="left" w:pos="8580"/>
-        </w:tabs>
+        <w:spacing w:before="100" w:after="100"/>
+        <w:ind w:left="1418"/>
+        <w:jc w:val="both"/>
+      </w:pPr>
+      <w:r>
+        <w:t xml:space="preserve">RNF1: </w:t>
+      </w:r>
+      <w:r>
+        <w:t xml:space="preserve">Il sistema deve offrire un layout flessibile in grado di adattarsi automaticamente alle diverse risoluzioni e formati di schermo (smartphone, tablet, laptop e desktop). </w:t>
+      </w:r>
+      <w:r>
+        <w:t>Gli elementi visivi, come le schede prodotto, la tabella degli ordini e i controlli di gestione, devono riorganizzarsi per preservare leggibilità, accessibilità e facilità d</w:t>
+      </w:r>
+      <w:r>
+        <w:t>’uso</w:t>
+      </w:r>
+      <w:r>
+        <w:t xml:space="preserve"> su qualsiasi dispositivo</w:t>
+      </w:r>
+      <w:r>
+        <w:t>.</w:t>
+      </w:r>
+    </w:p>
+    <w:p>
+      <w:pPr>
         <w:spacing w:after="100"/>
         <w:ind w:left="1418"/>
       </w:pPr>
       <w:r>
-        <w:t>A</w:t>
+        <w:t>RNF2:</w:t>
+      </w:r>
+      <w:r>
+        <w:t xml:space="preserve"> Nelle situazioni in cui una schermata o un componente non presenta contenuti da mostrare (es. carrello degli acquisti vuoto, nessun ordine effettuato, nessun risultato corrispondente a un filtro di ricerca), il sistema non deve mai restituire schermate bianche o layout frammentati. Deve invece mostrare messaggi visivi descrittivi che spieghino chiaramente lo stato attuale e suggeriscano l'azione successiva da compiere</w:t>
+      </w:r>
+      <w:r>
+        <w:t>.</w:t>
+      </w:r>
+    </w:p>
+    <w:p>
+      <w:pPr>
+        <w:spacing w:after="120"/>
+        <w:ind w:left="1418"/>
+        <w:rPr>
+          <w:b/>
+          <w:bCs/>
+        </w:rPr>
+      </w:pPr>
+      <w:r>
+        <w:t>RNF3:</w:t>
+      </w:r>
+      <w:r>
+        <w:t xml:space="preserve"> Il sistema deve rendere costantemente evidente all'utente il risultato delle proprie azioni attraverso notifiche visive, come banner cromatici di conferma (suc</w:t>
+      </w:r>
+      <w:r>
+        <w:t>cesso o errore)</w:t>
+      </w:r>
+      <w:r>
+        <w:t xml:space="preserve"> e badge di stato ben distinti</w:t>
+      </w:r>
+      <w:r>
+        <w:t>.</w:t>
       </w:r>
     </w:p>
     <w:p>
@@ -5553,7 +5989,7 @@
           <w:bCs w:val="0"/>
         </w:rPr>
       </w:pPr>
-      <w:bookmarkStart w:id="14" w:name="_Toc243380179"/>
+      <w:bookmarkStart w:id="14" w:name="_Toc243657075"/>
       <w:r>
         <w:rPr>
           <w:b w:val="0"/>
@@ -5561,7 +5997,7 @@
           <w:sz w:val="26"/>
           <w:szCs w:val="26"/>
         </w:rPr>
-        <w:t>Reliability</w:t>
+        <w:t>Documentation</w:t>
       </w:r>
       <w:bookmarkEnd w:id="14"/>
     </w:p>
@@ -5571,11 +6007,97 @@
           <w:tab w:val="left" w:pos="993"/>
           <w:tab w:val="left" w:pos="8580"/>
         </w:tabs>
-        <w:spacing w:after="100"/>
+        <w:spacing w:before="100" w:after="100"/>
         <w:ind w:left="1418"/>
       </w:pPr>
       <w:r>
-        <w:t>A</w:t>
+        <w:t xml:space="preserve">RFN8: </w:t>
+      </w:r>
+      <w:r>
+        <w:t>Deve essere fornito un documento tecnico (</w:t>
+      </w:r>
+      <w:r>
+        <w:rPr>
+          <w:rStyle w:val="CodiceHTML"/>
+          <w:rFonts w:ascii="Times New Roman" w:eastAsia="Lucida Sans Unicode" w:hAnsi="Times New Roman" w:cs="Times New Roman"/>
+          <w:sz w:val="24"/>
+          <w:szCs w:val="24"/>
+        </w:rPr>
+        <w:t>README</w:t>
+      </w:r>
+      <w:r>
+        <w:t>), rivolto a sviluppatori</w:t>
+      </w:r>
+      <w:r>
+        <w:t xml:space="preserve"> e</w:t>
+      </w:r>
+      <w:r>
+        <w:t xml:space="preserve"> sistemisti</w:t>
+      </w:r>
+      <w:r>
+        <w:t>,</w:t>
+      </w:r>
+      <w:r>
+        <w:t xml:space="preserve"> contenent</w:t>
+      </w:r>
+      <w:r>
+        <w:t>i</w:t>
+      </w:r>
+      <w:r>
+        <w:t xml:space="preserve"> i requisiti d'ambiente (Java JDK, Apache Tomcat, MySQL) e le istruzioni dettagliate per l'importazione del database</w:t>
+      </w:r>
+      <w:r>
+        <w:t>,</w:t>
+      </w:r>
+      <w:r>
+        <w:t xml:space="preserve"> la configurazione delle connessioni JDBC e il deploy dell'applicazione.</w:t>
+      </w:r>
+    </w:p>
+    <w:p>
+      <w:pPr>
+        <w:tabs>
+          <w:tab w:val="left" w:pos="993"/>
+          <w:tab w:val="left" w:pos="8580"/>
+        </w:tabs>
+        <w:spacing w:before="100" w:after="100"/>
+        <w:ind w:left="1418"/>
+      </w:pPr>
+      <w:r>
+        <w:t xml:space="preserve">RFN9: </w:t>
+      </w:r>
+      <w:r>
+        <w:t>Deve essere fornito un manuale d'uso (sotto forma di sezione Aiuto/FAQ integrata nel sito o documento PDF), rivolto ai clienti finali e ai gestori del negozio, che illustri le procedure di navigazione del catalogo occhiali, carrello e checkout per gli acquirenti</w:t>
+      </w:r>
+      <w:r>
+        <w:t xml:space="preserve"> e</w:t>
+      </w:r>
+      <w:r>
+        <w:t xml:space="preserve"> la gestione di prodotti, scorte e ordini per </w:t>
+      </w:r>
+      <w:r>
+        <w:t xml:space="preserve">gli </w:t>
+      </w:r>
+      <w:r>
+        <w:t>amministrator</w:t>
+      </w:r>
+      <w:r>
+        <w:t>i.</w:t>
+      </w:r>
+    </w:p>
+    <w:p>
+      <w:pPr>
+        <w:tabs>
+          <w:tab w:val="left" w:pos="993"/>
+          <w:tab w:val="left" w:pos="8580"/>
+        </w:tabs>
+        <w:spacing w:before="100" w:after="100"/>
+        <w:ind w:left="1418"/>
+      </w:pPr>
+      <w:r>
+        <w:t xml:space="preserve">RFN10: </w:t>
+      </w:r>
+      <w:r>
+        <w:t>Deve essere prodotta la documentazione tecnica delle API interne in formato HTML tramite Javadoc, rivolta agli sviluppatori e ai futuri manutentori del sistema, che descriva le classi Java di backend (Servlet, DAO, JavaBean), specificando metodi, parametri, valori di ritorno ed eccezioni gestite.</w:t>
       </w:r>
     </w:p>
     <w:p>
@@ -5591,7 +6113,7 @@
           <w:bCs w:val="0"/>
         </w:rPr>
       </w:pPr>
-      <w:bookmarkStart w:id="15" w:name="_Toc243380180"/>
+      <w:bookmarkStart w:id="15" w:name="_Toc243657076"/>
       <w:r>
         <w:rPr>
           <w:b w:val="0"/>
@@ -5599,7 +6121,8 @@
           <w:sz w:val="26"/>
           <w:szCs w:val="26"/>
         </w:rPr>
-        <w:t>Performance</w:t>
+        <w:lastRenderedPageBreak/>
+        <w:t>Hardware considerations</w:t>
       </w:r>
       <w:bookmarkEnd w:id="15"/>
     </w:p>
@@ -5609,11 +6132,72 @@
           <w:tab w:val="left" w:pos="993"/>
           <w:tab w:val="left" w:pos="8580"/>
         </w:tabs>
-        <w:spacing w:after="100"/>
+        <w:spacing w:before="100" w:after="100"/>
         <w:ind w:left="1418"/>
       </w:pPr>
       <w:r>
-        <w:t>a</w:t>
+        <w:t xml:space="preserve">RFN11: </w:t>
+      </w:r>
+      <w:r>
+        <w:t>Il sistema lato backend deve poter essere eseguito su un server fisico o</w:t>
+      </w:r>
+      <w:r>
+        <w:t xml:space="preserve"> su</w:t>
+      </w:r>
+      <w:r>
+        <w:t xml:space="preserve"> macchina virtuale dotata di processore multi-core</w:t>
+      </w:r>
+      <w:r>
+        <w:t xml:space="preserve">, </w:t>
+      </w:r>
+      <w:r>
+        <w:t>una memoria RAM minima di 4 GB</w:t>
+      </w:r>
+      <w:r>
+        <w:t xml:space="preserve"> (consigliati 8 GB)</w:t>
+      </w:r>
+      <w:r>
+        <w:t>, uno spazio di archiviazione secondaria (disco SSD</w:t>
+      </w:r>
+      <w:r>
+        <w:t>/Hard Disk</w:t>
+      </w:r>
+      <w:r>
+        <w:t>) di almeno 20 GB dedicati a sistema operativo, database relazionale e catalogo immagini dei prodotti.</w:t>
+      </w:r>
+    </w:p>
+    <w:p>
+      <w:pPr>
+        <w:tabs>
+          <w:tab w:val="left" w:pos="993"/>
+          <w:tab w:val="left" w:pos="8580"/>
+        </w:tabs>
+        <w:spacing w:before="100" w:after="100"/>
+        <w:ind w:left="1418"/>
+      </w:pPr>
+      <w:r>
+        <w:t xml:space="preserve">RFN12: </w:t>
+      </w:r>
+      <w:r>
+        <w:t xml:space="preserve">L'accesso alla piattaforma web da parte di clienti e amministratori deve essere garantito su qualsiasi dispositivo </w:t>
+      </w:r>
+      <w:r>
+        <w:t>(</w:t>
+      </w:r>
+      <w:r>
+        <w:t>desktop, notebook, tablet o smartphone</w:t>
+      </w:r>
+      <w:r>
+        <w:t xml:space="preserve">) </w:t>
+      </w:r>
+      <w:r>
+        <w:t>dotato di una memoria RAM minima di 2 GB</w:t>
+      </w:r>
+      <w:r>
+        <w:t xml:space="preserve"> e una connessione stabile ad Internet</w:t>
+      </w:r>
+      <w:r>
+        <w:t>.</w:t>
       </w:r>
     </w:p>
     <w:p>
@@ -5629,7 +6213,7 @@
           <w:bCs w:val="0"/>
         </w:rPr>
       </w:pPr>
-      <w:bookmarkStart w:id="16" w:name="_Toc243380181"/>
+      <w:bookmarkStart w:id="16" w:name="_Toc243657077"/>
       <w:r>
         <w:rPr>
           <w:b w:val="0"/>
@@ -5637,21 +6221,24 @@
           <w:sz w:val="26"/>
           <w:szCs w:val="26"/>
         </w:rPr>
-        <w:t>Supportability</w:t>
+        <w:t>Performance characteristics</w:t>
       </w:r>
       <w:bookmarkEnd w:id="16"/>
     </w:p>
     <w:p>
       <w:pPr>
-        <w:tabs>
-          <w:tab w:val="left" w:pos="993"/>
-          <w:tab w:val="left" w:pos="8580"/>
-        </w:tabs>
-        <w:spacing w:after="100"/>
+        <w:spacing w:before="100" w:after="120"/>
         <w:ind w:left="1418"/>
-      </w:pPr>
-      <w:r>
-        <w:t>a</w:t>
+        <w:rPr>
+          <w:b/>
+          <w:bCs/>
+        </w:rPr>
+      </w:pPr>
+      <w:r>
+        <w:t>RNF5:</w:t>
+      </w:r>
+      <w:r>
+        <w:t xml:space="preserve"> L'interfaccia utente deve garantire una navigazione fluida riducendo al minimo i tempi di attesa e i ricaricamenti dell'intera pagina, i quali comporterebbero fastidiose interruzioni visive e attese stimate tra 0,5 e 3 secondi per ogni singola azione. Le operazioni frequenti, quali la modifica delle quantità del carrello, il filtraggio dei prodotti nel catalogo o l'aggiornamento dello stato di un ordine, devono avvenire in modo asincrono. Questo significa che il sistema deve aggiornare istantaneamente (in circa 100-300 millisecondi) solo le porzioni di schermo interessate dal cambiamento, evitando di dover scaricare e ridisegnare da zero l'intera pagina web per ogni minima modifica.</w:t>
       </w:r>
     </w:p>
     <w:p>
@@ -5667,7 +6254,7 @@
           <w:bCs w:val="0"/>
         </w:rPr>
       </w:pPr>
-      <w:bookmarkStart w:id="17" w:name="_Toc243380182"/>
+      <w:bookmarkStart w:id="17" w:name="_Toc243657078"/>
       <w:r>
         <w:rPr>
           <w:b w:val="0"/>
@@ -5675,21 +6262,30 @@
           <w:sz w:val="26"/>
           <w:szCs w:val="26"/>
         </w:rPr>
-        <w:t>Implementation</w:t>
+        <w:t>Error handling and extreme conditions</w:t>
       </w:r>
       <w:bookmarkEnd w:id="17"/>
     </w:p>
     <w:p>
       <w:pPr>
-        <w:tabs>
-          <w:tab w:val="left" w:pos="993"/>
-          <w:tab w:val="left" w:pos="8580"/>
-        </w:tabs>
-        <w:spacing w:after="100"/>
+        <w:spacing w:before="100" w:after="120"/>
         <w:ind w:left="1418"/>
-      </w:pPr>
-      <w:r>
-        <w:t>a</w:t>
+        <w:rPr>
+          <w:b/>
+          <w:bCs/>
+        </w:rPr>
+      </w:pPr>
+      <w:r>
+        <w:t>RNF4:</w:t>
+      </w:r>
+      <w:r>
+        <w:t xml:space="preserve"> Le </w:t>
+      </w:r>
+      <w:r>
+        <w:t>regole di protezione e controllo degli accessi devono riflettersi chiaramente sull'interfaccia utente. L'utente deve ricevere messaggi espliciti e comprensibili in caso di inserimento di credenziali errate, tentativi di accesso a sezioni non autorizzate o nel caso in cui stia tentando di accedere con un account sospeso o disattivato</w:t>
+      </w:r>
+      <w:r>
+        <w:t>.</w:t>
       </w:r>
     </w:p>
     <w:p>
@@ -5705,7 +6301,7 @@
           <w:bCs w:val="0"/>
         </w:rPr>
       </w:pPr>
-      <w:bookmarkStart w:id="18" w:name="_Toc243380183"/>
+      <w:bookmarkStart w:id="18" w:name="_Toc243657079"/>
       <w:r>
         <w:rPr>
           <w:b w:val="0"/>
@@ -5713,7 +6309,7 @@
           <w:sz w:val="26"/>
           <w:szCs w:val="26"/>
         </w:rPr>
-        <w:t>Interface</w:t>
+        <w:t>System interfacing</w:t>
       </w:r>
       <w:bookmarkEnd w:id="18"/>
     </w:p>
@@ -5723,11 +6319,26 @@
           <w:tab w:val="left" w:pos="993"/>
           <w:tab w:val="left" w:pos="8580"/>
         </w:tabs>
-        <w:spacing w:after="100"/>
+        <w:spacing w:before="100" w:after="100"/>
         <w:ind w:left="1418"/>
       </w:pPr>
       <w:r>
-        <w:t>a</w:t>
+        <w:t xml:space="preserve">RFN13: </w:t>
+      </w:r>
+      <w:r>
+        <w:t>L'applicazione web deve interagire con il sistema esterno di gestione della base di dati (MySQL Server), inviando in output comandi e query formulati nel linguaggio</w:t>
+      </w:r>
+      <w:r>
+        <w:t xml:space="preserve"> </w:t>
+      </w:r>
+      <w:r>
+        <w:t>SQL e ricevendo in input i dati estratti sotto forma di record strutturati</w:t>
+      </w:r>
+      <w:r>
+        <w:t>.</w:t>
+      </w:r>
+      <w:r>
+        <w:t xml:space="preserve"> </w:t>
       </w:r>
     </w:p>
     <w:p>
@@ -5743,7 +6354,7 @@
           <w:bCs w:val="0"/>
         </w:rPr>
       </w:pPr>
-      <w:bookmarkStart w:id="19" w:name="_Toc243380184"/>
+      <w:bookmarkStart w:id="19" w:name="_Toc243657080"/>
       <w:r>
         <w:rPr>
           <w:b w:val="0"/>
@@ -5751,21 +6362,54 @@
           <w:sz w:val="26"/>
           <w:szCs w:val="26"/>
         </w:rPr>
-        <w:t>Packaging</w:t>
+        <w:t>Quality issues</w:t>
       </w:r>
       <w:bookmarkEnd w:id="19"/>
     </w:p>
     <w:p>
       <w:pPr>
-        <w:tabs>
-          <w:tab w:val="left" w:pos="993"/>
-          <w:tab w:val="left" w:pos="8580"/>
-        </w:tabs>
-        <w:spacing w:after="100"/>
+        <w:spacing w:before="100" w:after="120"/>
         <w:ind w:left="1418"/>
-      </w:pPr>
-      <w:r>
-        <w:t>a</w:t>
+        <w:jc w:val="both"/>
+      </w:pPr>
+      <w:r>
+        <w:t>RNF7:</w:t>
+      </w:r>
+      <w:r>
+        <w:t xml:space="preserve"> L'aspetto grafico</w:t>
+      </w:r>
+      <w:r>
+        <w:t xml:space="preserve"> </w:t>
+      </w:r>
+      <w:r>
+        <w:t>delle pagine dev</w:t>
+      </w:r>
+      <w:r>
+        <w:t>e</w:t>
+      </w:r>
+      <w:r>
+        <w:t xml:space="preserve"> risultare identic</w:t>
+      </w:r>
+      <w:r>
+        <w:t>o</w:t>
+      </w:r>
+      <w:r>
+        <w:t xml:space="preserve"> e priv</w:t>
+      </w:r>
+      <w:r>
+        <w:t>o</w:t>
+      </w:r>
+      <w:r>
+        <w:t xml:space="preserve"> di anomalie visive su tutti i principali browser web di uso comune</w:t>
+      </w:r>
+      <w:r>
+        <w:t>,</w:t>
+      </w:r>
+      <w:r>
+        <w:t xml:space="preserve"> garantendo un'esperienza omogenea a prescindere dal client utilizzato</w:t>
+      </w:r>
+      <w:r>
+        <w:t>.</w:t>
       </w:r>
     </w:p>
     <w:p>
@@ -5779,9 +6423,11 @@
         <w:rPr>
           <w:b w:val="0"/>
           <w:bCs w:val="0"/>
-        </w:rPr>
-      </w:pPr>
-      <w:bookmarkStart w:id="20" w:name="_Toc243380185"/>
+          <w:sz w:val="26"/>
+          <w:szCs w:val="26"/>
+        </w:rPr>
+      </w:pPr>
+      <w:bookmarkStart w:id="20" w:name="_Toc243657081"/>
       <w:r>
         <w:rPr>
           <w:b w:val="0"/>
@@ -5789,39 +6435,60 @@
           <w:sz w:val="26"/>
           <w:szCs w:val="26"/>
         </w:rPr>
-        <w:t>Legal</w:t>
+        <w:t>System modifications</w:t>
       </w:r>
       <w:bookmarkEnd w:id="20"/>
     </w:p>
     <w:p>
       <w:pPr>
-        <w:tabs>
-          <w:tab w:val="left" w:pos="993"/>
-          <w:tab w:val="left" w:pos="8580"/>
-        </w:tabs>
-        <w:spacing w:after="100"/>
+        <w:spacing w:before="100" w:after="100"/>
         <w:ind w:left="1418"/>
       </w:pPr>
       <w:r>
-        <w:t>a</w:t>
-      </w:r>
-    </w:p>
-    <w:p>
-      <w:pPr>
-        <w:pStyle w:val="Titolo2"/>
-        <w:numPr>
-          <w:ilvl w:val="1"/>
-          <w:numId w:val="6"/>
-        </w:numPr>
-      </w:pPr>
-      <w:r>
-        <w:t xml:space="preserve"> </w:t>
-      </w:r>
-      <w:bookmarkStart w:id="21" w:name="_Toc243380186"/>
-      <w:r>
-        <w:t>System models</w:t>
-      </w:r>
-      <w:bookmarkEnd w:id="21"/>
+        <w:t xml:space="preserve">RNF14: </w:t>
+      </w:r>
+      <w:r>
+        <w:t>La struttura della base di dati e il livello Model devono essere facilmente estendibili per accogliere future funzionalità</w:t>
+      </w:r>
+      <w:r>
+        <w:t>, ad esempio</w:t>
+      </w:r>
+      <w:r>
+        <w:t xml:space="preserve"> la gestione di lenti personalizzate </w:t>
+      </w:r>
+      <w:r>
+        <w:t>o</w:t>
+      </w:r>
+      <w:r>
+        <w:t xml:space="preserve"> l'applicazione di codici coupon</w:t>
+      </w:r>
+      <w:r>
+        <w:t>. G</w:t>
+      </w:r>
+      <w:r>
+        <w:t>arantendo che tali modifiche richiedano solo l'aggiunta di nuove entità o attributi e</w:t>
+      </w:r>
+      <w:r>
+        <w:t>d eventualmente la modifica</w:t>
+      </w:r>
+      <w:r>
+        <w:t xml:space="preserve"> delle relative viste JSP</w:t>
+      </w:r>
+      <w:r>
+        <w:t>.</w:t>
+      </w:r>
+    </w:p>
+    <w:p>
+      <w:pPr>
+        <w:spacing w:before="100" w:after="100"/>
+        <w:ind w:left="1418"/>
+      </w:pPr>
+    </w:p>
+    <w:p>
+      <w:pPr>
+        <w:spacing w:before="100" w:after="100"/>
+        <w:ind w:left="1418"/>
+      </w:pPr>
     </w:p>
     <w:p>
       <w:pPr>
@@ -5834,28 +6501,39 @@
         <w:rPr>
           <w:b w:val="0"/>
           <w:bCs w:val="0"/>
-        </w:rPr>
-      </w:pPr>
-      <w:bookmarkStart w:id="22" w:name="_Toc243380187"/>
+          <w:sz w:val="26"/>
+          <w:szCs w:val="26"/>
+        </w:rPr>
+      </w:pPr>
+      <w:bookmarkStart w:id="21" w:name="_Toc243657082"/>
       <w:r>
         <w:rPr>
           <w:b w:val="0"/>
           <w:bCs w:val="0"/>
-        </w:rPr>
-        <w:t>Scenarios</w:t>
-      </w:r>
-      <w:bookmarkEnd w:id="22"/>
-    </w:p>
-    <w:p>
-      <w:pPr>
-        <w:tabs>
-          <w:tab w:val="left" w:pos="8580"/>
-        </w:tabs>
-        <w:spacing w:after="100"/>
+          <w:sz w:val="26"/>
+          <w:szCs w:val="26"/>
+        </w:rPr>
+        <w:lastRenderedPageBreak/>
+        <w:t>Physical environment</w:t>
+      </w:r>
+      <w:bookmarkEnd w:id="21"/>
+    </w:p>
+    <w:p>
+      <w:pPr>
+        <w:spacing w:before="100" w:after="100"/>
         <w:ind w:left="1418"/>
       </w:pPr>
       <w:r>
-        <w:t>A</w:t>
+        <w:t xml:space="preserve">RFN15: </w:t>
+      </w:r>
+      <w:r>
+        <w:t xml:space="preserve">Il sistema opera su un'architettura distribuita su </w:t>
+      </w:r>
+      <w:r>
+        <w:t>un’unica sede</w:t>
+      </w:r>
+      <w:r>
+        <w:t>: le componenti server (server applicativo Tomcat e database MySQL) risiedono in un'unica postazione fissa (data center/server room), mentre i dispositivi client (computer desktop, notebook, smartphone e tablet) operano distribuiti in molteplici postazioni, connettendosi da remoto tramite rete Internet o rete locale.</w:t>
       </w:r>
     </w:p>
     <w:p>
@@ -5869,29 +6547,114 @@
         <w:rPr>
           <w:b w:val="0"/>
           <w:bCs w:val="0"/>
-        </w:rPr>
-      </w:pPr>
-      <w:bookmarkStart w:id="23" w:name="_Toc243380188"/>
+          <w:sz w:val="26"/>
+          <w:szCs w:val="26"/>
+        </w:rPr>
+      </w:pPr>
+      <w:bookmarkStart w:id="22" w:name="_Toc243657083"/>
       <w:r>
         <w:rPr>
           <w:b w:val="0"/>
           <w:bCs w:val="0"/>
-        </w:rPr>
-        <w:t>Use case model</w:t>
+          <w:sz w:val="26"/>
+          <w:szCs w:val="26"/>
+        </w:rPr>
+        <w:t>Security issues</w:t>
+      </w:r>
+      <w:bookmarkEnd w:id="22"/>
+    </w:p>
+    <w:p>
+      <w:pPr>
+        <w:spacing w:before="100" w:after="120"/>
+        <w:ind w:left="1418"/>
+      </w:pPr>
+      <w:r>
+        <w:t>RNF6:</w:t>
+      </w:r>
+      <w:r>
+        <w:t xml:space="preserve"> Per garantire affidabilità e sicurezza dei dati sensibili dei clienti e dei dipendenti, il sistema deve essere in grado di resistere a specifici attacchi di sicurezza. Vengono, pertanto, richieste all'utente la scelta di password robuste a protezione del suo account. Password che verranno poi criptate per i fini di sicurezza e conservate all'interno di un database (DB) protetto da un Firewall.</w:t>
+      </w:r>
+    </w:p>
+    <w:p>
+      <w:pPr>
+        <w:pStyle w:val="Titolo2"/>
+        <w:numPr>
+          <w:ilvl w:val="2"/>
+          <w:numId w:val="6"/>
+        </w:numPr>
+        <w:spacing w:before="100" w:after="100"/>
+        <w:ind w:left="1418" w:hanging="709"/>
+        <w:rPr>
+          <w:b w:val="0"/>
+          <w:bCs w:val="0"/>
+          <w:sz w:val="26"/>
+          <w:szCs w:val="26"/>
+        </w:rPr>
+      </w:pPr>
+      <w:bookmarkStart w:id="23" w:name="_Toc243657084"/>
+      <w:r>
+        <w:rPr>
+          <w:b w:val="0"/>
+          <w:bCs w:val="0"/>
+          <w:sz w:val="26"/>
+          <w:szCs w:val="26"/>
+        </w:rPr>
+        <w:t>Resources and management issues</w:t>
       </w:r>
       <w:bookmarkEnd w:id="23"/>
     </w:p>
     <w:p>
       <w:pPr>
-        <w:tabs>
-          <w:tab w:val="left" w:pos="8580"/>
-        </w:tabs>
-        <w:spacing w:after="100"/>
         <w:ind w:left="1418"/>
       </w:pPr>
       <w:r>
-        <w:t>a</w:t>
-      </w:r>
+        <w:t xml:space="preserve">RFN16: </w:t>
+      </w:r>
+      <w:r>
+        <w:t xml:space="preserve">Il sistema deve prevedere una procedura di backup automatizzata con frequenza giornaliera per </w:t>
+      </w:r>
+      <w:r>
+        <w:t>il DB</w:t>
+      </w:r>
+      <w:r>
+        <w:t xml:space="preserve"> e con frequenza settimanale per le risorse statiche (immagini degli occhiali</w:t>
+      </w:r>
+      <w:r>
+        <w:t>, banner pubblicitari</w:t>
+      </w:r>
+      <w:r>
+        <w:t>)</w:t>
+      </w:r>
+      <w:r>
+        <w:t>. L</w:t>
+      </w:r>
+      <w:r>
+        <w:t xml:space="preserve">a responsabilità della corretta esecuzione, verifica e conservazione dei backup è assegnata </w:t>
+      </w:r>
+      <w:r>
+        <w:t>all’User Manager (</w:t>
+      </w:r>
+      <w:r>
+        <w:t>in qualità di amministratore della piattaforma).</w:t>
+      </w:r>
+    </w:p>
+    <w:p/>
+    <w:p>
+      <w:pPr>
+        <w:pStyle w:val="Titolo2"/>
+        <w:numPr>
+          <w:ilvl w:val="1"/>
+          <w:numId w:val="6"/>
+        </w:numPr>
+      </w:pPr>
+      <w:r>
+        <w:t xml:space="preserve"> </w:t>
+      </w:r>
+      <w:bookmarkStart w:id="24" w:name="_Toc243657085"/>
+      <w:r>
+        <w:t>System models</w:t>
+      </w:r>
+      <w:bookmarkEnd w:id="24"/>
     </w:p>
     <w:p>
       <w:pPr>
@@ -5906,15 +6669,17 @@
           <w:bCs w:val="0"/>
         </w:rPr>
       </w:pPr>
-      <w:bookmarkStart w:id="24" w:name="_Toc243380189"/>
+      <w:bookmarkStart w:id="25" w:name="_Toc243657086"/>
+      <w:proofErr w:type="spellStart"/>
       <w:r>
         <w:rPr>
           <w:b w:val="0"/>
           <w:bCs w:val="0"/>
         </w:rPr>
-        <w:t>Object model</w:t>
-      </w:r>
-      <w:bookmarkEnd w:id="24"/>
+        <w:t>Scenarios</w:t>
+      </w:r>
+      <w:bookmarkEnd w:id="25"/>
+      <w:proofErr w:type="spellEnd"/>
     </w:p>
     <w:p>
       <w:pPr>
@@ -5925,7 +6690,7 @@
         <w:ind w:left="1418"/>
       </w:pPr>
       <w:r>
-        <w:t>a</w:t>
+        <w:t>A</w:t>
       </w:r>
     </w:p>
     <w:p>
@@ -5941,15 +6706,15 @@
           <w:bCs w:val="0"/>
         </w:rPr>
       </w:pPr>
-      <w:bookmarkStart w:id="25" w:name="_Toc243380190"/>
+      <w:bookmarkStart w:id="26" w:name="_Toc243657087"/>
       <w:r>
         <w:rPr>
           <w:b w:val="0"/>
           <w:bCs w:val="0"/>
         </w:rPr>
-        <w:t>Dynamic model</w:t>
-      </w:r>
-      <w:bookmarkEnd w:id="25"/>
+        <w:t>Use case model</w:t>
+      </w:r>
+      <w:bookmarkEnd w:id="26"/>
     </w:p>
     <w:p>
       <w:pPr>
@@ -5974,20 +6739,89 @@
         <w:rPr>
           <w:b w:val="0"/>
           <w:bCs w:val="0"/>
-          <w:lang w:val="en-US"/>
-        </w:rPr>
-      </w:pPr>
-      <w:bookmarkStart w:id="26" w:name="_Toc243380191"/>
-      <w:r>
+        </w:rPr>
+      </w:pPr>
+      <w:bookmarkStart w:id="27" w:name="_Toc243657088"/>
+      <w:r>
+        <w:rPr>
+          <w:b w:val="0"/>
+          <w:bCs w:val="0"/>
+        </w:rPr>
+        <w:t>Object model</w:t>
+      </w:r>
+      <w:bookmarkEnd w:id="27"/>
+    </w:p>
+    <w:p>
+      <w:pPr>
+        <w:tabs>
+          <w:tab w:val="left" w:pos="8580"/>
+        </w:tabs>
+        <w:spacing w:after="100"/>
+        <w:ind w:left="1418"/>
+      </w:pPr>
+      <w:r>
+        <w:t>a</w:t>
+      </w:r>
+    </w:p>
+    <w:p>
+      <w:pPr>
+        <w:pStyle w:val="Titolo2"/>
+        <w:numPr>
+          <w:ilvl w:val="2"/>
+          <w:numId w:val="6"/>
+        </w:numPr>
+        <w:ind w:left="1418" w:hanging="709"/>
+        <w:rPr>
+          <w:b w:val="0"/>
+          <w:bCs w:val="0"/>
+        </w:rPr>
+      </w:pPr>
+      <w:bookmarkStart w:id="28" w:name="_Toc243657089"/>
+      <w:r>
+        <w:rPr>
+          <w:b w:val="0"/>
+          <w:bCs w:val="0"/>
+        </w:rPr>
+        <w:t>Dynamic model</w:t>
+      </w:r>
+      <w:bookmarkEnd w:id="28"/>
+    </w:p>
+    <w:p>
+      <w:pPr>
+        <w:tabs>
+          <w:tab w:val="left" w:pos="8580"/>
+        </w:tabs>
+        <w:spacing w:after="100"/>
+        <w:ind w:left="1418"/>
+      </w:pPr>
+      <w:r>
+        <w:t>a</w:t>
+      </w:r>
+    </w:p>
+    <w:p>
+      <w:pPr>
+        <w:pStyle w:val="Titolo2"/>
+        <w:numPr>
+          <w:ilvl w:val="2"/>
+          <w:numId w:val="6"/>
+        </w:numPr>
+        <w:ind w:left="1418" w:hanging="709"/>
         <w:rPr>
           <w:b w:val="0"/>
           <w:bCs w:val="0"/>
           <w:lang w:val="en-US"/>
         </w:rPr>
-        <w:lastRenderedPageBreak/>
+      </w:pPr>
+      <w:bookmarkStart w:id="29" w:name="_Toc243657090"/>
+      <w:r>
+        <w:rPr>
+          <w:b w:val="0"/>
+          <w:bCs w:val="0"/>
+          <w:lang w:val="en-US"/>
+        </w:rPr>
         <w:t>User interface—navigational paths and screen mock-ups</w:t>
       </w:r>
-      <w:bookmarkEnd w:id="26"/>
+      <w:bookmarkEnd w:id="29"/>
     </w:p>
     <w:p>
       <w:pPr>
@@ -6011,11 +6845,11 @@
         <w:ind w:left="426" w:hanging="426"/>
         <w:jc w:val="left"/>
       </w:pPr>
-      <w:bookmarkStart w:id="27" w:name="_Toc243380192"/>
+      <w:bookmarkStart w:id="30" w:name="_Toc243657091"/>
       <w:r>
         <w:t>GLOSSARY</w:t>
       </w:r>
-      <w:bookmarkEnd w:id="27"/>
+      <w:bookmarkEnd w:id="30"/>
     </w:p>
     <w:p>
       <w:r>
@@ -6037,7 +6871,7 @@
 </file>
 
 <file path=word/endnotes.xml><?xml version="1.0" encoding="utf-8"?>
-<w:endnotes xmlns:wpc="http://schemas.microsoft.com/office/word/2010/wordprocessingCanvas" xmlns:cx="http://schemas.microsoft.com/office/drawing/2014/chartex" xmlns:cx1="http://schemas.microsoft.com/office/drawing/2015/9/8/chartex" xmlns:cx2="http://schemas.microsoft.com/office/drawing/2015/10/21/chartex" xmlns:cx3="http://schemas.microsoft.com/office/drawing/2016/5/9/chartex" xmlns:cx4="http://schemas.microsoft.com/office/drawing/2016/5/10/chartex" xmlns:cx5="http://schemas.microsoft.com/office/drawing/2016/5/11/chartex" xmlns:cx6="http://schemas.microsoft.com/office/drawing/2016/5/12/chartex" xmlns:cx7="http://schemas.microsoft.com/office/drawing/2016/5/13/chartex" xmlns:cx8="http://schemas.microsoft.com/office/drawing/2016/5/14/chartex" xmlns:mc="http://schemas.openxmlformats.org/markup-compatibility/2006" xmlns:aink="http://schemas.microsoft.com/office/drawing/2016/ink" xmlns:am3d="http://schemas.microsoft.com/office/drawing/2017/model3d" xmlns:o="urn:schemas-microsoft-com:office:office" xmlns:oel="http://schemas.microsoft.com/office/2019/extlst" xmlns:r="http://schemas.openxmlformats.org/officeDocument/2006/relationships" xmlns:m="http://schemas.openxmlformats.org/officeDocument/2006/math" xmlns:v="urn:schemas-microsoft-com:vml" xmlns:wp14="http://schemas.microsoft.com/office/word/2010/wordprocessingDrawing" xmlns:wp="http://schemas.openxmlformats.org/drawingml/2006/wordprocessingDrawing" xmlns:w10="urn:schemas-microsoft-com:office:word" xmlns:w="http://schemas.openxmlformats.org/wordprocessingml/2006/main" xmlns:w14="http://schemas.microsoft.com/office/word/2010/wordml" xmlns:w15="http://schemas.microsoft.com/office/word/2012/wordml" xmlns:w16cex="http://schemas.microsoft.com/office/word/2018/wordml/cex" xmlns:w16cid="http://schemas.microsoft.com/office/word/2016/wordml/cid" xmlns:w16="http://schemas.microsoft.com/office/word/2018/wordml" xmlns:w16du="http://schemas.microsoft.com/office/word/2023/wordml/word16du" xmlns:w16sdtdh="http://schemas.microsoft.com/office/word/2020/wordml/sdtdatahash" xmlns:w16sdtfl="http://schemas.microsoft.com/office/word/2024/wordml/sdtformatlock" xmlns:w16se="http://schemas.microsoft.com/office/word/2015/wordml/symex" xmlns:wpg="http://schemas.microsoft.com/office/word/2010/wordprocessingGroup" xmlns:wpi="http://schemas.microsoft.com/office/word/2010/wordprocessingInk" xmlns:wne="http://schemas.microsoft.com/office/word/2006/wordml" xmlns:wps="http://schemas.microsoft.com/office/word/2010/wordprocessingShape" mc:Ignorable="w14 w15 w16se w16cid w16 w16cex w16sdtdh w16sdtfl w16du wp14">
+<w:endnotes xmlns:wpc="http://schemas.microsoft.com/office/word/2010/wordprocessingCanvas" xmlns:cx="http://schemas.microsoft.com/office/drawing/2014/chartex" xmlns:cx1="http://schemas.microsoft.com/office/drawing/2015/9/8/chartex" xmlns:cx2="http://schemas.microsoft.com/office/drawing/2015/10/21/chartex" xmlns:cx3="http://schemas.microsoft.com/office/drawing/2016/5/9/chartex" xmlns:cx4="http://schemas.microsoft.com/office/drawing/2016/5/10/chartex" xmlns:cx5="http://schemas.microsoft.com/office/drawing/2016/5/11/chartex" xmlns:cx6="http://schemas.microsoft.com/office/drawing/2016/5/12/chartex" xmlns:cx7="http://schemas.microsoft.com/office/drawing/2016/5/13/chartex" xmlns:cx8="http://schemas.microsoft.com/office/drawing/2016/5/14/chartex" xmlns:mc="http://schemas.openxmlformats.org/markup-compatibility/2006" xmlns:m="http://schemas.openxmlformats.org/officeDocument/2006/math" xmlns:aink="http://schemas.microsoft.com/office/drawing/2016/ink" xmlns:am3d="http://schemas.microsoft.com/office/drawing/2017/model3d" xmlns:oel="http://schemas.microsoft.com/office/2019/extlst" xmlns:r="http://schemas.openxmlformats.org/officeDocument/2006/relationships" xmlns:wp14="http://schemas.microsoft.com/office/word/2010/wordprocessingDrawing" xmlns:wp="http://schemas.openxmlformats.org/drawingml/2006/wordprocessingDrawing" xmlns:wpg="http://schemas.microsoft.com/office/word/2010/wordprocessingGroup" xmlns:wpi="http://schemas.microsoft.com/office/word/2010/wordprocessingInk" xmlns:wps="http://schemas.microsoft.com/office/word/2010/wordprocessingShape" xmlns:o="urn:schemas-microsoft-com:office:office" xmlns:v="urn:schemas-microsoft-com:vml" xmlns:w10="urn:schemas-microsoft-com:office:word" xmlns:w="http://schemas.openxmlformats.org/wordprocessingml/2006/main" xmlns:w14="http://schemas.microsoft.com/office/word/2010/wordml" xmlns:w15="http://schemas.microsoft.com/office/word/2012/wordml" xmlns:w16cex="http://schemas.microsoft.com/office/word/2018/wordml/cex" xmlns:w16cid="http://schemas.microsoft.com/office/word/2016/wordml/cid" xmlns:w16="http://schemas.microsoft.com/office/word/2018/wordml" xmlns:w16sdtdh="http://schemas.microsoft.com/office/word/2020/wordml/sdtdatahash" xmlns:w16sdtfl="http://schemas.microsoft.com/office/word/2024/wordml/sdtformatlock" xmlns:w16se="http://schemas.microsoft.com/office/word/2015/wordml/symex" xmlns:w16du="http://schemas.microsoft.com/office/word/2023/wordml/word16du" xmlns:wne="http://schemas.microsoft.com/office/word/2006/wordml" mc:Ignorable="w14 w15 w16se w16cid w16 w16cex w16sdtdh w16sdtfl w16du wp14">
   <w:endnote w:type="separator" w:id="-1">
     <w:p>
       <w:r>
@@ -6056,7 +6890,7 @@
 </file>
 
 <file path=word/footer1.xml><?xml version="1.0" encoding="utf-8"?>
-<w:ftr xmlns:wpc="http://schemas.microsoft.com/office/word/2010/wordprocessingCanvas" xmlns:cx="http://schemas.microsoft.com/office/drawing/2014/chartex" xmlns:cx1="http://schemas.microsoft.com/office/drawing/2015/9/8/chartex" xmlns:cx2="http://schemas.microsoft.com/office/drawing/2015/10/21/chartex" xmlns:cx3="http://schemas.microsoft.com/office/drawing/2016/5/9/chartex" xmlns:cx4="http://schemas.microsoft.com/office/drawing/2016/5/10/chartex" xmlns:cx5="http://schemas.microsoft.com/office/drawing/2016/5/11/chartex" xmlns:cx6="http://schemas.microsoft.com/office/drawing/2016/5/12/chartex" xmlns:cx7="http://schemas.microsoft.com/office/drawing/2016/5/13/chartex" xmlns:cx8="http://schemas.microsoft.com/office/drawing/2016/5/14/chartex" xmlns:mc="http://schemas.openxmlformats.org/markup-compatibility/2006" xmlns:aink="http://schemas.microsoft.com/office/drawing/2016/ink" xmlns:am3d="http://schemas.microsoft.com/office/drawing/2017/model3d" xmlns:o="urn:schemas-microsoft-com:office:office" xmlns:oel="http://schemas.microsoft.com/office/2019/extlst" xmlns:r="http://schemas.openxmlformats.org/officeDocument/2006/relationships" xmlns:m="http://schemas.openxmlformats.org/officeDocument/2006/math" xmlns:v="urn:schemas-microsoft-com:vml" xmlns:wp14="http://schemas.microsoft.com/office/word/2010/wordprocessingDrawing" xmlns:wp="http://schemas.openxmlformats.org/drawingml/2006/wordprocessingDrawing" xmlns:w10="urn:schemas-microsoft-com:office:word" xmlns:w="http://schemas.openxmlformats.org/wordprocessingml/2006/main" xmlns:w14="http://schemas.microsoft.com/office/word/2010/wordml" xmlns:w15="http://schemas.microsoft.com/office/word/2012/wordml" xmlns:w16cex="http://schemas.microsoft.com/office/word/2018/wordml/cex" xmlns:w16cid="http://schemas.microsoft.com/office/word/2016/wordml/cid" xmlns:w16="http://schemas.microsoft.com/office/word/2018/wordml" xmlns:w16du="http://schemas.microsoft.com/office/word/2023/wordml/word16du" xmlns:w16sdtdh="http://schemas.microsoft.com/office/word/2020/wordml/sdtdatahash" xmlns:w16sdtfl="http://schemas.microsoft.com/office/word/2024/wordml/sdtformatlock" xmlns:w16se="http://schemas.microsoft.com/office/word/2015/wordml/symex" xmlns:wpg="http://schemas.microsoft.com/office/word/2010/wordprocessingGroup" xmlns:wpi="http://schemas.microsoft.com/office/word/2010/wordprocessingInk" xmlns:wne="http://schemas.microsoft.com/office/word/2006/wordml" xmlns:wps="http://schemas.microsoft.com/office/word/2010/wordprocessingShape" mc:Ignorable="w14 w15 w16se w16cid w16 w16cex w16sdtdh w16sdtfl w16du wp14">
+<w:ftr xmlns:wpc="http://schemas.microsoft.com/office/word/2010/wordprocessingCanvas" xmlns:cx="http://schemas.microsoft.com/office/drawing/2014/chartex" xmlns:cx1="http://schemas.microsoft.com/office/drawing/2015/9/8/chartex" xmlns:cx2="http://schemas.microsoft.com/office/drawing/2015/10/21/chartex" xmlns:cx3="http://schemas.microsoft.com/office/drawing/2016/5/9/chartex" xmlns:cx4="http://schemas.microsoft.com/office/drawing/2016/5/10/chartex" xmlns:cx5="http://schemas.microsoft.com/office/drawing/2016/5/11/chartex" xmlns:cx6="http://schemas.microsoft.com/office/drawing/2016/5/12/chartex" xmlns:cx7="http://schemas.microsoft.com/office/drawing/2016/5/13/chartex" xmlns:cx8="http://schemas.microsoft.com/office/drawing/2016/5/14/chartex" xmlns:mc="http://schemas.openxmlformats.org/markup-compatibility/2006" xmlns:m="http://schemas.openxmlformats.org/officeDocument/2006/math" xmlns:aink="http://schemas.microsoft.com/office/drawing/2016/ink" xmlns:am3d="http://schemas.microsoft.com/office/drawing/2017/model3d" xmlns:oel="http://schemas.microsoft.com/office/2019/extlst" xmlns:r="http://schemas.openxmlformats.org/officeDocument/2006/relationships" xmlns:wp14="http://schemas.microsoft.com/office/word/2010/wordprocessingDrawing" xmlns:wp="http://schemas.openxmlformats.org/drawingml/2006/wordprocessingDrawing" xmlns:wpg="http://schemas.microsoft.com/office/word/2010/wordprocessingGroup" xmlns:wpi="http://schemas.microsoft.com/office/word/2010/wordprocessingInk" xmlns:wps="http://schemas.microsoft.com/office/word/2010/wordprocessingShape" xmlns:o="urn:schemas-microsoft-com:office:office" xmlns:v="urn:schemas-microsoft-com:vml" xmlns:w10="urn:schemas-microsoft-com:office:word" xmlns:w="http://schemas.openxmlformats.org/wordprocessingml/2006/main" xmlns:w14="http://schemas.microsoft.com/office/word/2010/wordml" xmlns:w15="http://schemas.microsoft.com/office/word/2012/wordml" xmlns:w16cex="http://schemas.microsoft.com/office/word/2018/wordml/cex" xmlns:w16cid="http://schemas.microsoft.com/office/word/2016/wordml/cid" xmlns:w16="http://schemas.microsoft.com/office/word/2018/wordml" xmlns:w16sdtdh="http://schemas.microsoft.com/office/word/2020/wordml/sdtdatahash" xmlns:w16sdtfl="http://schemas.microsoft.com/office/word/2024/wordml/sdtformatlock" xmlns:w16se="http://schemas.microsoft.com/office/word/2015/wordml/symex" xmlns:w16du="http://schemas.microsoft.com/office/word/2023/wordml/word16du" xmlns:wne="http://schemas.microsoft.com/office/word/2006/wordml" mc:Ignorable="w14 w15 w16se w16cid w16 w16cex w16sdtdh w16sdtfl w16du wp14">
   <w:tbl>
     <w:tblPr>
       <w:tblW w:w="0" w:type="auto"/>
@@ -6224,31 +7058,31 @@
 </file>
 
 <file path=word/footer2.xml><?xml version="1.0" encoding="utf-8"?>
-<w:ftr xmlns:wpc="http://schemas.microsoft.com/office/word/2010/wordprocessingCanvas" xmlns:cx="http://schemas.microsoft.com/office/drawing/2014/chartex" xmlns:cx1="http://schemas.microsoft.com/office/drawing/2015/9/8/chartex" xmlns:cx2="http://schemas.microsoft.com/office/drawing/2015/10/21/chartex" xmlns:cx3="http://schemas.microsoft.com/office/drawing/2016/5/9/chartex" xmlns:cx4="http://schemas.microsoft.com/office/drawing/2016/5/10/chartex" xmlns:cx5="http://schemas.microsoft.com/office/drawing/2016/5/11/chartex" xmlns:cx6="http://schemas.microsoft.com/office/drawing/2016/5/12/chartex" xmlns:cx7="http://schemas.microsoft.com/office/drawing/2016/5/13/chartex" xmlns:cx8="http://schemas.microsoft.com/office/drawing/2016/5/14/chartex" xmlns:mc="http://schemas.openxmlformats.org/markup-compatibility/2006" xmlns:aink="http://schemas.microsoft.com/office/drawing/2016/ink" xmlns:am3d="http://schemas.microsoft.com/office/drawing/2017/model3d" xmlns:o="urn:schemas-microsoft-com:office:office" xmlns:oel="http://schemas.microsoft.com/office/2019/extlst" xmlns:r="http://schemas.openxmlformats.org/officeDocument/2006/relationships" xmlns:m="http://schemas.openxmlformats.org/officeDocument/2006/math" xmlns:v="urn:schemas-microsoft-com:vml" xmlns:wp14="http://schemas.microsoft.com/office/word/2010/wordprocessingDrawing" xmlns:wp="http://schemas.openxmlformats.org/drawingml/2006/wordprocessingDrawing" xmlns:w10="urn:schemas-microsoft-com:office:word" xmlns:w="http://schemas.openxmlformats.org/wordprocessingml/2006/main" xmlns:w14="http://schemas.microsoft.com/office/word/2010/wordml" xmlns:w15="http://schemas.microsoft.com/office/word/2012/wordml" xmlns:w16cex="http://schemas.microsoft.com/office/word/2018/wordml/cex" xmlns:w16cid="http://schemas.microsoft.com/office/word/2016/wordml/cid" xmlns:w16="http://schemas.microsoft.com/office/word/2018/wordml" xmlns:w16du="http://schemas.microsoft.com/office/word/2023/wordml/word16du" xmlns:w16sdtdh="http://schemas.microsoft.com/office/word/2020/wordml/sdtdatahash" xmlns:w16sdtfl="http://schemas.microsoft.com/office/word/2024/wordml/sdtformatlock" xmlns:w16se="http://schemas.microsoft.com/office/word/2015/wordml/symex" xmlns:wpg="http://schemas.microsoft.com/office/word/2010/wordprocessingGroup" xmlns:wpi="http://schemas.microsoft.com/office/word/2010/wordprocessingInk" xmlns:wne="http://schemas.microsoft.com/office/word/2006/wordml" xmlns:wps="http://schemas.microsoft.com/office/word/2010/wordprocessingShape" mc:Ignorable="w14 w15 w16se w16cid w16 w16cex w16sdtdh w16sdtfl w16du wp14">
+<w:ftr xmlns:wpc="http://schemas.microsoft.com/office/word/2010/wordprocessingCanvas" xmlns:cx="http://schemas.microsoft.com/office/drawing/2014/chartex" xmlns:cx1="http://schemas.microsoft.com/office/drawing/2015/9/8/chartex" xmlns:cx2="http://schemas.microsoft.com/office/drawing/2015/10/21/chartex" xmlns:cx3="http://schemas.microsoft.com/office/drawing/2016/5/9/chartex" xmlns:cx4="http://schemas.microsoft.com/office/drawing/2016/5/10/chartex" xmlns:cx5="http://schemas.microsoft.com/office/drawing/2016/5/11/chartex" xmlns:cx6="http://schemas.microsoft.com/office/drawing/2016/5/12/chartex" xmlns:cx7="http://schemas.microsoft.com/office/drawing/2016/5/13/chartex" xmlns:cx8="http://schemas.microsoft.com/office/drawing/2016/5/14/chartex" xmlns:mc="http://schemas.openxmlformats.org/markup-compatibility/2006" xmlns:m="http://schemas.openxmlformats.org/officeDocument/2006/math" xmlns:aink="http://schemas.microsoft.com/office/drawing/2016/ink" xmlns:am3d="http://schemas.microsoft.com/office/drawing/2017/model3d" xmlns:oel="http://schemas.microsoft.com/office/2019/extlst" xmlns:r="http://schemas.openxmlformats.org/officeDocument/2006/relationships" xmlns:wp14="http://schemas.microsoft.com/office/word/2010/wordprocessingDrawing" xmlns:wp="http://schemas.openxmlformats.org/drawingml/2006/wordprocessingDrawing" xmlns:wpg="http://schemas.microsoft.com/office/word/2010/wordprocessingGroup" xmlns:wpi="http://schemas.microsoft.com/office/word/2010/wordprocessingInk" xmlns:wps="http://schemas.microsoft.com/office/word/2010/wordprocessingShape" xmlns:o="urn:schemas-microsoft-com:office:office" xmlns:v="urn:schemas-microsoft-com:vml" xmlns:w10="urn:schemas-microsoft-com:office:word" xmlns:w="http://schemas.openxmlformats.org/wordprocessingml/2006/main" xmlns:w14="http://schemas.microsoft.com/office/word/2010/wordml" xmlns:w15="http://schemas.microsoft.com/office/word/2012/wordml" xmlns:w16cex="http://schemas.microsoft.com/office/word/2018/wordml/cex" xmlns:w16cid="http://schemas.microsoft.com/office/word/2016/wordml/cid" xmlns:w16="http://schemas.microsoft.com/office/word/2018/wordml" xmlns:w16sdtdh="http://schemas.microsoft.com/office/word/2020/wordml/sdtdatahash" xmlns:w16sdtfl="http://schemas.microsoft.com/office/word/2024/wordml/sdtformatlock" xmlns:w16se="http://schemas.microsoft.com/office/word/2015/wordml/symex" xmlns:w16du="http://schemas.microsoft.com/office/word/2023/wordml/word16du" xmlns:wne="http://schemas.microsoft.com/office/word/2006/wordml" mc:Ignorable="w14 w15 w16se w16cid w16 w16cex w16sdtdh w16sdtfl w16du wp14">
   <w:p/>
 </w:ftr>
 </file>
 
 <file path=word/footer3.xml><?xml version="1.0" encoding="utf-8"?>
-<w:ftr xmlns:wpc="http://schemas.microsoft.com/office/word/2010/wordprocessingCanvas" xmlns:cx="http://schemas.microsoft.com/office/drawing/2014/chartex" xmlns:cx1="http://schemas.microsoft.com/office/drawing/2015/9/8/chartex" xmlns:cx2="http://schemas.microsoft.com/office/drawing/2015/10/21/chartex" xmlns:cx3="http://schemas.microsoft.com/office/drawing/2016/5/9/chartex" xmlns:cx4="http://schemas.microsoft.com/office/drawing/2016/5/10/chartex" xmlns:cx5="http://schemas.microsoft.com/office/drawing/2016/5/11/chartex" xmlns:cx6="http://schemas.microsoft.com/office/drawing/2016/5/12/chartex" xmlns:cx7="http://schemas.microsoft.com/office/drawing/2016/5/13/chartex" xmlns:cx8="http://schemas.microsoft.com/office/drawing/2016/5/14/chartex" xmlns:mc="http://schemas.openxmlformats.org/markup-compatibility/2006" xmlns:aink="http://schemas.microsoft.com/office/drawing/2016/ink" xmlns:am3d="http://schemas.microsoft.com/office/drawing/2017/model3d" xmlns:o="urn:schemas-microsoft-com:office:office" xmlns:oel="http://schemas.microsoft.com/office/2019/extlst" xmlns:r="http://schemas.openxmlformats.org/officeDocument/2006/relationships" xmlns:m="http://schemas.openxmlformats.org/officeDocument/2006/math" xmlns:v="urn:schemas-microsoft-com:vml" xmlns:wp14="http://schemas.microsoft.com/office/word/2010/wordprocessingDrawing" xmlns:wp="http://schemas.openxmlformats.org/drawingml/2006/wordprocessingDrawing" xmlns:w10="urn:schemas-microsoft-com:office:word" xmlns:w="http://schemas.openxmlformats.org/wordprocessingml/2006/main" xmlns:w14="http://schemas.microsoft.com/office/word/2010/wordml" xmlns:w15="http://schemas.microsoft.com/office/word/2012/wordml" xmlns:w16cex="http://schemas.microsoft.com/office/word/2018/wordml/cex" xmlns:w16cid="http://schemas.microsoft.com/office/word/2016/wordml/cid" xmlns:w16="http://schemas.microsoft.com/office/word/2018/wordml" xmlns:w16du="http://schemas.microsoft.com/office/word/2023/wordml/word16du" xmlns:w16sdtdh="http://schemas.microsoft.com/office/word/2020/wordml/sdtdatahash" xmlns:w16sdtfl="http://schemas.microsoft.com/office/word/2024/wordml/sdtformatlock" xmlns:w16se="http://schemas.microsoft.com/office/word/2015/wordml/symex" xmlns:wpg="http://schemas.microsoft.com/office/word/2010/wordprocessingGroup" xmlns:wpi="http://schemas.microsoft.com/office/word/2010/wordprocessingInk" xmlns:wne="http://schemas.microsoft.com/office/word/2006/wordml" xmlns:wps="http://schemas.microsoft.com/office/word/2010/wordprocessingShape" mc:Ignorable="w14 w15 w16se w16cid w16 w16cex w16sdtdh w16sdtfl w16du wp14">
+<w:ftr xmlns:wpc="http://schemas.microsoft.com/office/word/2010/wordprocessingCanvas" xmlns:cx="http://schemas.microsoft.com/office/drawing/2014/chartex" xmlns:cx1="http://schemas.microsoft.com/office/drawing/2015/9/8/chartex" xmlns:cx2="http://schemas.microsoft.com/office/drawing/2015/10/21/chartex" xmlns:cx3="http://schemas.microsoft.com/office/drawing/2016/5/9/chartex" xmlns:cx4="http://schemas.microsoft.com/office/drawing/2016/5/10/chartex" xmlns:cx5="http://schemas.microsoft.com/office/drawing/2016/5/11/chartex" xmlns:cx6="http://schemas.microsoft.com/office/drawing/2016/5/12/chartex" xmlns:cx7="http://schemas.microsoft.com/office/drawing/2016/5/13/chartex" xmlns:cx8="http://schemas.microsoft.com/office/drawing/2016/5/14/chartex" xmlns:mc="http://schemas.openxmlformats.org/markup-compatibility/2006" xmlns:m="http://schemas.openxmlformats.org/officeDocument/2006/math" xmlns:aink="http://schemas.microsoft.com/office/drawing/2016/ink" xmlns:am3d="http://schemas.microsoft.com/office/drawing/2017/model3d" xmlns:oel="http://schemas.microsoft.com/office/2019/extlst" xmlns:r="http://schemas.openxmlformats.org/officeDocument/2006/relationships" xmlns:wp14="http://schemas.microsoft.com/office/word/2010/wordprocessingDrawing" xmlns:wp="http://schemas.openxmlformats.org/drawingml/2006/wordprocessingDrawing" xmlns:wpg="http://schemas.microsoft.com/office/word/2010/wordprocessingGroup" xmlns:wpi="http://schemas.microsoft.com/office/word/2010/wordprocessingInk" xmlns:wps="http://schemas.microsoft.com/office/word/2010/wordprocessingShape" xmlns:o="urn:schemas-microsoft-com:office:office" xmlns:v="urn:schemas-microsoft-com:vml" xmlns:w10="urn:schemas-microsoft-com:office:word" xmlns:w="http://schemas.openxmlformats.org/wordprocessingml/2006/main" xmlns:w14="http://schemas.microsoft.com/office/word/2010/wordml" xmlns:w15="http://schemas.microsoft.com/office/word/2012/wordml" xmlns:w16cex="http://schemas.microsoft.com/office/word/2018/wordml/cex" xmlns:w16cid="http://schemas.microsoft.com/office/word/2016/wordml/cid" xmlns:w16="http://schemas.microsoft.com/office/word/2018/wordml" xmlns:w16sdtdh="http://schemas.microsoft.com/office/word/2020/wordml/sdtdatahash" xmlns:w16sdtfl="http://schemas.microsoft.com/office/word/2024/wordml/sdtformatlock" xmlns:w16se="http://schemas.microsoft.com/office/word/2015/wordml/symex" xmlns:w16du="http://schemas.microsoft.com/office/word/2023/wordml/word16du" xmlns:wne="http://schemas.microsoft.com/office/word/2006/wordml" mc:Ignorable="w14 w15 w16se w16cid w16 w16cex w16sdtdh w16sdtfl w16du wp14">
   <w:p/>
 </w:ftr>
 </file>
 
 <file path=word/footer4.xml><?xml version="1.0" encoding="utf-8"?>
-<w:ftr xmlns:wpc="http://schemas.microsoft.com/office/word/2010/wordprocessingCanvas" xmlns:cx="http://schemas.microsoft.com/office/drawing/2014/chartex" xmlns:cx1="http://schemas.microsoft.com/office/drawing/2015/9/8/chartex" xmlns:cx2="http://schemas.microsoft.com/office/drawing/2015/10/21/chartex" xmlns:cx3="http://schemas.microsoft.com/office/drawing/2016/5/9/chartex" xmlns:cx4="http://schemas.microsoft.com/office/drawing/2016/5/10/chartex" xmlns:cx5="http://schemas.microsoft.com/office/drawing/2016/5/11/chartex" xmlns:cx6="http://schemas.microsoft.com/office/drawing/2016/5/12/chartex" xmlns:cx7="http://schemas.microsoft.com/office/drawing/2016/5/13/chartex" xmlns:cx8="http://schemas.microsoft.com/office/drawing/2016/5/14/chartex" xmlns:mc="http://schemas.openxmlformats.org/markup-compatibility/2006" xmlns:aink="http://schemas.microsoft.com/office/drawing/2016/ink" xmlns:am3d="http://schemas.microsoft.com/office/drawing/2017/model3d" xmlns:o="urn:schemas-microsoft-com:office:office" xmlns:oel="http://schemas.microsoft.com/office/2019/extlst" xmlns:r="http://schemas.openxmlformats.org/officeDocument/2006/relationships" xmlns:m="http://schemas.openxmlformats.org/officeDocument/2006/math" xmlns:v="urn:schemas-microsoft-com:vml" xmlns:wp14="http://schemas.microsoft.com/office/word/2010/wordprocessingDrawing" xmlns:wp="http://schemas.openxmlformats.org/drawingml/2006/wordprocessingDrawing" xmlns:w10="urn:schemas-microsoft-com:office:word" xmlns:w="http://schemas.openxmlformats.org/wordprocessingml/2006/main" xmlns:w14="http://schemas.microsoft.com/office/word/2010/wordml" xmlns:w15="http://schemas.microsoft.com/office/word/2012/wordml" xmlns:w16cex="http://schemas.microsoft.com/office/word/2018/wordml/cex" xmlns:w16cid="http://schemas.microsoft.com/office/word/2016/wordml/cid" xmlns:w16="http://schemas.microsoft.com/office/word/2018/wordml" xmlns:w16du="http://schemas.microsoft.com/office/word/2023/wordml/word16du" xmlns:w16sdtdh="http://schemas.microsoft.com/office/word/2020/wordml/sdtdatahash" xmlns:w16sdtfl="http://schemas.microsoft.com/office/word/2024/wordml/sdtformatlock" xmlns:w16se="http://schemas.microsoft.com/office/word/2015/wordml/symex" xmlns:wpg="http://schemas.microsoft.com/office/word/2010/wordprocessingGroup" xmlns:wpi="http://schemas.microsoft.com/office/word/2010/wordprocessingInk" xmlns:wne="http://schemas.microsoft.com/office/word/2006/wordml" xmlns:wps="http://schemas.microsoft.com/office/word/2010/wordprocessingShape" mc:Ignorable="w14 w15 w16se w16cid w16 w16cex w16sdtdh w16sdtfl w16du wp14">
+<w:ftr xmlns:wpc="http://schemas.microsoft.com/office/word/2010/wordprocessingCanvas" xmlns:cx="http://schemas.microsoft.com/office/drawing/2014/chartex" xmlns:cx1="http://schemas.microsoft.com/office/drawing/2015/9/8/chartex" xmlns:cx2="http://schemas.microsoft.com/office/drawing/2015/10/21/chartex" xmlns:cx3="http://schemas.microsoft.com/office/drawing/2016/5/9/chartex" xmlns:cx4="http://schemas.microsoft.com/office/drawing/2016/5/10/chartex" xmlns:cx5="http://schemas.microsoft.com/office/drawing/2016/5/11/chartex" xmlns:cx6="http://schemas.microsoft.com/office/drawing/2016/5/12/chartex" xmlns:cx7="http://schemas.microsoft.com/office/drawing/2016/5/13/chartex" xmlns:cx8="http://schemas.microsoft.com/office/drawing/2016/5/14/chartex" xmlns:mc="http://schemas.openxmlformats.org/markup-compatibility/2006" xmlns:m="http://schemas.openxmlformats.org/officeDocument/2006/math" xmlns:aink="http://schemas.microsoft.com/office/drawing/2016/ink" xmlns:am3d="http://schemas.microsoft.com/office/drawing/2017/model3d" xmlns:oel="http://schemas.microsoft.com/office/2019/extlst" xmlns:r="http://schemas.openxmlformats.org/officeDocument/2006/relationships" xmlns:wp14="http://schemas.microsoft.com/office/word/2010/wordprocessingDrawing" xmlns:wp="http://schemas.openxmlformats.org/drawingml/2006/wordprocessingDrawing" xmlns:wpg="http://schemas.microsoft.com/office/word/2010/wordprocessingGroup" xmlns:wpi="http://schemas.microsoft.com/office/word/2010/wordprocessingInk" xmlns:wps="http://schemas.microsoft.com/office/word/2010/wordprocessingShape" xmlns:o="urn:schemas-microsoft-com:office:office" xmlns:v="urn:schemas-microsoft-com:vml" xmlns:w10="urn:schemas-microsoft-com:office:word" xmlns:w="http://schemas.openxmlformats.org/wordprocessingml/2006/main" xmlns:w14="http://schemas.microsoft.com/office/word/2010/wordml" xmlns:w15="http://schemas.microsoft.com/office/word/2012/wordml" xmlns:w16cex="http://schemas.microsoft.com/office/word/2018/wordml/cex" xmlns:w16cid="http://schemas.microsoft.com/office/word/2016/wordml/cid" xmlns:w16="http://schemas.microsoft.com/office/word/2018/wordml" xmlns:w16sdtdh="http://schemas.microsoft.com/office/word/2020/wordml/sdtdatahash" xmlns:w16sdtfl="http://schemas.microsoft.com/office/word/2024/wordml/sdtformatlock" xmlns:w16se="http://schemas.microsoft.com/office/word/2015/wordml/symex" xmlns:w16du="http://schemas.microsoft.com/office/word/2023/wordml/word16du" xmlns:wne="http://schemas.microsoft.com/office/word/2006/wordml" mc:Ignorable="w14 w15 w16se w16cid w16 w16cex w16sdtdh w16sdtfl w16du wp14">
   <w:p/>
 </w:ftr>
 </file>
 
 <file path=word/footer5.xml><?xml version="1.0" encoding="utf-8"?>
-<w:ftr xmlns:wpc="http://schemas.microsoft.com/office/word/2010/wordprocessingCanvas" xmlns:cx="http://schemas.microsoft.com/office/drawing/2014/chartex" xmlns:cx1="http://schemas.microsoft.com/office/drawing/2015/9/8/chartex" xmlns:cx2="http://schemas.microsoft.com/office/drawing/2015/10/21/chartex" xmlns:cx3="http://schemas.microsoft.com/office/drawing/2016/5/9/chartex" xmlns:cx4="http://schemas.microsoft.com/office/drawing/2016/5/10/chartex" xmlns:cx5="http://schemas.microsoft.com/office/drawing/2016/5/11/chartex" xmlns:cx6="http://schemas.microsoft.com/office/drawing/2016/5/12/chartex" xmlns:cx7="http://schemas.microsoft.com/office/drawing/2016/5/13/chartex" xmlns:cx8="http://schemas.microsoft.com/office/drawing/2016/5/14/chartex" xmlns:mc="http://schemas.openxmlformats.org/markup-compatibility/2006" xmlns:aink="http://schemas.microsoft.com/office/drawing/2016/ink" xmlns:am3d="http://schemas.microsoft.com/office/drawing/2017/model3d" xmlns:o="urn:schemas-microsoft-com:office:office" xmlns:oel="http://schemas.microsoft.com/office/2019/extlst" xmlns:r="http://schemas.openxmlformats.org/officeDocument/2006/relationships" xmlns:m="http://schemas.openxmlformats.org/officeDocument/2006/math" xmlns:v="urn:schemas-microsoft-com:vml" xmlns:wp14="http://schemas.microsoft.com/office/word/2010/wordprocessingDrawing" xmlns:wp="http://schemas.openxmlformats.org/drawingml/2006/wordprocessingDrawing" xmlns:w10="urn:schemas-microsoft-com:office:word" xmlns:w="http://schemas.openxmlformats.org/wordprocessingml/2006/main" xmlns:w14="http://schemas.microsoft.com/office/word/2010/wordml" xmlns:w15="http://schemas.microsoft.com/office/word/2012/wordml" xmlns:w16cex="http://schemas.microsoft.com/office/word/2018/wordml/cex" xmlns:w16cid="http://schemas.microsoft.com/office/word/2016/wordml/cid" xmlns:w16="http://schemas.microsoft.com/office/word/2018/wordml" xmlns:w16du="http://schemas.microsoft.com/office/word/2023/wordml/word16du" xmlns:w16sdtdh="http://schemas.microsoft.com/office/word/2020/wordml/sdtdatahash" xmlns:w16sdtfl="http://schemas.microsoft.com/office/word/2024/wordml/sdtformatlock" xmlns:w16se="http://schemas.microsoft.com/office/word/2015/wordml/symex" xmlns:wpg="http://schemas.microsoft.com/office/word/2010/wordprocessingGroup" xmlns:wpi="http://schemas.microsoft.com/office/word/2010/wordprocessingInk" xmlns:wne="http://schemas.microsoft.com/office/word/2006/wordml" xmlns:wps="http://schemas.microsoft.com/office/word/2010/wordprocessingShape" mc:Ignorable="w14 w15 w16se w16cid w16 w16cex w16sdtdh w16sdtfl w16du wp14">
+<w:ftr xmlns:wpc="http://schemas.microsoft.com/office/word/2010/wordprocessingCanvas" xmlns:cx="http://schemas.microsoft.com/office/drawing/2014/chartex" xmlns:cx1="http://schemas.microsoft.com/office/drawing/2015/9/8/chartex" xmlns:cx2="http://schemas.microsoft.com/office/drawing/2015/10/21/chartex" xmlns:cx3="http://schemas.microsoft.com/office/drawing/2016/5/9/chartex" xmlns:cx4="http://schemas.microsoft.com/office/drawing/2016/5/10/chartex" xmlns:cx5="http://schemas.microsoft.com/office/drawing/2016/5/11/chartex" xmlns:cx6="http://schemas.microsoft.com/office/drawing/2016/5/12/chartex" xmlns:cx7="http://schemas.microsoft.com/office/drawing/2016/5/13/chartex" xmlns:cx8="http://schemas.microsoft.com/office/drawing/2016/5/14/chartex" xmlns:mc="http://schemas.openxmlformats.org/markup-compatibility/2006" xmlns:m="http://schemas.openxmlformats.org/officeDocument/2006/math" xmlns:aink="http://schemas.microsoft.com/office/drawing/2016/ink" xmlns:am3d="http://schemas.microsoft.com/office/drawing/2017/model3d" xmlns:oel="http://schemas.microsoft.com/office/2019/extlst" xmlns:r="http://schemas.openxmlformats.org/officeDocument/2006/relationships" xmlns:wp14="http://schemas.microsoft.com/office/word/2010/wordprocessingDrawing" xmlns:wp="http://schemas.openxmlformats.org/drawingml/2006/wordprocessingDrawing" xmlns:wpg="http://schemas.microsoft.com/office/word/2010/wordprocessingGroup" xmlns:wpi="http://schemas.microsoft.com/office/word/2010/wordprocessingInk" xmlns:wps="http://schemas.microsoft.com/office/word/2010/wordprocessingShape" xmlns:o="urn:schemas-microsoft-com:office:office" xmlns:v="urn:schemas-microsoft-com:vml" xmlns:w10="urn:schemas-microsoft-com:office:word" xmlns:w="http://schemas.openxmlformats.org/wordprocessingml/2006/main" xmlns:w14="http://schemas.microsoft.com/office/word/2010/wordml" xmlns:w15="http://schemas.microsoft.com/office/word/2012/wordml" xmlns:w16cex="http://schemas.microsoft.com/office/word/2018/wordml/cex" xmlns:w16cid="http://schemas.microsoft.com/office/word/2016/wordml/cid" xmlns:w16="http://schemas.microsoft.com/office/word/2018/wordml" xmlns:w16sdtdh="http://schemas.microsoft.com/office/word/2020/wordml/sdtdatahash" xmlns:w16sdtfl="http://schemas.microsoft.com/office/word/2024/wordml/sdtformatlock" xmlns:w16se="http://schemas.microsoft.com/office/word/2015/wordml/symex" xmlns:w16du="http://schemas.microsoft.com/office/word/2023/wordml/word16du" xmlns:wne="http://schemas.microsoft.com/office/word/2006/wordml" mc:Ignorable="w14 w15 w16se w16cid w16 w16cex w16sdtdh w16sdtfl w16du wp14">
   <w:p/>
 </w:ftr>
 </file>
 
 <file path=word/footnotes.xml><?xml version="1.0" encoding="utf-8"?>
-<w:footnotes xmlns:wpc="http://schemas.microsoft.com/office/word/2010/wordprocessingCanvas" xmlns:cx="http://schemas.microsoft.com/office/drawing/2014/chartex" xmlns:cx1="http://schemas.microsoft.com/office/drawing/2015/9/8/chartex" xmlns:cx2="http://schemas.microsoft.com/office/drawing/2015/10/21/chartex" xmlns:cx3="http://schemas.microsoft.com/office/drawing/2016/5/9/chartex" xmlns:cx4="http://schemas.microsoft.com/office/drawing/2016/5/10/chartex" xmlns:cx5="http://schemas.microsoft.com/office/drawing/2016/5/11/chartex" xmlns:cx6="http://schemas.microsoft.com/office/drawing/2016/5/12/chartex" xmlns:cx7="http://schemas.microsoft.com/office/drawing/2016/5/13/chartex" xmlns:cx8="http://schemas.microsoft.com/office/drawing/2016/5/14/chartex" xmlns:mc="http://schemas.openxmlformats.org/markup-compatibility/2006" xmlns:aink="http://schemas.microsoft.com/office/drawing/2016/ink" xmlns:am3d="http://schemas.microsoft.com/office/drawing/2017/model3d" xmlns:o="urn:schemas-microsoft-com:office:office" xmlns:oel="http://schemas.microsoft.com/office/2019/extlst" xmlns:r="http://schemas.openxmlformats.org/officeDocument/2006/relationships" xmlns:m="http://schemas.openxmlformats.org/officeDocument/2006/math" xmlns:v="urn:schemas-microsoft-com:vml" xmlns:wp14="http://schemas.microsoft.com/office/word/2010/wordprocessingDrawing" xmlns:wp="http://schemas.openxmlformats.org/drawingml/2006/wordprocessingDrawing" xmlns:w10="urn:schemas-microsoft-com:office:word" xmlns:w="http://schemas.openxmlformats.org/wordprocessingml/2006/main" xmlns:w14="http://schemas.microsoft.com/office/word/2010/wordml" xmlns:w15="http://schemas.microsoft.com/office/word/2012/wordml" xmlns:w16cex="http://schemas.microsoft.com/office/word/2018/wordml/cex" xmlns:w16cid="http://schemas.microsoft.com/office/word/2016/wordml/cid" xmlns:w16="http://schemas.microsoft.com/office/word/2018/wordml" xmlns:w16du="http://schemas.microsoft.com/office/word/2023/wordml/word16du" xmlns:w16sdtdh="http://schemas.microsoft.com/office/word/2020/wordml/sdtdatahash" xmlns:w16sdtfl="http://schemas.microsoft.com/office/word/2024/wordml/sdtformatlock" xmlns:w16se="http://schemas.microsoft.com/office/word/2015/wordml/symex" xmlns:wpg="http://schemas.microsoft.com/office/word/2010/wordprocessingGroup" xmlns:wpi="http://schemas.microsoft.com/office/word/2010/wordprocessingInk" xmlns:wne="http://schemas.microsoft.com/office/word/2006/wordml" xmlns:wps="http://schemas.microsoft.com/office/word/2010/wordprocessingShape" mc:Ignorable="w14 w15 w16se w16cid w16 w16cex w16sdtdh w16sdtfl w16du wp14">
+<w:footnotes xmlns:wpc="http://schemas.microsoft.com/office/word/2010/wordprocessingCanvas" xmlns:cx="http://schemas.microsoft.com/office/drawing/2014/chartex" xmlns:cx1="http://schemas.microsoft.com/office/drawing/2015/9/8/chartex" xmlns:cx2="http://schemas.microsoft.com/office/drawing/2015/10/21/chartex" xmlns:cx3="http://schemas.microsoft.com/office/drawing/2016/5/9/chartex" xmlns:cx4="http://schemas.microsoft.com/office/drawing/2016/5/10/chartex" xmlns:cx5="http://schemas.microsoft.com/office/drawing/2016/5/11/chartex" xmlns:cx6="http://schemas.microsoft.com/office/drawing/2016/5/12/chartex" xmlns:cx7="http://schemas.microsoft.com/office/drawing/2016/5/13/chartex" xmlns:cx8="http://schemas.microsoft.com/office/drawing/2016/5/14/chartex" xmlns:mc="http://schemas.openxmlformats.org/markup-compatibility/2006" xmlns:m="http://schemas.openxmlformats.org/officeDocument/2006/math" xmlns:aink="http://schemas.microsoft.com/office/drawing/2016/ink" xmlns:am3d="http://schemas.microsoft.com/office/drawing/2017/model3d" xmlns:oel="http://schemas.microsoft.com/office/2019/extlst" xmlns:r="http://schemas.openxmlformats.org/officeDocument/2006/relationships" xmlns:wp14="http://schemas.microsoft.com/office/word/2010/wordprocessingDrawing" xmlns:wp="http://schemas.openxmlformats.org/drawingml/2006/wordprocessingDrawing" xmlns:wpg="http://schemas.microsoft.com/office/word/2010/wordprocessingGroup" xmlns:wpi="http://schemas.microsoft.com/office/word/2010/wordprocessingInk" xmlns:wps="http://schemas.microsoft.com/office/word/2010/wordprocessingShape" xmlns:o="urn:schemas-microsoft-com:office:office" xmlns:v="urn:schemas-microsoft-com:vml" xmlns:w10="urn:schemas-microsoft-com:office:word" xmlns:w="http://schemas.openxmlformats.org/wordprocessingml/2006/main" xmlns:w14="http://schemas.microsoft.com/office/word/2010/wordml" xmlns:w15="http://schemas.microsoft.com/office/word/2012/wordml" xmlns:w16cex="http://schemas.microsoft.com/office/word/2018/wordml/cex" xmlns:w16cid="http://schemas.microsoft.com/office/word/2016/wordml/cid" xmlns:w16="http://schemas.microsoft.com/office/word/2018/wordml" xmlns:w16sdtdh="http://schemas.microsoft.com/office/word/2020/wordml/sdtdatahash" xmlns:w16sdtfl="http://schemas.microsoft.com/office/word/2024/wordml/sdtformatlock" xmlns:w16se="http://schemas.microsoft.com/office/word/2015/wordml/symex" xmlns:w16du="http://schemas.microsoft.com/office/word/2023/wordml/word16du" xmlns:wne="http://schemas.microsoft.com/office/word/2006/wordml" mc:Ignorable="w14 w15 w16se w16cid w16 w16cex w16sdtdh w16sdtfl w16du wp14">
   <w:footnote w:type="separator" w:id="-1">
     <w:p>
       <w:r>
@@ -6267,7 +7101,7 @@
 </file>
 
 <file path=word/header1.xml><?xml version="1.0" encoding="utf-8"?>
-<w:hdr xmlns:wpc="http://schemas.microsoft.com/office/word/2010/wordprocessingCanvas" xmlns:cx="http://schemas.microsoft.com/office/drawing/2014/chartex" xmlns:cx1="http://schemas.microsoft.com/office/drawing/2015/9/8/chartex" xmlns:cx2="http://schemas.microsoft.com/office/drawing/2015/10/21/chartex" xmlns:cx3="http://schemas.microsoft.com/office/drawing/2016/5/9/chartex" xmlns:cx4="http://schemas.microsoft.com/office/drawing/2016/5/10/chartex" xmlns:cx5="http://schemas.microsoft.com/office/drawing/2016/5/11/chartex" xmlns:cx6="http://schemas.microsoft.com/office/drawing/2016/5/12/chartex" xmlns:cx7="http://schemas.microsoft.com/office/drawing/2016/5/13/chartex" xmlns:cx8="http://schemas.microsoft.com/office/drawing/2016/5/14/chartex" xmlns:mc="http://schemas.openxmlformats.org/markup-compatibility/2006" xmlns:aink="http://schemas.microsoft.com/office/drawing/2016/ink" xmlns:am3d="http://schemas.microsoft.com/office/drawing/2017/model3d" xmlns:o="urn:schemas-microsoft-com:office:office" xmlns:oel="http://schemas.microsoft.com/office/2019/extlst" xmlns:r="http://schemas.openxmlformats.org/officeDocument/2006/relationships" xmlns:m="http://schemas.openxmlformats.org/officeDocument/2006/math" xmlns:v="urn:schemas-microsoft-com:vml" xmlns:wp14="http://schemas.microsoft.com/office/word/2010/wordprocessingDrawing" xmlns:wp="http://schemas.openxmlformats.org/drawingml/2006/wordprocessingDrawing" xmlns:w10="urn:schemas-microsoft-com:office:word" xmlns:w="http://schemas.openxmlformats.org/wordprocessingml/2006/main" xmlns:w14="http://schemas.microsoft.com/office/word/2010/wordml" xmlns:w15="http://schemas.microsoft.com/office/word/2012/wordml" xmlns:w16cex="http://schemas.microsoft.com/office/word/2018/wordml/cex" xmlns:w16cid="http://schemas.microsoft.com/office/word/2016/wordml/cid" xmlns:w16="http://schemas.microsoft.com/office/word/2018/wordml" xmlns:w16du="http://schemas.microsoft.com/office/word/2023/wordml/word16du" xmlns:w16sdtdh="http://schemas.microsoft.com/office/word/2020/wordml/sdtdatahash" xmlns:w16sdtfl="http://schemas.microsoft.com/office/word/2024/wordml/sdtformatlock" xmlns:w16se="http://schemas.microsoft.com/office/word/2015/wordml/symex" xmlns:wpg="http://schemas.microsoft.com/office/word/2010/wordprocessingGroup" xmlns:wpi="http://schemas.microsoft.com/office/word/2010/wordprocessingInk" xmlns:wne="http://schemas.microsoft.com/office/word/2006/wordml" xmlns:wps="http://schemas.microsoft.com/office/word/2010/wordprocessingShape" mc:Ignorable="w14 w15 w16se w16cid w16 w16cex w16sdtdh w16sdtfl w16du wp14">
+<w:hdr xmlns:wpc="http://schemas.microsoft.com/office/word/2010/wordprocessingCanvas" xmlns:cx="http://schemas.microsoft.com/office/drawing/2014/chartex" xmlns:cx1="http://schemas.microsoft.com/office/drawing/2015/9/8/chartex" xmlns:cx2="http://schemas.microsoft.com/office/drawing/2015/10/21/chartex" xmlns:cx3="http://schemas.microsoft.com/office/drawing/2016/5/9/chartex" xmlns:cx4="http://schemas.microsoft.com/office/drawing/2016/5/10/chartex" xmlns:cx5="http://schemas.microsoft.com/office/drawing/2016/5/11/chartex" xmlns:cx6="http://schemas.microsoft.com/office/drawing/2016/5/12/chartex" xmlns:cx7="http://schemas.microsoft.com/office/drawing/2016/5/13/chartex" xmlns:cx8="http://schemas.microsoft.com/office/drawing/2016/5/14/chartex" xmlns:mc="http://schemas.openxmlformats.org/markup-compatibility/2006" xmlns:m="http://schemas.openxmlformats.org/officeDocument/2006/math" xmlns:aink="http://schemas.microsoft.com/office/drawing/2016/ink" xmlns:am3d="http://schemas.microsoft.com/office/drawing/2017/model3d" xmlns:oel="http://schemas.microsoft.com/office/2019/extlst" xmlns:r="http://schemas.openxmlformats.org/officeDocument/2006/relationships" xmlns:wp14="http://schemas.microsoft.com/office/word/2010/wordprocessingDrawing" xmlns:wp="http://schemas.openxmlformats.org/drawingml/2006/wordprocessingDrawing" xmlns:wpg="http://schemas.microsoft.com/office/word/2010/wordprocessingGroup" xmlns:wpi="http://schemas.microsoft.com/office/word/2010/wordprocessingInk" xmlns:wps="http://schemas.microsoft.com/office/word/2010/wordprocessingShape" xmlns:o="urn:schemas-microsoft-com:office:office" xmlns:v="urn:schemas-microsoft-com:vml" xmlns:w10="urn:schemas-microsoft-com:office:word" xmlns:w="http://schemas.openxmlformats.org/wordprocessingml/2006/main" xmlns:w14="http://schemas.microsoft.com/office/word/2010/wordml" xmlns:w15="http://schemas.microsoft.com/office/word/2012/wordml" xmlns:w16cex="http://schemas.microsoft.com/office/word/2018/wordml/cex" xmlns:w16cid="http://schemas.microsoft.com/office/word/2016/wordml/cid" xmlns:w16="http://schemas.microsoft.com/office/word/2018/wordml" xmlns:w16sdtdh="http://schemas.microsoft.com/office/word/2020/wordml/sdtdatahash" xmlns:w16sdtfl="http://schemas.microsoft.com/office/word/2024/wordml/sdtformatlock" xmlns:w16se="http://schemas.microsoft.com/office/word/2015/wordml/symex" xmlns:w16du="http://schemas.microsoft.com/office/word/2023/wordml/word16du" xmlns:wne="http://schemas.microsoft.com/office/word/2006/wordml" mc:Ignorable="w14 w15 w16se w16cid w16 w16cex w16sdtdh w16sdtfl w16du wp14">
   <w:tbl>
     <w:tblPr>
       <w:tblW w:w="0" w:type="auto"/>
@@ -6356,7 +7190,7 @@
               <w:b w:val="0"/>
               <w:sz w:val="20"/>
             </w:rPr>
-            <w:t>1</w:t>
+            <w:t>2</w:t>
           </w:r>
           <w:r>
             <w:rPr>
@@ -6370,7 +7204,7 @@
               <w:b w:val="0"/>
               <w:sz w:val="20"/>
             </w:rPr>
-            <w:t>7</w:t>
+            <w:t>2</w:t>
           </w:r>
         </w:p>
       </w:tc>
@@ -6436,13 +7270,7 @@
             <w:rPr>
               <w:sz w:val="20"/>
             </w:rPr>
-            <w:t>1</w:t>
-          </w:r>
-          <w:r>
-            <w:rPr>
-              <w:sz w:val="20"/>
-            </w:rPr>
-            <w:t>4</w:t>
+            <w:t>23</w:t>
           </w:r>
           <w:r>
             <w:rPr>
@@ -6481,31 +7309,31 @@
 </file>
 
 <file path=word/header2.xml><?xml version="1.0" encoding="utf-8"?>
-<w:hdr xmlns:wpc="http://schemas.microsoft.com/office/word/2010/wordprocessingCanvas" xmlns:cx="http://schemas.microsoft.com/office/drawing/2014/chartex" xmlns:cx1="http://schemas.microsoft.com/office/drawing/2015/9/8/chartex" xmlns:cx2="http://schemas.microsoft.com/office/drawing/2015/10/21/chartex" xmlns:cx3="http://schemas.microsoft.com/office/drawing/2016/5/9/chartex" xmlns:cx4="http://schemas.microsoft.com/office/drawing/2016/5/10/chartex" xmlns:cx5="http://schemas.microsoft.com/office/drawing/2016/5/11/chartex" xmlns:cx6="http://schemas.microsoft.com/office/drawing/2016/5/12/chartex" xmlns:cx7="http://schemas.microsoft.com/office/drawing/2016/5/13/chartex" xmlns:cx8="http://schemas.microsoft.com/office/drawing/2016/5/14/chartex" xmlns:mc="http://schemas.openxmlformats.org/markup-compatibility/2006" xmlns:aink="http://schemas.microsoft.com/office/drawing/2016/ink" xmlns:am3d="http://schemas.microsoft.com/office/drawing/2017/model3d" xmlns:o="urn:schemas-microsoft-com:office:office" xmlns:oel="http://schemas.microsoft.com/office/2019/extlst" xmlns:r="http://schemas.openxmlformats.org/officeDocument/2006/relationships" xmlns:m="http://schemas.openxmlformats.org/officeDocument/2006/math" xmlns:v="urn:schemas-microsoft-com:vml" xmlns:wp14="http://schemas.microsoft.com/office/word/2010/wordprocessingDrawing" xmlns:wp="http://schemas.openxmlformats.org/drawingml/2006/wordprocessingDrawing" xmlns:w10="urn:schemas-microsoft-com:office:word" xmlns:w="http://schemas.openxmlformats.org/wordprocessingml/2006/main" xmlns:w14="http://schemas.microsoft.com/office/word/2010/wordml" xmlns:w15="http://schemas.microsoft.com/office/word/2012/wordml" xmlns:w16cex="http://schemas.microsoft.com/office/word/2018/wordml/cex" xmlns:w16cid="http://schemas.microsoft.com/office/word/2016/wordml/cid" xmlns:w16="http://schemas.microsoft.com/office/word/2018/wordml" xmlns:w16du="http://schemas.microsoft.com/office/word/2023/wordml/word16du" xmlns:w16sdtdh="http://schemas.microsoft.com/office/word/2020/wordml/sdtdatahash" xmlns:w16sdtfl="http://schemas.microsoft.com/office/word/2024/wordml/sdtformatlock" xmlns:w16se="http://schemas.microsoft.com/office/word/2015/wordml/symex" xmlns:wpg="http://schemas.microsoft.com/office/word/2010/wordprocessingGroup" xmlns:wpi="http://schemas.microsoft.com/office/word/2010/wordprocessingInk" xmlns:wne="http://schemas.microsoft.com/office/word/2006/wordml" xmlns:wps="http://schemas.microsoft.com/office/word/2010/wordprocessingShape" mc:Ignorable="w14 w15 w16se w16cid w16 w16cex w16sdtdh w16sdtfl w16du wp14">
+<w:hdr xmlns:wpc="http://schemas.microsoft.com/office/word/2010/wordprocessingCanvas" xmlns:cx="http://schemas.microsoft.com/office/drawing/2014/chartex" xmlns:cx1="http://schemas.microsoft.com/office/drawing/2015/9/8/chartex" xmlns:cx2="http://schemas.microsoft.com/office/drawing/2015/10/21/chartex" xmlns:cx3="http://schemas.microsoft.com/office/drawing/2016/5/9/chartex" xmlns:cx4="http://schemas.microsoft.com/office/drawing/2016/5/10/chartex" xmlns:cx5="http://schemas.microsoft.com/office/drawing/2016/5/11/chartex" xmlns:cx6="http://schemas.microsoft.com/office/drawing/2016/5/12/chartex" xmlns:cx7="http://schemas.microsoft.com/office/drawing/2016/5/13/chartex" xmlns:cx8="http://schemas.microsoft.com/office/drawing/2016/5/14/chartex" xmlns:mc="http://schemas.openxmlformats.org/markup-compatibility/2006" xmlns:m="http://schemas.openxmlformats.org/officeDocument/2006/math" xmlns:aink="http://schemas.microsoft.com/office/drawing/2016/ink" xmlns:am3d="http://schemas.microsoft.com/office/drawing/2017/model3d" xmlns:oel="http://schemas.microsoft.com/office/2019/extlst" xmlns:r="http://schemas.openxmlformats.org/officeDocument/2006/relationships" xmlns:wp14="http://schemas.microsoft.com/office/word/2010/wordprocessingDrawing" xmlns:wp="http://schemas.openxmlformats.org/drawingml/2006/wordprocessingDrawing" xmlns:wpg="http://schemas.microsoft.com/office/word/2010/wordprocessingGroup" xmlns:wpi="http://schemas.microsoft.com/office/word/2010/wordprocessingInk" xmlns:wps="http://schemas.microsoft.com/office/word/2010/wordprocessingShape" xmlns:o="urn:schemas-microsoft-com:office:office" xmlns:v="urn:schemas-microsoft-com:vml" xmlns:w10="urn:schemas-microsoft-com:office:word" xmlns:w="http://schemas.openxmlformats.org/wordprocessingml/2006/main" xmlns:w14="http://schemas.microsoft.com/office/word/2010/wordml" xmlns:w15="http://schemas.microsoft.com/office/word/2012/wordml" xmlns:w16cex="http://schemas.microsoft.com/office/word/2018/wordml/cex" xmlns:w16cid="http://schemas.microsoft.com/office/word/2016/wordml/cid" xmlns:w16="http://schemas.microsoft.com/office/word/2018/wordml" xmlns:w16sdtdh="http://schemas.microsoft.com/office/word/2020/wordml/sdtdatahash" xmlns:w16sdtfl="http://schemas.microsoft.com/office/word/2024/wordml/sdtformatlock" xmlns:w16se="http://schemas.microsoft.com/office/word/2015/wordml/symex" xmlns:w16du="http://schemas.microsoft.com/office/word/2023/wordml/word16du" xmlns:wne="http://schemas.microsoft.com/office/word/2006/wordml" mc:Ignorable="w14 w15 w16se w16cid w16 w16cex w16sdtdh w16sdtfl w16du wp14">
   <w:p/>
 </w:hdr>
 </file>
 
 <file path=word/header3.xml><?xml version="1.0" encoding="utf-8"?>
-<w:hdr xmlns:wpc="http://schemas.microsoft.com/office/word/2010/wordprocessingCanvas" xmlns:cx="http://schemas.microsoft.com/office/drawing/2014/chartex" xmlns:cx1="http://schemas.microsoft.com/office/drawing/2015/9/8/chartex" xmlns:cx2="http://schemas.microsoft.com/office/drawing/2015/10/21/chartex" xmlns:cx3="http://schemas.microsoft.com/office/drawing/2016/5/9/chartex" xmlns:cx4="http://schemas.microsoft.com/office/drawing/2016/5/10/chartex" xmlns:cx5="http://schemas.microsoft.com/office/drawing/2016/5/11/chartex" xmlns:cx6="http://schemas.microsoft.com/office/drawing/2016/5/12/chartex" xmlns:cx7="http://schemas.microsoft.com/office/drawing/2016/5/13/chartex" xmlns:cx8="http://schemas.microsoft.com/office/drawing/2016/5/14/chartex" xmlns:mc="http://schemas.openxmlformats.org/markup-compatibility/2006" xmlns:aink="http://schemas.microsoft.com/office/drawing/2016/ink" xmlns:am3d="http://schemas.microsoft.com/office/drawing/2017/model3d" xmlns:o="urn:schemas-microsoft-com:office:office" xmlns:oel="http://schemas.microsoft.com/office/2019/extlst" xmlns:r="http://schemas.openxmlformats.org/officeDocument/2006/relationships" xmlns:m="http://schemas.openxmlformats.org/officeDocument/2006/math" xmlns:v="urn:schemas-microsoft-com:vml" xmlns:wp14="http://schemas.microsoft.com/office/word/2010/wordprocessingDrawing" xmlns:wp="http://schemas.openxmlformats.org/drawingml/2006/wordprocessingDrawing" xmlns:w10="urn:schemas-microsoft-com:office:word" xmlns:w="http://schemas.openxmlformats.org/wordprocessingml/2006/main" xmlns:w14="http://schemas.microsoft.com/office/word/2010/wordml" xmlns:w15="http://schemas.microsoft.com/office/word/2012/wordml" xmlns:w16cex="http://schemas.microsoft.com/office/word/2018/wordml/cex" xmlns:w16cid="http://schemas.microsoft.com/office/word/2016/wordml/cid" xmlns:w16="http://schemas.microsoft.com/office/word/2018/wordml" xmlns:w16du="http://schemas.microsoft.com/office/word/2023/wordml/word16du" xmlns:w16sdtdh="http://schemas.microsoft.com/office/word/2020/wordml/sdtdatahash" xmlns:w16sdtfl="http://schemas.microsoft.com/office/word/2024/wordml/sdtformatlock" xmlns:w16se="http://schemas.microsoft.com/office/word/2015/wordml/symex" xmlns:wpg="http://schemas.microsoft.com/office/word/2010/wordprocessingGroup" xmlns:wpi="http://schemas.microsoft.com/office/word/2010/wordprocessingInk" xmlns:wne="http://schemas.microsoft.com/office/word/2006/wordml" xmlns:wps="http://schemas.microsoft.com/office/word/2010/wordprocessingShape" mc:Ignorable="w14 w15 w16se w16cid w16 w16cex w16sdtdh w16sdtfl w16du wp14">
+<w:hdr xmlns:wpc="http://schemas.microsoft.com/office/word/2010/wordprocessingCanvas" xmlns:cx="http://schemas.microsoft.com/office/drawing/2014/chartex" xmlns:cx1="http://schemas.microsoft.com/office/drawing/2015/9/8/chartex" xmlns:cx2="http://schemas.microsoft.com/office/drawing/2015/10/21/chartex" xmlns:cx3="http://schemas.microsoft.com/office/drawing/2016/5/9/chartex" xmlns:cx4="http://schemas.microsoft.com/office/drawing/2016/5/10/chartex" xmlns:cx5="http://schemas.microsoft.com/office/drawing/2016/5/11/chartex" xmlns:cx6="http://schemas.microsoft.com/office/drawing/2016/5/12/chartex" xmlns:cx7="http://schemas.microsoft.com/office/drawing/2016/5/13/chartex" xmlns:cx8="http://schemas.microsoft.com/office/drawing/2016/5/14/chartex" xmlns:mc="http://schemas.openxmlformats.org/markup-compatibility/2006" xmlns:m="http://schemas.openxmlformats.org/officeDocument/2006/math" xmlns:aink="http://schemas.microsoft.com/office/drawing/2016/ink" xmlns:am3d="http://schemas.microsoft.com/office/drawing/2017/model3d" xmlns:oel="http://schemas.microsoft.com/office/2019/extlst" xmlns:r="http://schemas.openxmlformats.org/officeDocument/2006/relationships" xmlns:wp14="http://schemas.microsoft.com/office/word/2010/wordprocessingDrawing" xmlns:wp="http://schemas.openxmlformats.org/drawingml/2006/wordprocessingDrawing" xmlns:wpg="http://schemas.microsoft.com/office/word/2010/wordprocessingGroup" xmlns:wpi="http://schemas.microsoft.com/office/word/2010/wordprocessingInk" xmlns:wps="http://schemas.microsoft.com/office/word/2010/wordprocessingShape" xmlns:o="urn:schemas-microsoft-com:office:office" xmlns:v="urn:schemas-microsoft-com:vml" xmlns:w10="urn:schemas-microsoft-com:office:word" xmlns:w="http://schemas.openxmlformats.org/wordprocessingml/2006/main" xmlns:w14="http://schemas.microsoft.com/office/word/2010/wordml" xmlns:w15="http://schemas.microsoft.com/office/word/2012/wordml" xmlns:w16cex="http://schemas.microsoft.com/office/word/2018/wordml/cex" xmlns:w16cid="http://schemas.microsoft.com/office/word/2016/wordml/cid" xmlns:w16="http://schemas.microsoft.com/office/word/2018/wordml" xmlns:w16sdtdh="http://schemas.microsoft.com/office/word/2020/wordml/sdtdatahash" xmlns:w16sdtfl="http://schemas.microsoft.com/office/word/2024/wordml/sdtformatlock" xmlns:w16se="http://schemas.microsoft.com/office/word/2015/wordml/symex" xmlns:w16du="http://schemas.microsoft.com/office/word/2023/wordml/word16du" xmlns:wne="http://schemas.microsoft.com/office/word/2006/wordml" mc:Ignorable="w14 w15 w16se w16cid w16 w16cex w16sdtdh w16sdtfl w16du wp14">
   <w:p/>
 </w:hdr>
 </file>
 
 <file path=word/header4.xml><?xml version="1.0" encoding="utf-8"?>
-<w:hdr xmlns:wpc="http://schemas.microsoft.com/office/word/2010/wordprocessingCanvas" xmlns:cx="http://schemas.microsoft.com/office/drawing/2014/chartex" xmlns:cx1="http://schemas.microsoft.com/office/drawing/2015/9/8/chartex" xmlns:cx2="http://schemas.microsoft.com/office/drawing/2015/10/21/chartex" xmlns:cx3="http://schemas.microsoft.com/office/drawing/2016/5/9/chartex" xmlns:cx4="http://schemas.microsoft.com/office/drawing/2016/5/10/chartex" xmlns:cx5="http://schemas.microsoft.com/office/drawing/2016/5/11/chartex" xmlns:cx6="http://schemas.microsoft.com/office/drawing/2016/5/12/chartex" xmlns:cx7="http://schemas.microsoft.com/office/drawing/2016/5/13/chartex" xmlns:cx8="http://schemas.microsoft.com/office/drawing/2016/5/14/chartex" xmlns:mc="http://schemas.openxmlformats.org/markup-compatibility/2006" xmlns:aink="http://schemas.microsoft.com/office/drawing/2016/ink" xmlns:am3d="http://schemas.microsoft.com/office/drawing/2017/model3d" xmlns:o="urn:schemas-microsoft-com:office:office" xmlns:oel="http://schemas.microsoft.com/office/2019/extlst" xmlns:r="http://schemas.openxmlformats.org/officeDocument/2006/relationships" xmlns:m="http://schemas.openxmlformats.org/officeDocument/2006/math" xmlns:v="urn:schemas-microsoft-com:vml" xmlns:wp14="http://schemas.microsoft.com/office/word/2010/wordprocessingDrawing" xmlns:wp="http://schemas.openxmlformats.org/drawingml/2006/wordprocessingDrawing" xmlns:w10="urn:schemas-microsoft-com:office:word" xmlns:w="http://schemas.openxmlformats.org/wordprocessingml/2006/main" xmlns:w14="http://schemas.microsoft.com/office/word/2010/wordml" xmlns:w15="http://schemas.microsoft.com/office/word/2012/wordml" xmlns:w16cex="http://schemas.microsoft.com/office/word/2018/wordml/cex" xmlns:w16cid="http://schemas.microsoft.com/office/word/2016/wordml/cid" xmlns:w16="http://schemas.microsoft.com/office/word/2018/wordml" xmlns:w16du="http://schemas.microsoft.com/office/word/2023/wordml/word16du" xmlns:w16sdtdh="http://schemas.microsoft.com/office/word/2020/wordml/sdtdatahash" xmlns:w16sdtfl="http://schemas.microsoft.com/office/word/2024/wordml/sdtformatlock" xmlns:w16se="http://schemas.microsoft.com/office/word/2015/wordml/symex" xmlns:wpg="http://schemas.microsoft.com/office/word/2010/wordprocessingGroup" xmlns:wpi="http://schemas.microsoft.com/office/word/2010/wordprocessingInk" xmlns:wne="http://schemas.microsoft.com/office/word/2006/wordml" xmlns:wps="http://schemas.microsoft.com/office/word/2010/wordprocessingShape" mc:Ignorable="w14 w15 w16se w16cid w16 w16cex w16sdtdh w16sdtfl w16du wp14">
+<w:hdr xmlns:wpc="http://schemas.microsoft.com/office/word/2010/wordprocessingCanvas" xmlns:cx="http://schemas.microsoft.com/office/drawing/2014/chartex" xmlns:cx1="http://schemas.microsoft.com/office/drawing/2015/9/8/chartex" xmlns:cx2="http://schemas.microsoft.com/office/drawing/2015/10/21/chartex" xmlns:cx3="http://schemas.microsoft.com/office/drawing/2016/5/9/chartex" xmlns:cx4="http://schemas.microsoft.com/office/drawing/2016/5/10/chartex" xmlns:cx5="http://schemas.microsoft.com/office/drawing/2016/5/11/chartex" xmlns:cx6="http://schemas.microsoft.com/office/drawing/2016/5/12/chartex" xmlns:cx7="http://schemas.microsoft.com/office/drawing/2016/5/13/chartex" xmlns:cx8="http://schemas.microsoft.com/office/drawing/2016/5/14/chartex" xmlns:mc="http://schemas.openxmlformats.org/markup-compatibility/2006" xmlns:m="http://schemas.openxmlformats.org/officeDocument/2006/math" xmlns:aink="http://schemas.microsoft.com/office/drawing/2016/ink" xmlns:am3d="http://schemas.microsoft.com/office/drawing/2017/model3d" xmlns:oel="http://schemas.microsoft.com/office/2019/extlst" xmlns:r="http://schemas.openxmlformats.org/officeDocument/2006/relationships" xmlns:wp14="http://schemas.microsoft.com/office/word/2010/wordprocessingDrawing" xmlns:wp="http://schemas.openxmlformats.org/drawingml/2006/wordprocessingDrawing" xmlns:wpg="http://schemas.microsoft.com/office/word/2010/wordprocessingGroup" xmlns:wpi="http://schemas.microsoft.com/office/word/2010/wordprocessingInk" xmlns:wps="http://schemas.microsoft.com/office/word/2010/wordprocessingShape" xmlns:o="urn:schemas-microsoft-com:office:office" xmlns:v="urn:schemas-microsoft-com:vml" xmlns:w10="urn:schemas-microsoft-com:office:word" xmlns:w="http://schemas.openxmlformats.org/wordprocessingml/2006/main" xmlns:w14="http://schemas.microsoft.com/office/word/2010/wordml" xmlns:w15="http://schemas.microsoft.com/office/word/2012/wordml" xmlns:w16cex="http://schemas.microsoft.com/office/word/2018/wordml/cex" xmlns:w16cid="http://schemas.microsoft.com/office/word/2016/wordml/cid" xmlns:w16="http://schemas.microsoft.com/office/word/2018/wordml" xmlns:w16sdtdh="http://schemas.microsoft.com/office/word/2020/wordml/sdtdatahash" xmlns:w16sdtfl="http://schemas.microsoft.com/office/word/2024/wordml/sdtformatlock" xmlns:w16se="http://schemas.microsoft.com/office/word/2015/wordml/symex" xmlns:w16du="http://schemas.microsoft.com/office/word/2023/wordml/word16du" xmlns:wne="http://schemas.microsoft.com/office/word/2006/wordml" mc:Ignorable="w14 w15 w16se w16cid w16 w16cex w16sdtdh w16sdtfl w16du wp14">
   <w:p/>
 </w:hdr>
 </file>
 
 <file path=word/header5.xml><?xml version="1.0" encoding="utf-8"?>
-<w:hdr xmlns:wpc="http://schemas.microsoft.com/office/word/2010/wordprocessingCanvas" xmlns:cx="http://schemas.microsoft.com/office/drawing/2014/chartex" xmlns:cx1="http://schemas.microsoft.com/office/drawing/2015/9/8/chartex" xmlns:cx2="http://schemas.microsoft.com/office/drawing/2015/10/21/chartex" xmlns:cx3="http://schemas.microsoft.com/office/drawing/2016/5/9/chartex" xmlns:cx4="http://schemas.microsoft.com/office/drawing/2016/5/10/chartex" xmlns:cx5="http://schemas.microsoft.com/office/drawing/2016/5/11/chartex" xmlns:cx6="http://schemas.microsoft.com/office/drawing/2016/5/12/chartex" xmlns:cx7="http://schemas.microsoft.com/office/drawing/2016/5/13/chartex" xmlns:cx8="http://schemas.microsoft.com/office/drawing/2016/5/14/chartex" xmlns:mc="http://schemas.openxmlformats.org/markup-compatibility/2006" xmlns:aink="http://schemas.microsoft.com/office/drawing/2016/ink" xmlns:am3d="http://schemas.microsoft.com/office/drawing/2017/model3d" xmlns:o="urn:schemas-microsoft-com:office:office" xmlns:oel="http://schemas.microsoft.com/office/2019/extlst" xmlns:r="http://schemas.openxmlformats.org/officeDocument/2006/relationships" xmlns:m="http://schemas.openxmlformats.org/officeDocument/2006/math" xmlns:v="urn:schemas-microsoft-com:vml" xmlns:wp14="http://schemas.microsoft.com/office/word/2010/wordprocessingDrawing" xmlns:wp="http://schemas.openxmlformats.org/drawingml/2006/wordprocessingDrawing" xmlns:w10="urn:schemas-microsoft-com:office:word" xmlns:w="http://schemas.openxmlformats.org/wordprocessingml/2006/main" xmlns:w14="http://schemas.microsoft.com/office/word/2010/wordml" xmlns:w15="http://schemas.microsoft.com/office/word/2012/wordml" xmlns:w16cex="http://schemas.microsoft.com/office/word/2018/wordml/cex" xmlns:w16cid="http://schemas.microsoft.com/office/word/2016/wordml/cid" xmlns:w16="http://schemas.microsoft.com/office/word/2018/wordml" xmlns:w16du="http://schemas.microsoft.com/office/word/2023/wordml/word16du" xmlns:w16sdtdh="http://schemas.microsoft.com/office/word/2020/wordml/sdtdatahash" xmlns:w16sdtfl="http://schemas.microsoft.com/office/word/2024/wordml/sdtformatlock" xmlns:w16se="http://schemas.microsoft.com/office/word/2015/wordml/symex" xmlns:wpg="http://schemas.microsoft.com/office/word/2010/wordprocessingGroup" xmlns:wpi="http://schemas.microsoft.com/office/word/2010/wordprocessingInk" xmlns:wne="http://schemas.microsoft.com/office/word/2006/wordml" xmlns:wps="http://schemas.microsoft.com/office/word/2010/wordprocessingShape" mc:Ignorable="w14 w15 w16se w16cid w16 w16cex w16sdtdh w16sdtfl w16du wp14">
+<w:hdr xmlns:wpc="http://schemas.microsoft.com/office/word/2010/wordprocessingCanvas" xmlns:cx="http://schemas.microsoft.com/office/drawing/2014/chartex" xmlns:cx1="http://schemas.microsoft.com/office/drawing/2015/9/8/chartex" xmlns:cx2="http://schemas.microsoft.com/office/drawing/2015/10/21/chartex" xmlns:cx3="http://schemas.microsoft.com/office/drawing/2016/5/9/chartex" xmlns:cx4="http://schemas.microsoft.com/office/drawing/2016/5/10/chartex" xmlns:cx5="http://schemas.microsoft.com/office/drawing/2016/5/11/chartex" xmlns:cx6="http://schemas.microsoft.com/office/drawing/2016/5/12/chartex" xmlns:cx7="http://schemas.microsoft.com/office/drawing/2016/5/13/chartex" xmlns:cx8="http://schemas.microsoft.com/office/drawing/2016/5/14/chartex" xmlns:mc="http://schemas.openxmlformats.org/markup-compatibility/2006" xmlns:m="http://schemas.openxmlformats.org/officeDocument/2006/math" xmlns:aink="http://schemas.microsoft.com/office/drawing/2016/ink" xmlns:am3d="http://schemas.microsoft.com/office/drawing/2017/model3d" xmlns:oel="http://schemas.microsoft.com/office/2019/extlst" xmlns:r="http://schemas.openxmlformats.org/officeDocument/2006/relationships" xmlns:wp14="http://schemas.microsoft.com/office/word/2010/wordprocessingDrawing" xmlns:wp="http://schemas.openxmlformats.org/drawingml/2006/wordprocessingDrawing" xmlns:wpg="http://schemas.microsoft.com/office/word/2010/wordprocessingGroup" xmlns:wpi="http://schemas.microsoft.com/office/word/2010/wordprocessingInk" xmlns:wps="http://schemas.microsoft.com/office/word/2010/wordprocessingShape" xmlns:o="urn:schemas-microsoft-com:office:office" xmlns:v="urn:schemas-microsoft-com:vml" xmlns:w10="urn:schemas-microsoft-com:office:word" xmlns:w="http://schemas.openxmlformats.org/wordprocessingml/2006/main" xmlns:w14="http://schemas.microsoft.com/office/word/2010/wordml" xmlns:w15="http://schemas.microsoft.com/office/word/2012/wordml" xmlns:w16cex="http://schemas.microsoft.com/office/word/2018/wordml/cex" xmlns:w16cid="http://schemas.microsoft.com/office/word/2016/wordml/cid" xmlns:w16="http://schemas.microsoft.com/office/word/2018/wordml" xmlns:w16sdtdh="http://schemas.microsoft.com/office/word/2020/wordml/sdtdatahash" xmlns:w16sdtfl="http://schemas.microsoft.com/office/word/2024/wordml/sdtformatlock" xmlns:w16se="http://schemas.microsoft.com/office/word/2015/wordml/symex" xmlns:w16du="http://schemas.microsoft.com/office/word/2023/wordml/word16du" xmlns:wne="http://schemas.microsoft.com/office/word/2006/wordml" mc:Ignorable="w14 w15 w16se w16cid w16 w16cex w16sdtdh w16sdtfl w16du wp14">
   <w:p/>
 </w:hdr>
 </file>
 
 <file path=word/numbering.xml><?xml version="1.0" encoding="utf-8"?>
-<w:numbering xmlns:wpc="http://schemas.microsoft.com/office/word/2010/wordprocessingCanvas" xmlns:cx="http://schemas.microsoft.com/office/drawing/2014/chartex" xmlns:cx1="http://schemas.microsoft.com/office/drawing/2015/9/8/chartex" xmlns:cx2="http://schemas.microsoft.com/office/drawing/2015/10/21/chartex" xmlns:cx3="http://schemas.microsoft.com/office/drawing/2016/5/9/chartex" xmlns:cx4="http://schemas.microsoft.com/office/drawing/2016/5/10/chartex" xmlns:cx5="http://schemas.microsoft.com/office/drawing/2016/5/11/chartex" xmlns:cx6="http://schemas.microsoft.com/office/drawing/2016/5/12/chartex" xmlns:cx7="http://schemas.microsoft.com/office/drawing/2016/5/13/chartex" xmlns:cx8="http://schemas.microsoft.com/office/drawing/2016/5/14/chartex" xmlns:mc="http://schemas.openxmlformats.org/markup-compatibility/2006" xmlns:aink="http://schemas.microsoft.com/office/drawing/2016/ink" xmlns:am3d="http://schemas.microsoft.com/office/drawing/2017/model3d" xmlns:o="urn:schemas-microsoft-com:office:office" xmlns:oel="http://schemas.microsoft.com/office/2019/extlst" xmlns:r="http://schemas.openxmlformats.org/officeDocument/2006/relationships" xmlns:m="http://schemas.openxmlformats.org/officeDocument/2006/math" xmlns:v="urn:schemas-microsoft-com:vml" xmlns:wp14="http://schemas.microsoft.com/office/word/2010/wordprocessingDrawing" xmlns:wp="http://schemas.openxmlformats.org/drawingml/2006/wordprocessingDrawing" xmlns:w10="urn:schemas-microsoft-com:office:word" xmlns:w="http://schemas.openxmlformats.org/wordprocessingml/2006/main" xmlns:w14="http://schemas.microsoft.com/office/word/2010/wordml" xmlns:w15="http://schemas.microsoft.com/office/word/2012/wordml" xmlns:w16cex="http://schemas.microsoft.com/office/word/2018/wordml/cex" xmlns:w16cid="http://schemas.microsoft.com/office/word/2016/wordml/cid" xmlns:w16="http://schemas.microsoft.com/office/word/2018/wordml" xmlns:w16du="http://schemas.microsoft.com/office/word/2023/wordml/word16du" xmlns:w16sdtdh="http://schemas.microsoft.com/office/word/2020/wordml/sdtdatahash" xmlns:w16sdtfl="http://schemas.microsoft.com/office/word/2024/wordml/sdtformatlock" xmlns:w16se="http://schemas.microsoft.com/office/word/2015/wordml/symex" xmlns:wpg="http://schemas.microsoft.com/office/word/2010/wordprocessingGroup" xmlns:wpi="http://schemas.microsoft.com/office/word/2010/wordprocessingInk" xmlns:wne="http://schemas.microsoft.com/office/word/2006/wordml" xmlns:wps="http://schemas.microsoft.com/office/word/2010/wordprocessingShape" mc:Ignorable="w14 w15 w16se w16cid w16 w16cex w16sdtdh w16sdtfl w16du wp14">
+<w:numbering xmlns:wpc="http://schemas.microsoft.com/office/word/2010/wordprocessingCanvas" xmlns:cx="http://schemas.microsoft.com/office/drawing/2014/chartex" xmlns:cx1="http://schemas.microsoft.com/office/drawing/2015/9/8/chartex" xmlns:cx2="http://schemas.microsoft.com/office/drawing/2015/10/21/chartex" xmlns:cx3="http://schemas.microsoft.com/office/drawing/2016/5/9/chartex" xmlns:cx4="http://schemas.microsoft.com/office/drawing/2016/5/10/chartex" xmlns:cx5="http://schemas.microsoft.com/office/drawing/2016/5/11/chartex" xmlns:cx6="http://schemas.microsoft.com/office/drawing/2016/5/12/chartex" xmlns:cx7="http://schemas.microsoft.com/office/drawing/2016/5/13/chartex" xmlns:cx8="http://schemas.microsoft.com/office/drawing/2016/5/14/chartex" xmlns:mc="http://schemas.openxmlformats.org/markup-compatibility/2006" xmlns:m="http://schemas.openxmlformats.org/officeDocument/2006/math" xmlns:aink="http://schemas.microsoft.com/office/drawing/2016/ink" xmlns:am3d="http://schemas.microsoft.com/office/drawing/2017/model3d" xmlns:oel="http://schemas.microsoft.com/office/2019/extlst" xmlns:r="http://schemas.openxmlformats.org/officeDocument/2006/relationships" xmlns:wp14="http://schemas.microsoft.com/office/word/2010/wordprocessingDrawing" xmlns:wp="http://schemas.openxmlformats.org/drawingml/2006/wordprocessingDrawing" xmlns:wpg="http://schemas.microsoft.com/office/word/2010/wordprocessingGroup" xmlns:wpi="http://schemas.microsoft.com/office/word/2010/wordprocessingInk" xmlns:wps="http://schemas.microsoft.com/office/word/2010/wordprocessingShape" xmlns:o="urn:schemas-microsoft-com:office:office" xmlns:v="urn:schemas-microsoft-com:vml" xmlns:w10="urn:schemas-microsoft-com:office:word" xmlns:w="http://schemas.openxmlformats.org/wordprocessingml/2006/main" xmlns:w14="http://schemas.microsoft.com/office/word/2010/wordml" xmlns:w15="http://schemas.microsoft.com/office/word/2012/wordml" xmlns:w16cex="http://schemas.microsoft.com/office/word/2018/wordml/cex" xmlns:w16cid="http://schemas.microsoft.com/office/word/2016/wordml/cid" xmlns:w16="http://schemas.microsoft.com/office/word/2018/wordml" xmlns:w16sdtdh="http://schemas.microsoft.com/office/word/2020/wordml/sdtdatahash" xmlns:w16sdtfl="http://schemas.microsoft.com/office/word/2024/wordml/sdtformatlock" xmlns:w16se="http://schemas.microsoft.com/office/word/2015/wordml/symex" xmlns:w16du="http://schemas.microsoft.com/office/word/2023/wordml/word16du" xmlns:wne="http://schemas.microsoft.com/office/word/2006/wordml" mc:Ignorable="w14 w15 w16se w16cid w16 w16cex w16sdtdh w16sdtfl w16du wp14">
   <w:numPicBullet w:numPicBulletId="0">
     <w:pict>
       <v:shapetype id="_x0000_t75" coordsize="21600,21600" o:spt="75" o:preferrelative="t" path="m@4@5l@4@11@9@11@9@5xe" filled="f" stroked="f">
@@ -6527,7 +7355,7 @@
         <v:path o:extrusionok="f" gradientshapeok="t" o:connecttype="rect"/>
         <o:lock v:ext="edit" aspectratio="t"/>
       </v:shapetype>
-      <v:shape id="_x0000_i1059" type="#_x0000_t75" style="width:320.4pt;height:249.6pt" o:bullet="t" filled="t">
+      <v:shape id="_x0000_i1025" type="#_x0000_t75" style="width:320.65pt;height:249.5pt" o:bullet="t" filled="t">
         <v:fill color2="black"/>
         <v:imagedata r:id="rId1" o:title=""/>
       </v:shape>
@@ -9914,6 +10742,92 @@
     </w:lvl>
   </w:abstractNum>
   <w:abstractNum w:abstractNumId="34" w15:restartNumberingAfterBreak="0">
+    <w:nsid w:val="6B4A497B"/>
+    <w:multiLevelType w:val="hybridMultilevel"/>
+    <w:tmpl w:val="5BEAA890"/>
+    <w:lvl w:ilvl="0" w:tplc="0410000F">
+      <w:start w:val="1"/>
+      <w:numFmt w:val="decimal"/>
+      <w:lvlText w:val="%1."/>
+      <w:lvlJc w:val="left"/>
+      <w:pPr>
+        <w:ind w:left="720" w:hanging="360"/>
+      </w:pPr>
+    </w:lvl>
+    <w:lvl w:ilvl="1" w:tplc="04100019" w:tentative="1">
+      <w:start w:val="1"/>
+      <w:numFmt w:val="lowerLetter"/>
+      <w:lvlText w:val="%2."/>
+      <w:lvlJc w:val="left"/>
+      <w:pPr>
+        <w:ind w:left="1440" w:hanging="360"/>
+      </w:pPr>
+    </w:lvl>
+    <w:lvl w:ilvl="2" w:tplc="0410001B" w:tentative="1">
+      <w:start w:val="1"/>
+      <w:numFmt w:val="lowerRoman"/>
+      <w:lvlText w:val="%3."/>
+      <w:lvlJc w:val="right"/>
+      <w:pPr>
+        <w:ind w:left="2160" w:hanging="180"/>
+      </w:pPr>
+    </w:lvl>
+    <w:lvl w:ilvl="3" w:tplc="0410000F" w:tentative="1">
+      <w:start w:val="1"/>
+      <w:numFmt w:val="decimal"/>
+      <w:lvlText w:val="%4."/>
+      <w:lvlJc w:val="left"/>
+      <w:pPr>
+        <w:ind w:left="2880" w:hanging="360"/>
+      </w:pPr>
+    </w:lvl>
+    <w:lvl w:ilvl="4" w:tplc="04100019" w:tentative="1">
+      <w:start w:val="1"/>
+      <w:numFmt w:val="lowerLetter"/>
+      <w:lvlText w:val="%5."/>
+      <w:lvlJc w:val="left"/>
+      <w:pPr>
+        <w:ind w:left="3600" w:hanging="360"/>
+      </w:pPr>
+    </w:lvl>
+    <w:lvl w:ilvl="5" w:tplc="0410001B" w:tentative="1">
+      <w:start w:val="1"/>
+      <w:numFmt w:val="lowerRoman"/>
+      <w:lvlText w:val="%6."/>
+      <w:lvlJc w:val="right"/>
+      <w:pPr>
+        <w:ind w:left="4320" w:hanging="180"/>
+      </w:pPr>
+    </w:lvl>
+    <w:lvl w:ilvl="6" w:tplc="0410000F" w:tentative="1">
+      <w:start w:val="1"/>
+      <w:numFmt w:val="decimal"/>
+      <w:lvlText w:val="%7."/>
+      <w:lvlJc w:val="left"/>
+      <w:pPr>
+        <w:ind w:left="5040" w:hanging="360"/>
+      </w:pPr>
+    </w:lvl>
+    <w:lvl w:ilvl="7" w:tplc="04100019" w:tentative="1">
+      <w:start w:val="1"/>
+      <w:numFmt w:val="lowerLetter"/>
+      <w:lvlText w:val="%8."/>
+      <w:lvlJc w:val="left"/>
+      <w:pPr>
+        <w:ind w:left="5760" w:hanging="360"/>
+      </w:pPr>
+    </w:lvl>
+    <w:lvl w:ilvl="8" w:tplc="0410001B" w:tentative="1">
+      <w:start w:val="1"/>
+      <w:numFmt w:val="lowerRoman"/>
+      <w:lvlText w:val="%9."/>
+      <w:lvlJc w:val="right"/>
+      <w:pPr>
+        <w:ind w:left="6480" w:hanging="180"/>
+      </w:pPr>
+    </w:lvl>
+  </w:abstractNum>
+  <w:abstractNum w:abstractNumId="35" w15:restartNumberingAfterBreak="0">
     <w:nsid w:val="6B9B6A93"/>
     <w:multiLevelType w:val="hybridMultilevel"/>
     <w:tmpl w:val="16286834"/>
@@ -10026,7 +10940,7 @@
       </w:rPr>
     </w:lvl>
   </w:abstractNum>
-  <w:abstractNum w:abstractNumId="35" w15:restartNumberingAfterBreak="0">
+  <w:abstractNum w:abstractNumId="36" w15:restartNumberingAfterBreak="0">
     <w:nsid w:val="74E12702"/>
     <w:multiLevelType w:val="hybridMultilevel"/>
     <w:tmpl w:val="60F880AA"/>
@@ -10112,7 +11026,7 @@
       </w:pPr>
     </w:lvl>
   </w:abstractNum>
-  <w:abstractNum w:abstractNumId="36" w15:restartNumberingAfterBreak="0">
+  <w:abstractNum w:abstractNumId="37" w15:restartNumberingAfterBreak="0">
     <w:nsid w:val="74FA6749"/>
     <w:multiLevelType w:val="multilevel"/>
     <w:tmpl w:val="C8F4DA3C"/>
@@ -10233,7 +11147,7 @@
       </w:rPr>
     </w:lvl>
   </w:abstractNum>
-  <w:abstractNum w:abstractNumId="37" w15:restartNumberingAfterBreak="0">
+  <w:abstractNum w:abstractNumId="38" w15:restartNumberingAfterBreak="0">
     <w:nsid w:val="7659093E"/>
     <w:multiLevelType w:val="multilevel"/>
     <w:tmpl w:val="C8F4DA3C"/>
@@ -10354,7 +11268,7 @@
       </w:rPr>
     </w:lvl>
   </w:abstractNum>
-  <w:abstractNum w:abstractNumId="38" w15:restartNumberingAfterBreak="0">
+  <w:abstractNum w:abstractNumId="39" w15:restartNumberingAfterBreak="0">
     <w:nsid w:val="7CCE2BA3"/>
     <w:multiLevelType w:val="hybridMultilevel"/>
     <w:tmpl w:val="A20AD9D2"/>
@@ -10495,7 +11409,7 @@
     <w:abstractNumId w:val="22"/>
   </w:num>
   <w:num w:numId="19" w16cid:durableId="202911112">
-    <w:abstractNumId w:val="38"/>
+    <w:abstractNumId w:val="39"/>
   </w:num>
   <w:num w:numId="20" w16cid:durableId="4943408">
     <w:abstractNumId w:val="6"/>
@@ -10504,7 +11418,7 @@
     <w:abstractNumId w:val="14"/>
   </w:num>
   <w:num w:numId="22" w16cid:durableId="510147163">
-    <w:abstractNumId w:val="35"/>
+    <w:abstractNumId w:val="36"/>
   </w:num>
   <w:num w:numId="23" w16cid:durableId="1096175075">
     <w:abstractNumId w:val="24"/>
@@ -10561,13 +11475,13 @@
     <w:abstractNumId w:val="8"/>
   </w:num>
   <w:num w:numId="32" w16cid:durableId="854459494">
-    <w:abstractNumId w:val="37"/>
+    <w:abstractNumId w:val="38"/>
   </w:num>
   <w:num w:numId="33" w16cid:durableId="2102329784">
     <w:abstractNumId w:val="29"/>
   </w:num>
   <w:num w:numId="34" w16cid:durableId="787314231">
-    <w:abstractNumId w:val="36"/>
+    <w:abstractNumId w:val="37"/>
   </w:num>
   <w:num w:numId="35" w16cid:durableId="6254848">
     <w:abstractNumId w:val="23"/>
@@ -10576,7 +11490,7 @@
     <w:abstractNumId w:val="18"/>
   </w:num>
   <w:num w:numId="37" w16cid:durableId="1870869743">
-    <w:abstractNumId w:val="34"/>
+    <w:abstractNumId w:val="35"/>
   </w:num>
   <w:num w:numId="38" w16cid:durableId="153184791">
     <w:abstractNumId w:val="19"/>
@@ -10590,11 +11504,14 @@
   <w:num w:numId="41" w16cid:durableId="1547715577">
     <w:abstractNumId w:val="31"/>
   </w:num>
+  <w:num w:numId="42" w16cid:durableId="1331366170">
+    <w:abstractNumId w:val="34"/>
+  </w:num>
 </w:numbering>
 </file>
 
 <file path=word/styles.xml><?xml version="1.0" encoding="utf-8"?>
-<w:styles xmlns:mc="http://schemas.openxmlformats.org/markup-compatibility/2006" xmlns:r="http://schemas.openxmlformats.org/officeDocument/2006/relationships" xmlns:w="http://schemas.openxmlformats.org/wordprocessingml/2006/main" xmlns:w14="http://schemas.microsoft.com/office/word/2010/wordml" xmlns:w15="http://schemas.microsoft.com/office/word/2012/wordml" xmlns:w16cex="http://schemas.microsoft.com/office/word/2018/wordml/cex" xmlns:w16cid="http://schemas.microsoft.com/office/word/2016/wordml/cid" xmlns:w16="http://schemas.microsoft.com/office/word/2018/wordml" xmlns:w16du="http://schemas.microsoft.com/office/word/2023/wordml/word16du" xmlns:w16sdtdh="http://schemas.microsoft.com/office/word/2020/wordml/sdtdatahash" xmlns:w16sdtfl="http://schemas.microsoft.com/office/word/2024/wordml/sdtformatlock" xmlns:w16se="http://schemas.microsoft.com/office/word/2015/wordml/symex" mc:Ignorable="w14 w15 w16se w16cid w16 w16cex w16sdtdh w16sdtfl w16du">
+<w:styles xmlns:mc="http://schemas.openxmlformats.org/markup-compatibility/2006" xmlns:r="http://schemas.openxmlformats.org/officeDocument/2006/relationships" xmlns:w="http://schemas.openxmlformats.org/wordprocessingml/2006/main" xmlns:w14="http://schemas.microsoft.com/office/word/2010/wordml" xmlns:w15="http://schemas.microsoft.com/office/word/2012/wordml" xmlns:w16cex="http://schemas.microsoft.com/office/word/2018/wordml/cex" xmlns:w16cid="http://schemas.microsoft.com/office/word/2016/wordml/cid" xmlns:w16="http://schemas.microsoft.com/office/word/2018/wordml" xmlns:w16sdtdh="http://schemas.microsoft.com/office/word/2020/wordml/sdtdatahash" xmlns:w16sdtfl="http://schemas.microsoft.com/office/word/2024/wordml/sdtformatlock" xmlns:w16se="http://schemas.microsoft.com/office/word/2015/wordml/symex" xmlns:w16du="http://schemas.microsoft.com/office/word/2023/wordml/word16du" mc:Ignorable="w14 w15 w16se w16cid w16 w16cex w16sdtdh w16sdtfl w16du">
   <w:docDefaults>
     <w:rPrDefault>
       <w:rPr>

</xml_diff>

<commit_message>
rese alcune cose nel documento più leggibili con testi in grassetto
</commit_message>
<xml_diff>
--- a/Deliverables/RAD_GGEyewear.docx
+++ b/Deliverables/RAD_GGEyewear.docx
@@ -144,8 +144,8 @@
           <w:lang w:val="en-US"/>
         </w:rPr>
         <w:br/>
-        <w:t xml:space="preserve">Versione </w:t>
-      </w:r>
+      </w:r>
+      <w:proofErr w:type="spellStart"/>
       <w:r>
         <w:rPr>
           <w:rFonts w:ascii="Arial" w:hAnsi="Arial"/>
@@ -153,7 +153,35 @@
           <w:sz w:val="36"/>
           <w:lang w:val="en-US"/>
         </w:rPr>
-        <w:t>3.0</w:t>
+        <w:t>Versione</w:t>
+      </w:r>
+      <w:proofErr w:type="spellEnd"/>
+      <w:r>
+        <w:rPr>
+          <w:rFonts w:ascii="Arial" w:hAnsi="Arial"/>
+          <w:b/>
+          <w:sz w:val="36"/>
+          <w:lang w:val="en-US"/>
+        </w:rPr>
+        <w:t xml:space="preserve"> </w:t>
+      </w:r>
+      <w:r>
+        <w:rPr>
+          <w:rFonts w:ascii="Arial" w:hAnsi="Arial"/>
+          <w:b/>
+          <w:sz w:val="36"/>
+          <w:lang w:val="en-US"/>
+        </w:rPr>
+        <w:t>4</w:t>
+      </w:r>
+      <w:r>
+        <w:rPr>
+          <w:rFonts w:ascii="Arial" w:hAnsi="Arial"/>
+          <w:b/>
+          <w:sz w:val="36"/>
+          <w:lang w:val="en-US"/>
+        </w:rPr>
+        <w:t>.0</w:t>
       </w:r>
       <w:r>
         <w:rPr>
@@ -1458,7 +1486,7 @@
               <w:rPr>
                 <w:sz w:val="20"/>
               </w:rPr>
-              <w:t>2.2</w:t>
+              <w:t>3.0</w:t>
             </w:r>
           </w:p>
         </w:tc>
@@ -1560,7 +1588,7 @@
               <w:rPr>
                 <w:sz w:val="20"/>
               </w:rPr>
-              <w:t>3.0</w:t>
+              <w:t>4.0</w:t>
             </w:r>
           </w:p>
         </w:tc>
@@ -1580,6 +1608,12 @@
                 <w:sz w:val="20"/>
               </w:rPr>
             </w:pPr>
+            <w:r>
+              <w:rPr>
+                <w:sz w:val="20"/>
+              </w:rPr>
+              <w:t>Aggiunti scenari per acquisto di un prodotto e aggiornamento dello stato di un prodotto</w:t>
+            </w:r>
           </w:p>
         </w:tc>
         <w:tc>
@@ -4686,11 +4720,15 @@
         <w:jc w:val="both"/>
         <w:rPr>
           <w:rFonts w:ascii="Times New Roman" w:hAnsi="Times New Roman" w:cs="Times New Roman"/>
+          <w:b/>
+          <w:bCs/>
         </w:rPr>
       </w:pPr>
       <w:r>
         <w:rPr>
           <w:rFonts w:ascii="Times New Roman" w:hAnsi="Times New Roman" w:cs="Times New Roman"/>
+          <w:b/>
+          <w:bCs/>
         </w:rPr>
         <w:t>Area utenti registrati / utenti non registrati</w:t>
       </w:r>
@@ -4798,11 +4836,15 @@
         <w:jc w:val="both"/>
         <w:rPr>
           <w:rFonts w:ascii="Times New Roman" w:hAnsi="Times New Roman" w:cs="Times New Roman"/>
+          <w:b/>
+          <w:bCs/>
         </w:rPr>
       </w:pPr>
       <w:r>
         <w:rPr>
           <w:rFonts w:ascii="Times New Roman" w:hAnsi="Times New Roman" w:cs="Times New Roman"/>
+          <w:b/>
+          <w:bCs/>
         </w:rPr>
         <w:t xml:space="preserve">Aree per i dipendenti </w:t>
       </w:r>
@@ -4824,8 +4866,16 @@
       <w:r>
         <w:rPr>
           <w:rFonts w:ascii="Times New Roman" w:hAnsi="Times New Roman" w:cs="Times New Roman"/>
-        </w:rPr>
-        <w:t>Product Manager: accesso ad un’area dove ha la possibilità di aggiungere occhiali al catalogo con le relative informazioni necessarie, deciderne la scorta presente nel magazzino al momento dell’inserimento, o decidere di nasconderlo per i clienti</w:t>
+          <w:b/>
+          <w:bCs/>
+        </w:rPr>
+        <w:t>Product Manager</w:t>
+      </w:r>
+      <w:r>
+        <w:rPr>
+          <w:rFonts w:ascii="Times New Roman" w:hAnsi="Times New Roman" w:cs="Times New Roman"/>
+        </w:rPr>
+        <w:t>: accesso ad un’area dove ha la possibilità di aggiungere occhiali al catalogo con le relative informazioni necessarie, deciderne la scorta presente nel magazzino al momento dell’inserimento, o decidere di nasconderlo per i clienti</w:t>
       </w:r>
     </w:p>
     <w:p>
@@ -4845,8 +4895,16 @@
       <w:r>
         <w:rPr>
           <w:rFonts w:ascii="Times New Roman" w:hAnsi="Times New Roman" w:cs="Times New Roman"/>
-        </w:rPr>
-        <w:t xml:space="preserve">Market Analyzer: accesso a una sezione con gli ordini effettuati dai clienti senza i dati personali, potendo visualizzare quindi solo gli occhiali ordinati, e la possibilità di filtrare questi ordini per un periodo di tempo scelto </w:t>
+          <w:b/>
+          <w:bCs/>
+        </w:rPr>
+        <w:t>Market Analyzer</w:t>
+      </w:r>
+      <w:r>
+        <w:rPr>
+          <w:rFonts w:ascii="Times New Roman" w:hAnsi="Times New Roman" w:cs="Times New Roman"/>
+        </w:rPr>
+        <w:t xml:space="preserve">: accesso a una sezione con gli ordini effettuati dai clienti senza i dati personali, potendo visualizzare quindi solo gli occhiali ordinati, e la possibilità di filtrare questi ordini per un periodo di tempo scelto </w:t>
       </w:r>
     </w:p>
     <w:p>
@@ -4866,8 +4924,16 @@
       <w:r>
         <w:rPr>
           <w:rFonts w:ascii="Times New Roman" w:hAnsi="Times New Roman" w:cs="Times New Roman"/>
-        </w:rPr>
-        <w:t>Order Manager: accesso a un’area dove è possibile visualizzare gli ordini effettuati dai clienti con tutti i dati associati, filtrarli all’occorrenza per una determinata data o cliente e la possibilità di cambiare lo stato dell’ordine da “in lavorazione”, a “spedito”, successivamente “in consegna”, infine “consegnato”</w:t>
+          <w:b/>
+          <w:bCs/>
+        </w:rPr>
+        <w:t>Order Manager</w:t>
+      </w:r>
+      <w:r>
+        <w:rPr>
+          <w:rFonts w:ascii="Times New Roman" w:hAnsi="Times New Roman" w:cs="Times New Roman"/>
+        </w:rPr>
+        <w:t>: accesso a un’area dove è possibile visualizzare gli ordini effettuati dai clienti con tutti i dati associati, filtrarli all’occorrenza per una determinata data o cliente e la possibilità di cambiare lo stato dell’ordine da “in lavorazione”, a “spedito”, successivamente “in consegna”, infine “consegnato”</w:t>
       </w:r>
     </w:p>
     <w:p>
@@ -4877,7 +4943,17 @@
         <w:jc w:val="both"/>
       </w:pPr>
       <w:r>
-        <w:t>Le funzionalità che NON sono incluse nell’ambito del sistema sono:</w:t>
+        <w:t xml:space="preserve">Le funzionalità che </w:t>
+      </w:r>
+      <w:r>
+        <w:rPr>
+          <w:b/>
+          <w:bCs/>
+        </w:rPr>
+        <w:t>NON</w:t>
+      </w:r>
+      <w:r>
+        <w:t xml:space="preserve"> sono incluse nell’ambito del sistema sono:</w:t>
       </w:r>
     </w:p>
     <w:p>
@@ -4964,21 +5040,7 @@
         <w:rPr>
           <w:lang w:val="en-US"/>
         </w:rPr>
-        <w:t xml:space="preserve">Objectives and success criteria </w:t>
-      </w:r>
-      <w:proofErr w:type="gramStart"/>
-      <w:r>
-        <w:rPr>
-          <w:lang w:val="en-US"/>
-        </w:rPr>
-        <w:t>of</w:t>
-      </w:r>
-      <w:proofErr w:type="gramEnd"/>
-      <w:r>
-        <w:rPr>
-          <w:lang w:val="en-US"/>
-        </w:rPr>
-        <w:t xml:space="preserve"> the project</w:t>
+        <w:t>Objectives and success criteria of the project</w:t>
       </w:r>
       <w:bookmarkEnd w:id="4"/>
     </w:p>
@@ -4997,8 +5059,16 @@
       <w:r>
         <w:rPr>
           <w:rFonts w:ascii="Times New Roman" w:hAnsi="Times New Roman" w:cs="Times New Roman"/>
-        </w:rPr>
-        <w:t>Espansione territoriale dell’area di influenza del negozio: rendere il catalogo disponibile anche per persone che sono impossibilitate a recarsi al negozio fisico, permettendo a futuri clienti da acquistare da negozi locali basati in Italia anche se lontano dalla loro zona</w:t>
+          <w:b/>
+          <w:bCs/>
+        </w:rPr>
+        <w:t>Espansione territoriale dell’area di influenza del negozio</w:t>
+      </w:r>
+      <w:r>
+        <w:rPr>
+          <w:rFonts w:ascii="Times New Roman" w:hAnsi="Times New Roman" w:cs="Times New Roman"/>
+        </w:rPr>
+        <w:t>: rendere il catalogo disponibile anche per persone che sono impossibilitate a recarsi al negozio fisico, permettendo a futuri clienti da acquistare da negozi locali basati in Italia anche se lontano dalla loro zona</w:t>
       </w:r>
     </w:p>
     <w:p>
@@ -5281,7 +5351,14 @@
         <w:ind w:left="709"/>
       </w:pPr>
       <w:r>
-        <w:t>RF1.1: il sistema deve consentire ai nuovi clienti di creare un account personale compilando un form di registrazione che richiede obbligatoriamente nome, cognome, indirizzo email, password</w:t>
+        <w:rPr>
+          <w:b/>
+          <w:bCs/>
+        </w:rPr>
+        <w:t>RF1.1</w:t>
+      </w:r>
+      <w:r>
+        <w:t>: il sistema deve consentire ai nuovi clienti di creare un account personale compilando un form di registrazione che richiede obbligatoriamente nome, cognome, indirizzo email, password</w:t>
       </w:r>
       <w:r>
         <w:t>, conferma della password, numero di telefono, data di nascita, e indirizzo di spedizione predefinito</w:t>
@@ -5296,7 +5373,14 @@
         <w:ind w:left="709"/>
       </w:pPr>
       <w:r>
-        <w:t>RF1.2: il sistema deve verificare che l’email inserita sia univoca (non già presente nel database) e sintatticamente valida, e che la password rispetti i vincoli di sicurezza definiti</w:t>
+        <w:rPr>
+          <w:b/>
+          <w:bCs/>
+        </w:rPr>
+        <w:t>RF1.2</w:t>
+      </w:r>
+      <w:r>
+        <w:t>: il sistema deve verificare che l’email inserita sia univoca (non già presente nel database) e sintatticamente valida, e che la password rispetti i vincoli di sicurezza definiti</w:t>
       </w:r>
     </w:p>
     <w:p>
@@ -5308,7 +5392,14 @@
         <w:ind w:left="709"/>
       </w:pPr>
       <w:r>
-        <w:t>RF1.3: il sistema deve consentire agli utenti registrati di accedere al proprio account fornendo le credenziali email e password scelte in fase di registrazione</w:t>
+        <w:rPr>
+          <w:b/>
+          <w:bCs/>
+        </w:rPr>
+        <w:t>RF1.3</w:t>
+      </w:r>
+      <w:r>
+        <w:t>: il sistema deve consentire agli utenti registrati di accedere al proprio account fornendo le credenziali email e password scelte in fase di registrazione</w:t>
       </w:r>
     </w:p>
     <w:p>
@@ -5320,7 +5411,14 @@
         <w:ind w:left="709"/>
       </w:pPr>
       <w:r>
-        <w:t>RF 2.1: il sistema deve consentire all’utente autenticato di visualizzare un’area personale contenente i propri dati</w:t>
+        <w:rPr>
+          <w:b/>
+          <w:bCs/>
+        </w:rPr>
+        <w:t>RF 2.1</w:t>
+      </w:r>
+      <w:r>
+        <w:t>: il sistema deve consentire all’utente autenticato di visualizzare un’area personale contenente i propri dati</w:t>
       </w:r>
     </w:p>
     <w:p>
@@ -5332,7 +5430,14 @@
         <w:ind w:left="709"/>
       </w:pPr>
       <w:r>
-        <w:t>RF2.2: il sistema deve consentire all’utente di apportare modifiche ai suoi dati personali dall’area</w:t>
+        <w:rPr>
+          <w:b/>
+          <w:bCs/>
+        </w:rPr>
+        <w:t>RF2.2</w:t>
+      </w:r>
+      <w:r>
+        <w:t>: il sistema deve consentire all’utente di apportare modifiche ai suoi dati personali dall’area</w:t>
       </w:r>
     </w:p>
     <w:p>
@@ -5344,7 +5449,14 @@
         <w:ind w:left="709"/>
       </w:pPr>
       <w:r>
-        <w:t xml:space="preserve">RF3.1: il sistema deve consentire all’utente la visualizzazione di un’area dedicata agli ordini effettuati, dove per ogni ordine sono presenti gli occhiali ordinati, l’indirizzo di spedizione </w:t>
+        <w:rPr>
+          <w:b/>
+          <w:bCs/>
+        </w:rPr>
+        <w:t>RF3.1:</w:t>
+      </w:r>
+      <w:r>
+        <w:t xml:space="preserve"> il sistema deve consentire all’utente la visualizzazione di un’area dedicata agli ordini effettuati, dove per ogni ordine sono presenti gli occhiali ordinati, l’indirizzo di spedizione </w:t>
       </w:r>
       <w:r>
         <w:lastRenderedPageBreak/>
@@ -5360,7 +5472,14 @@
         <w:ind w:left="709"/>
       </w:pPr>
       <w:r>
-        <w:t>RF3.2: il sistema deve consentire l’aggiornamento dello stato dell’ordine nell’area personale dell’utente basandosi sullo stato che viene inserito dall’OM</w:t>
+        <w:rPr>
+          <w:b/>
+          <w:bCs/>
+        </w:rPr>
+        <w:t>RF3.2:</w:t>
+      </w:r>
+      <w:r>
+        <w:t xml:space="preserve"> il sistema deve consentire l’aggiornamento dello stato dell’ordine nell’area personale dell’utente basandosi sullo stato che viene inserito dall’OM</w:t>
       </w:r>
     </w:p>
     <w:p>
@@ -5372,7 +5491,14 @@
         <w:ind w:left="709"/>
       </w:pPr>
       <w:r>
-        <w:t>RF3.3: il sistema deve assicurarsi che la visualizzazione dello stato dell’ordine del cliente deve avvenire in modalità di sola lettura, quindi quest’ultimo non può autonomamente modificare lo stato del proprio ordine</w:t>
+        <w:rPr>
+          <w:b/>
+          <w:bCs/>
+        </w:rPr>
+        <w:t>RF3.3</w:t>
+      </w:r>
+      <w:r>
+        <w:t>: il sistema deve assicurarsi che la visualizzazione dello stato dell’ordine del cliente deve avvenire in modalità di sola lettura, quindi quest’ultimo non può autonomamente modificare lo stato del proprio ordine</w:t>
       </w:r>
     </w:p>
     <w:p>
@@ -5388,6 +5514,8 @@
       </w:pPr>
       <w:r>
         <w:rPr>
+          <w:b/>
+          <w:bCs/>
           <w:color w:val="000000" w:themeColor="text1"/>
         </w:rPr>
         <w:t>RF4.1</w:t>
@@ -5412,9 +5540,17 @@
       </w:pPr>
       <w:r>
         <w:rPr>
+          <w:b/>
+          <w:bCs/>
           <w:color w:val="000000" w:themeColor="text1"/>
         </w:rPr>
-        <w:t>RF4.2: Il sistema deve permettere all’utente di azzerare i filtri se si vuole ritornare a una visione generale del catalogo</w:t>
+        <w:t>RF4.2</w:t>
+      </w:r>
+      <w:r>
+        <w:rPr>
+          <w:color w:val="000000" w:themeColor="text1"/>
+        </w:rPr>
+        <w:t>: Il sistema deve permettere all’utente di azzerare i filtri se si vuole ritornare a una visione generale del catalogo</w:t>
       </w:r>
     </w:p>
     <w:p>
@@ -5430,9 +5566,17 @@
       </w:pPr>
       <w:r>
         <w:rPr>
+          <w:b/>
+          <w:bCs/>
           <w:color w:val="000000" w:themeColor="text1"/>
         </w:rPr>
-        <w:t>RF4.3: Il sistema d</w:t>
+        <w:t>RF4.3:</w:t>
+      </w:r>
+      <w:r>
+        <w:rPr>
+          <w:color w:val="000000" w:themeColor="text1"/>
+        </w:rPr>
+        <w:t xml:space="preserve"> Il sistema d</w:t>
       </w:r>
       <w:r>
         <w:rPr>
@@ -5460,9 +5604,25 @@
       </w:pPr>
       <w:r>
         <w:rPr>
+          <w:b/>
+          <w:bCs/>
           <w:color w:val="000000" w:themeColor="text1"/>
         </w:rPr>
-        <w:t xml:space="preserve">RF5.1 il sistema deve consentire la possibilità di cliccare su un prodotto provenendo dal catalogo, e all’atto di questo evento vengano mostrate le due foto del prodotto selezionato, il nome, il prezzo, </w:t>
+        <w:t>RF5.1</w:t>
+      </w:r>
+      <w:r>
+        <w:rPr>
+          <w:b/>
+          <w:bCs/>
+          <w:color w:val="000000" w:themeColor="text1"/>
+        </w:rPr>
+        <w:t>:</w:t>
+      </w:r>
+      <w:r>
+        <w:rPr>
+          <w:color w:val="000000" w:themeColor="text1"/>
+        </w:rPr>
+        <w:t xml:space="preserve"> il sistema deve consentire la possibilità di cliccare su un prodotto provenendo dal catalogo, e all’atto di questo evento vengano mostrate le due foto del prodotto selezionato, il nome, il prezzo, </w:t>
       </w:r>
       <w:r>
         <w:rPr>
@@ -5490,9 +5650,17 @@
       </w:pPr>
       <w:r>
         <w:rPr>
+          <w:b/>
+          <w:bCs/>
           <w:color w:val="000000" w:themeColor="text1"/>
         </w:rPr>
-        <w:t xml:space="preserve">RF5.2: Il sistema deve aggiornare la pagina del dettaglio del prodotto con il colore selezionato, indicando chiaramente </w:t>
+        <w:t>RF5.2:</w:t>
+      </w:r>
+      <w:r>
+        <w:rPr>
+          <w:color w:val="000000" w:themeColor="text1"/>
+        </w:rPr>
+        <w:t xml:space="preserve"> Il sistema deve aggiornare la pagina del dettaglio del prodotto con il colore selezionato, indicando chiaramente </w:t>
       </w:r>
       <w:r>
         <w:rPr>
@@ -5514,9 +5682,17 @@
       </w:pPr>
       <w:r>
         <w:rPr>
+          <w:b/>
+          <w:bCs/>
           <w:color w:val="000000" w:themeColor="text1"/>
         </w:rPr>
-        <w:t>RF6.1: Il sistema deve consentire al cliente sulla pagina del dettaglio prodotto di poter aggiungere il paio di occhiali selezionati nel carrello</w:t>
+        <w:t>RF6.1</w:t>
+      </w:r>
+      <w:r>
+        <w:rPr>
+          <w:color w:val="000000" w:themeColor="text1"/>
+        </w:rPr>
+        <w:t>: Il sistema deve consentire al cliente sulla pagina del dettaglio prodotto di poter aggiungere il paio di occhiali selezionati nel carrello</w:t>
       </w:r>
     </w:p>
     <w:p>
@@ -5532,9 +5708,17 @@
       </w:pPr>
       <w:r>
         <w:rPr>
+          <w:b/>
+          <w:bCs/>
           <w:color w:val="000000" w:themeColor="text1"/>
         </w:rPr>
-        <w:t>RF6.2: Il sistema deve permettere al cliente di modificare la quantità del singolo modello di occhiale presente nel carrello sia dal carrello stesso sia dalla pagina del dettaglio prodotto</w:t>
+        <w:t>RF6.2</w:t>
+      </w:r>
+      <w:r>
+        <w:rPr>
+          <w:color w:val="000000" w:themeColor="text1"/>
+        </w:rPr>
+        <w:t>: Il sistema deve permettere al cliente di modificare la quantità del singolo modello di occhiale presente nel carrello sia dal carrello stesso sia dalla pagina del dettaglio prodotto</w:t>
       </w:r>
     </w:p>
     <w:p>
@@ -5550,9 +5734,17 @@
       </w:pPr>
       <w:r>
         <w:rPr>
+          <w:b/>
+          <w:bCs/>
           <w:color w:val="000000" w:themeColor="text1"/>
         </w:rPr>
-        <w:t>RF6.3: Il sistema deve permettere all’utente non loggato di poter visualizzare il catalogo è e prodotti, e aggiungerli al carrello, ma bisogna bloccarlo se vuole proseguire alla fase di checkout mostrandogli la pagina necessaria per effettuare il login o registrarsi se non possiede un account</w:t>
+        <w:t>RF6.3</w:t>
+      </w:r>
+      <w:r>
+        <w:rPr>
+          <w:color w:val="000000" w:themeColor="text1"/>
+        </w:rPr>
+        <w:t>: Il sistema deve permettere all’utente non loggato di poter visualizzare il catalogo è e prodotti, e aggiungerli al carrello, ma bisogna bloccarlo se vuole proseguire alla fase di checkout mostrandogli la pagina necessaria per effettuare il login o registrarsi se non possiede un account</w:t>
       </w:r>
     </w:p>
     <w:p>
@@ -5568,9 +5760,17 @@
       </w:pPr>
       <w:r>
         <w:rPr>
+          <w:b/>
+          <w:bCs/>
           <w:color w:val="000000" w:themeColor="text1"/>
         </w:rPr>
-        <w:t xml:space="preserve">RF7.1: Il sistema, nella fase di checkout, deve mostrare al cliente una scheda precompilata con i suoi dati personali </w:t>
+        <w:t>RF7.1:</w:t>
+      </w:r>
+      <w:r>
+        <w:rPr>
+          <w:color w:val="000000" w:themeColor="text1"/>
+        </w:rPr>
+        <w:t xml:space="preserve"> Il sistema, nella fase di checkout, deve mostrare al cliente una scheda precompilata con i suoi dati personali </w:t>
       </w:r>
       <w:r>
         <w:rPr>
@@ -5616,9 +5816,17 @@
       </w:pPr>
       <w:r>
         <w:rPr>
+          <w:b/>
+          <w:bCs/>
           <w:color w:val="000000" w:themeColor="text1"/>
         </w:rPr>
-        <w:t>RF7.2:</w:t>
+        <w:t>RF7.2</w:t>
+      </w:r>
+      <w:r>
+        <w:rPr>
+          <w:color w:val="000000" w:themeColor="text1"/>
+        </w:rPr>
+        <w:t>:</w:t>
       </w:r>
       <w:r>
         <w:rPr>
@@ -5646,9 +5854,17 @@
       </w:pPr>
       <w:r>
         <w:rPr>
+          <w:b/>
+          <w:bCs/>
           <w:color w:val="000000" w:themeColor="text1"/>
         </w:rPr>
-        <w:t xml:space="preserve">RF8.1: Il sistema deve consentire esclusivamente al Product Manager di poter aggiungere nuovi prodotti al catalogo, specificando nome, </w:t>
+        <w:t>RF8.1:</w:t>
+      </w:r>
+      <w:r>
+        <w:rPr>
+          <w:color w:val="000000" w:themeColor="text1"/>
+        </w:rPr>
+        <w:t xml:space="preserve"> Il sistema deve consentire esclusivamente al Product Manager di poter aggiungere nuovi prodotti al catalogo, specificando nome, </w:t>
       </w:r>
       <w:r>
         <w:rPr>
@@ -5688,21 +5904,33 @@
       </w:pPr>
       <w:r>
         <w:rPr>
+          <w:b/>
+          <w:bCs/>
           <w:color w:val="000000" w:themeColor="text1"/>
         </w:rPr>
         <w:t>RF</w:t>
       </w:r>
       <w:r>
         <w:rPr>
+          <w:b/>
+          <w:bCs/>
           <w:color w:val="000000" w:themeColor="text1"/>
         </w:rPr>
         <w:t>9.1</w:t>
       </w:r>
       <w:r>
         <w:rPr>
+          <w:b/>
+          <w:bCs/>
           <w:color w:val="000000" w:themeColor="text1"/>
         </w:rPr>
-        <w:t>: Il sistema deve permettere</w:t>
+        <w:t>:</w:t>
+      </w:r>
+      <w:r>
+        <w:rPr>
+          <w:color w:val="000000" w:themeColor="text1"/>
+        </w:rPr>
+        <w:t xml:space="preserve"> Il sistema deve permettere</w:t>
       </w:r>
       <w:r>
         <w:rPr>
@@ -5737,51 +5965,17 @@
       </w:pPr>
       <w:r>
         <w:rPr>
+          <w:b/>
+          <w:bCs/>
           <w:color w:val="000000" w:themeColor="text1"/>
         </w:rPr>
-        <w:t>RF</w:t>
+        <w:t>RF10.1</w:t>
       </w:r>
       <w:r>
         <w:rPr>
           <w:color w:val="000000" w:themeColor="text1"/>
         </w:rPr>
-        <w:t>10</w:t>
-      </w:r>
-      <w:r>
-        <w:rPr>
-          <w:color w:val="000000" w:themeColor="text1"/>
-        </w:rPr>
-        <w:t xml:space="preserve">.1: Il sistema deve consentire esclusivamente al Product Manager di poter </w:t>
-      </w:r>
-      <w:r>
-        <w:rPr>
-          <w:color w:val="000000" w:themeColor="text1"/>
-        </w:rPr>
-        <w:t>modificare ogni caratteristica dei prodotti de</w:t>
-      </w:r>
-      <w:r>
-        <w:rPr>
-          <w:color w:val="000000" w:themeColor="text1"/>
-        </w:rPr>
-        <w:t>l catalogo</w:t>
-      </w:r>
-      <w:r>
-        <w:rPr>
-          <w:color w:val="000000" w:themeColor="text1"/>
-        </w:rPr>
-        <w:t xml:space="preserve"> (</w:t>
-      </w:r>
-      <w:r>
-        <w:rPr>
-          <w:color w:val="000000" w:themeColor="text1"/>
-        </w:rPr>
-        <w:t xml:space="preserve">nome, taglia, genere, materiale, forma, montatura, foto </w:t>
-      </w:r>
-      <w:r>
-        <w:rPr>
-          <w:color w:val="000000" w:themeColor="text1"/>
-        </w:rPr>
-        <w:t>allegate, prezzo).</w:t>
+        <w:t>: Il sistema deve consentire esclusivamente al Product Manager di poter modificare ogni caratteristica dei prodotti del catalogo (nome, taglia, genere, materiale, forma, montatura, foto allegate, prezzo).</w:t>
       </w:r>
     </w:p>
     <w:p>
@@ -5797,45 +5991,17 @@
       </w:pPr>
       <w:r>
         <w:rPr>
+          <w:b/>
+          <w:bCs/>
           <w:color w:val="000000" w:themeColor="text1"/>
         </w:rPr>
-        <w:t xml:space="preserve">RF10.2 </w:t>
+        <w:t>RF10.2</w:t>
       </w:r>
       <w:r>
         <w:rPr>
           <w:color w:val="000000" w:themeColor="text1"/>
         </w:rPr>
-        <w:t xml:space="preserve">Il sistema deve consentire esclusivamente al Product Manager </w:t>
-      </w:r>
-      <w:r>
-        <w:rPr>
-          <w:color w:val="000000" w:themeColor="text1"/>
-        </w:rPr>
-        <w:t xml:space="preserve">di poter aggiornare le </w:t>
-      </w:r>
-      <w:r>
-        <w:rPr>
-          <w:color w:val="000000" w:themeColor="text1"/>
-        </w:rPr>
-        <w:t>quantità disponibil</w:t>
-      </w:r>
-      <w:r>
-        <w:rPr>
-          <w:color w:val="000000" w:themeColor="text1"/>
-        </w:rPr>
-        <w:t>i</w:t>
-      </w:r>
-      <w:r>
-        <w:rPr>
-          <w:color w:val="000000" w:themeColor="text1"/>
-        </w:rPr>
-        <w:t xml:space="preserve"> in magazzino</w:t>
-      </w:r>
-      <w:r>
-        <w:rPr>
-          <w:color w:val="000000" w:themeColor="text1"/>
-        </w:rPr>
-        <w:t xml:space="preserve"> di ogni modello di occhiale in ogni sua variante colore disponibile, ma anche di poter aggiungere nuove varianti colore per ogni modello.</w:t>
+        <w:t xml:space="preserve"> Il sistema deve consentire esclusivamente al Product Manager di poter aggiornare le quantità disponibili in magazzino di ogni modello di occhiale in ogni sua variante colore disponibile, ma anche di poter aggiungere nuove varianti colore per ogni modello.</w:t>
       </w:r>
     </w:p>
     <w:p>
@@ -5851,42 +6017,36 @@
       </w:pPr>
       <w:r>
         <w:rPr>
+          <w:b/>
+          <w:bCs/>
           <w:color w:val="000000" w:themeColor="text1"/>
         </w:rPr>
-        <w:t xml:space="preserve">RF 10.3 </w:t>
+        <w:t>RF 10.3</w:t>
       </w:r>
       <w:r>
         <w:rPr>
           <w:color w:val="000000" w:themeColor="text1"/>
         </w:rPr>
-        <w:t>Il sistema deve consentire esclusivamente al Product Manager</w:t>
+        <w:t xml:space="preserve"> Il sistema deve consentire esclusivamente al Product Manager di poter mettere in saldo determinati prodotti, </w:t>
       </w:r>
       <w:r>
         <w:rPr>
           <w:color w:val="000000" w:themeColor="text1"/>
         </w:rPr>
-        <w:t xml:space="preserve"> di poter mettere in saldo determinati prodotti, </w:t>
+        <w:t>specificando</w:t>
       </w:r>
       <w:r>
         <w:rPr>
           <w:color w:val="000000" w:themeColor="text1"/>
         </w:rPr>
-        <w:t>specificando</w:t>
+        <w:t xml:space="preserve"> un</w:t>
       </w:r>
       <w:r>
         <w:rPr>
           <w:color w:val="000000" w:themeColor="text1"/>
         </w:rPr>
-        <w:t xml:space="preserve"> </w:t>
-      </w:r>
-      <w:proofErr w:type="gramStart"/>
-      <w:r>
-        <w:rPr>
-          <w:color w:val="000000" w:themeColor="text1"/>
-        </w:rPr>
-        <w:t>un</w:t>
-      </w:r>
-      <w:proofErr w:type="gramEnd"/>
+        <w:t>o</w:t>
+      </w:r>
       <w:r>
         <w:rPr>
           <w:color w:val="000000" w:themeColor="text1"/>
@@ -5925,21 +6085,33 @@
       </w:pPr>
       <w:r>
         <w:rPr>
+          <w:b/>
+          <w:bCs/>
           <w:color w:val="000000" w:themeColor="text1"/>
         </w:rPr>
         <w:t>RF</w:t>
       </w:r>
       <w:r>
         <w:rPr>
+          <w:b/>
+          <w:bCs/>
           <w:color w:val="000000" w:themeColor="text1"/>
         </w:rPr>
         <w:t>11</w:t>
       </w:r>
       <w:r>
         <w:rPr>
+          <w:b/>
+          <w:bCs/>
           <w:color w:val="000000" w:themeColor="text1"/>
         </w:rPr>
-        <w:t>.1: Il sistema deve permettere esclusivamente all’Order Manager di poter visualizzare una lista di ordini</w:t>
+        <w:t>.1:</w:t>
+      </w:r>
+      <w:r>
+        <w:rPr>
+          <w:color w:val="000000" w:themeColor="text1"/>
+        </w:rPr>
+        <w:t xml:space="preserve"> Il sistema deve permettere esclusivamente all’Order Manager di poter visualizzare una lista di ordini</w:t>
       </w:r>
       <w:r>
         <w:rPr>
@@ -5961,21 +6133,33 @@
       </w:pPr>
       <w:r>
         <w:rPr>
+          <w:b/>
+          <w:bCs/>
           <w:color w:val="000000" w:themeColor="text1"/>
         </w:rPr>
         <w:t>RF</w:t>
       </w:r>
       <w:r>
         <w:rPr>
+          <w:b/>
+          <w:bCs/>
           <w:color w:val="000000" w:themeColor="text1"/>
         </w:rPr>
         <w:t>11</w:t>
       </w:r>
       <w:r>
         <w:rPr>
+          <w:b/>
+          <w:bCs/>
           <w:color w:val="000000" w:themeColor="text1"/>
         </w:rPr>
-        <w:t xml:space="preserve">.2: Il sistema deve </w:t>
+        <w:t>.2</w:t>
+      </w:r>
+      <w:r>
+        <w:rPr>
+          <w:color w:val="000000" w:themeColor="text1"/>
+        </w:rPr>
+        <w:t xml:space="preserve">: Il sistema deve </w:t>
       </w:r>
       <w:r>
         <w:rPr>
@@ -6021,21 +6205,33 @@
       </w:pPr>
       <w:r>
         <w:rPr>
+          <w:b/>
+          <w:bCs/>
           <w:color w:val="000000" w:themeColor="text1"/>
         </w:rPr>
         <w:t>RF</w:t>
       </w:r>
       <w:r>
         <w:rPr>
+          <w:b/>
+          <w:bCs/>
           <w:color w:val="000000" w:themeColor="text1"/>
         </w:rPr>
         <w:t>11</w:t>
       </w:r>
       <w:r>
         <w:rPr>
+          <w:b/>
+          <w:bCs/>
           <w:color w:val="000000" w:themeColor="text1"/>
         </w:rPr>
-        <w:t>.3: Il sistema deve permettere all’Order Manager di poter filtrare gli ordini per data, cliente, tipo di occhiale, marca, stato dell’ordine, metodo di pagamento, e prezzo</w:t>
+        <w:t>.3:</w:t>
+      </w:r>
+      <w:r>
+        <w:rPr>
+          <w:color w:val="000000" w:themeColor="text1"/>
+        </w:rPr>
+        <w:t xml:space="preserve"> Il sistema deve permettere all’Order Manager di poter filtrare gli ordini per data, cliente, tipo di occhiale, marca, stato dell’ordine, metodo di pagamento, e prezzo</w:t>
       </w:r>
       <w:r>
         <w:rPr>
@@ -6052,32 +6248,70 @@
         <w:spacing w:after="100"/>
         <w:ind w:left="709"/>
         <w:rPr>
+          <w:color w:val="000000" w:themeColor="text1"/>
+        </w:rPr>
+      </w:pPr>
+      <w:r>
+        <w:rPr>
+          <w:b/>
+          <w:bCs/>
+          <w:color w:val="000000" w:themeColor="text1"/>
+        </w:rPr>
+        <w:t>RF1</w:t>
+      </w:r>
+      <w:r>
+        <w:rPr>
+          <w:b/>
+          <w:bCs/>
+          <w:color w:val="000000" w:themeColor="text1"/>
+        </w:rPr>
+        <w:t>2</w:t>
+      </w:r>
+      <w:r>
+        <w:rPr>
+          <w:b/>
+          <w:bCs/>
+          <w:color w:val="000000" w:themeColor="text1"/>
+        </w:rPr>
+        <w:t>.1:</w:t>
+      </w:r>
+      <w:r>
+        <w:rPr>
+          <w:color w:val="000000" w:themeColor="text1"/>
+        </w:rPr>
+        <w:t xml:space="preserve"> Il sistema deve permettere esclusivamente al Market Analyzer di accedere a una </w:t>
+      </w:r>
+      <w:r>
+        <w:rPr>
+          <w:color w:val="000000" w:themeColor="text1"/>
+        </w:rPr>
+        <w:t>tabella con i prodotti presenti nel catalogo con accanto un numero che indica la quantità di volte che quel prodotto è stato ordinato</w:t>
+      </w:r>
+    </w:p>
+    <w:p>
+      <w:pPr>
+        <w:tabs>
+          <w:tab w:val="left" w:pos="8580"/>
+        </w:tabs>
+        <w:spacing w:after="100"/>
+        <w:ind w:left="709"/>
+        <w:rPr>
           <w:color w:val="EE0000"/>
         </w:rPr>
       </w:pPr>
       <w:r>
         <w:rPr>
+          <w:b/>
+          <w:bCs/>
           <w:color w:val="000000" w:themeColor="text1"/>
         </w:rPr>
-        <w:t>RF1</w:t>
+        <w:t>RF12.2</w:t>
       </w:r>
       <w:r>
         <w:rPr>
           <w:color w:val="000000" w:themeColor="text1"/>
         </w:rPr>
-        <w:t>2</w:t>
-      </w:r>
-      <w:r>
-        <w:rPr>
-          <w:color w:val="000000" w:themeColor="text1"/>
-        </w:rPr>
-        <w:t xml:space="preserve">.1: Il sistema deve permettere esclusivamente al Market Analyzer di accedere a una lista di ordini effettuati dai clienti, dove esso può visualizzare i prodotti ordinati, e filtrarli per data, tipo di occhiale, marca </w:t>
-      </w:r>
-      <w:r>
-        <w:rPr>
-          <w:color w:val="EE0000"/>
-        </w:rPr>
-        <w:t>finisci</w:t>
+        <w:t xml:space="preserve"> Il sistema deve permettere al Market Analyzer di filtrare per data i prodotti ordinati, cosi da cambiare i numeri presenti accanto ad essi e permettergli di creare statistiche per determinate date</w:t>
       </w:r>
     </w:p>
     <w:p>
@@ -6105,16 +6339,10 @@
           <w:numId w:val="1"/>
         </w:numPr>
         <w:ind w:left="1418" w:hanging="709"/>
-        <w:rPr>
-          <w:b w:val="0"/>
-          <w:bCs w:val="0"/>
-        </w:rPr>
       </w:pPr>
       <w:bookmarkStart w:id="13" w:name="_Toc243657074"/>
       <w:r>
         <w:rPr>
-          <w:b w:val="0"/>
-          <w:bCs w:val="0"/>
           <w:sz w:val="26"/>
           <w:szCs w:val="26"/>
         </w:rPr>
@@ -6129,7 +6357,14 @@
         <w:jc w:val="both"/>
       </w:pPr>
       <w:r>
-        <w:t xml:space="preserve">RNF1: </w:t>
+        <w:rPr>
+          <w:b/>
+          <w:bCs/>
+        </w:rPr>
+        <w:t>RNF1</w:t>
+      </w:r>
+      <w:r>
+        <w:t xml:space="preserve">: </w:t>
       </w:r>
       <w:r>
         <w:t xml:space="preserve">Il sistema deve offrire un layout flessibile in grado di adattarsi automaticamente alle diverse risoluzioni e formati di schermo (smartphone, tablet, laptop e desktop). </w:t>
@@ -6153,7 +6388,14 @@
         <w:ind w:left="1418"/>
       </w:pPr>
       <w:r>
-        <w:t>RNF2:</w:t>
+        <w:rPr>
+          <w:b/>
+          <w:bCs/>
+        </w:rPr>
+        <w:t>RNF2</w:t>
+      </w:r>
+      <w:r>
+        <w:t>:</w:t>
       </w:r>
       <w:r>
         <w:t xml:space="preserve"> Nelle situazioni in cui una schermata o un componente non presenta contenuti da mostrare (es. carrello degli acquisti vuoto, nessun ordine effettuato, nessun risultato corrispondente a un filtro di ricerca), il sistema non deve mai restituire schermate bianche o layout frammentati. Deve invece mostrare messaggi visivi descrittivi che spieghino chiaramente lo stato attuale e suggeriscano l'azione successiva da compiere</w:t>
@@ -6172,7 +6414,14 @@
         </w:rPr>
       </w:pPr>
       <w:r>
-        <w:t>RNF3:</w:t>
+        <w:rPr>
+          <w:b/>
+          <w:bCs/>
+        </w:rPr>
+        <w:t>RNF3</w:t>
+      </w:r>
+      <w:r>
+        <w:t>:</w:t>
       </w:r>
       <w:r>
         <w:t xml:space="preserve"> Il sistema deve rendere costantemente evidente all'utente il risultato delle proprie azioni attraverso notifiche visive, come banner cromatici di conferma (suc</w:t>
@@ -6195,19 +6444,14 @@
           <w:numId w:val="1"/>
         </w:numPr>
         <w:ind w:left="1418" w:hanging="709"/>
-        <w:rPr>
-          <w:b w:val="0"/>
-          <w:bCs w:val="0"/>
-        </w:rPr>
       </w:pPr>
       <w:bookmarkStart w:id="14" w:name="_Toc243657075"/>
       <w:r>
         <w:rPr>
-          <w:b w:val="0"/>
-          <w:bCs w:val="0"/>
           <w:sz w:val="26"/>
           <w:szCs w:val="26"/>
         </w:rPr>
+        <w:lastRenderedPageBreak/>
         <w:t>Documentation</w:t>
       </w:r>
       <w:bookmarkEnd w:id="14"/>
@@ -6222,7 +6466,14 @@
         <w:ind w:left="1418"/>
       </w:pPr>
       <w:r>
-        <w:t xml:space="preserve">RFN8: </w:t>
+        <w:rPr>
+          <w:b/>
+          <w:bCs/>
+        </w:rPr>
+        <w:t>RFN8:</w:t>
+      </w:r>
+      <w:r>
+        <w:t xml:space="preserve"> </w:t>
       </w:r>
       <w:r>
         <w:t>Deve essere fornito un documento tecnico (</w:t>
@@ -6255,11 +6506,7 @@
         <w:t>i</w:t>
       </w:r>
       <w:r>
-        <w:t xml:space="preserve"> i requisiti d'ambiente (Java JDK, Apache Tomcat, MySQL) e </w:t>
-      </w:r>
-      <w:r>
-        <w:lastRenderedPageBreak/>
-        <w:t>le istruzioni dettagliate per l'importazione del database</w:t>
+        <w:t xml:space="preserve"> i requisiti d'ambiente (Java JDK, Apache Tomcat, MySQL) e le istruzioni dettagliate per l'importazione del database</w:t>
       </w:r>
       <w:r>
         <w:t>,</w:t>
@@ -6278,7 +6525,14 @@
         <w:ind w:left="1418"/>
       </w:pPr>
       <w:r>
-        <w:t>RFN9: Deve essere fornito un manuale d'uso (sotto forma di sezione Aiuto/FAQ integrata nel sito o documento PDF), rivolto ai clienti finali e ai gestori del negozio, che illustri le procedure di navigazione del catalogo occhiali, carrello e checkout per gli acquirenti e la gestione di prodotti, scorte e ordini per gli amministratori.</w:t>
+        <w:rPr>
+          <w:b/>
+          <w:bCs/>
+        </w:rPr>
+        <w:t>RFN9:</w:t>
+      </w:r>
+      <w:r>
+        <w:t xml:space="preserve"> Deve essere fornito un manuale d'uso (sotto forma di sezione Aiuto/FAQ integrata nel sito o documento PDF), rivolto ai clienti finali e ai gestori del negozio, che illustri le procedure di navigazione del catalogo occhiali, carrello e checkout per gli acquirenti e la gestione di prodotti, scorte e ordini per gli amministratori.</w:t>
       </w:r>
     </w:p>
     <w:p>
@@ -6291,7 +6545,14 @@
         <w:ind w:left="1418"/>
       </w:pPr>
       <w:r>
-        <w:t>RFN10: Deve essere prodotta la documentazione tecnica delle API interne in formato HTML tramite Javadoc, rivolta agli sviluppatori e ai futuri manutentori del sistema, che descriva le classi Java di backend (Servlet, DAO, JavaBean), specificando metodi, parametri, valori di ritorno ed eccezioni gestite.</w:t>
+        <w:rPr>
+          <w:b/>
+          <w:bCs/>
+        </w:rPr>
+        <w:t>RFN10</w:t>
+      </w:r>
+      <w:r>
+        <w:t>: Deve essere prodotta la documentazione tecnica delle API interne in formato HTML tramite Javadoc, rivolta agli sviluppatori e ai futuri manutentori del sistema, che descriva le classi Java di backend (Servlet, DAO, JavaBean), specificando metodi, parametri, valori di ritorno ed eccezioni gestite.</w:t>
       </w:r>
     </w:p>
     <w:p>
@@ -6302,16 +6563,10 @@
           <w:numId w:val="1"/>
         </w:numPr>
         <w:ind w:left="1418" w:hanging="709"/>
-        <w:rPr>
-          <w:b w:val="0"/>
-          <w:bCs w:val="0"/>
-        </w:rPr>
       </w:pPr>
       <w:bookmarkStart w:id="15" w:name="_Toc243657076"/>
       <w:r>
         <w:rPr>
-          <w:b w:val="0"/>
-          <w:bCs w:val="0"/>
           <w:sz w:val="26"/>
           <w:szCs w:val="26"/>
         </w:rPr>
@@ -6329,7 +6584,14 @@
         <w:ind w:left="1418"/>
       </w:pPr>
       <w:r>
-        <w:t>RFN11: Il sistema lato backend deve poter essere eseguito su un server fisico o su macchina virtuale dotata di processore multi-core, una memoria RAM minima di 4 GB (consigliati 8 GB), uno spazio di archiviazione secondaria (disco SSD/Hard Disk) di almeno 20 GB dedicati a sistema operativo, database relazionale e catalogo immagini dei prodotti.</w:t>
+        <w:rPr>
+          <w:b/>
+          <w:bCs/>
+        </w:rPr>
+        <w:t>RFN11</w:t>
+      </w:r>
+      <w:r>
+        <w:t>: Il sistema lato backend deve poter essere eseguito su un server fisico o su macchina virtuale dotata di processore multi-core, una memoria RAM minima di 4 GB (consigliati 8 GB), uno spazio di archiviazione secondaria (disco SSD/Hard Disk) di almeno 20 GB dedicati a sistema operativo, database relazionale e catalogo immagini dei prodotti.</w:t>
       </w:r>
     </w:p>
     <w:p>
@@ -6342,7 +6604,14 @@
         <w:ind w:left="1418"/>
       </w:pPr>
       <w:r>
-        <w:t xml:space="preserve">RFN12: L'accesso alla piattaforma web da parte di clienti e amministratori deve essere garantito su qualsiasi dispositivo </w:t>
+        <w:rPr>
+          <w:b/>
+          <w:bCs/>
+        </w:rPr>
+        <w:t>RFN12:</w:t>
+      </w:r>
+      <w:r>
+        <w:t xml:space="preserve"> L'accesso alla piattaforma web da parte di clienti e amministratori deve essere garantito su qualsiasi dispositivo </w:t>
       </w:r>
       <w:r>
         <w:t>(</w:t>
@@ -6371,16 +6640,10 @@
           <w:numId w:val="1"/>
         </w:numPr>
         <w:ind w:left="1418" w:hanging="709"/>
-        <w:rPr>
-          <w:b w:val="0"/>
-          <w:bCs w:val="0"/>
-        </w:rPr>
       </w:pPr>
       <w:bookmarkStart w:id="16" w:name="_Toc243657077"/>
       <w:r>
         <w:rPr>
-          <w:b w:val="0"/>
-          <w:bCs w:val="0"/>
           <w:sz w:val="26"/>
           <w:szCs w:val="26"/>
         </w:rPr>
@@ -6398,7 +6661,14 @@
         </w:rPr>
       </w:pPr>
       <w:r>
-        <w:t>RNF5:</w:t>
+        <w:rPr>
+          <w:b/>
+          <w:bCs/>
+        </w:rPr>
+        <w:t>RNF5</w:t>
+      </w:r>
+      <w:r>
+        <w:t>:</w:t>
       </w:r>
       <w:r>
         <w:t xml:space="preserve"> L'interfaccia utente deve garantire una navigazione fluida riducendo al minimo i tempi di attesa e i ricaricamenti dell'intera pagina, i quali comporterebbero fastidiose interruzioni visive e attese stimate tra 0,5 e 3 secondi per ogni singola azione. Le operazioni frequenti, quali la modifica delle quantità del carrello, il filtraggio dei prodotti nel catalogo o l'aggiornamento dello stato di un ordine, devono avvenire in modo asincrono. Questo significa che il sistema deve aggiornare istantaneamente (in circa 100-300 millisecondi) solo le porzioni di schermo interessate dal cambiamento, evitando di dover scaricare e ridisegnare da zero l'intera pagina web per ogni minima modifica.</w:t>
@@ -6412,16 +6682,10 @@
           <w:numId w:val="1"/>
         </w:numPr>
         <w:ind w:left="1418" w:hanging="709"/>
-        <w:rPr>
-          <w:b w:val="0"/>
-          <w:bCs w:val="0"/>
-        </w:rPr>
       </w:pPr>
       <w:bookmarkStart w:id="17" w:name="_Toc243657078"/>
       <w:r>
         <w:rPr>
-          <w:b w:val="0"/>
-          <w:bCs w:val="0"/>
           <w:sz w:val="26"/>
           <w:szCs w:val="26"/>
         </w:rPr>
@@ -6439,7 +6703,14 @@
         </w:rPr>
       </w:pPr>
       <w:r>
-        <w:t>RNF4:</w:t>
+        <w:rPr>
+          <w:b/>
+          <w:bCs/>
+        </w:rPr>
+        <w:t>RNF4</w:t>
+      </w:r>
+      <w:r>
+        <w:t>:</w:t>
       </w:r>
       <w:r>
         <w:t xml:space="preserve"> Le </w:t>
@@ -6459,16 +6730,10 @@
           <w:numId w:val="1"/>
         </w:numPr>
         <w:ind w:left="1418" w:hanging="709"/>
-        <w:rPr>
-          <w:b w:val="0"/>
-          <w:bCs w:val="0"/>
-        </w:rPr>
       </w:pPr>
       <w:bookmarkStart w:id="18" w:name="_Toc243657079"/>
       <w:r>
         <w:rPr>
-          <w:b w:val="0"/>
-          <w:bCs w:val="0"/>
           <w:sz w:val="26"/>
           <w:szCs w:val="26"/>
         </w:rPr>
@@ -6486,7 +6751,14 @@
         <w:ind w:left="1418"/>
       </w:pPr>
       <w:r>
-        <w:t xml:space="preserve">RFN13: L'applicazione web deve interagire con il sistema esterno di gestione della base di dati (MySQL Server), inviando in output comandi e query formulati nel linguaggio SQL e ricevendo in input i dati estratti sotto forma di record strutturati. </w:t>
+        <w:rPr>
+          <w:b/>
+          <w:bCs/>
+        </w:rPr>
+        <w:t>RFN13</w:t>
+      </w:r>
+      <w:r>
+        <w:t xml:space="preserve">: L'applicazione web deve interagire con il sistema esterno di gestione della base di dati (MySQL Server), inviando in output comandi e query formulati nel linguaggio SQL e ricevendo in input i dati estratti sotto forma di record strutturati. </w:t>
       </w:r>
     </w:p>
     <w:p>
@@ -6497,19 +6769,14 @@
           <w:numId w:val="1"/>
         </w:numPr>
         <w:ind w:left="1418" w:hanging="709"/>
-        <w:rPr>
-          <w:b w:val="0"/>
-          <w:bCs w:val="0"/>
-        </w:rPr>
       </w:pPr>
       <w:bookmarkStart w:id="19" w:name="_Toc243657080"/>
       <w:r>
         <w:rPr>
-          <w:b w:val="0"/>
-          <w:bCs w:val="0"/>
           <w:sz w:val="26"/>
           <w:szCs w:val="26"/>
         </w:rPr>
+        <w:lastRenderedPageBreak/>
         <w:t>Quality issues</w:t>
       </w:r>
       <w:bookmarkEnd w:id="19"/>
@@ -6521,7 +6788,14 @@
         <w:jc w:val="both"/>
       </w:pPr>
       <w:r>
-        <w:t>RNF7:</w:t>
+        <w:rPr>
+          <w:b/>
+          <w:bCs/>
+        </w:rPr>
+        <w:t>RNF7</w:t>
+      </w:r>
+      <w:r>
+        <w:t>:</w:t>
       </w:r>
       <w:r>
         <w:t xml:space="preserve"> L'aspetto grafico</w:t>
@@ -6554,11 +6828,7 @@
         <w:t>,</w:t>
       </w:r>
       <w:r>
-        <w:t xml:space="preserve"> garantendo un'esperienza omogenea a </w:t>
-      </w:r>
-      <w:r>
-        <w:lastRenderedPageBreak/>
-        <w:t>prescindere dal client utilizzato</w:t>
+        <w:t xml:space="preserve"> garantendo un'esperienza omogenea a prescindere dal client utilizzato</w:t>
       </w:r>
       <w:r>
         <w:t>.</w:t>
@@ -6573,8 +6843,6 @@
         </w:numPr>
         <w:ind w:left="1418" w:hanging="709"/>
         <w:rPr>
-          <w:b w:val="0"/>
-          <w:bCs w:val="0"/>
           <w:sz w:val="26"/>
           <w:szCs w:val="26"/>
         </w:rPr>
@@ -6582,8 +6850,6 @@
       <w:bookmarkStart w:id="20" w:name="_Toc243657081"/>
       <w:r>
         <w:rPr>
-          <w:b w:val="0"/>
-          <w:bCs w:val="0"/>
           <w:sz w:val="26"/>
           <w:szCs w:val="26"/>
         </w:rPr>
@@ -6597,7 +6863,14 @@
         <w:ind w:left="1418"/>
       </w:pPr>
       <w:r>
-        <w:t>RNF14: La struttura della base di dati e il livello Model devono essere facilmente estendibili per accogliere future funzionalità</w:t>
+        <w:rPr>
+          <w:b/>
+          <w:bCs/>
+        </w:rPr>
+        <w:t>RNF14</w:t>
+      </w:r>
+      <w:r>
+        <w:t>: La struttura della base di dati e il livello Model devono essere facilmente estendibili per accogliere future funzionalità</w:t>
       </w:r>
       <w:r>
         <w:t>, ad esempio</w:t>
@@ -6626,18 +6899,6 @@
       <w:r>
         <w:t>.</w:t>
       </w:r>
-    </w:p>
-    <w:p>
-      <w:pPr>
-        <w:spacing w:before="100" w:after="100"/>
-        <w:ind w:left="1418"/>
-      </w:pPr>
-    </w:p>
-    <w:p>
-      <w:pPr>
-        <w:spacing w:before="100" w:after="100"/>
-        <w:ind w:left="1418"/>
-      </w:pPr>
     </w:p>
     <w:p>
       <w:pPr>
@@ -6648,8 +6909,6 @@
         </w:numPr>
         <w:ind w:left="1418" w:hanging="709"/>
         <w:rPr>
-          <w:b w:val="0"/>
-          <w:bCs w:val="0"/>
           <w:sz w:val="26"/>
           <w:szCs w:val="26"/>
         </w:rPr>
@@ -6657,8 +6916,6 @@
       <w:bookmarkStart w:id="21" w:name="_Toc243657082"/>
       <w:r>
         <w:rPr>
-          <w:b w:val="0"/>
-          <w:bCs w:val="0"/>
           <w:sz w:val="26"/>
           <w:szCs w:val="26"/>
         </w:rPr>
@@ -6672,7 +6929,14 @@
         <w:ind w:left="1418"/>
       </w:pPr>
       <w:r>
-        <w:t>RFN15: Il sistema opera su un'architettura distribuita su un’unica sede: le componenti server (server applicativo Tomcat e database MySQL) risiedono in un'unica postazione fissa (data center/server room), mentre i dispositivi client (computer desktop, notebook, smartphone e tablet) operano distribuiti in molteplici postazioni, connettendosi da remoto tramite rete Internet o rete locale.</w:t>
+        <w:rPr>
+          <w:b/>
+          <w:bCs/>
+        </w:rPr>
+        <w:t>RFN15</w:t>
+      </w:r>
+      <w:r>
+        <w:t>: Il sistema opera su un'architettura distribuita su un’unica sede: le componenti server (server applicativo Tomcat e database MySQL) risiedono in un'unica postazione fissa (data center/server room), mentre i dispositivi client (computer desktop, notebook, smartphone e tablet) operano distribuiti in molteplici postazioni, connettendosi da remoto tramite rete Internet o rete locale.</w:t>
       </w:r>
     </w:p>
     <w:p>
@@ -6684,8 +6948,6 @@
         </w:numPr>
         <w:ind w:left="1418" w:hanging="709"/>
         <w:rPr>
-          <w:b w:val="0"/>
-          <w:bCs w:val="0"/>
           <w:sz w:val="26"/>
           <w:szCs w:val="26"/>
         </w:rPr>
@@ -6693,8 +6955,6 @@
       <w:bookmarkStart w:id="22" w:name="_Toc243657083"/>
       <w:r>
         <w:rPr>
-          <w:b w:val="0"/>
-          <w:bCs w:val="0"/>
           <w:sz w:val="26"/>
           <w:szCs w:val="26"/>
         </w:rPr>
@@ -6708,7 +6968,14 @@
         <w:ind w:left="1418"/>
       </w:pPr>
       <w:r>
-        <w:t>RNF6:</w:t>
+        <w:rPr>
+          <w:b/>
+          <w:bCs/>
+        </w:rPr>
+        <w:t>RNF6</w:t>
+      </w:r>
+      <w:r>
+        <w:t>:</w:t>
       </w:r>
       <w:r>
         <w:t xml:space="preserve"> Per garantire affidabilità e sicurezza dei dati sensibili dei clienti e dei dipendenti, il sistema deve essere in grado di resistere a specifici attacchi di sicurezza. Vengono, pertanto, richieste all'utente la scelta di password robuste a protezione del suo account. Password che verranno poi criptate per i fini di sicurezza e conservate all'interno di un database (DB) protetto da un Firewall.</w:t>
@@ -6724,8 +6991,6 @@
         <w:spacing w:before="100" w:after="100"/>
         <w:ind w:left="1418" w:hanging="709"/>
         <w:rPr>
-          <w:b w:val="0"/>
-          <w:bCs w:val="0"/>
           <w:sz w:val="26"/>
           <w:szCs w:val="26"/>
         </w:rPr>
@@ -6733,8 +6998,6 @@
       <w:bookmarkStart w:id="23" w:name="_Toc243657084"/>
       <w:r>
         <w:rPr>
-          <w:b w:val="0"/>
-          <w:bCs w:val="0"/>
           <w:sz w:val="26"/>
           <w:szCs w:val="26"/>
         </w:rPr>
@@ -6747,7 +7010,14 @@
         <w:ind w:left="1418"/>
       </w:pPr>
       <w:r>
-        <w:t xml:space="preserve">RFN16: Il sistema deve prevedere una procedura di backup automatizzata con frequenza giornaliera per il DB e con frequenza settimanale per le risorse statiche (immagini degli occhiali, banner pubblicitari). La responsabilità della corretta esecuzione, verifica e conservazione dei backup è assegnata </w:t>
+        <w:rPr>
+          <w:b/>
+          <w:bCs/>
+        </w:rPr>
+        <w:t>RFN16</w:t>
+      </w:r>
+      <w:r>
+        <w:t xml:space="preserve">: Il sistema deve prevedere una procedura di backup automatizzata con frequenza giornaliera per il DB e con frequenza settimanale per le risorse statiche (immagini degli occhiali, banner pubblicitari). La responsabilità della corretta esecuzione, verifica e conservazione dei backup è assegnata </w:t>
       </w:r>
       <w:r>
         <w:t>all’User Manager (in qualità di amministratore della piattaforma).</w:t>
@@ -6779,23 +7049,16 @@
           <w:numId w:val="1"/>
         </w:numPr>
         <w:ind w:left="1418" w:hanging="709"/>
-        <w:rPr>
-          <w:b w:val="0"/>
-          <w:bCs w:val="0"/>
-        </w:rPr>
       </w:pPr>
       <w:bookmarkStart w:id="25" w:name="_Toc243657086"/>
       <w:proofErr w:type="spellStart"/>
       <w:r>
-        <w:rPr>
-          <w:b w:val="0"/>
-          <w:bCs w:val="0"/>
-        </w:rPr>
         <w:t>Scenarios</w:t>
       </w:r>
       <w:bookmarkEnd w:id="25"/>
       <w:proofErr w:type="spellEnd"/>
     </w:p>
+    <w:p/>
     <w:p>
       <w:pPr>
         <w:tabs>
@@ -6892,25 +7155,7 @@
           <w:sz w:val="22"/>
           <w:szCs w:val="22"/>
         </w:rPr>
-        <w:t>marco.</w:t>
-      </w:r>
-      <w:r>
-        <w:rPr>
-          <w:rFonts w:ascii="Courier New" w:eastAsia="Times New Roman" w:hAnsi="Courier New" w:cs="Courier New"/>
-          <w:kern w:val="0"/>
-          <w:sz w:val="22"/>
-          <w:szCs w:val="22"/>
-        </w:rPr>
-        <w:t>gialli</w:t>
-      </w:r>
-      <w:r>
-        <w:rPr>
-          <w:rFonts w:ascii="Courier New" w:eastAsia="Times New Roman" w:hAnsi="Courier New" w:cs="Courier New"/>
-          <w:kern w:val="0"/>
-          <w:sz w:val="22"/>
-          <w:szCs w:val="22"/>
-        </w:rPr>
-        <w:t>@email.it</w:t>
+        <w:t>marco.gialli@email.it</w:t>
       </w:r>
       <w:r>
         <w:rPr>
@@ -7099,22 +7344,22 @@
           <w:rFonts w:eastAsia="Times New Roman"/>
           <w:kern w:val="0"/>
         </w:rPr>
-        <w:t>, mostrando</w:t>
+        <w:t xml:space="preserve">, </w:t>
       </w:r>
       <w:r>
         <w:rPr>
           <w:rFonts w:eastAsia="Times New Roman"/>
           <w:kern w:val="0"/>
         </w:rPr>
-        <w:t xml:space="preserve"> a schermo due foto ad alta risoluzione del modello (con la prima in primo </w:t>
+        <w:lastRenderedPageBreak/>
+        <w:t>mostrando</w:t>
       </w:r>
       <w:r>
         <w:rPr>
           <w:rFonts w:eastAsia="Times New Roman"/>
           <w:kern w:val="0"/>
         </w:rPr>
-        <w:lastRenderedPageBreak/>
-        <w:t xml:space="preserve">piano), il prezzo di € </w:t>
+        <w:t xml:space="preserve"> a schermo due foto ad alta risoluzione del modello (con la prima in primo piano), il prezzo di € </w:t>
       </w:r>
       <w:r>
         <w:rPr>
@@ -7721,28 +7966,7 @@
           <w:b/>
           <w:bCs/>
         </w:rPr>
-        <w:t>SC</w:t>
-      </w:r>
-      <w:r>
-        <w:rPr>
-          <w:b/>
-          <w:bCs/>
-        </w:rPr>
-        <w:t>2</w:t>
-      </w:r>
-      <w:r>
-        <w:rPr>
-          <w:b/>
-          <w:bCs/>
-        </w:rPr>
-        <w:t>_A</w:t>
-      </w:r>
-      <w:r>
-        <w:rPr>
-          <w:b/>
-          <w:bCs/>
-        </w:rPr>
-        <w:t>ggiornamentoOrdine</w:t>
+        <w:t>SC2_AggiornamentoOrdine</w:t>
       </w:r>
     </w:p>
     <w:p>
@@ -7759,19 +7983,7 @@
         <w:ind w:left="1701" w:hanging="283"/>
       </w:pPr>
       <w:r>
-        <w:t xml:space="preserve">Attori coinvolti: </w:t>
-      </w:r>
-      <w:r>
-        <w:t>Antonio</w:t>
-      </w:r>
-      <w:r>
-        <w:t xml:space="preserve"> (</w:t>
-      </w:r>
-      <w:r>
-        <w:t>OM</w:t>
-      </w:r>
-      <w:r>
-        <w:t>)</w:t>
+        <w:t>Attori coinvolti: Antonio (OM)</w:t>
       </w:r>
     </w:p>
     <w:p>
@@ -7781,19 +7993,7 @@
       </w:pPr>
       <w:bookmarkStart w:id="26" w:name="_Toc243657087"/>
       <w:r>
-        <w:t xml:space="preserve">Antonio Esposito, all'inizio del suo turno nel negozio fisico, accede alla pagina di login </w:t>
-      </w:r>
-      <w:r>
-        <w:t xml:space="preserve">autenticandosi con le proprie credenziali </w:t>
-      </w:r>
-      <w:r>
-        <w:t>aziendal</w:t>
-      </w:r>
-      <w:r>
-        <w:t>i: inserisce</w:t>
-      </w:r>
-      <w:r>
-        <w:t xml:space="preserve"> e-mail </w:t>
+        <w:t xml:space="preserve">Antonio Esposito, all'inizio del suo turno nel negozio fisico, accede alla pagina di login autenticandosi con le proprie credenziali aziendali: inserisce e-mail </w:t>
       </w:r>
       <w:r>
         <w:rPr>
@@ -7838,37 +8038,7 @@
         <w:ind w:left="1418"/>
       </w:pPr>
       <w:r>
-        <w:t xml:space="preserve">Il sistema convalida le credenziali, riconosce il ruolo di "Order Manager" e </w:t>
-      </w:r>
-      <w:r>
-        <w:t>reindirizza Antonio al</w:t>
-      </w:r>
-      <w:r>
-        <w:t>la Dashboard Gestionale</w:t>
-      </w:r>
-      <w:r>
-        <w:t xml:space="preserve"> degli ordini, dove viene mostrata l</w:t>
-      </w:r>
-      <w:r>
-        <w:t xml:space="preserve">a tabella contenente </w:t>
-      </w:r>
-      <w:r>
-        <w:t xml:space="preserve">tutti </w:t>
-      </w:r>
-      <w:r>
-        <w:t xml:space="preserve">gli ordini </w:t>
-      </w:r>
-      <w:r>
-        <w:t>effettuati</w:t>
-      </w:r>
-      <w:r>
-        <w:t>.</w:t>
-      </w:r>
-      <w:r>
-        <w:t xml:space="preserve"> </w:t>
-      </w:r>
-      <w:r>
-        <w:t xml:space="preserve">Antonio individua la riga relativa all'ordine </w:t>
+        <w:t xml:space="preserve">Il sistema convalida le credenziali, riconosce il ruolo di "Order Manager" e reindirizza Antonio alla Dashboard Gestionale degli ordini, dove viene mostrata la tabella contenente tutti gli ordini effettuati. Antonio individua la riga relativa all'ordine </w:t>
       </w:r>
       <w:r>
         <w:rPr>
@@ -7966,6 +8136,7 @@
         <w:ind w:left="1702" w:hanging="284"/>
       </w:pPr>
       <w:r>
+        <w:lastRenderedPageBreak/>
         <w:t>metodo di pagamento: Contrassegno;</w:t>
       </w:r>
     </w:p>
@@ -7980,7 +8151,6 @@
         <w:ind w:left="1702" w:hanging="284"/>
       </w:pPr>
       <w:r>
-        <w:lastRenderedPageBreak/>
         <w:t>stato attuale: IN LAVORAZIONE.</w:t>
       </w:r>
     </w:p>
@@ -8105,10 +8275,7 @@
         <w:t>Tornato alla sua postazione</w:t>
       </w:r>
       <w:r>
-        <w:t xml:space="preserve"> e alla dashboard di gestione, torna sulla riga dell’ordine </w:t>
-      </w:r>
-      <w:r>
-        <w:t>#829209</w:t>
+        <w:t xml:space="preserve"> e alla dashboard di gestione, torna sulla riga dell’ordine #829209</w:t>
       </w:r>
       <w:r>
         <w:t>, clicca sul menu a tendina presente nella colonna "Stato"</w:t>
@@ -8677,11 +8844,19 @@
             </w:rPr>
             <w:t xml:space="preserve">Documento: </w:t>
           </w:r>
+          <w:proofErr w:type="spellStart"/>
           <w:r>
             <w:rPr>
               <w:sz w:val="20"/>
             </w:rPr>
-            <w:t>Problem Statement</w:t>
+            <w:t>Problem</w:t>
+          </w:r>
+          <w:proofErr w:type="spellEnd"/>
+          <w:r>
+            <w:rPr>
+              <w:sz w:val="20"/>
+            </w:rPr>
+            <w:t xml:space="preserve"> Statement</w:t>
           </w:r>
         </w:p>
       </w:tc>
@@ -10836,6 +11011,7 @@
   <w:style w:type="character" w:default="1" w:styleId="Carpredefinitoparagrafo">
     <w:name w:val="Default Paragraph Font"/>
     <w:uiPriority w:val="1"/>
+    <w:semiHidden/>
     <w:unhideWhenUsed/>
   </w:style>
   <w:style w:type="table" w:default="1" w:styleId="Tabellanormale">

</xml_diff>

<commit_message>
Aggiunta delle Definizioni, Abbreviazione e Overview
</commit_message>
<xml_diff>
--- a/Deliverables/RAD_GGEyewear.docx
+++ b/Deliverables/RAD_GGEyewear.docx
@@ -1,6 +1,6 @@
 
 <file path=word/document.xml><?xml version="1.0" encoding="utf-8"?>
-<w:document xmlns:wpc="http://schemas.microsoft.com/office/word/2010/wordprocessingCanvas" xmlns:cx="http://schemas.microsoft.com/office/drawing/2014/chartex" xmlns:cx1="http://schemas.microsoft.com/office/drawing/2015/9/8/chartex" xmlns:cx2="http://schemas.microsoft.com/office/drawing/2015/10/21/chartex" xmlns:cx3="http://schemas.microsoft.com/office/drawing/2016/5/9/chartex" xmlns:cx4="http://schemas.microsoft.com/office/drawing/2016/5/10/chartex" xmlns:cx5="http://schemas.microsoft.com/office/drawing/2016/5/11/chartex" xmlns:cx6="http://schemas.microsoft.com/office/drawing/2016/5/12/chartex" xmlns:cx7="http://schemas.microsoft.com/office/drawing/2016/5/13/chartex" xmlns:cx8="http://schemas.microsoft.com/office/drawing/2016/5/14/chartex" xmlns:mc="http://schemas.openxmlformats.org/markup-compatibility/2006" xmlns:aink="http://schemas.microsoft.com/office/drawing/2016/ink" xmlns:am3d="http://schemas.microsoft.com/office/drawing/2017/model3d" xmlns:o="urn:schemas-microsoft-com:office:office" xmlns:oel="http://schemas.microsoft.com/office/2019/extlst" xmlns:r="http://schemas.openxmlformats.org/officeDocument/2006/relationships" xmlns:m="http://schemas.openxmlformats.org/officeDocument/2006/math" xmlns:v="urn:schemas-microsoft-com:vml" xmlns:wp14="http://schemas.microsoft.com/office/word/2010/wordprocessingDrawing" xmlns:wp="http://schemas.openxmlformats.org/drawingml/2006/wordprocessingDrawing" xmlns:w10="urn:schemas-microsoft-com:office:word" xmlns:w="http://schemas.openxmlformats.org/wordprocessingml/2006/main" xmlns:w14="http://schemas.microsoft.com/office/word/2010/wordml" xmlns:w15="http://schemas.microsoft.com/office/word/2012/wordml" xmlns:w16cex="http://schemas.microsoft.com/office/word/2018/wordml/cex" xmlns:w16cid="http://schemas.microsoft.com/office/word/2016/wordml/cid" xmlns:w16="http://schemas.microsoft.com/office/word/2018/wordml" xmlns:w16du="http://schemas.microsoft.com/office/word/2023/wordml/word16du" xmlns:w16sdtdh="http://schemas.microsoft.com/office/word/2020/wordml/sdtdatahash" xmlns:w16sdtfl="http://schemas.microsoft.com/office/word/2024/wordml/sdtformatlock" xmlns:w16se="http://schemas.microsoft.com/office/word/2015/wordml/symex" xmlns:wpg="http://schemas.microsoft.com/office/word/2010/wordprocessingGroup" xmlns:wpi="http://schemas.microsoft.com/office/word/2010/wordprocessingInk" xmlns:wne="http://schemas.microsoft.com/office/word/2006/wordml" xmlns:wps="http://schemas.microsoft.com/office/word/2010/wordprocessingShape" mc:Ignorable="w14 w15 w16se w16cid w16 w16cex w16sdtdh w16sdtfl w16du wp14">
+<w:document xmlns:wpc="http://schemas.microsoft.com/office/word/2010/wordprocessingCanvas" xmlns:cx="http://schemas.microsoft.com/office/drawing/2014/chartex" xmlns:cx1="http://schemas.microsoft.com/office/drawing/2015/9/8/chartex" xmlns:cx2="http://schemas.microsoft.com/office/drawing/2015/10/21/chartex" xmlns:cx3="http://schemas.microsoft.com/office/drawing/2016/5/9/chartex" xmlns:cx4="http://schemas.microsoft.com/office/drawing/2016/5/10/chartex" xmlns:cx5="http://schemas.microsoft.com/office/drawing/2016/5/11/chartex" xmlns:cx6="http://schemas.microsoft.com/office/drawing/2016/5/12/chartex" xmlns:cx7="http://schemas.microsoft.com/office/drawing/2016/5/13/chartex" xmlns:cx8="http://schemas.microsoft.com/office/drawing/2016/5/14/chartex" xmlns:mc="http://schemas.openxmlformats.org/markup-compatibility/2006" xmlns:m="http://schemas.openxmlformats.org/officeDocument/2006/math" xmlns:aink="http://schemas.microsoft.com/office/drawing/2016/ink" xmlns:am3d="http://schemas.microsoft.com/office/drawing/2017/model3d" xmlns:oel="http://schemas.microsoft.com/office/2019/extlst" xmlns:r="http://schemas.openxmlformats.org/officeDocument/2006/relationships" xmlns:wp14="http://schemas.microsoft.com/office/word/2010/wordprocessingDrawing" xmlns:wp="http://schemas.openxmlformats.org/drawingml/2006/wordprocessingDrawing" xmlns:wpg="http://schemas.microsoft.com/office/word/2010/wordprocessingGroup" xmlns:wpi="http://schemas.microsoft.com/office/word/2010/wordprocessingInk" xmlns:wps="http://schemas.microsoft.com/office/word/2010/wordprocessingShape" xmlns:o="urn:schemas-microsoft-com:office:office" xmlns:v="urn:schemas-microsoft-com:vml" xmlns:w10="urn:schemas-microsoft-com:office:word" xmlns:w="http://schemas.openxmlformats.org/wordprocessingml/2006/main" xmlns:w14="http://schemas.microsoft.com/office/word/2010/wordml" xmlns:w15="http://schemas.microsoft.com/office/word/2012/wordml" xmlns:w16cex="http://schemas.microsoft.com/office/word/2018/wordml/cex" xmlns:w16cid="http://schemas.microsoft.com/office/word/2016/wordml/cid" xmlns:w16="http://schemas.microsoft.com/office/word/2018/wordml" xmlns:w16sdtdh="http://schemas.microsoft.com/office/word/2020/wordml/sdtdatahash" xmlns:w16sdtfl="http://schemas.microsoft.com/office/word/2024/wordml/sdtformatlock" xmlns:w16se="http://schemas.microsoft.com/office/word/2015/wordml/symex" xmlns:w16du="http://schemas.microsoft.com/office/word/2023/wordml/word16du" xmlns:wne="http://schemas.microsoft.com/office/word/2006/wordml" mc:Ignorable="w14 w15 w16se w16cid w16 w16cex w16sdtdh w16sdtfl w16du wp14">
   <w:body>
     <w:p/>
     <w:tbl>
@@ -144,8 +144,8 @@
           <w:lang w:val="en-US"/>
         </w:rPr>
         <w:br/>
-        <w:t xml:space="preserve">Versione </w:t>
-      </w:r>
+      </w:r>
+      <w:proofErr w:type="spellStart"/>
       <w:r>
         <w:rPr>
           <w:rFonts w:ascii="Arial" w:hAnsi="Arial"/>
@@ -153,8 +153,9 @@
           <w:sz w:val="36"/>
           <w:lang w:val="en-US"/>
         </w:rPr>
-        <w:t>4</w:t>
-      </w:r>
+        <w:t>Versione</w:t>
+      </w:r>
+      <w:proofErr w:type="spellEnd"/>
       <w:r>
         <w:rPr>
           <w:rFonts w:ascii="Arial" w:hAnsi="Arial"/>
@@ -162,7 +163,7 @@
           <w:sz w:val="36"/>
           <w:lang w:val="en-US"/>
         </w:rPr>
-        <w:t>.</w:t>
+        <w:t xml:space="preserve"> </w:t>
       </w:r>
       <w:r>
         <w:rPr>
@@ -171,7 +172,25 @@
           <w:sz w:val="36"/>
           <w:lang w:val="en-US"/>
         </w:rPr>
-        <w:t>1</w:t>
+        <w:t>5</w:t>
+      </w:r>
+      <w:r>
+        <w:rPr>
+          <w:rFonts w:ascii="Arial" w:hAnsi="Arial"/>
+          <w:b/>
+          <w:sz w:val="36"/>
+          <w:lang w:val="en-US"/>
+        </w:rPr>
+        <w:t>.</w:t>
+      </w:r>
+      <w:r>
+        <w:rPr>
+          <w:rFonts w:ascii="Arial" w:hAnsi="Arial"/>
+          <w:b/>
+          <w:sz w:val="36"/>
+          <w:lang w:val="en-US"/>
+        </w:rPr>
+        <w:t>0</w:t>
       </w:r>
       <w:r>
         <w:rPr>
@@ -1718,19 +1737,11 @@
               </w:rPr>
               <w:t xml:space="preserve">per l’analisi </w:t>
             </w:r>
-            <w:proofErr w:type="gramStart"/>
             <w:r>
               <w:rPr>
                 <w:sz w:val="20"/>
               </w:rPr>
-              <w:t>del trend</w:t>
-            </w:r>
-            <w:proofErr w:type="gramEnd"/>
-            <w:r>
-              <w:rPr>
-                <w:sz w:val="20"/>
-              </w:rPr>
-              <w:t xml:space="preserve"> </w:t>
+              <w:t xml:space="preserve">del trend </w:t>
             </w:r>
             <w:r>
               <w:rPr>
@@ -1768,6 +1779,123 @@
                 <w:sz w:val="20"/>
               </w:rPr>
               <w:t>Gennaro Esposito</w:t>
+            </w:r>
+          </w:p>
+        </w:tc>
+      </w:tr>
+      <w:tr>
+        <w:trPr>
+          <w:trHeight w:val="230"/>
+        </w:trPr>
+        <w:tc>
+          <w:tcPr>
+            <w:tcW w:w="1927" w:type="dxa"/>
+            <w:tcBorders>
+              <w:top w:val="single" w:sz="4" w:space="0" w:color="auto"/>
+              <w:left w:val="single" w:sz="4" w:space="0" w:color="auto"/>
+              <w:bottom w:val="single" w:sz="4" w:space="0" w:color="auto"/>
+              <w:right w:val="single" w:sz="4" w:space="0" w:color="auto"/>
+            </w:tcBorders>
+          </w:tcPr>
+          <w:p>
+            <w:pPr>
+              <w:pStyle w:val="Contenutotabella"/>
+              <w:rPr>
+                <w:sz w:val="20"/>
+              </w:rPr>
+            </w:pPr>
+            <w:r>
+              <w:rPr>
+                <w:sz w:val="20"/>
+              </w:rPr>
+              <w:t>24/10/2026</w:t>
+            </w:r>
+          </w:p>
+        </w:tc>
+        <w:tc>
+          <w:tcPr>
+            <w:tcW w:w="964" w:type="dxa"/>
+            <w:tcBorders>
+              <w:top w:val="single" w:sz="4" w:space="0" w:color="auto"/>
+              <w:left w:val="single" w:sz="4" w:space="0" w:color="auto"/>
+              <w:bottom w:val="single" w:sz="4" w:space="0" w:color="auto"/>
+              <w:right w:val="single" w:sz="4" w:space="0" w:color="auto"/>
+            </w:tcBorders>
+          </w:tcPr>
+          <w:p>
+            <w:pPr>
+              <w:pStyle w:val="Contenutotabella"/>
+              <w:rPr>
+                <w:sz w:val="20"/>
+              </w:rPr>
+            </w:pPr>
+            <w:r>
+              <w:rPr>
+                <w:sz w:val="20"/>
+              </w:rPr>
+              <w:t>5.0</w:t>
+            </w:r>
+          </w:p>
+        </w:tc>
+        <w:tc>
+          <w:tcPr>
+            <w:tcW w:w="4336" w:type="dxa"/>
+            <w:tcBorders>
+              <w:top w:val="single" w:sz="4" w:space="0" w:color="auto"/>
+              <w:left w:val="single" w:sz="4" w:space="0" w:color="auto"/>
+              <w:bottom w:val="single" w:sz="4" w:space="0" w:color="auto"/>
+              <w:right w:val="single" w:sz="4" w:space="0" w:color="auto"/>
+            </w:tcBorders>
+          </w:tcPr>
+          <w:p>
+            <w:pPr>
+              <w:pStyle w:val="Contenutotabella"/>
+              <w:rPr>
+                <w:sz w:val="20"/>
+              </w:rPr>
+            </w:pPr>
+            <w:r>
+              <w:rPr>
+                <w:sz w:val="20"/>
+              </w:rPr>
+              <w:t xml:space="preserve">Aggiunti </w:t>
+            </w:r>
+            <w:r>
+              <w:rPr>
+                <w:sz w:val="20"/>
+              </w:rPr>
+              <w:t>Definitions, acronyms, and abbreviations</w:t>
+            </w:r>
+            <w:r>
+              <w:rPr>
+                <w:sz w:val="20"/>
+              </w:rPr>
+              <w:t xml:space="preserve"> e Overview </w:t>
+            </w:r>
+          </w:p>
+        </w:tc>
+        <w:tc>
+          <w:tcPr>
+            <w:tcW w:w="2410" w:type="dxa"/>
+            <w:tcBorders>
+              <w:top w:val="single" w:sz="4" w:space="0" w:color="auto"/>
+              <w:left w:val="single" w:sz="4" w:space="0" w:color="auto"/>
+              <w:bottom w:val="single" w:sz="4" w:space="0" w:color="auto"/>
+              <w:right w:val="single" w:sz="4" w:space="0" w:color="auto"/>
+            </w:tcBorders>
+          </w:tcPr>
+          <w:p>
+            <w:pPr>
+              <w:pStyle w:val="Contenutotabella"/>
+              <w:rPr>
+                <w:sz w:val="20"/>
+              </w:rPr>
+            </w:pPr>
+            <w:r>
+              <w:rPr>
+                <w:sz w:val="20"/>
+              </w:rPr>
+              <w:t>Gerardo Vertolomo</w:t>
             </w:r>
           </w:p>
         </w:tc>
@@ -1853,87 +1981,6 @@
           </w:p>
         </w:tc>
       </w:tr>
-      <w:tr>
-        <w:trPr>
-          <w:trHeight w:val="230"/>
-        </w:trPr>
-        <w:tc>
-          <w:tcPr>
-            <w:tcW w:w="1927" w:type="dxa"/>
-            <w:tcBorders>
-              <w:top w:val="single" w:sz="4" w:space="0" w:color="auto"/>
-              <w:left w:val="single" w:sz="4" w:space="0" w:color="auto"/>
-              <w:bottom w:val="single" w:sz="4" w:space="0" w:color="auto"/>
-              <w:right w:val="single" w:sz="4" w:space="0" w:color="auto"/>
-            </w:tcBorders>
-          </w:tcPr>
-          <w:p>
-            <w:pPr>
-              <w:pStyle w:val="Contenutotabella"/>
-              <w:rPr>
-                <w:sz w:val="20"/>
-              </w:rPr>
-            </w:pPr>
-          </w:p>
-        </w:tc>
-        <w:tc>
-          <w:tcPr>
-            <w:tcW w:w="964" w:type="dxa"/>
-            <w:tcBorders>
-              <w:top w:val="single" w:sz="4" w:space="0" w:color="auto"/>
-              <w:left w:val="single" w:sz="4" w:space="0" w:color="auto"/>
-              <w:bottom w:val="single" w:sz="4" w:space="0" w:color="auto"/>
-              <w:right w:val="single" w:sz="4" w:space="0" w:color="auto"/>
-            </w:tcBorders>
-          </w:tcPr>
-          <w:p>
-            <w:pPr>
-              <w:pStyle w:val="Contenutotabella"/>
-              <w:rPr>
-                <w:sz w:val="20"/>
-              </w:rPr>
-            </w:pPr>
-          </w:p>
-        </w:tc>
-        <w:tc>
-          <w:tcPr>
-            <w:tcW w:w="4336" w:type="dxa"/>
-            <w:tcBorders>
-              <w:top w:val="single" w:sz="4" w:space="0" w:color="auto"/>
-              <w:left w:val="single" w:sz="4" w:space="0" w:color="auto"/>
-              <w:bottom w:val="single" w:sz="4" w:space="0" w:color="auto"/>
-              <w:right w:val="single" w:sz="4" w:space="0" w:color="auto"/>
-            </w:tcBorders>
-          </w:tcPr>
-          <w:p>
-            <w:pPr>
-              <w:pStyle w:val="Contenutotabella"/>
-              <w:rPr>
-                <w:sz w:val="20"/>
-              </w:rPr>
-            </w:pPr>
-          </w:p>
-        </w:tc>
-        <w:tc>
-          <w:tcPr>
-            <w:tcW w:w="2410" w:type="dxa"/>
-            <w:tcBorders>
-              <w:top w:val="single" w:sz="4" w:space="0" w:color="auto"/>
-              <w:left w:val="single" w:sz="4" w:space="0" w:color="auto"/>
-              <w:bottom w:val="single" w:sz="4" w:space="0" w:color="auto"/>
-              <w:right w:val="single" w:sz="4" w:space="0" w:color="auto"/>
-            </w:tcBorders>
-          </w:tcPr>
-          <w:p>
-            <w:pPr>
-              <w:pStyle w:val="Contenutotabella"/>
-              <w:rPr>
-                <w:sz w:val="20"/>
-              </w:rPr>
-            </w:pPr>
-          </w:p>
-        </w:tc>
-      </w:tr>
     </w:tbl>
     <w:p>
       <w:pPr>
@@ -2394,7 +2441,21 @@
             <w:rStyle w:val="Collegamentoipertestuale"/>
             <w:noProof/>
           </w:rPr>
-          <w:t>Definitions, acronyms, and abbreviations</w:t>
+          <w:t>Definitions, acronyms, and abbre</w:t>
+        </w:r>
+        <w:r>
+          <w:rPr>
+            <w:rStyle w:val="Collegamentoipertestuale"/>
+            <w:noProof/>
+          </w:rPr>
+          <w:t>v</w:t>
+        </w:r>
+        <w:r>
+          <w:rPr>
+            <w:rStyle w:val="Collegamentoipertestuale"/>
+            <w:noProof/>
+          </w:rPr>
+          <w:t>iations</w:t>
         </w:r>
         <w:r>
           <w:rPr>
@@ -4134,21 +4195,7 @@
             <w:rStyle w:val="Collegamentoipertestuale"/>
             <w:noProof/>
           </w:rPr>
-          <w:t>Scena</w:t>
-        </w:r>
-        <w:r>
-          <w:rPr>
-            <w:rStyle w:val="Collegamentoipertestuale"/>
-            <w:noProof/>
-          </w:rPr>
-          <w:t>r</w:t>
-        </w:r>
-        <w:r>
-          <w:rPr>
-            <w:rStyle w:val="Collegamentoipertestuale"/>
-            <w:noProof/>
-          </w:rPr>
-          <w:t>ios</w:t>
+          <w:t>Scenarios</w:t>
         </w:r>
         <w:r>
           <w:rPr>
@@ -4682,13 +4729,13 @@
         <w:ind w:left="426" w:hanging="426"/>
         <w:jc w:val="left"/>
       </w:pPr>
-      <w:bookmarkStart w:id="0" w:name="_Hlk243298281"/>
-      <w:bookmarkStart w:id="1" w:name="_Toc243741974"/>
+      <w:bookmarkStart w:id="0" w:name="_Toc243741974"/>
+      <w:bookmarkStart w:id="1" w:name="_Hlk243298281"/>
       <w:r>
         <w:lastRenderedPageBreak/>
         <w:t>INTRODUCTION</w:t>
       </w:r>
-      <w:bookmarkEnd w:id="1"/>
+      <w:bookmarkEnd w:id="0"/>
     </w:p>
     <w:p>
       <w:pPr>
@@ -4700,7 +4747,7 @@
         <w:ind w:left="716" w:hanging="432"/>
       </w:pPr>
       <w:bookmarkStart w:id="2" w:name="_Toc243741975"/>
-      <w:bookmarkEnd w:id="0"/>
+      <w:bookmarkEnd w:id="1"/>
       <w:r>
         <w:t>Purpose of the system</w:t>
       </w:r>
@@ -5168,28 +5215,27 @@
         </w:numPr>
       </w:pPr>
       <w:bookmarkStart w:id="5" w:name="_Toc243741978"/>
-      <w:proofErr w:type="spellStart"/>
-      <w:r>
+      <w:r>
+        <w:t>Definitions, acronyms, and abbreviations</w:t>
+      </w:r>
+      <w:bookmarkEnd w:id="5"/>
+    </w:p>
+    <w:p>
+      <w:pPr>
+        <w:spacing w:before="100" w:after="100"/>
+        <w:ind w:left="709"/>
+        <w:rPr>
+          <w:b/>
+          <w:bCs/>
+        </w:rPr>
+      </w:pPr>
+      <w:r>
+        <w:rPr>
+          <w:b/>
+          <w:bCs/>
+        </w:rPr>
         <w:t>Definitions</w:t>
       </w:r>
-      <w:proofErr w:type="spellEnd"/>
-      <w:r>
-        <w:t xml:space="preserve">, </w:t>
-      </w:r>
-      <w:proofErr w:type="spellStart"/>
-      <w:r>
-        <w:t>acronyms</w:t>
-      </w:r>
-      <w:proofErr w:type="spellEnd"/>
-      <w:r>
-        <w:t xml:space="preserve">, and </w:t>
-      </w:r>
-      <w:proofErr w:type="spellStart"/>
-      <w:r>
-        <w:t>abbreviations</w:t>
-      </w:r>
-      <w:bookmarkEnd w:id="5"/>
-      <w:proofErr w:type="spellEnd"/>
     </w:p>
     <w:p>
       <w:pPr>
@@ -5198,24 +5244,1084 @@
         <w:rPr>
           <w:b/>
           <w:bCs/>
-          <w:color w:val="EE0000"/>
+          <w:color w:val="000000" w:themeColor="text1"/>
         </w:rPr>
       </w:pPr>
       <w:r>
         <w:rPr>
           <w:b/>
           <w:bCs/>
-          <w:color w:val="EE0000"/>
-        </w:rPr>
-        <w:t>DA FARE</w:t>
-      </w:r>
+          <w:color w:val="000000" w:themeColor="text1"/>
+        </w:rPr>
+        <w:t xml:space="preserve">Guest: </w:t>
+      </w:r>
+      <w:r>
+        <w:t xml:space="preserve">utente non autenticato che naviga sulla piattaforma. Ha la possibilità di esplorare il catalogo prodotti, visualizzare le schede dettagliate degli occhiali, applicare filtri di ricerca e aggiungere articoli al proprio </w:t>
+      </w:r>
+      <w:r>
+        <w:rPr>
+          <w:rStyle w:val="Enfasicorsivo"/>
+          <w:i w:val="0"/>
+          <w:iCs w:val="0"/>
+        </w:rPr>
+        <w:t>Carrello</w:t>
+      </w:r>
+      <w:r>
+        <w:t xml:space="preserve"> però senza poter effettuare il checkout.</w:t>
+      </w:r>
+    </w:p>
+    <w:p>
+      <w:pPr>
+        <w:spacing w:after="100"/>
+        <w:ind w:left="709"/>
+        <w:rPr>
+          <w:color w:val="000000" w:themeColor="text1"/>
+        </w:rPr>
+      </w:pPr>
       <w:r>
         <w:rPr>
           <w:b/>
           <w:bCs/>
-          <w:color w:val="EE0000"/>
-        </w:rPr>
-        <w:t xml:space="preserve"> alla fine</w:t>
+          <w:color w:val="000000" w:themeColor="text1"/>
+        </w:rPr>
+        <w:t xml:space="preserve">Cliente: </w:t>
+      </w:r>
+      <w:r>
+        <w:rPr>
+          <w:color w:val="000000" w:themeColor="text1"/>
+        </w:rPr>
+        <w:t xml:space="preserve">utente autenticato nel sistema, a differenza del Guest può effettuare un acquisto e dispone di una dashboard contenente tutte le informazioni relative al suo account e al suo storico ordini. Nel suo account sono specificati: </w:t>
+      </w:r>
+    </w:p>
+    <w:p>
+      <w:pPr>
+        <w:pStyle w:val="Paragrafoelenco"/>
+        <w:numPr>
+          <w:ilvl w:val="0"/>
+          <w:numId w:val="7"/>
+        </w:numPr>
+        <w:rPr>
+          <w:rFonts w:ascii="Times New Roman" w:eastAsia="Times New Roman" w:hAnsi="Times New Roman" w:cs="Times New Roman"/>
+        </w:rPr>
+      </w:pPr>
+      <w:r>
+        <w:rPr>
+          <w:rFonts w:ascii="Times New Roman" w:eastAsia="Times New Roman" w:hAnsi="Times New Roman" w:cs="Times New Roman"/>
+        </w:rPr>
+        <w:t xml:space="preserve">Nome </w:t>
+      </w:r>
+    </w:p>
+    <w:p>
+      <w:pPr>
+        <w:pStyle w:val="Paragrafoelenco"/>
+        <w:numPr>
+          <w:ilvl w:val="0"/>
+          <w:numId w:val="7"/>
+        </w:numPr>
+        <w:rPr>
+          <w:rFonts w:ascii="Times New Roman" w:eastAsia="Times New Roman" w:hAnsi="Times New Roman" w:cs="Times New Roman"/>
+        </w:rPr>
+      </w:pPr>
+      <w:r>
+        <w:rPr>
+          <w:rFonts w:ascii="Times New Roman" w:eastAsia="Times New Roman" w:hAnsi="Times New Roman" w:cs="Times New Roman"/>
+        </w:rPr>
+        <w:t xml:space="preserve">Cognome </w:t>
+      </w:r>
+    </w:p>
+    <w:p>
+      <w:pPr>
+        <w:pStyle w:val="Paragrafoelenco"/>
+        <w:numPr>
+          <w:ilvl w:val="0"/>
+          <w:numId w:val="7"/>
+        </w:numPr>
+        <w:rPr>
+          <w:rFonts w:ascii="Times New Roman" w:eastAsia="Times New Roman" w:hAnsi="Times New Roman" w:cs="Times New Roman"/>
+        </w:rPr>
+      </w:pPr>
+      <w:r>
+        <w:rPr>
+          <w:rFonts w:ascii="Times New Roman" w:eastAsia="Times New Roman" w:hAnsi="Times New Roman" w:cs="Times New Roman"/>
+        </w:rPr>
+        <w:t xml:space="preserve">E-Mail  </w:t>
+      </w:r>
+    </w:p>
+    <w:p>
+      <w:pPr>
+        <w:pStyle w:val="Paragrafoelenco"/>
+        <w:numPr>
+          <w:ilvl w:val="0"/>
+          <w:numId w:val="7"/>
+        </w:numPr>
+        <w:rPr>
+          <w:rFonts w:ascii="Times New Roman" w:eastAsia="Times New Roman" w:hAnsi="Times New Roman" w:cs="Times New Roman"/>
+        </w:rPr>
+      </w:pPr>
+      <w:r>
+        <w:rPr>
+          <w:rFonts w:ascii="Times New Roman" w:eastAsia="Times New Roman" w:hAnsi="Times New Roman" w:cs="Times New Roman"/>
+        </w:rPr>
+        <w:t xml:space="preserve">Password </w:t>
+      </w:r>
+    </w:p>
+    <w:p>
+      <w:pPr>
+        <w:pStyle w:val="Paragrafoelenco"/>
+        <w:numPr>
+          <w:ilvl w:val="0"/>
+          <w:numId w:val="7"/>
+        </w:numPr>
+        <w:rPr>
+          <w:rFonts w:ascii="Times New Roman" w:eastAsia="Times New Roman" w:hAnsi="Times New Roman" w:cs="Times New Roman"/>
+        </w:rPr>
+      </w:pPr>
+      <w:r>
+        <w:rPr>
+          <w:rFonts w:ascii="Times New Roman" w:eastAsia="Times New Roman" w:hAnsi="Times New Roman" w:cs="Times New Roman"/>
+        </w:rPr>
+        <w:t xml:space="preserve">Telefono </w:t>
+      </w:r>
+    </w:p>
+    <w:p>
+      <w:pPr>
+        <w:pStyle w:val="Paragrafoelenco"/>
+        <w:numPr>
+          <w:ilvl w:val="0"/>
+          <w:numId w:val="7"/>
+        </w:numPr>
+        <w:rPr>
+          <w:rFonts w:ascii="Times New Roman" w:eastAsia="Times New Roman" w:hAnsi="Times New Roman" w:cs="Times New Roman"/>
+        </w:rPr>
+      </w:pPr>
+      <w:r>
+        <w:rPr>
+          <w:rFonts w:ascii="Times New Roman" w:eastAsia="Times New Roman" w:hAnsi="Times New Roman" w:cs="Times New Roman"/>
+        </w:rPr>
+        <w:t xml:space="preserve">Indirizzo di spedizione predefinito </w:t>
+      </w:r>
+    </w:p>
+    <w:p>
+      <w:pPr>
+        <w:pStyle w:val="Paragrafoelenco"/>
+        <w:numPr>
+          <w:ilvl w:val="0"/>
+          <w:numId w:val="7"/>
+        </w:numPr>
+        <w:rPr>
+          <w:rFonts w:ascii="Times New Roman" w:eastAsia="Times New Roman" w:hAnsi="Times New Roman" w:cs="Times New Roman"/>
+        </w:rPr>
+      </w:pPr>
+      <w:r>
+        <w:rPr>
+          <w:rFonts w:ascii="Times New Roman" w:eastAsia="Times New Roman" w:hAnsi="Times New Roman" w:cs="Times New Roman"/>
+        </w:rPr>
+        <w:t xml:space="preserve">Data di nascita </w:t>
+      </w:r>
+    </w:p>
+    <w:p>
+      <w:pPr>
+        <w:pStyle w:val="Paragrafoelenco"/>
+        <w:numPr>
+          <w:ilvl w:val="0"/>
+          <w:numId w:val="7"/>
+        </w:numPr>
+        <w:spacing w:after="100"/>
+        <w:rPr>
+          <w:rFonts w:ascii="Times New Roman" w:hAnsi="Times New Roman" w:cs="Times New Roman"/>
+          <w:color w:val="000000" w:themeColor="text1"/>
+        </w:rPr>
+      </w:pPr>
+      <w:r>
+        <w:rPr>
+          <w:rFonts w:ascii="Times New Roman" w:eastAsia="Times New Roman" w:hAnsi="Times New Roman" w:cs="Times New Roman"/>
+        </w:rPr>
+        <w:t>Stato account (attivo / disattivato)</w:t>
+      </w:r>
+    </w:p>
+    <w:p>
+      <w:pPr>
+        <w:spacing w:after="100"/>
+        <w:ind w:left="709"/>
+        <w:jc w:val="both"/>
+        <w:rPr>
+          <w:b/>
+          <w:bCs/>
+          <w:color w:val="000000" w:themeColor="text1"/>
+        </w:rPr>
+      </w:pPr>
+      <w:r>
+        <w:rPr>
+          <w:b/>
+          <w:bCs/>
+          <w:color w:val="000000" w:themeColor="text1"/>
+        </w:rPr>
+        <w:t xml:space="preserve">Manager: </w:t>
+      </w:r>
+      <w:r>
+        <w:t>figura con privilegi gestionali elevati che si occupa dell'amministrazione del negozio online.</w:t>
+      </w:r>
+    </w:p>
+    <w:p>
+      <w:pPr>
+        <w:spacing w:after="100"/>
+        <w:ind w:left="709"/>
+        <w:rPr>
+          <w:color w:val="000000" w:themeColor="text1"/>
+        </w:rPr>
+      </w:pPr>
+      <w:r>
+        <w:rPr>
+          <w:b/>
+          <w:bCs/>
+          <w:color w:val="000000" w:themeColor="text1"/>
+        </w:rPr>
+        <w:t xml:space="preserve">Occhiale: </w:t>
+      </w:r>
+      <w:r>
+        <w:rPr>
+          <w:color w:val="000000" w:themeColor="text1"/>
+        </w:rPr>
+        <w:t>prodotto commercializzato sulla piattaforma. È caratterizzato da:</w:t>
+      </w:r>
+    </w:p>
+    <w:p>
+      <w:pPr>
+        <w:pStyle w:val="Paragrafoelenco"/>
+        <w:numPr>
+          <w:ilvl w:val="0"/>
+          <w:numId w:val="19"/>
+        </w:numPr>
+        <w:spacing w:after="100"/>
+        <w:rPr>
+          <w:color w:val="000000" w:themeColor="text1"/>
+        </w:rPr>
+      </w:pPr>
+      <w:r>
+        <w:rPr>
+          <w:color w:val="000000" w:themeColor="text1"/>
+        </w:rPr>
+        <w:t>ID</w:t>
+      </w:r>
+    </w:p>
+    <w:p>
+      <w:pPr>
+        <w:pStyle w:val="Paragrafoelenco"/>
+        <w:numPr>
+          <w:ilvl w:val="0"/>
+          <w:numId w:val="19"/>
+        </w:numPr>
+        <w:spacing w:after="100"/>
+        <w:rPr>
+          <w:color w:val="000000" w:themeColor="text1"/>
+        </w:rPr>
+      </w:pPr>
+      <w:r>
+        <w:rPr>
+          <w:color w:val="000000" w:themeColor="text1"/>
+        </w:rPr>
+        <w:t>Tipologia (Da vista, Da sole)</w:t>
+      </w:r>
+    </w:p>
+    <w:p>
+      <w:pPr>
+        <w:pStyle w:val="Paragrafoelenco"/>
+        <w:numPr>
+          <w:ilvl w:val="0"/>
+          <w:numId w:val="19"/>
+        </w:numPr>
+        <w:spacing w:after="100"/>
+        <w:rPr>
+          <w:color w:val="000000" w:themeColor="text1"/>
+        </w:rPr>
+      </w:pPr>
+      <w:r>
+        <w:rPr>
+          <w:color w:val="000000" w:themeColor="text1"/>
+        </w:rPr>
+        <w:t>Galleria con immagini</w:t>
+      </w:r>
+    </w:p>
+    <w:p>
+      <w:pPr>
+        <w:pStyle w:val="Paragrafoelenco"/>
+        <w:numPr>
+          <w:ilvl w:val="0"/>
+          <w:numId w:val="19"/>
+        </w:numPr>
+        <w:spacing w:after="100"/>
+        <w:rPr>
+          <w:color w:val="000000" w:themeColor="text1"/>
+        </w:rPr>
+      </w:pPr>
+      <w:r>
+        <w:rPr>
+          <w:color w:val="000000" w:themeColor="text1"/>
+        </w:rPr>
+        <w:t>Marca e Modello</w:t>
+      </w:r>
+    </w:p>
+    <w:p>
+      <w:pPr>
+        <w:pStyle w:val="Paragrafoelenco"/>
+        <w:numPr>
+          <w:ilvl w:val="0"/>
+          <w:numId w:val="19"/>
+        </w:numPr>
+        <w:spacing w:after="100"/>
+        <w:rPr>
+          <w:color w:val="000000" w:themeColor="text1"/>
+        </w:rPr>
+      </w:pPr>
+      <w:r>
+        <w:rPr>
+          <w:color w:val="000000" w:themeColor="text1"/>
+        </w:rPr>
+        <w:t>Genere</w:t>
+      </w:r>
+    </w:p>
+    <w:p>
+      <w:pPr>
+        <w:pStyle w:val="Paragrafoelenco"/>
+        <w:numPr>
+          <w:ilvl w:val="0"/>
+          <w:numId w:val="19"/>
+        </w:numPr>
+        <w:spacing w:after="100"/>
+        <w:rPr>
+          <w:color w:val="000000" w:themeColor="text1"/>
+        </w:rPr>
+      </w:pPr>
+      <w:r>
+        <w:rPr>
+          <w:color w:val="000000" w:themeColor="text1"/>
+        </w:rPr>
+        <w:t>Taglia e Tipologia di montatura</w:t>
+      </w:r>
+    </w:p>
+    <w:p>
+      <w:pPr>
+        <w:pStyle w:val="Paragrafoelenco"/>
+        <w:numPr>
+          <w:ilvl w:val="0"/>
+          <w:numId w:val="19"/>
+        </w:numPr>
+        <w:spacing w:after="100"/>
+        <w:rPr>
+          <w:color w:val="000000" w:themeColor="text1"/>
+        </w:rPr>
+      </w:pPr>
+      <w:r>
+        <w:rPr>
+          <w:color w:val="000000" w:themeColor="text1"/>
+        </w:rPr>
+        <w:t>Forma</w:t>
+      </w:r>
+    </w:p>
+    <w:p>
+      <w:pPr>
+        <w:pStyle w:val="Paragrafoelenco"/>
+        <w:numPr>
+          <w:ilvl w:val="0"/>
+          <w:numId w:val="19"/>
+        </w:numPr>
+        <w:spacing w:after="100"/>
+        <w:rPr>
+          <w:color w:val="000000" w:themeColor="text1"/>
+        </w:rPr>
+      </w:pPr>
+      <w:r>
+        <w:rPr>
+          <w:color w:val="000000" w:themeColor="text1"/>
+        </w:rPr>
+        <w:t>Materiale</w:t>
+      </w:r>
+    </w:p>
+    <w:p>
+      <w:pPr>
+        <w:pStyle w:val="Paragrafoelenco"/>
+        <w:numPr>
+          <w:ilvl w:val="0"/>
+          <w:numId w:val="19"/>
+        </w:numPr>
+        <w:spacing w:after="100"/>
+        <w:rPr>
+          <w:color w:val="000000" w:themeColor="text1"/>
+        </w:rPr>
+      </w:pPr>
+      <w:r>
+        <w:rPr>
+          <w:color w:val="000000" w:themeColor="text1"/>
+        </w:rPr>
+        <w:t>Prezzo di vendita</w:t>
+      </w:r>
+    </w:p>
+    <w:p>
+      <w:pPr>
+        <w:spacing w:after="100"/>
+        <w:ind w:left="709"/>
+        <w:rPr>
+          <w:color w:val="000000" w:themeColor="text1"/>
+        </w:rPr>
+      </w:pPr>
+      <w:r>
+        <w:rPr>
+          <w:b/>
+          <w:bCs/>
+          <w:color w:val="000000" w:themeColor="text1"/>
+        </w:rPr>
+        <w:t xml:space="preserve">Outlet: </w:t>
+      </w:r>
+      <w:r>
+        <w:rPr>
+          <w:color w:val="000000" w:themeColor="text1"/>
+        </w:rPr>
+        <w:t xml:space="preserve">Sezione del sito in cui è presente il catalogo con gli occhiali con un prezzo scontato attivo. </w:t>
+      </w:r>
+    </w:p>
+    <w:p>
+      <w:pPr>
+        <w:widowControl/>
+        <w:tabs>
+          <w:tab w:val="left" w:pos="709"/>
+        </w:tabs>
+        <w:suppressAutoHyphens w:val="0"/>
+        <w:ind w:left="709"/>
+        <w:rPr>
+          <w:rFonts w:eastAsia="Times New Roman"/>
+          <w:kern w:val="0"/>
+        </w:rPr>
+      </w:pPr>
+      <w:r>
+        <w:rPr>
+          <w:b/>
+          <w:bCs/>
+          <w:color w:val="000000" w:themeColor="text1"/>
+        </w:rPr>
+        <w:t xml:space="preserve">Ordine: </w:t>
+      </w:r>
+      <w:r>
+        <w:rPr>
+          <w:rFonts w:eastAsia="Times New Roman"/>
+          <w:kern w:val="0"/>
+        </w:rPr>
+        <w:t xml:space="preserve">rappresenta la richiesta d'acquisto formalizzata e confermata da un Cliente. È composto da: </w:t>
+      </w:r>
+    </w:p>
+    <w:p>
+      <w:pPr>
+        <w:widowControl/>
+        <w:numPr>
+          <w:ilvl w:val="0"/>
+          <w:numId w:val="20"/>
+        </w:numPr>
+        <w:suppressAutoHyphens w:val="0"/>
+        <w:rPr>
+          <w:rFonts w:eastAsia="Times New Roman"/>
+          <w:kern w:val="0"/>
+        </w:rPr>
+      </w:pPr>
+      <w:r>
+        <w:rPr>
+          <w:rFonts w:eastAsia="Times New Roman"/>
+          <w:kern w:val="0"/>
+        </w:rPr>
+        <w:t>Identificativo univoco (ID Ordine)</w:t>
+      </w:r>
+    </w:p>
+    <w:p>
+      <w:pPr>
+        <w:widowControl/>
+        <w:numPr>
+          <w:ilvl w:val="0"/>
+          <w:numId w:val="20"/>
+        </w:numPr>
+        <w:suppressAutoHyphens w:val="0"/>
+        <w:rPr>
+          <w:rFonts w:eastAsia="Times New Roman"/>
+          <w:kern w:val="0"/>
+        </w:rPr>
+      </w:pPr>
+      <w:r>
+        <w:rPr>
+          <w:rFonts w:eastAsia="Times New Roman"/>
+          <w:kern w:val="0"/>
+        </w:rPr>
+        <w:t>Dati di consegna (Nome destinatario, Indirizzo di spedizione, Recapito telefonico)</w:t>
+      </w:r>
+    </w:p>
+    <w:p>
+      <w:pPr>
+        <w:widowControl/>
+        <w:numPr>
+          <w:ilvl w:val="0"/>
+          <w:numId w:val="20"/>
+        </w:numPr>
+        <w:suppressAutoHyphens w:val="0"/>
+        <w:rPr>
+          <w:rFonts w:eastAsia="Times New Roman"/>
+          <w:kern w:val="0"/>
+        </w:rPr>
+      </w:pPr>
+      <w:r>
+        <w:rPr>
+          <w:rFonts w:eastAsia="Times New Roman"/>
+          <w:kern w:val="0"/>
+        </w:rPr>
+        <w:t>Metodo di pagamento selezionato</w:t>
+      </w:r>
+    </w:p>
+    <w:p>
+      <w:pPr>
+        <w:widowControl/>
+        <w:numPr>
+          <w:ilvl w:val="0"/>
+          <w:numId w:val="20"/>
+        </w:numPr>
+        <w:suppressAutoHyphens w:val="0"/>
+        <w:rPr>
+          <w:rFonts w:eastAsia="Times New Roman"/>
+          <w:kern w:val="0"/>
+        </w:rPr>
+      </w:pPr>
+      <w:r>
+        <w:rPr>
+          <w:rFonts w:eastAsia="Times New Roman"/>
+          <w:kern w:val="0"/>
+        </w:rPr>
+        <w:t>Data e ora di emissione</w:t>
+      </w:r>
+    </w:p>
+    <w:p>
+      <w:pPr>
+        <w:widowControl/>
+        <w:numPr>
+          <w:ilvl w:val="0"/>
+          <w:numId w:val="20"/>
+        </w:numPr>
+        <w:suppressAutoHyphens w:val="0"/>
+        <w:rPr>
+          <w:rFonts w:eastAsia="Times New Roman"/>
+          <w:kern w:val="0"/>
+        </w:rPr>
+      </w:pPr>
+      <w:r>
+        <w:rPr>
+          <w:rFonts w:eastAsia="Times New Roman"/>
+          <w:kern w:val="0"/>
+        </w:rPr>
+        <w:t>Totale complessivo</w:t>
+      </w:r>
+    </w:p>
+    <w:p>
+      <w:pPr>
+        <w:widowControl/>
+        <w:numPr>
+          <w:ilvl w:val="0"/>
+          <w:numId w:val="20"/>
+        </w:numPr>
+        <w:suppressAutoHyphens w:val="0"/>
+        <w:rPr>
+          <w:rFonts w:eastAsia="Times New Roman"/>
+          <w:kern w:val="0"/>
+        </w:rPr>
+      </w:pPr>
+      <w:r>
+        <w:rPr>
+          <w:rFonts w:eastAsia="Times New Roman"/>
+          <w:kern w:val="0"/>
+        </w:rPr>
+        <w:t>Stato di avanzamento (</w:t>
+      </w:r>
+      <w:r>
+        <w:rPr>
+          <w:rFonts w:eastAsia="Times New Roman"/>
+          <w:i/>
+          <w:iCs/>
+          <w:kern w:val="0"/>
+        </w:rPr>
+        <w:t>In lavorazione</w:t>
+      </w:r>
+      <w:r>
+        <w:rPr>
+          <w:rFonts w:eastAsia="Times New Roman"/>
+          <w:kern w:val="0"/>
+        </w:rPr>
+        <w:t xml:space="preserve">, </w:t>
+      </w:r>
+      <w:r>
+        <w:rPr>
+          <w:rFonts w:eastAsia="Times New Roman"/>
+          <w:i/>
+          <w:iCs/>
+          <w:kern w:val="0"/>
+        </w:rPr>
+        <w:t>Spedito</w:t>
+      </w:r>
+      <w:r>
+        <w:rPr>
+          <w:rFonts w:eastAsia="Times New Roman"/>
+          <w:kern w:val="0"/>
+        </w:rPr>
+        <w:t xml:space="preserve">, </w:t>
+      </w:r>
+      <w:r>
+        <w:rPr>
+          <w:rFonts w:eastAsia="Times New Roman"/>
+          <w:i/>
+          <w:iCs/>
+          <w:kern w:val="0"/>
+        </w:rPr>
+        <w:t>In consegna</w:t>
+      </w:r>
+      <w:r>
+        <w:rPr>
+          <w:rFonts w:eastAsia="Times New Roman"/>
+          <w:kern w:val="0"/>
+        </w:rPr>
+        <w:t xml:space="preserve">, </w:t>
+      </w:r>
+      <w:r>
+        <w:rPr>
+          <w:rFonts w:eastAsia="Times New Roman"/>
+          <w:i/>
+          <w:iCs/>
+          <w:kern w:val="0"/>
+        </w:rPr>
+        <w:t>Consegnato</w:t>
+      </w:r>
+      <w:r>
+        <w:rPr>
+          <w:rFonts w:eastAsia="Times New Roman"/>
+          <w:kern w:val="0"/>
+        </w:rPr>
+        <w:t>)</w:t>
+      </w:r>
+    </w:p>
+    <w:p>
+      <w:pPr>
+        <w:widowControl/>
+        <w:numPr>
+          <w:ilvl w:val="0"/>
+          <w:numId w:val="20"/>
+        </w:numPr>
+        <w:suppressAutoHyphens w:val="0"/>
+        <w:rPr>
+          <w:rFonts w:eastAsia="Times New Roman"/>
+          <w:kern w:val="0"/>
+        </w:rPr>
+      </w:pPr>
+      <w:r>
+        <w:rPr>
+          <w:rFonts w:eastAsia="Times New Roman"/>
+          <w:kern w:val="0"/>
+        </w:rPr>
+        <w:t>Lista dei Prodotti Acquistati</w:t>
+      </w:r>
+    </w:p>
+    <w:p>
+      <w:pPr>
+        <w:spacing w:after="100"/>
+        <w:jc w:val="both"/>
+        <w:rPr>
+          <w:b/>
+          <w:bCs/>
+          <w:color w:val="000000" w:themeColor="text1"/>
+        </w:rPr>
+      </w:pPr>
+    </w:p>
+    <w:p>
+      <w:pPr>
+        <w:spacing w:after="100"/>
+        <w:ind w:left="709"/>
+        <w:jc w:val="both"/>
+        <w:rPr>
+          <w:b/>
+          <w:bCs/>
+          <w:color w:val="000000" w:themeColor="text1"/>
+        </w:rPr>
+      </w:pPr>
+      <w:r>
+        <w:rPr>
+          <w:b/>
+          <w:bCs/>
+          <w:color w:val="000000" w:themeColor="text1"/>
+        </w:rPr>
+        <w:lastRenderedPageBreak/>
+        <w:t xml:space="preserve">Carrello: </w:t>
+      </w:r>
+      <w:r>
+        <w:t>struttura temporanea in cui vengono memorizzati i prodotti selezionati dall'utente prima della conferma d'acquisto, con relative quantità e calcolo del totale provvisorio.</w:t>
+      </w:r>
+    </w:p>
+    <w:p>
+      <w:pPr>
+        <w:spacing w:after="100"/>
+        <w:ind w:left="709"/>
+        <w:rPr>
+          <w:b/>
+          <w:bCs/>
+          <w:color w:val="000000" w:themeColor="text1"/>
+        </w:rPr>
+      </w:pPr>
+      <w:r>
+        <w:rPr>
+          <w:b/>
+          <w:bCs/>
+          <w:color w:val="000000" w:themeColor="text1"/>
+        </w:rPr>
+        <w:t xml:space="preserve">Recensione: </w:t>
+      </w:r>
+      <w:r>
+        <w:t xml:space="preserve">feedback rilasciato da un </w:t>
+      </w:r>
+      <w:r>
+        <w:rPr>
+          <w:rStyle w:val="Enfasicorsivo"/>
+          <w:i w:val="0"/>
+          <w:iCs w:val="0"/>
+        </w:rPr>
+        <w:t>Cliente</w:t>
+      </w:r>
+      <w:r>
+        <w:rPr>
+          <w:i/>
+          <w:iCs/>
+        </w:rPr>
+        <w:t xml:space="preserve"> </w:t>
+      </w:r>
+      <w:r>
+        <w:t xml:space="preserve">per uno specifico </w:t>
+      </w:r>
+      <w:r>
+        <w:rPr>
+          <w:rStyle w:val="Enfasicorsivo"/>
+          <w:i w:val="0"/>
+          <w:iCs w:val="0"/>
+        </w:rPr>
+        <w:t>Occhiale</w:t>
+      </w:r>
+      <w:r>
+        <w:t>, composto da una valutazione numerica su scala 1–5 e un testo descrittivo</w:t>
+      </w:r>
+      <w:r>
+        <w:t xml:space="preserve"> dell’esperienza</w:t>
+      </w:r>
+      <w:r>
+        <w:t>.</w:t>
+      </w:r>
+    </w:p>
+    <w:p>
+      <w:pPr>
+        <w:spacing w:after="100"/>
+        <w:ind w:left="709"/>
+      </w:pPr>
+      <w:r>
+        <w:rPr>
+          <w:b/>
+          <w:bCs/>
+          <w:color w:val="000000" w:themeColor="text1"/>
+        </w:rPr>
+        <w:t xml:space="preserve">Catalogo: </w:t>
+      </w:r>
+      <w:r>
+        <w:t xml:space="preserve">l'insieme di tutti gli </w:t>
+      </w:r>
+      <w:r>
+        <w:rPr>
+          <w:rStyle w:val="Enfasicorsivo"/>
+          <w:i w:val="0"/>
+          <w:iCs w:val="0"/>
+        </w:rPr>
+        <w:t>Occhiali</w:t>
+      </w:r>
+      <w:r>
+        <w:rPr>
+          <w:i/>
+          <w:iCs/>
+        </w:rPr>
+        <w:t xml:space="preserve"> </w:t>
+      </w:r>
+      <w:r>
+        <w:t>esposti all'interno dello store, navigabili e filtrabili secondo criteri quali prezzo, marchio, forma, genere, taglia, tipologia e materiale.</w:t>
+      </w:r>
+    </w:p>
+    <w:p>
+      <w:pPr>
+        <w:spacing w:after="100"/>
+        <w:ind w:left="709"/>
+        <w:rPr>
+          <w:b/>
+          <w:bCs/>
+          <w:color w:val="000000" w:themeColor="text1"/>
+        </w:rPr>
+      </w:pPr>
+    </w:p>
+    <w:p>
+      <w:pPr>
+        <w:spacing w:after="100"/>
+        <w:ind w:left="709"/>
+        <w:rPr>
+          <w:b/>
+          <w:bCs/>
+          <w:color w:val="000000" w:themeColor="text1"/>
+        </w:rPr>
+      </w:pPr>
+      <w:r>
+        <w:rPr>
+          <w:b/>
+          <w:bCs/>
+          <w:color w:val="000000" w:themeColor="text1"/>
+        </w:rPr>
+        <w:t>Acronyms and Abbreviations</w:t>
+      </w:r>
+    </w:p>
+    <w:p>
+      <w:pPr>
+        <w:spacing w:after="100"/>
+        <w:ind w:left="709"/>
+        <w:rPr>
+          <w:color w:val="000000" w:themeColor="text1"/>
+        </w:rPr>
+      </w:pPr>
+      <w:r>
+        <w:rPr>
+          <w:color w:val="000000" w:themeColor="text1"/>
+        </w:rPr>
+        <w:t>RAD = Requirement Analysis Document</w:t>
+      </w:r>
+    </w:p>
+    <w:p>
+      <w:pPr>
+        <w:spacing w:after="100"/>
+        <w:ind w:left="709"/>
+        <w:rPr>
+          <w:color w:val="000000" w:themeColor="text1"/>
+        </w:rPr>
+      </w:pPr>
+      <w:r>
+        <w:rPr>
+          <w:color w:val="000000" w:themeColor="text1"/>
+        </w:rPr>
+        <w:t>RF = Requisito Funzionale</w:t>
+      </w:r>
+    </w:p>
+    <w:p>
+      <w:pPr>
+        <w:spacing w:after="100"/>
+        <w:ind w:left="709"/>
+        <w:rPr>
+          <w:color w:val="000000" w:themeColor="text1"/>
+        </w:rPr>
+      </w:pPr>
+      <w:r>
+        <w:rPr>
+          <w:color w:val="000000" w:themeColor="text1"/>
+        </w:rPr>
+        <w:t>RNF = Requisito Non Funzionale</w:t>
+      </w:r>
+    </w:p>
+    <w:p>
+      <w:pPr>
+        <w:spacing w:after="100"/>
+        <w:ind w:left="709"/>
+        <w:rPr>
+          <w:color w:val="000000" w:themeColor="text1"/>
+        </w:rPr>
+      </w:pPr>
+      <w:r>
+        <w:rPr>
+          <w:color w:val="000000" w:themeColor="text1"/>
+        </w:rPr>
+        <w:t>PM = Product Manager</w:t>
+      </w:r>
+    </w:p>
+    <w:p>
+      <w:pPr>
+        <w:spacing w:after="100"/>
+        <w:ind w:left="709"/>
+        <w:rPr>
+          <w:color w:val="000000" w:themeColor="text1"/>
+        </w:rPr>
+      </w:pPr>
+      <w:r>
+        <w:rPr>
+          <w:color w:val="000000" w:themeColor="text1"/>
+        </w:rPr>
+        <w:t>MA = Market Analyzer</w:t>
+      </w:r>
+    </w:p>
+    <w:p>
+      <w:pPr>
+        <w:spacing w:after="100"/>
+        <w:ind w:left="709"/>
+        <w:rPr>
+          <w:color w:val="000000" w:themeColor="text1"/>
+        </w:rPr>
+      </w:pPr>
+      <w:r>
+        <w:rPr>
+          <w:color w:val="000000" w:themeColor="text1"/>
+        </w:rPr>
+        <w:t>OM = Order Manager</w:t>
+      </w:r>
+    </w:p>
+    <w:p>
+      <w:pPr>
+        <w:spacing w:after="100"/>
+        <w:ind w:left="709"/>
+        <w:rPr>
+          <w:color w:val="000000" w:themeColor="text1"/>
+        </w:rPr>
+      </w:pPr>
+      <w:r>
+        <w:rPr>
+          <w:color w:val="000000" w:themeColor="text1"/>
+        </w:rPr>
+        <w:t>API = Application Programming Interface</w:t>
+      </w:r>
+    </w:p>
+    <w:p>
+      <w:pPr>
+        <w:spacing w:after="100"/>
+        <w:ind w:left="709"/>
+        <w:rPr>
+          <w:color w:val="000000" w:themeColor="text1"/>
+        </w:rPr>
+      </w:pPr>
+      <w:r>
+        <w:rPr>
+          <w:color w:val="000000" w:themeColor="text1"/>
+        </w:rPr>
+        <w:t>DB = DataBase</w:t>
+      </w:r>
+    </w:p>
+    <w:p>
+      <w:pPr>
+        <w:spacing w:after="100"/>
+        <w:ind w:left="709"/>
+        <w:rPr>
+          <w:color w:val="000000" w:themeColor="text1"/>
+        </w:rPr>
+      </w:pPr>
+      <w:r>
+        <w:rPr>
+          <w:color w:val="000000" w:themeColor="text1"/>
+        </w:rPr>
+        <w:t>DBMS = DataBase Management System</w:t>
+      </w:r>
+    </w:p>
+    <w:p>
+      <w:pPr>
+        <w:spacing w:after="100"/>
+        <w:ind w:left="709"/>
+        <w:rPr>
+          <w:color w:val="000000" w:themeColor="text1"/>
+        </w:rPr>
+      </w:pPr>
+      <w:r>
+        <w:rPr>
+          <w:color w:val="000000" w:themeColor="text1"/>
+        </w:rPr>
+        <w:t>RAM = Random Access Memory</w:t>
+      </w:r>
+    </w:p>
+    <w:p>
+      <w:pPr>
+        <w:spacing w:after="100"/>
+        <w:ind w:left="709"/>
+        <w:rPr>
+          <w:color w:val="000000" w:themeColor="text1"/>
+        </w:rPr>
+      </w:pPr>
+      <w:r>
+        <w:rPr>
+          <w:color w:val="000000" w:themeColor="text1"/>
+        </w:rPr>
+        <w:t>MVC = Model View Control</w:t>
+      </w:r>
+    </w:p>
+    <w:p>
+      <w:pPr>
+        <w:spacing w:after="100"/>
+        <w:ind w:left="709"/>
+        <w:rPr>
+          <w:rStyle w:val="Enfasicorsivo"/>
+          <w:i w:val="0"/>
+          <w:iCs w:val="0"/>
+        </w:rPr>
+      </w:pPr>
+      <w:r>
+        <w:rPr>
+          <w:rStyle w:val="Enfasigrassetto"/>
+          <w:b w:val="0"/>
+          <w:bCs w:val="0"/>
+        </w:rPr>
+        <w:t>HEX</w:t>
+      </w:r>
+      <w:r>
+        <w:rPr>
+          <w:rStyle w:val="Enfasigrassetto"/>
+          <w:b w:val="0"/>
+          <w:bCs w:val="0"/>
+        </w:rPr>
+        <w:t xml:space="preserve"> </w:t>
+      </w:r>
+      <w:r>
+        <w:rPr>
+          <w:b/>
+          <w:bCs/>
+        </w:rPr>
+        <w:t>=</w:t>
+      </w:r>
+      <w:r>
+        <w:t xml:space="preserve"> </w:t>
+      </w:r>
+      <w:r>
+        <w:rPr>
+          <w:rStyle w:val="Enfasicorsivo"/>
+          <w:i w:val="0"/>
+          <w:iCs w:val="0"/>
+        </w:rPr>
+        <w:t>Hexadecimal Code</w:t>
+      </w:r>
+    </w:p>
+    <w:p>
+      <w:pPr>
+        <w:spacing w:after="100"/>
+        <w:ind w:left="709"/>
+        <w:rPr>
+          <w:rStyle w:val="Enfasicorsivo"/>
+          <w:i w:val="0"/>
+          <w:iCs w:val="0"/>
+        </w:rPr>
+      </w:pPr>
+      <w:r>
+        <w:rPr>
+          <w:rStyle w:val="Enfasicorsivo"/>
+          <w:i w:val="0"/>
+          <w:iCs w:val="0"/>
+        </w:rPr>
+        <w:t>DAO = Data Access Object</w:t>
+      </w:r>
+    </w:p>
+    <w:p>
+      <w:pPr>
+        <w:spacing w:after="100"/>
+        <w:ind w:left="709"/>
+        <w:rPr>
+          <w:i/>
+          <w:iCs/>
+          <w:color w:val="000000" w:themeColor="text1"/>
+        </w:rPr>
+      </w:pPr>
+      <w:r>
+        <w:rPr>
+          <w:rStyle w:val="Enfasicorsivo"/>
+          <w:i w:val="0"/>
+          <w:iCs w:val="0"/>
+        </w:rPr>
+        <w:t>CAP = Codice di Avviamento Postale</w:t>
       </w:r>
     </w:p>
     <w:p>
@@ -5226,9 +6332,6 @@
           <w:numId w:val="1"/>
         </w:numPr>
       </w:pPr>
-      <w:r>
-        <w:t xml:space="preserve"> </w:t>
-      </w:r>
       <w:bookmarkStart w:id="6" w:name="_Toc243741979"/>
       <w:proofErr w:type="spellStart"/>
       <w:r>
@@ -5268,12 +6371,104 @@
         <w:t xml:space="preserve"> </w:t>
       </w:r>
       <w:bookmarkStart w:id="7" w:name="_Toc243741980"/>
-      <w:proofErr w:type="spellStart"/>
       <w:r>
         <w:t>Overview</w:t>
       </w:r>
       <w:bookmarkEnd w:id="7"/>
-      <w:proofErr w:type="spellEnd"/>
+    </w:p>
+    <w:p>
+      <w:pPr>
+        <w:pStyle w:val="Paragrafoelenco"/>
+        <w:spacing w:before="100" w:after="100"/>
+        <w:ind w:left="760"/>
+      </w:pPr>
+      <w:r>
+        <w:t xml:space="preserve">l seguente documento è diviso in sezioni ed ha la seguente composizione: </w:t>
+      </w:r>
+    </w:p>
+    <w:p>
+      <w:pPr>
+        <w:pStyle w:val="Paragrafoelenco"/>
+        <w:spacing w:before="100" w:after="100"/>
+        <w:ind w:left="760"/>
+        <w:rPr>
+          <w:b/>
+          <w:bCs/>
+        </w:rPr>
+      </w:pPr>
+      <w:r>
+        <w:rPr>
+          <w:b/>
+          <w:bCs/>
+        </w:rPr>
+        <w:t>Capitolo 2 – Current System</w:t>
+      </w:r>
+    </w:p>
+    <w:p>
+      <w:pPr>
+        <w:pStyle w:val="Paragrafoelenco"/>
+        <w:spacing w:before="100" w:after="100"/>
+        <w:ind w:left="760"/>
+      </w:pPr>
+      <w:r>
+        <w:t>Descrive lo stato attuale del negozio fisico GG-Eyewear, illustrando le limitazioni dovute all'assenza di una piattaforma di vendita online e delineando i ruoli fisici esistenti, come il Product Manager, l’Order Manager e il Market Analyzer.</w:t>
+      </w:r>
+    </w:p>
+    <w:p>
+      <w:pPr>
+        <w:pStyle w:val="Paragrafoelenco"/>
+        <w:spacing w:before="100" w:after="100"/>
+        <w:ind w:left="760"/>
+        <w:rPr>
+          <w:b/>
+          <w:bCs/>
+        </w:rPr>
+      </w:pPr>
+      <w:r>
+        <w:rPr>
+          <w:b/>
+          <w:bCs/>
+        </w:rPr>
+        <w:t xml:space="preserve">Capitolo 3 – Proposed System (Da aggiornare una volta completato) </w:t>
+      </w:r>
+    </w:p>
+    <w:p>
+      <w:pPr>
+        <w:pStyle w:val="Paragrafoelenco"/>
+        <w:spacing w:before="100" w:after="100"/>
+        <w:ind w:left="760"/>
+      </w:pPr>
+      <w:r>
+        <w:t>Definisce nel dettaglio il nuovo sistema di e-commerce proposto. Al suo interno sono specificati i requisiti funzionali e i requisiti non funzionali. Il capitolo presenta inoltre i Sistem Models, che includono gli scenari operativi e le sezioni previste per i modelli Use Case, Object e Dynamic.</w:t>
+      </w:r>
+    </w:p>
+    <w:p>
+      <w:pPr>
+        <w:pStyle w:val="Paragrafoelenco"/>
+        <w:spacing w:before="100" w:after="100"/>
+        <w:ind w:left="760"/>
+        <w:rPr>
+          <w:b/>
+          <w:bCs/>
+        </w:rPr>
+      </w:pPr>
+      <w:r>
+        <w:rPr>
+          <w:b/>
+          <w:bCs/>
+        </w:rPr>
+        <w:t>Capitolo 4 – Glossary</w:t>
+      </w:r>
+    </w:p>
+    <w:p>
+      <w:pPr>
+        <w:pStyle w:val="Paragrafoelenco"/>
+        <w:spacing w:before="100" w:after="100"/>
+        <w:ind w:left="760"/>
+      </w:pPr>
+      <w:r>
+        <w:t>Sezione dove sono specificati i termini utilizzati nel documento per evitare incomprensioni.</w:t>
+      </w:r>
     </w:p>
     <w:p>
       <w:pPr>
@@ -5285,14 +6480,6 @@
           <w:color w:val="EE0000"/>
         </w:rPr>
       </w:pPr>
-      <w:r>
-        <w:rPr>
-          <w:b/>
-          <w:bCs/>
-          <w:color w:val="EE0000"/>
-        </w:rPr>
-        <w:t>DA FARE</w:t>
-      </w:r>
     </w:p>
     <w:p>
       <w:pPr>
@@ -5306,6 +6493,7 @@
       </w:pPr>
       <w:bookmarkStart w:id="8" w:name="_Toc243741981"/>
       <w:r>
+        <w:lastRenderedPageBreak/>
         <w:t>CURRENT SYSTEM</w:t>
       </w:r>
       <w:bookmarkEnd w:id="8"/>
@@ -5359,12 +6547,10 @@
         <w:t xml:space="preserve"> </w:t>
       </w:r>
       <w:bookmarkStart w:id="10" w:name="_Toc243741983"/>
-      <w:proofErr w:type="spellStart"/>
       <w:r>
         <w:t>Overview</w:t>
       </w:r>
       <w:bookmarkEnd w:id="10"/>
-      <w:proofErr w:type="spellEnd"/>
     </w:p>
     <w:p>
       <w:pPr>
@@ -5522,11 +6708,7 @@
         <w:t>RF3.1:</w:t>
       </w:r>
       <w:r>
-        <w:t xml:space="preserve"> il sistema deve consentire all’utente la visualizzazione di un’area dedicata agli ordini effettuati, dove per ogni ordine sono presenti gli occhiali ordinati, l’indirizzo di spedizione </w:t>
-      </w:r>
-      <w:r>
-        <w:lastRenderedPageBreak/>
-        <w:t>al quale va recapitato il pacco, l’intestatario, e lo stato dell’ordine</w:t>
+        <w:t xml:space="preserve"> il sistema deve consentire all’utente la visualizzazione di un’area dedicata agli ordini effettuati, dove per ogni ordine sono presenti gli occhiali ordinati, l’indirizzo di spedizione al quale va recapitato il pacco, l’intestatario, e lo stato dell’ordine</w:t>
       </w:r>
     </w:p>
     <w:p>
@@ -5610,6 +6792,7 @@
           <w:bCs/>
           <w:color w:val="000000" w:themeColor="text1"/>
         </w:rPr>
+        <w:lastRenderedPageBreak/>
         <w:t>RF4.2</w:t>
       </w:r>
       <w:r>
@@ -6012,14 +7195,7 @@
         <w:rPr>
           <w:color w:val="000000" w:themeColor="text1"/>
         </w:rPr>
-        <w:t xml:space="preserve"> Il sistema deve offrire controlli sui dati inseriti dall’utente in modo immediato, senza ricaricare la pagina, mostrando un messaggio a schermo per indicare se sono sintatticamente </w:t>
-      </w:r>
-      <w:r>
-        <w:rPr>
-          <w:color w:val="000000" w:themeColor="text1"/>
-        </w:rPr>
-        <w:lastRenderedPageBreak/>
-        <w:t>corretti</w:t>
+        <w:t xml:space="preserve"> Il sistema deve offrire controlli sui dati inseriti dall’utente in modo immediato, senza ricaricare la pagina, mostrando un messaggio a schermo per indicare se sono sintatticamente corretti</w:t>
       </w:r>
       <w:r>
         <w:rPr>
@@ -6175,6 +7351,7 @@
           <w:bCs/>
           <w:color w:val="000000" w:themeColor="text1"/>
         </w:rPr>
+        <w:lastRenderedPageBreak/>
         <w:t>RF10.2</w:t>
       </w:r>
       <w:r>
@@ -6628,11 +7805,7 @@
         <w:t>:</w:t>
       </w:r>
       <w:r>
-        <w:t xml:space="preserve"> Nelle situazioni in cui una schermata o un componente non presenta contenuti da mostrare (es. carrello degli acquisti vuoto, nessun ordine effettuato, </w:t>
-      </w:r>
-      <w:r>
-        <w:lastRenderedPageBreak/>
-        <w:t>nessun risultato corrispondente a un filtro di ricerca), il sistema non deve mai restituire schermate bianche o layout frammentati. Deve invece mostrare messaggi visivi descrittivi che spieghino chiaramente lo stato attuale e suggeriscano l'azione successiva da compiere</w:t>
+        <w:t xml:space="preserve"> Nelle situazioni in cui una schermata o un componente non presenta contenuti da mostrare (es. carrello degli acquisti vuoto, nessun ordine effettuato, nessun risultato corrispondente a un filtro di ricerca), il sistema non deve mai restituire schermate bianche o layout frammentati. Deve invece mostrare messaggi visivi descrittivi che spieghino chiaramente lo stato attuale e suggeriscano l'azione successiva da compiere</w:t>
       </w:r>
       <w:r>
         <w:t>.</w:t>
@@ -6745,7 +7918,11 @@
         <w:t>,</w:t>
       </w:r>
       <w:r>
-        <w:t xml:space="preserve"> la configurazione delle connessioni JDBC e il deploy dell'applicazione.</w:t>
+        <w:t xml:space="preserve"> la configurazione delle </w:t>
+      </w:r>
+      <w:r>
+        <w:lastRenderedPageBreak/>
+        <w:t>connessioni JDBC e il deploy dell'applicazione.</w:t>
       </w:r>
     </w:p>
     <w:p>
@@ -6949,11 +8126,7 @@
         <w:t xml:space="preserve"> Le </w:t>
       </w:r>
       <w:r>
-        <w:t xml:space="preserve">regole di protezione e controllo degli accessi devono riflettersi chiaramente sull'interfaccia utente. L'utente deve ricevere messaggi espliciti e </w:t>
-      </w:r>
-      <w:r>
-        <w:lastRenderedPageBreak/>
-        <w:t>comprensibili in caso di inserimento di credenziali errate, tentativi di accesso a sezioni non autorizzate o nel caso in cui stia tentando di accedere con un account sospeso o disattivato</w:t>
+        <w:t>regole di protezione e controllo degli accessi devono riflettersi chiaramente sull'interfaccia utente. L'utente deve ricevere messaggi espliciti e comprensibili in caso di inserimento di credenziali errate, tentativi di accesso a sezioni non autorizzate o nel caso in cui stia tentando di accedere con un account sospeso o disattivato</w:t>
       </w:r>
       <w:r>
         <w:t>.</w:t>
@@ -7089,6 +8262,7 @@
           <w:sz w:val="26"/>
           <w:szCs w:val="26"/>
         </w:rPr>
+        <w:lastRenderedPageBreak/>
         <w:t>System modifications</w:t>
       </w:r>
       <w:bookmarkEnd w:id="20"/>
@@ -7382,15 +8556,7 @@
           <w:rFonts w:eastAsia="Times New Roman"/>
           <w:kern w:val="0"/>
         </w:rPr>
-        <w:t xml:space="preserve">si autentica sul sito, dalla pagina di login, inserendo le </w:t>
-      </w:r>
-      <w:r>
-        <w:rPr>
-          <w:rFonts w:eastAsia="Times New Roman"/>
-          <w:kern w:val="0"/>
-        </w:rPr>
-        <w:lastRenderedPageBreak/>
-        <w:t xml:space="preserve">proprie credenziali, email </w:t>
+        <w:t xml:space="preserve">si autentica sul sito, dalla pagina di login, inserendo le proprie credenziali, email </w:t>
       </w:r>
       <w:r>
         <w:rPr>
@@ -7674,7 +8840,15 @@
           <w:rFonts w:eastAsia="Times New Roman"/>
           <w:kern w:val="0"/>
         </w:rPr>
-        <w:t>Marco clicca sulla foto secondaria per ingrandirla</w:t>
+        <w:t xml:space="preserve">Marco clicca sulla foto secondaria per </w:t>
+      </w:r>
+      <w:r>
+        <w:rPr>
+          <w:rFonts w:eastAsia="Times New Roman"/>
+          <w:kern w:val="0"/>
+        </w:rPr>
+        <w:lastRenderedPageBreak/>
+        <w:t>ingrandirla</w:t>
       </w:r>
       <w:r>
         <w:rPr>
@@ -8350,7 +9524,6 @@
         <w:ind w:left="1418"/>
       </w:pPr>
       <w:r>
-        <w:lastRenderedPageBreak/>
         <w:t xml:space="preserve">Il sistema convalida le credenziali, riconosce il ruolo di "Order Manager" e reindirizza Antonio alla Dashboard Gestionale degli ordini, dove viene mostrata la tabella contenente tutti gli ordini effettuati. Antonio </w:t>
       </w:r>
       <w:r>
@@ -8486,6 +9659,7 @@
         <w:ind w:left="1418"/>
       </w:pPr>
       <w:r>
+        <w:lastRenderedPageBreak/>
         <w:t>Antonio necessita però di tutte le informazioni dell’ordine. Clicca quindi sulla freccia al lato della riga dell’ordine. Il sistema risponde mostrando</w:t>
       </w:r>
       <w:r>
@@ -8743,11 +9917,7 @@
         <w:t>".</w:t>
       </w:r>
       <w:r>
-        <w:t xml:space="preserve"> Vittoria deve quindi </w:t>
-      </w:r>
-      <w:r>
-        <w:lastRenderedPageBreak/>
-        <w:t>inserire il nuovo prodotto all’interno del catalogo per renderlo disponibile a tutti gli utenti online.</w:t>
+        <w:t xml:space="preserve"> Vittoria deve quindi inserire il nuovo prodotto all’interno del catalogo per renderlo disponibile a tutti gli utenti online.</w:t>
       </w:r>
     </w:p>
     <w:p>
@@ -8853,6 +10023,7 @@
         <w:ind w:left="1418"/>
       </w:pPr>
       <w:r>
+        <w:lastRenderedPageBreak/>
         <w:t>Di fianco alla tabella elenco, il sistema mostra a Vittoria il form, vuoto, per l’inserimento di un nuovo prodotto. Vittoria inizia, quindi a compilare i campi del form inserendo le specifiche del nuovo modello arrivato:</w:t>
       </w:r>
     </w:p>
@@ -9370,7 +10541,6 @@
         <w:ind w:left="1418"/>
       </w:pPr>
       <w:r>
-        <w:lastRenderedPageBreak/>
         <w:t xml:space="preserve">Fabio accede alla pagina di login di GG Eyewear, </w:t>
       </w:r>
       <w:r>
@@ -9435,10 +10605,7 @@
         <w:t>Il sistema mostra a schermo una tabella aggregata contenente l'elenco dei prodotti del catalogo</w:t>
       </w:r>
       <w:r>
-        <w:t xml:space="preserve">, </w:t>
-      </w:r>
-      <w:r>
-        <w:t>completi</w:t>
+        <w:t>, completi</w:t>
       </w:r>
       <w:r>
         <w:t xml:space="preserve"> di</w:t>
@@ -9513,15 +10680,7 @@
         <w:ind w:left="1418" w:firstLine="11"/>
       </w:pPr>
       <w:r>
-        <w:t xml:space="preserve">Per individuare </w:t>
-      </w:r>
-      <w:proofErr w:type="gramStart"/>
-      <w:r>
-        <w:t>il trend</w:t>
-      </w:r>
-      <w:proofErr w:type="gramEnd"/>
-      <w:r>
-        <w:t xml:space="preserve"> del momento, Fabio interagisce con il pannello dei filtri: </w:t>
+        <w:t xml:space="preserve">Per individuare il trend del momento, Fabio interagisce con il pannello dei filtri: </w:t>
       </w:r>
     </w:p>
     <w:p>
@@ -9535,6 +10694,7 @@
         <w:ind w:left="1702" w:hanging="284"/>
       </w:pPr>
       <w:r>
+        <w:lastRenderedPageBreak/>
         <w:t xml:space="preserve">inserisce le date </w:t>
       </w:r>
       <w:r>
@@ -9871,7 +11031,7 @@
 </file>
 
 <file path=word/endnotes.xml><?xml version="1.0" encoding="utf-8"?>
-<w:endnotes xmlns:wpc="http://schemas.microsoft.com/office/word/2010/wordprocessingCanvas" xmlns:cx="http://schemas.microsoft.com/office/drawing/2014/chartex" xmlns:cx1="http://schemas.microsoft.com/office/drawing/2015/9/8/chartex" xmlns:cx2="http://schemas.microsoft.com/office/drawing/2015/10/21/chartex" xmlns:cx3="http://schemas.microsoft.com/office/drawing/2016/5/9/chartex" xmlns:cx4="http://schemas.microsoft.com/office/drawing/2016/5/10/chartex" xmlns:cx5="http://schemas.microsoft.com/office/drawing/2016/5/11/chartex" xmlns:cx6="http://schemas.microsoft.com/office/drawing/2016/5/12/chartex" xmlns:cx7="http://schemas.microsoft.com/office/drawing/2016/5/13/chartex" xmlns:cx8="http://schemas.microsoft.com/office/drawing/2016/5/14/chartex" xmlns:mc="http://schemas.openxmlformats.org/markup-compatibility/2006" xmlns:aink="http://schemas.microsoft.com/office/drawing/2016/ink" xmlns:am3d="http://schemas.microsoft.com/office/drawing/2017/model3d" xmlns:o="urn:schemas-microsoft-com:office:office" xmlns:oel="http://schemas.microsoft.com/office/2019/extlst" xmlns:r="http://schemas.openxmlformats.org/officeDocument/2006/relationships" xmlns:m="http://schemas.openxmlformats.org/officeDocument/2006/math" xmlns:v="urn:schemas-microsoft-com:vml" xmlns:wp14="http://schemas.microsoft.com/office/word/2010/wordprocessingDrawing" xmlns:wp="http://schemas.openxmlformats.org/drawingml/2006/wordprocessingDrawing" xmlns:w10="urn:schemas-microsoft-com:office:word" xmlns:w="http://schemas.openxmlformats.org/wordprocessingml/2006/main" xmlns:w14="http://schemas.microsoft.com/office/word/2010/wordml" xmlns:w15="http://schemas.microsoft.com/office/word/2012/wordml" xmlns:w16cex="http://schemas.microsoft.com/office/word/2018/wordml/cex" xmlns:w16cid="http://schemas.microsoft.com/office/word/2016/wordml/cid" xmlns:w16="http://schemas.microsoft.com/office/word/2018/wordml" xmlns:w16du="http://schemas.microsoft.com/office/word/2023/wordml/word16du" xmlns:w16sdtdh="http://schemas.microsoft.com/office/word/2020/wordml/sdtdatahash" xmlns:w16sdtfl="http://schemas.microsoft.com/office/word/2024/wordml/sdtformatlock" xmlns:w16se="http://schemas.microsoft.com/office/word/2015/wordml/symex" xmlns:wpg="http://schemas.microsoft.com/office/word/2010/wordprocessingGroup" xmlns:wpi="http://schemas.microsoft.com/office/word/2010/wordprocessingInk" xmlns:wne="http://schemas.microsoft.com/office/word/2006/wordml" xmlns:wps="http://schemas.microsoft.com/office/word/2010/wordprocessingShape" mc:Ignorable="w14 w15 w16se w16cid w16 w16cex w16sdtdh w16sdtfl w16du wp14">
+<w:endnotes xmlns:wpc="http://schemas.microsoft.com/office/word/2010/wordprocessingCanvas" xmlns:cx="http://schemas.microsoft.com/office/drawing/2014/chartex" xmlns:cx1="http://schemas.microsoft.com/office/drawing/2015/9/8/chartex" xmlns:cx2="http://schemas.microsoft.com/office/drawing/2015/10/21/chartex" xmlns:cx3="http://schemas.microsoft.com/office/drawing/2016/5/9/chartex" xmlns:cx4="http://schemas.microsoft.com/office/drawing/2016/5/10/chartex" xmlns:cx5="http://schemas.microsoft.com/office/drawing/2016/5/11/chartex" xmlns:cx6="http://schemas.microsoft.com/office/drawing/2016/5/12/chartex" xmlns:cx7="http://schemas.microsoft.com/office/drawing/2016/5/13/chartex" xmlns:cx8="http://schemas.microsoft.com/office/drawing/2016/5/14/chartex" xmlns:mc="http://schemas.openxmlformats.org/markup-compatibility/2006" xmlns:m="http://schemas.openxmlformats.org/officeDocument/2006/math" xmlns:aink="http://schemas.microsoft.com/office/drawing/2016/ink" xmlns:am3d="http://schemas.microsoft.com/office/drawing/2017/model3d" xmlns:oel="http://schemas.microsoft.com/office/2019/extlst" xmlns:r="http://schemas.openxmlformats.org/officeDocument/2006/relationships" xmlns:wp14="http://schemas.microsoft.com/office/word/2010/wordprocessingDrawing" xmlns:wp="http://schemas.openxmlformats.org/drawingml/2006/wordprocessingDrawing" xmlns:wpg="http://schemas.microsoft.com/office/word/2010/wordprocessingGroup" xmlns:wpi="http://schemas.microsoft.com/office/word/2010/wordprocessingInk" xmlns:wps="http://schemas.microsoft.com/office/word/2010/wordprocessingShape" xmlns:o="urn:schemas-microsoft-com:office:office" xmlns:v="urn:schemas-microsoft-com:vml" xmlns:w10="urn:schemas-microsoft-com:office:word" xmlns:w="http://schemas.openxmlformats.org/wordprocessingml/2006/main" xmlns:w14="http://schemas.microsoft.com/office/word/2010/wordml" xmlns:w15="http://schemas.microsoft.com/office/word/2012/wordml" xmlns:w16cex="http://schemas.microsoft.com/office/word/2018/wordml/cex" xmlns:w16cid="http://schemas.microsoft.com/office/word/2016/wordml/cid" xmlns:w16="http://schemas.microsoft.com/office/word/2018/wordml" xmlns:w16sdtdh="http://schemas.microsoft.com/office/word/2020/wordml/sdtdatahash" xmlns:w16sdtfl="http://schemas.microsoft.com/office/word/2024/wordml/sdtformatlock" xmlns:w16se="http://schemas.microsoft.com/office/word/2015/wordml/symex" xmlns:w16du="http://schemas.microsoft.com/office/word/2023/wordml/word16du" xmlns:wne="http://schemas.microsoft.com/office/word/2006/wordml" mc:Ignorable="w14 w15 w16se w16cid w16 w16cex w16sdtdh w16sdtfl w16du wp14">
   <w:endnote w:type="separator" w:id="-1">
     <w:p>
       <w:r>
@@ -9890,7 +11050,7 @@
 </file>
 
 <file path=word/footer1.xml><?xml version="1.0" encoding="utf-8"?>
-<w:ftr xmlns:wpc="http://schemas.microsoft.com/office/word/2010/wordprocessingCanvas" xmlns:cx="http://schemas.microsoft.com/office/drawing/2014/chartex" xmlns:cx1="http://schemas.microsoft.com/office/drawing/2015/9/8/chartex" xmlns:cx2="http://schemas.microsoft.com/office/drawing/2015/10/21/chartex" xmlns:cx3="http://schemas.microsoft.com/office/drawing/2016/5/9/chartex" xmlns:cx4="http://schemas.microsoft.com/office/drawing/2016/5/10/chartex" xmlns:cx5="http://schemas.microsoft.com/office/drawing/2016/5/11/chartex" xmlns:cx6="http://schemas.microsoft.com/office/drawing/2016/5/12/chartex" xmlns:cx7="http://schemas.microsoft.com/office/drawing/2016/5/13/chartex" xmlns:cx8="http://schemas.microsoft.com/office/drawing/2016/5/14/chartex" xmlns:mc="http://schemas.openxmlformats.org/markup-compatibility/2006" xmlns:aink="http://schemas.microsoft.com/office/drawing/2016/ink" xmlns:am3d="http://schemas.microsoft.com/office/drawing/2017/model3d" xmlns:o="urn:schemas-microsoft-com:office:office" xmlns:oel="http://schemas.microsoft.com/office/2019/extlst" xmlns:r="http://schemas.openxmlformats.org/officeDocument/2006/relationships" xmlns:m="http://schemas.openxmlformats.org/officeDocument/2006/math" xmlns:v="urn:schemas-microsoft-com:vml" xmlns:wp14="http://schemas.microsoft.com/office/word/2010/wordprocessingDrawing" xmlns:wp="http://schemas.openxmlformats.org/drawingml/2006/wordprocessingDrawing" xmlns:w10="urn:schemas-microsoft-com:office:word" xmlns:w="http://schemas.openxmlformats.org/wordprocessingml/2006/main" xmlns:w14="http://schemas.microsoft.com/office/word/2010/wordml" xmlns:w15="http://schemas.microsoft.com/office/word/2012/wordml" xmlns:w16cex="http://schemas.microsoft.com/office/word/2018/wordml/cex" xmlns:w16cid="http://schemas.microsoft.com/office/word/2016/wordml/cid" xmlns:w16="http://schemas.microsoft.com/office/word/2018/wordml" xmlns:w16du="http://schemas.microsoft.com/office/word/2023/wordml/word16du" xmlns:w16sdtdh="http://schemas.microsoft.com/office/word/2020/wordml/sdtdatahash" xmlns:w16sdtfl="http://schemas.microsoft.com/office/word/2024/wordml/sdtformatlock" xmlns:w16se="http://schemas.microsoft.com/office/word/2015/wordml/symex" xmlns:wpg="http://schemas.microsoft.com/office/word/2010/wordprocessingGroup" xmlns:wpi="http://schemas.microsoft.com/office/word/2010/wordprocessingInk" xmlns:wne="http://schemas.microsoft.com/office/word/2006/wordml" xmlns:wps="http://schemas.microsoft.com/office/word/2010/wordprocessingShape" mc:Ignorable="w14 w15 w16se w16cid w16 w16cex w16sdtdh w16sdtfl w16du wp14">
+<w:ftr xmlns:wpc="http://schemas.microsoft.com/office/word/2010/wordprocessingCanvas" xmlns:cx="http://schemas.microsoft.com/office/drawing/2014/chartex" xmlns:cx1="http://schemas.microsoft.com/office/drawing/2015/9/8/chartex" xmlns:cx2="http://schemas.microsoft.com/office/drawing/2015/10/21/chartex" xmlns:cx3="http://schemas.microsoft.com/office/drawing/2016/5/9/chartex" xmlns:cx4="http://schemas.microsoft.com/office/drawing/2016/5/10/chartex" xmlns:cx5="http://schemas.microsoft.com/office/drawing/2016/5/11/chartex" xmlns:cx6="http://schemas.microsoft.com/office/drawing/2016/5/12/chartex" xmlns:cx7="http://schemas.microsoft.com/office/drawing/2016/5/13/chartex" xmlns:cx8="http://schemas.microsoft.com/office/drawing/2016/5/14/chartex" xmlns:mc="http://schemas.openxmlformats.org/markup-compatibility/2006" xmlns:m="http://schemas.openxmlformats.org/officeDocument/2006/math" xmlns:aink="http://schemas.microsoft.com/office/drawing/2016/ink" xmlns:am3d="http://schemas.microsoft.com/office/drawing/2017/model3d" xmlns:oel="http://schemas.microsoft.com/office/2019/extlst" xmlns:r="http://schemas.openxmlformats.org/officeDocument/2006/relationships" xmlns:wp14="http://schemas.microsoft.com/office/word/2010/wordprocessingDrawing" xmlns:wp="http://schemas.openxmlformats.org/drawingml/2006/wordprocessingDrawing" xmlns:wpg="http://schemas.microsoft.com/office/word/2010/wordprocessingGroup" xmlns:wpi="http://schemas.microsoft.com/office/word/2010/wordprocessingInk" xmlns:wps="http://schemas.microsoft.com/office/word/2010/wordprocessingShape" xmlns:o="urn:schemas-microsoft-com:office:office" xmlns:v="urn:schemas-microsoft-com:vml" xmlns:w10="urn:schemas-microsoft-com:office:word" xmlns:w="http://schemas.openxmlformats.org/wordprocessingml/2006/main" xmlns:w14="http://schemas.microsoft.com/office/word/2010/wordml" xmlns:w15="http://schemas.microsoft.com/office/word/2012/wordml" xmlns:w16cex="http://schemas.microsoft.com/office/word/2018/wordml/cex" xmlns:w16cid="http://schemas.microsoft.com/office/word/2016/wordml/cid" xmlns:w16="http://schemas.microsoft.com/office/word/2018/wordml" xmlns:w16sdtdh="http://schemas.microsoft.com/office/word/2020/wordml/sdtdatahash" xmlns:w16sdtfl="http://schemas.microsoft.com/office/word/2024/wordml/sdtformatlock" xmlns:w16se="http://schemas.microsoft.com/office/word/2015/wordml/symex" xmlns:w16du="http://schemas.microsoft.com/office/word/2023/wordml/word16du" xmlns:wne="http://schemas.microsoft.com/office/word/2006/wordml" mc:Ignorable="w14 w15 w16se w16cid w16 w16cex w16sdtdh w16sdtfl w16du wp14">
   <w:tbl>
     <w:tblPr>
       <w:tblW w:w="0" w:type="auto"/>
@@ -10058,31 +11218,31 @@
 </file>
 
 <file path=word/footer2.xml><?xml version="1.0" encoding="utf-8"?>
-<w:ftr xmlns:wpc="http://schemas.microsoft.com/office/word/2010/wordprocessingCanvas" xmlns:cx="http://schemas.microsoft.com/office/drawing/2014/chartex" xmlns:cx1="http://schemas.microsoft.com/office/drawing/2015/9/8/chartex" xmlns:cx2="http://schemas.microsoft.com/office/drawing/2015/10/21/chartex" xmlns:cx3="http://schemas.microsoft.com/office/drawing/2016/5/9/chartex" xmlns:cx4="http://schemas.microsoft.com/office/drawing/2016/5/10/chartex" xmlns:cx5="http://schemas.microsoft.com/office/drawing/2016/5/11/chartex" xmlns:cx6="http://schemas.microsoft.com/office/drawing/2016/5/12/chartex" xmlns:cx7="http://schemas.microsoft.com/office/drawing/2016/5/13/chartex" xmlns:cx8="http://schemas.microsoft.com/office/drawing/2016/5/14/chartex" xmlns:mc="http://schemas.openxmlformats.org/markup-compatibility/2006" xmlns:aink="http://schemas.microsoft.com/office/drawing/2016/ink" xmlns:am3d="http://schemas.microsoft.com/office/drawing/2017/model3d" xmlns:o="urn:schemas-microsoft-com:office:office" xmlns:oel="http://schemas.microsoft.com/office/2019/extlst" xmlns:r="http://schemas.openxmlformats.org/officeDocument/2006/relationships" xmlns:m="http://schemas.openxmlformats.org/officeDocument/2006/math" xmlns:v="urn:schemas-microsoft-com:vml" xmlns:wp14="http://schemas.microsoft.com/office/word/2010/wordprocessingDrawing" xmlns:wp="http://schemas.openxmlformats.org/drawingml/2006/wordprocessingDrawing" xmlns:w10="urn:schemas-microsoft-com:office:word" xmlns:w="http://schemas.openxmlformats.org/wordprocessingml/2006/main" xmlns:w14="http://schemas.microsoft.com/office/word/2010/wordml" xmlns:w15="http://schemas.microsoft.com/office/word/2012/wordml" xmlns:w16cex="http://schemas.microsoft.com/office/word/2018/wordml/cex" xmlns:w16cid="http://schemas.microsoft.com/office/word/2016/wordml/cid" xmlns:w16="http://schemas.microsoft.com/office/word/2018/wordml" xmlns:w16du="http://schemas.microsoft.com/office/word/2023/wordml/word16du" xmlns:w16sdtdh="http://schemas.microsoft.com/office/word/2020/wordml/sdtdatahash" xmlns:w16sdtfl="http://schemas.microsoft.com/office/word/2024/wordml/sdtformatlock" xmlns:w16se="http://schemas.microsoft.com/office/word/2015/wordml/symex" xmlns:wpg="http://schemas.microsoft.com/office/word/2010/wordprocessingGroup" xmlns:wpi="http://schemas.microsoft.com/office/word/2010/wordprocessingInk" xmlns:wne="http://schemas.microsoft.com/office/word/2006/wordml" xmlns:wps="http://schemas.microsoft.com/office/word/2010/wordprocessingShape" mc:Ignorable="w14 w15 w16se w16cid w16 w16cex w16sdtdh w16sdtfl w16du wp14">
+<w:ftr xmlns:wpc="http://schemas.microsoft.com/office/word/2010/wordprocessingCanvas" xmlns:cx="http://schemas.microsoft.com/office/drawing/2014/chartex" xmlns:cx1="http://schemas.microsoft.com/office/drawing/2015/9/8/chartex" xmlns:cx2="http://schemas.microsoft.com/office/drawing/2015/10/21/chartex" xmlns:cx3="http://schemas.microsoft.com/office/drawing/2016/5/9/chartex" xmlns:cx4="http://schemas.microsoft.com/office/drawing/2016/5/10/chartex" xmlns:cx5="http://schemas.microsoft.com/office/drawing/2016/5/11/chartex" xmlns:cx6="http://schemas.microsoft.com/office/drawing/2016/5/12/chartex" xmlns:cx7="http://schemas.microsoft.com/office/drawing/2016/5/13/chartex" xmlns:cx8="http://schemas.microsoft.com/office/drawing/2016/5/14/chartex" xmlns:mc="http://schemas.openxmlformats.org/markup-compatibility/2006" xmlns:m="http://schemas.openxmlformats.org/officeDocument/2006/math" xmlns:aink="http://schemas.microsoft.com/office/drawing/2016/ink" xmlns:am3d="http://schemas.microsoft.com/office/drawing/2017/model3d" xmlns:oel="http://schemas.microsoft.com/office/2019/extlst" xmlns:r="http://schemas.openxmlformats.org/officeDocument/2006/relationships" xmlns:wp14="http://schemas.microsoft.com/office/word/2010/wordprocessingDrawing" xmlns:wp="http://schemas.openxmlformats.org/drawingml/2006/wordprocessingDrawing" xmlns:wpg="http://schemas.microsoft.com/office/word/2010/wordprocessingGroup" xmlns:wpi="http://schemas.microsoft.com/office/word/2010/wordprocessingInk" xmlns:wps="http://schemas.microsoft.com/office/word/2010/wordprocessingShape" xmlns:o="urn:schemas-microsoft-com:office:office" xmlns:v="urn:schemas-microsoft-com:vml" xmlns:w10="urn:schemas-microsoft-com:office:word" xmlns:w="http://schemas.openxmlformats.org/wordprocessingml/2006/main" xmlns:w14="http://schemas.microsoft.com/office/word/2010/wordml" xmlns:w15="http://schemas.microsoft.com/office/word/2012/wordml" xmlns:w16cex="http://schemas.microsoft.com/office/word/2018/wordml/cex" xmlns:w16cid="http://schemas.microsoft.com/office/word/2016/wordml/cid" xmlns:w16="http://schemas.microsoft.com/office/word/2018/wordml" xmlns:w16sdtdh="http://schemas.microsoft.com/office/word/2020/wordml/sdtdatahash" xmlns:w16sdtfl="http://schemas.microsoft.com/office/word/2024/wordml/sdtformatlock" xmlns:w16se="http://schemas.microsoft.com/office/word/2015/wordml/symex" xmlns:w16du="http://schemas.microsoft.com/office/word/2023/wordml/word16du" xmlns:wne="http://schemas.microsoft.com/office/word/2006/wordml" mc:Ignorable="w14 w15 w16se w16cid w16 w16cex w16sdtdh w16sdtfl w16du wp14">
   <w:p/>
 </w:ftr>
 </file>
 
 <file path=word/footer3.xml><?xml version="1.0" encoding="utf-8"?>
-<w:ftr xmlns:wpc="http://schemas.microsoft.com/office/word/2010/wordprocessingCanvas" xmlns:cx="http://schemas.microsoft.com/office/drawing/2014/chartex" xmlns:cx1="http://schemas.microsoft.com/office/drawing/2015/9/8/chartex" xmlns:cx2="http://schemas.microsoft.com/office/drawing/2015/10/21/chartex" xmlns:cx3="http://schemas.microsoft.com/office/drawing/2016/5/9/chartex" xmlns:cx4="http://schemas.microsoft.com/office/drawing/2016/5/10/chartex" xmlns:cx5="http://schemas.microsoft.com/office/drawing/2016/5/11/chartex" xmlns:cx6="http://schemas.microsoft.com/office/drawing/2016/5/12/chartex" xmlns:cx7="http://schemas.microsoft.com/office/drawing/2016/5/13/chartex" xmlns:cx8="http://schemas.microsoft.com/office/drawing/2016/5/14/chartex" xmlns:mc="http://schemas.openxmlformats.org/markup-compatibility/2006" xmlns:aink="http://schemas.microsoft.com/office/drawing/2016/ink" xmlns:am3d="http://schemas.microsoft.com/office/drawing/2017/model3d" xmlns:o="urn:schemas-microsoft-com:office:office" xmlns:oel="http://schemas.microsoft.com/office/2019/extlst" xmlns:r="http://schemas.openxmlformats.org/officeDocument/2006/relationships" xmlns:m="http://schemas.openxmlformats.org/officeDocument/2006/math" xmlns:v="urn:schemas-microsoft-com:vml" xmlns:wp14="http://schemas.microsoft.com/office/word/2010/wordprocessingDrawing" xmlns:wp="http://schemas.openxmlformats.org/drawingml/2006/wordprocessingDrawing" xmlns:w10="urn:schemas-microsoft-com:office:word" xmlns:w="http://schemas.openxmlformats.org/wordprocessingml/2006/main" xmlns:w14="http://schemas.microsoft.com/office/word/2010/wordml" xmlns:w15="http://schemas.microsoft.com/office/word/2012/wordml" xmlns:w16cex="http://schemas.microsoft.com/office/word/2018/wordml/cex" xmlns:w16cid="http://schemas.microsoft.com/office/word/2016/wordml/cid" xmlns:w16="http://schemas.microsoft.com/office/word/2018/wordml" xmlns:w16du="http://schemas.microsoft.com/office/word/2023/wordml/word16du" xmlns:w16sdtdh="http://schemas.microsoft.com/office/word/2020/wordml/sdtdatahash" xmlns:w16sdtfl="http://schemas.microsoft.com/office/word/2024/wordml/sdtformatlock" xmlns:w16se="http://schemas.microsoft.com/office/word/2015/wordml/symex" xmlns:wpg="http://schemas.microsoft.com/office/word/2010/wordprocessingGroup" xmlns:wpi="http://schemas.microsoft.com/office/word/2010/wordprocessingInk" xmlns:wne="http://schemas.microsoft.com/office/word/2006/wordml" xmlns:wps="http://schemas.microsoft.com/office/word/2010/wordprocessingShape" mc:Ignorable="w14 w15 w16se w16cid w16 w16cex w16sdtdh w16sdtfl w16du wp14">
+<w:ftr xmlns:wpc="http://schemas.microsoft.com/office/word/2010/wordprocessingCanvas" xmlns:cx="http://schemas.microsoft.com/office/drawing/2014/chartex" xmlns:cx1="http://schemas.microsoft.com/office/drawing/2015/9/8/chartex" xmlns:cx2="http://schemas.microsoft.com/office/drawing/2015/10/21/chartex" xmlns:cx3="http://schemas.microsoft.com/office/drawing/2016/5/9/chartex" xmlns:cx4="http://schemas.microsoft.com/office/drawing/2016/5/10/chartex" xmlns:cx5="http://schemas.microsoft.com/office/drawing/2016/5/11/chartex" xmlns:cx6="http://schemas.microsoft.com/office/drawing/2016/5/12/chartex" xmlns:cx7="http://schemas.microsoft.com/office/drawing/2016/5/13/chartex" xmlns:cx8="http://schemas.microsoft.com/office/drawing/2016/5/14/chartex" xmlns:mc="http://schemas.openxmlformats.org/markup-compatibility/2006" xmlns:m="http://schemas.openxmlformats.org/officeDocument/2006/math" xmlns:aink="http://schemas.microsoft.com/office/drawing/2016/ink" xmlns:am3d="http://schemas.microsoft.com/office/drawing/2017/model3d" xmlns:oel="http://schemas.microsoft.com/office/2019/extlst" xmlns:r="http://schemas.openxmlformats.org/officeDocument/2006/relationships" xmlns:wp14="http://schemas.microsoft.com/office/word/2010/wordprocessingDrawing" xmlns:wp="http://schemas.openxmlformats.org/drawingml/2006/wordprocessingDrawing" xmlns:wpg="http://schemas.microsoft.com/office/word/2010/wordprocessingGroup" xmlns:wpi="http://schemas.microsoft.com/office/word/2010/wordprocessingInk" xmlns:wps="http://schemas.microsoft.com/office/word/2010/wordprocessingShape" xmlns:o="urn:schemas-microsoft-com:office:office" xmlns:v="urn:schemas-microsoft-com:vml" xmlns:w10="urn:schemas-microsoft-com:office:word" xmlns:w="http://schemas.openxmlformats.org/wordprocessingml/2006/main" xmlns:w14="http://schemas.microsoft.com/office/word/2010/wordml" xmlns:w15="http://schemas.microsoft.com/office/word/2012/wordml" xmlns:w16cex="http://schemas.microsoft.com/office/word/2018/wordml/cex" xmlns:w16cid="http://schemas.microsoft.com/office/word/2016/wordml/cid" xmlns:w16="http://schemas.microsoft.com/office/word/2018/wordml" xmlns:w16sdtdh="http://schemas.microsoft.com/office/word/2020/wordml/sdtdatahash" xmlns:w16sdtfl="http://schemas.microsoft.com/office/word/2024/wordml/sdtformatlock" xmlns:w16se="http://schemas.microsoft.com/office/word/2015/wordml/symex" xmlns:w16du="http://schemas.microsoft.com/office/word/2023/wordml/word16du" xmlns:wne="http://schemas.microsoft.com/office/word/2006/wordml" mc:Ignorable="w14 w15 w16se w16cid w16 w16cex w16sdtdh w16sdtfl w16du wp14">
   <w:p/>
 </w:ftr>
 </file>
 
 <file path=word/footer4.xml><?xml version="1.0" encoding="utf-8"?>
-<w:ftr xmlns:wpc="http://schemas.microsoft.com/office/word/2010/wordprocessingCanvas" xmlns:cx="http://schemas.microsoft.com/office/drawing/2014/chartex" xmlns:cx1="http://schemas.microsoft.com/office/drawing/2015/9/8/chartex" xmlns:cx2="http://schemas.microsoft.com/office/drawing/2015/10/21/chartex" xmlns:cx3="http://schemas.microsoft.com/office/drawing/2016/5/9/chartex" xmlns:cx4="http://schemas.microsoft.com/office/drawing/2016/5/10/chartex" xmlns:cx5="http://schemas.microsoft.com/office/drawing/2016/5/11/chartex" xmlns:cx6="http://schemas.microsoft.com/office/drawing/2016/5/12/chartex" xmlns:cx7="http://schemas.microsoft.com/office/drawing/2016/5/13/chartex" xmlns:cx8="http://schemas.microsoft.com/office/drawing/2016/5/14/chartex" xmlns:mc="http://schemas.openxmlformats.org/markup-compatibility/2006" xmlns:aink="http://schemas.microsoft.com/office/drawing/2016/ink" xmlns:am3d="http://schemas.microsoft.com/office/drawing/2017/model3d" xmlns:o="urn:schemas-microsoft-com:office:office" xmlns:oel="http://schemas.microsoft.com/office/2019/extlst" xmlns:r="http://schemas.openxmlformats.org/officeDocument/2006/relationships" xmlns:m="http://schemas.openxmlformats.org/officeDocument/2006/math" xmlns:v="urn:schemas-microsoft-com:vml" xmlns:wp14="http://schemas.microsoft.com/office/word/2010/wordprocessingDrawing" xmlns:wp="http://schemas.openxmlformats.org/drawingml/2006/wordprocessingDrawing" xmlns:w10="urn:schemas-microsoft-com:office:word" xmlns:w="http://schemas.openxmlformats.org/wordprocessingml/2006/main" xmlns:w14="http://schemas.microsoft.com/office/word/2010/wordml" xmlns:w15="http://schemas.microsoft.com/office/word/2012/wordml" xmlns:w16cex="http://schemas.microsoft.com/office/word/2018/wordml/cex" xmlns:w16cid="http://schemas.microsoft.com/office/word/2016/wordml/cid" xmlns:w16="http://schemas.microsoft.com/office/word/2018/wordml" xmlns:w16du="http://schemas.microsoft.com/office/word/2023/wordml/word16du" xmlns:w16sdtdh="http://schemas.microsoft.com/office/word/2020/wordml/sdtdatahash" xmlns:w16sdtfl="http://schemas.microsoft.com/office/word/2024/wordml/sdtformatlock" xmlns:w16se="http://schemas.microsoft.com/office/word/2015/wordml/symex" xmlns:wpg="http://schemas.microsoft.com/office/word/2010/wordprocessingGroup" xmlns:wpi="http://schemas.microsoft.com/office/word/2010/wordprocessingInk" xmlns:wne="http://schemas.microsoft.com/office/word/2006/wordml" xmlns:wps="http://schemas.microsoft.com/office/word/2010/wordprocessingShape" mc:Ignorable="w14 w15 w16se w16cid w16 w16cex w16sdtdh w16sdtfl w16du wp14">
+<w:ftr xmlns:wpc="http://schemas.microsoft.com/office/word/2010/wordprocessingCanvas" xmlns:cx="http://schemas.microsoft.com/office/drawing/2014/chartex" xmlns:cx1="http://schemas.microsoft.com/office/drawing/2015/9/8/chartex" xmlns:cx2="http://schemas.microsoft.com/office/drawing/2015/10/21/chartex" xmlns:cx3="http://schemas.microsoft.com/office/drawing/2016/5/9/chartex" xmlns:cx4="http://schemas.microsoft.com/office/drawing/2016/5/10/chartex" xmlns:cx5="http://schemas.microsoft.com/office/drawing/2016/5/11/chartex" xmlns:cx6="http://schemas.microsoft.com/office/drawing/2016/5/12/chartex" xmlns:cx7="http://schemas.microsoft.com/office/drawing/2016/5/13/chartex" xmlns:cx8="http://schemas.microsoft.com/office/drawing/2016/5/14/chartex" xmlns:mc="http://schemas.openxmlformats.org/markup-compatibility/2006" xmlns:m="http://schemas.openxmlformats.org/officeDocument/2006/math" xmlns:aink="http://schemas.microsoft.com/office/drawing/2016/ink" xmlns:am3d="http://schemas.microsoft.com/office/drawing/2017/model3d" xmlns:oel="http://schemas.microsoft.com/office/2019/extlst" xmlns:r="http://schemas.openxmlformats.org/officeDocument/2006/relationships" xmlns:wp14="http://schemas.microsoft.com/office/word/2010/wordprocessingDrawing" xmlns:wp="http://schemas.openxmlformats.org/drawingml/2006/wordprocessingDrawing" xmlns:wpg="http://schemas.microsoft.com/office/word/2010/wordprocessingGroup" xmlns:wpi="http://schemas.microsoft.com/office/word/2010/wordprocessingInk" xmlns:wps="http://schemas.microsoft.com/office/word/2010/wordprocessingShape" xmlns:o="urn:schemas-microsoft-com:office:office" xmlns:v="urn:schemas-microsoft-com:vml" xmlns:w10="urn:schemas-microsoft-com:office:word" xmlns:w="http://schemas.openxmlformats.org/wordprocessingml/2006/main" xmlns:w14="http://schemas.microsoft.com/office/word/2010/wordml" xmlns:w15="http://schemas.microsoft.com/office/word/2012/wordml" xmlns:w16cex="http://schemas.microsoft.com/office/word/2018/wordml/cex" xmlns:w16cid="http://schemas.microsoft.com/office/word/2016/wordml/cid" xmlns:w16="http://schemas.microsoft.com/office/word/2018/wordml" xmlns:w16sdtdh="http://schemas.microsoft.com/office/word/2020/wordml/sdtdatahash" xmlns:w16sdtfl="http://schemas.microsoft.com/office/word/2024/wordml/sdtformatlock" xmlns:w16se="http://schemas.microsoft.com/office/word/2015/wordml/symex" xmlns:w16du="http://schemas.microsoft.com/office/word/2023/wordml/word16du" xmlns:wne="http://schemas.microsoft.com/office/word/2006/wordml" mc:Ignorable="w14 w15 w16se w16cid w16 w16cex w16sdtdh w16sdtfl w16du wp14">
   <w:p/>
 </w:ftr>
 </file>
 
 <file path=word/footer5.xml><?xml version="1.0" encoding="utf-8"?>
-<w:ftr xmlns:wpc="http://schemas.microsoft.com/office/word/2010/wordprocessingCanvas" xmlns:cx="http://schemas.microsoft.com/office/drawing/2014/chartex" xmlns:cx1="http://schemas.microsoft.com/office/drawing/2015/9/8/chartex" xmlns:cx2="http://schemas.microsoft.com/office/drawing/2015/10/21/chartex" xmlns:cx3="http://schemas.microsoft.com/office/drawing/2016/5/9/chartex" xmlns:cx4="http://schemas.microsoft.com/office/drawing/2016/5/10/chartex" xmlns:cx5="http://schemas.microsoft.com/office/drawing/2016/5/11/chartex" xmlns:cx6="http://schemas.microsoft.com/office/drawing/2016/5/12/chartex" xmlns:cx7="http://schemas.microsoft.com/office/drawing/2016/5/13/chartex" xmlns:cx8="http://schemas.microsoft.com/office/drawing/2016/5/14/chartex" xmlns:mc="http://schemas.openxmlformats.org/markup-compatibility/2006" xmlns:aink="http://schemas.microsoft.com/office/drawing/2016/ink" xmlns:am3d="http://schemas.microsoft.com/office/drawing/2017/model3d" xmlns:o="urn:schemas-microsoft-com:office:office" xmlns:oel="http://schemas.microsoft.com/office/2019/extlst" xmlns:r="http://schemas.openxmlformats.org/officeDocument/2006/relationships" xmlns:m="http://schemas.openxmlformats.org/officeDocument/2006/math" xmlns:v="urn:schemas-microsoft-com:vml" xmlns:wp14="http://schemas.microsoft.com/office/word/2010/wordprocessingDrawing" xmlns:wp="http://schemas.openxmlformats.org/drawingml/2006/wordprocessingDrawing" xmlns:w10="urn:schemas-microsoft-com:office:word" xmlns:w="http://schemas.openxmlformats.org/wordprocessingml/2006/main" xmlns:w14="http://schemas.microsoft.com/office/word/2010/wordml" xmlns:w15="http://schemas.microsoft.com/office/word/2012/wordml" xmlns:w16cex="http://schemas.microsoft.com/office/word/2018/wordml/cex" xmlns:w16cid="http://schemas.microsoft.com/office/word/2016/wordml/cid" xmlns:w16="http://schemas.microsoft.com/office/word/2018/wordml" xmlns:w16du="http://schemas.microsoft.com/office/word/2023/wordml/word16du" xmlns:w16sdtdh="http://schemas.microsoft.com/office/word/2020/wordml/sdtdatahash" xmlns:w16sdtfl="http://schemas.microsoft.com/office/word/2024/wordml/sdtformatlock" xmlns:w16se="http://schemas.microsoft.com/office/word/2015/wordml/symex" xmlns:wpg="http://schemas.microsoft.com/office/word/2010/wordprocessingGroup" xmlns:wpi="http://schemas.microsoft.com/office/word/2010/wordprocessingInk" xmlns:wne="http://schemas.microsoft.com/office/word/2006/wordml" xmlns:wps="http://schemas.microsoft.com/office/word/2010/wordprocessingShape" mc:Ignorable="w14 w15 w16se w16cid w16 w16cex w16sdtdh w16sdtfl w16du wp14">
+<w:ftr xmlns:wpc="http://schemas.microsoft.com/office/word/2010/wordprocessingCanvas" xmlns:cx="http://schemas.microsoft.com/office/drawing/2014/chartex" xmlns:cx1="http://schemas.microsoft.com/office/drawing/2015/9/8/chartex" xmlns:cx2="http://schemas.microsoft.com/office/drawing/2015/10/21/chartex" xmlns:cx3="http://schemas.microsoft.com/office/drawing/2016/5/9/chartex" xmlns:cx4="http://schemas.microsoft.com/office/drawing/2016/5/10/chartex" xmlns:cx5="http://schemas.microsoft.com/office/drawing/2016/5/11/chartex" xmlns:cx6="http://schemas.microsoft.com/office/drawing/2016/5/12/chartex" xmlns:cx7="http://schemas.microsoft.com/office/drawing/2016/5/13/chartex" xmlns:cx8="http://schemas.microsoft.com/office/drawing/2016/5/14/chartex" xmlns:mc="http://schemas.openxmlformats.org/markup-compatibility/2006" xmlns:m="http://schemas.openxmlformats.org/officeDocument/2006/math" xmlns:aink="http://schemas.microsoft.com/office/drawing/2016/ink" xmlns:am3d="http://schemas.microsoft.com/office/drawing/2017/model3d" xmlns:oel="http://schemas.microsoft.com/office/2019/extlst" xmlns:r="http://schemas.openxmlformats.org/officeDocument/2006/relationships" xmlns:wp14="http://schemas.microsoft.com/office/word/2010/wordprocessingDrawing" xmlns:wp="http://schemas.openxmlformats.org/drawingml/2006/wordprocessingDrawing" xmlns:wpg="http://schemas.microsoft.com/office/word/2010/wordprocessingGroup" xmlns:wpi="http://schemas.microsoft.com/office/word/2010/wordprocessingInk" xmlns:wps="http://schemas.microsoft.com/office/word/2010/wordprocessingShape" xmlns:o="urn:schemas-microsoft-com:office:office" xmlns:v="urn:schemas-microsoft-com:vml" xmlns:w10="urn:schemas-microsoft-com:office:word" xmlns:w="http://schemas.openxmlformats.org/wordprocessingml/2006/main" xmlns:w14="http://schemas.microsoft.com/office/word/2010/wordml" xmlns:w15="http://schemas.microsoft.com/office/word/2012/wordml" xmlns:w16cex="http://schemas.microsoft.com/office/word/2018/wordml/cex" xmlns:w16cid="http://schemas.microsoft.com/office/word/2016/wordml/cid" xmlns:w16="http://schemas.microsoft.com/office/word/2018/wordml" xmlns:w16sdtdh="http://schemas.microsoft.com/office/word/2020/wordml/sdtdatahash" xmlns:w16sdtfl="http://schemas.microsoft.com/office/word/2024/wordml/sdtformatlock" xmlns:w16se="http://schemas.microsoft.com/office/word/2015/wordml/symex" xmlns:w16du="http://schemas.microsoft.com/office/word/2023/wordml/word16du" xmlns:wne="http://schemas.microsoft.com/office/word/2006/wordml" mc:Ignorable="w14 w15 w16se w16cid w16 w16cex w16sdtdh w16sdtfl w16du wp14">
   <w:p/>
 </w:ftr>
 </file>
 
 <file path=word/footnotes.xml><?xml version="1.0" encoding="utf-8"?>
-<w:footnotes xmlns:wpc="http://schemas.microsoft.com/office/word/2010/wordprocessingCanvas" xmlns:cx="http://schemas.microsoft.com/office/drawing/2014/chartex" xmlns:cx1="http://schemas.microsoft.com/office/drawing/2015/9/8/chartex" xmlns:cx2="http://schemas.microsoft.com/office/drawing/2015/10/21/chartex" xmlns:cx3="http://schemas.microsoft.com/office/drawing/2016/5/9/chartex" xmlns:cx4="http://schemas.microsoft.com/office/drawing/2016/5/10/chartex" xmlns:cx5="http://schemas.microsoft.com/office/drawing/2016/5/11/chartex" xmlns:cx6="http://schemas.microsoft.com/office/drawing/2016/5/12/chartex" xmlns:cx7="http://schemas.microsoft.com/office/drawing/2016/5/13/chartex" xmlns:cx8="http://schemas.microsoft.com/office/drawing/2016/5/14/chartex" xmlns:mc="http://schemas.openxmlformats.org/markup-compatibility/2006" xmlns:aink="http://schemas.microsoft.com/office/drawing/2016/ink" xmlns:am3d="http://schemas.microsoft.com/office/drawing/2017/model3d" xmlns:o="urn:schemas-microsoft-com:office:office" xmlns:oel="http://schemas.microsoft.com/office/2019/extlst" xmlns:r="http://schemas.openxmlformats.org/officeDocument/2006/relationships" xmlns:m="http://schemas.openxmlformats.org/officeDocument/2006/math" xmlns:v="urn:schemas-microsoft-com:vml" xmlns:wp14="http://schemas.microsoft.com/office/word/2010/wordprocessingDrawing" xmlns:wp="http://schemas.openxmlformats.org/drawingml/2006/wordprocessingDrawing" xmlns:w10="urn:schemas-microsoft-com:office:word" xmlns:w="http://schemas.openxmlformats.org/wordprocessingml/2006/main" xmlns:w14="http://schemas.microsoft.com/office/word/2010/wordml" xmlns:w15="http://schemas.microsoft.com/office/word/2012/wordml" xmlns:w16cex="http://schemas.microsoft.com/office/word/2018/wordml/cex" xmlns:w16cid="http://schemas.microsoft.com/office/word/2016/wordml/cid" xmlns:w16="http://schemas.microsoft.com/office/word/2018/wordml" xmlns:w16du="http://schemas.microsoft.com/office/word/2023/wordml/word16du" xmlns:w16sdtdh="http://schemas.microsoft.com/office/word/2020/wordml/sdtdatahash" xmlns:w16sdtfl="http://schemas.microsoft.com/office/word/2024/wordml/sdtformatlock" xmlns:w16se="http://schemas.microsoft.com/office/word/2015/wordml/symex" xmlns:wpg="http://schemas.microsoft.com/office/word/2010/wordprocessingGroup" xmlns:wpi="http://schemas.microsoft.com/office/word/2010/wordprocessingInk" xmlns:wne="http://schemas.microsoft.com/office/word/2006/wordml" xmlns:wps="http://schemas.microsoft.com/office/word/2010/wordprocessingShape" mc:Ignorable="w14 w15 w16se w16cid w16 w16cex w16sdtdh w16sdtfl w16du wp14">
+<w:footnotes xmlns:wpc="http://schemas.microsoft.com/office/word/2010/wordprocessingCanvas" xmlns:cx="http://schemas.microsoft.com/office/drawing/2014/chartex" xmlns:cx1="http://schemas.microsoft.com/office/drawing/2015/9/8/chartex" xmlns:cx2="http://schemas.microsoft.com/office/drawing/2015/10/21/chartex" xmlns:cx3="http://schemas.microsoft.com/office/drawing/2016/5/9/chartex" xmlns:cx4="http://schemas.microsoft.com/office/drawing/2016/5/10/chartex" xmlns:cx5="http://schemas.microsoft.com/office/drawing/2016/5/11/chartex" xmlns:cx6="http://schemas.microsoft.com/office/drawing/2016/5/12/chartex" xmlns:cx7="http://schemas.microsoft.com/office/drawing/2016/5/13/chartex" xmlns:cx8="http://schemas.microsoft.com/office/drawing/2016/5/14/chartex" xmlns:mc="http://schemas.openxmlformats.org/markup-compatibility/2006" xmlns:m="http://schemas.openxmlformats.org/officeDocument/2006/math" xmlns:aink="http://schemas.microsoft.com/office/drawing/2016/ink" xmlns:am3d="http://schemas.microsoft.com/office/drawing/2017/model3d" xmlns:oel="http://schemas.microsoft.com/office/2019/extlst" xmlns:r="http://schemas.openxmlformats.org/officeDocument/2006/relationships" xmlns:wp14="http://schemas.microsoft.com/office/word/2010/wordprocessingDrawing" xmlns:wp="http://schemas.openxmlformats.org/drawingml/2006/wordprocessingDrawing" xmlns:wpg="http://schemas.microsoft.com/office/word/2010/wordprocessingGroup" xmlns:wpi="http://schemas.microsoft.com/office/word/2010/wordprocessingInk" xmlns:wps="http://schemas.microsoft.com/office/word/2010/wordprocessingShape" xmlns:o="urn:schemas-microsoft-com:office:office" xmlns:v="urn:schemas-microsoft-com:vml" xmlns:w10="urn:schemas-microsoft-com:office:word" xmlns:w="http://schemas.openxmlformats.org/wordprocessingml/2006/main" xmlns:w14="http://schemas.microsoft.com/office/word/2010/wordml" xmlns:w15="http://schemas.microsoft.com/office/word/2012/wordml" xmlns:w16cex="http://schemas.microsoft.com/office/word/2018/wordml/cex" xmlns:w16cid="http://schemas.microsoft.com/office/word/2016/wordml/cid" xmlns:w16="http://schemas.microsoft.com/office/word/2018/wordml" xmlns:w16sdtdh="http://schemas.microsoft.com/office/word/2020/wordml/sdtdatahash" xmlns:w16sdtfl="http://schemas.microsoft.com/office/word/2024/wordml/sdtformatlock" xmlns:w16se="http://schemas.microsoft.com/office/word/2015/wordml/symex" xmlns:w16du="http://schemas.microsoft.com/office/word/2023/wordml/word16du" xmlns:wne="http://schemas.microsoft.com/office/word/2006/wordml" mc:Ignorable="w14 w15 w16se w16cid w16 w16cex w16sdtdh w16sdtfl w16du wp14">
   <w:footnote w:type="separator" w:id="-1">
     <w:p>
       <w:r>
@@ -10101,7 +11261,7 @@
 </file>
 
 <file path=word/header1.xml><?xml version="1.0" encoding="utf-8"?>
-<w:hdr xmlns:wpc="http://schemas.microsoft.com/office/word/2010/wordprocessingCanvas" xmlns:cx="http://schemas.microsoft.com/office/drawing/2014/chartex" xmlns:cx1="http://schemas.microsoft.com/office/drawing/2015/9/8/chartex" xmlns:cx2="http://schemas.microsoft.com/office/drawing/2015/10/21/chartex" xmlns:cx3="http://schemas.microsoft.com/office/drawing/2016/5/9/chartex" xmlns:cx4="http://schemas.microsoft.com/office/drawing/2016/5/10/chartex" xmlns:cx5="http://schemas.microsoft.com/office/drawing/2016/5/11/chartex" xmlns:cx6="http://schemas.microsoft.com/office/drawing/2016/5/12/chartex" xmlns:cx7="http://schemas.microsoft.com/office/drawing/2016/5/13/chartex" xmlns:cx8="http://schemas.microsoft.com/office/drawing/2016/5/14/chartex" xmlns:mc="http://schemas.openxmlformats.org/markup-compatibility/2006" xmlns:aink="http://schemas.microsoft.com/office/drawing/2016/ink" xmlns:am3d="http://schemas.microsoft.com/office/drawing/2017/model3d" xmlns:o="urn:schemas-microsoft-com:office:office" xmlns:oel="http://schemas.microsoft.com/office/2019/extlst" xmlns:r="http://schemas.openxmlformats.org/officeDocument/2006/relationships" xmlns:m="http://schemas.openxmlformats.org/officeDocument/2006/math" xmlns:v="urn:schemas-microsoft-com:vml" xmlns:wp14="http://schemas.microsoft.com/office/word/2010/wordprocessingDrawing" xmlns:wp="http://schemas.openxmlformats.org/drawingml/2006/wordprocessingDrawing" xmlns:w10="urn:schemas-microsoft-com:office:word" xmlns:w="http://schemas.openxmlformats.org/wordprocessingml/2006/main" xmlns:w14="http://schemas.microsoft.com/office/word/2010/wordml" xmlns:w15="http://schemas.microsoft.com/office/word/2012/wordml" xmlns:w16cex="http://schemas.microsoft.com/office/word/2018/wordml/cex" xmlns:w16cid="http://schemas.microsoft.com/office/word/2016/wordml/cid" xmlns:w16="http://schemas.microsoft.com/office/word/2018/wordml" xmlns:w16du="http://schemas.microsoft.com/office/word/2023/wordml/word16du" xmlns:w16sdtdh="http://schemas.microsoft.com/office/word/2020/wordml/sdtdatahash" xmlns:w16sdtfl="http://schemas.microsoft.com/office/word/2024/wordml/sdtformatlock" xmlns:w16se="http://schemas.microsoft.com/office/word/2015/wordml/symex" xmlns:wpg="http://schemas.microsoft.com/office/word/2010/wordprocessingGroup" xmlns:wpi="http://schemas.microsoft.com/office/word/2010/wordprocessingInk" xmlns:wne="http://schemas.microsoft.com/office/word/2006/wordml" xmlns:wps="http://schemas.microsoft.com/office/word/2010/wordprocessingShape" mc:Ignorable="w14 w15 w16se w16cid w16 w16cex w16sdtdh w16sdtfl w16du wp14">
+<w:hdr xmlns:wpc="http://schemas.microsoft.com/office/word/2010/wordprocessingCanvas" xmlns:cx="http://schemas.microsoft.com/office/drawing/2014/chartex" xmlns:cx1="http://schemas.microsoft.com/office/drawing/2015/9/8/chartex" xmlns:cx2="http://schemas.microsoft.com/office/drawing/2015/10/21/chartex" xmlns:cx3="http://schemas.microsoft.com/office/drawing/2016/5/9/chartex" xmlns:cx4="http://schemas.microsoft.com/office/drawing/2016/5/10/chartex" xmlns:cx5="http://schemas.microsoft.com/office/drawing/2016/5/11/chartex" xmlns:cx6="http://schemas.microsoft.com/office/drawing/2016/5/12/chartex" xmlns:cx7="http://schemas.microsoft.com/office/drawing/2016/5/13/chartex" xmlns:cx8="http://schemas.microsoft.com/office/drawing/2016/5/14/chartex" xmlns:mc="http://schemas.openxmlformats.org/markup-compatibility/2006" xmlns:m="http://schemas.openxmlformats.org/officeDocument/2006/math" xmlns:aink="http://schemas.microsoft.com/office/drawing/2016/ink" xmlns:am3d="http://schemas.microsoft.com/office/drawing/2017/model3d" xmlns:oel="http://schemas.microsoft.com/office/2019/extlst" xmlns:r="http://schemas.openxmlformats.org/officeDocument/2006/relationships" xmlns:wp14="http://schemas.microsoft.com/office/word/2010/wordprocessingDrawing" xmlns:wp="http://schemas.openxmlformats.org/drawingml/2006/wordprocessingDrawing" xmlns:wpg="http://schemas.microsoft.com/office/word/2010/wordprocessingGroup" xmlns:wpi="http://schemas.microsoft.com/office/word/2010/wordprocessingInk" xmlns:wps="http://schemas.microsoft.com/office/word/2010/wordprocessingShape" xmlns:o="urn:schemas-microsoft-com:office:office" xmlns:v="urn:schemas-microsoft-com:vml" xmlns:w10="urn:schemas-microsoft-com:office:word" xmlns:w="http://schemas.openxmlformats.org/wordprocessingml/2006/main" xmlns:w14="http://schemas.microsoft.com/office/word/2010/wordml" xmlns:w15="http://schemas.microsoft.com/office/word/2012/wordml" xmlns:w16cex="http://schemas.microsoft.com/office/word/2018/wordml/cex" xmlns:w16cid="http://schemas.microsoft.com/office/word/2016/wordml/cid" xmlns:w16="http://schemas.microsoft.com/office/word/2018/wordml" xmlns:w16sdtdh="http://schemas.microsoft.com/office/word/2020/wordml/sdtdatahash" xmlns:w16sdtfl="http://schemas.microsoft.com/office/word/2024/wordml/sdtformatlock" xmlns:w16se="http://schemas.microsoft.com/office/word/2015/wordml/symex" xmlns:w16du="http://schemas.microsoft.com/office/word/2023/wordml/word16du" xmlns:wne="http://schemas.microsoft.com/office/word/2006/wordml" mc:Ignorable="w14 w15 w16se w16cid w16 w16cex w16sdtdh w16sdtfl w16du wp14">
   <w:tbl>
     <w:tblPr>
       <w:tblW w:w="0" w:type="auto"/>
@@ -10190,7 +11350,21 @@
               <w:b w:val="0"/>
               <w:sz w:val="20"/>
             </w:rPr>
-            <w:t>4.1</w:t>
+            <w:t>5</w:t>
+          </w:r>
+          <w:r>
+            <w:rPr>
+              <w:b w:val="0"/>
+              <w:sz w:val="20"/>
+            </w:rPr>
+            <w:t>.</w:t>
+          </w:r>
+          <w:r>
+            <w:rPr>
+              <w:b w:val="0"/>
+              <w:sz w:val="20"/>
+            </w:rPr>
+            <w:t>0</w:t>
           </w:r>
         </w:p>
       </w:tc>
@@ -10301,31 +11475,31 @@
 </file>
 
 <file path=word/header2.xml><?xml version="1.0" encoding="utf-8"?>
-<w:hdr xmlns:wpc="http://schemas.microsoft.com/office/word/2010/wordprocessingCanvas" xmlns:cx="http://schemas.microsoft.com/office/drawing/2014/chartex" xmlns:cx1="http://schemas.microsoft.com/office/drawing/2015/9/8/chartex" xmlns:cx2="http://schemas.microsoft.com/office/drawing/2015/10/21/chartex" xmlns:cx3="http://schemas.microsoft.com/office/drawing/2016/5/9/chartex" xmlns:cx4="http://schemas.microsoft.com/office/drawing/2016/5/10/chartex" xmlns:cx5="http://schemas.microsoft.com/office/drawing/2016/5/11/chartex" xmlns:cx6="http://schemas.microsoft.com/office/drawing/2016/5/12/chartex" xmlns:cx7="http://schemas.microsoft.com/office/drawing/2016/5/13/chartex" xmlns:cx8="http://schemas.microsoft.com/office/drawing/2016/5/14/chartex" xmlns:mc="http://schemas.openxmlformats.org/markup-compatibility/2006" xmlns:aink="http://schemas.microsoft.com/office/drawing/2016/ink" xmlns:am3d="http://schemas.microsoft.com/office/drawing/2017/model3d" xmlns:o="urn:schemas-microsoft-com:office:office" xmlns:oel="http://schemas.microsoft.com/office/2019/extlst" xmlns:r="http://schemas.openxmlformats.org/officeDocument/2006/relationships" xmlns:m="http://schemas.openxmlformats.org/officeDocument/2006/math" xmlns:v="urn:schemas-microsoft-com:vml" xmlns:wp14="http://schemas.microsoft.com/office/word/2010/wordprocessingDrawing" xmlns:wp="http://schemas.openxmlformats.org/drawingml/2006/wordprocessingDrawing" xmlns:w10="urn:schemas-microsoft-com:office:word" xmlns:w="http://schemas.openxmlformats.org/wordprocessingml/2006/main" xmlns:w14="http://schemas.microsoft.com/office/word/2010/wordml" xmlns:w15="http://schemas.microsoft.com/office/word/2012/wordml" xmlns:w16cex="http://schemas.microsoft.com/office/word/2018/wordml/cex" xmlns:w16cid="http://schemas.microsoft.com/office/word/2016/wordml/cid" xmlns:w16="http://schemas.microsoft.com/office/word/2018/wordml" xmlns:w16du="http://schemas.microsoft.com/office/word/2023/wordml/word16du" xmlns:w16sdtdh="http://schemas.microsoft.com/office/word/2020/wordml/sdtdatahash" xmlns:w16sdtfl="http://schemas.microsoft.com/office/word/2024/wordml/sdtformatlock" xmlns:w16se="http://schemas.microsoft.com/office/word/2015/wordml/symex" xmlns:wpg="http://schemas.microsoft.com/office/word/2010/wordprocessingGroup" xmlns:wpi="http://schemas.microsoft.com/office/word/2010/wordprocessingInk" xmlns:wne="http://schemas.microsoft.com/office/word/2006/wordml" xmlns:wps="http://schemas.microsoft.com/office/word/2010/wordprocessingShape" mc:Ignorable="w14 w15 w16se w16cid w16 w16cex w16sdtdh w16sdtfl w16du wp14">
+<w:hdr xmlns:wpc="http://schemas.microsoft.com/office/word/2010/wordprocessingCanvas" xmlns:cx="http://schemas.microsoft.com/office/drawing/2014/chartex" xmlns:cx1="http://schemas.microsoft.com/office/drawing/2015/9/8/chartex" xmlns:cx2="http://schemas.microsoft.com/office/drawing/2015/10/21/chartex" xmlns:cx3="http://schemas.microsoft.com/office/drawing/2016/5/9/chartex" xmlns:cx4="http://schemas.microsoft.com/office/drawing/2016/5/10/chartex" xmlns:cx5="http://schemas.microsoft.com/office/drawing/2016/5/11/chartex" xmlns:cx6="http://schemas.microsoft.com/office/drawing/2016/5/12/chartex" xmlns:cx7="http://schemas.microsoft.com/office/drawing/2016/5/13/chartex" xmlns:cx8="http://schemas.microsoft.com/office/drawing/2016/5/14/chartex" xmlns:mc="http://schemas.openxmlformats.org/markup-compatibility/2006" xmlns:m="http://schemas.openxmlformats.org/officeDocument/2006/math" xmlns:aink="http://schemas.microsoft.com/office/drawing/2016/ink" xmlns:am3d="http://schemas.microsoft.com/office/drawing/2017/model3d" xmlns:oel="http://schemas.microsoft.com/office/2019/extlst" xmlns:r="http://schemas.openxmlformats.org/officeDocument/2006/relationships" xmlns:wp14="http://schemas.microsoft.com/office/word/2010/wordprocessingDrawing" xmlns:wp="http://schemas.openxmlformats.org/drawingml/2006/wordprocessingDrawing" xmlns:wpg="http://schemas.microsoft.com/office/word/2010/wordprocessingGroup" xmlns:wpi="http://schemas.microsoft.com/office/word/2010/wordprocessingInk" xmlns:wps="http://schemas.microsoft.com/office/word/2010/wordprocessingShape" xmlns:o="urn:schemas-microsoft-com:office:office" xmlns:v="urn:schemas-microsoft-com:vml" xmlns:w10="urn:schemas-microsoft-com:office:word" xmlns:w="http://schemas.openxmlformats.org/wordprocessingml/2006/main" xmlns:w14="http://schemas.microsoft.com/office/word/2010/wordml" xmlns:w15="http://schemas.microsoft.com/office/word/2012/wordml" xmlns:w16cex="http://schemas.microsoft.com/office/word/2018/wordml/cex" xmlns:w16cid="http://schemas.microsoft.com/office/word/2016/wordml/cid" xmlns:w16="http://schemas.microsoft.com/office/word/2018/wordml" xmlns:w16sdtdh="http://schemas.microsoft.com/office/word/2020/wordml/sdtdatahash" xmlns:w16sdtfl="http://schemas.microsoft.com/office/word/2024/wordml/sdtformatlock" xmlns:w16se="http://schemas.microsoft.com/office/word/2015/wordml/symex" xmlns:w16du="http://schemas.microsoft.com/office/word/2023/wordml/word16du" xmlns:wne="http://schemas.microsoft.com/office/word/2006/wordml" mc:Ignorable="w14 w15 w16se w16cid w16 w16cex w16sdtdh w16sdtfl w16du wp14">
   <w:p/>
 </w:hdr>
 </file>
 
 <file path=word/header3.xml><?xml version="1.0" encoding="utf-8"?>
-<w:hdr xmlns:wpc="http://schemas.microsoft.com/office/word/2010/wordprocessingCanvas" xmlns:cx="http://schemas.microsoft.com/office/drawing/2014/chartex" xmlns:cx1="http://schemas.microsoft.com/office/drawing/2015/9/8/chartex" xmlns:cx2="http://schemas.microsoft.com/office/drawing/2015/10/21/chartex" xmlns:cx3="http://schemas.microsoft.com/office/drawing/2016/5/9/chartex" xmlns:cx4="http://schemas.microsoft.com/office/drawing/2016/5/10/chartex" xmlns:cx5="http://schemas.microsoft.com/office/drawing/2016/5/11/chartex" xmlns:cx6="http://schemas.microsoft.com/office/drawing/2016/5/12/chartex" xmlns:cx7="http://schemas.microsoft.com/office/drawing/2016/5/13/chartex" xmlns:cx8="http://schemas.microsoft.com/office/drawing/2016/5/14/chartex" xmlns:mc="http://schemas.openxmlformats.org/markup-compatibility/2006" xmlns:aink="http://schemas.microsoft.com/office/drawing/2016/ink" xmlns:am3d="http://schemas.microsoft.com/office/drawing/2017/model3d" xmlns:o="urn:schemas-microsoft-com:office:office" xmlns:oel="http://schemas.microsoft.com/office/2019/extlst" xmlns:r="http://schemas.openxmlformats.org/officeDocument/2006/relationships" xmlns:m="http://schemas.openxmlformats.org/officeDocument/2006/math" xmlns:v="urn:schemas-microsoft-com:vml" xmlns:wp14="http://schemas.microsoft.com/office/word/2010/wordprocessingDrawing" xmlns:wp="http://schemas.openxmlformats.org/drawingml/2006/wordprocessingDrawing" xmlns:w10="urn:schemas-microsoft-com:office:word" xmlns:w="http://schemas.openxmlformats.org/wordprocessingml/2006/main" xmlns:w14="http://schemas.microsoft.com/office/word/2010/wordml" xmlns:w15="http://schemas.microsoft.com/office/word/2012/wordml" xmlns:w16cex="http://schemas.microsoft.com/office/word/2018/wordml/cex" xmlns:w16cid="http://schemas.microsoft.com/office/word/2016/wordml/cid" xmlns:w16="http://schemas.microsoft.com/office/word/2018/wordml" xmlns:w16du="http://schemas.microsoft.com/office/word/2023/wordml/word16du" xmlns:w16sdtdh="http://schemas.microsoft.com/office/word/2020/wordml/sdtdatahash" xmlns:w16sdtfl="http://schemas.microsoft.com/office/word/2024/wordml/sdtformatlock" xmlns:w16se="http://schemas.microsoft.com/office/word/2015/wordml/symex" xmlns:wpg="http://schemas.microsoft.com/office/word/2010/wordprocessingGroup" xmlns:wpi="http://schemas.microsoft.com/office/word/2010/wordprocessingInk" xmlns:wne="http://schemas.microsoft.com/office/word/2006/wordml" xmlns:wps="http://schemas.microsoft.com/office/word/2010/wordprocessingShape" mc:Ignorable="w14 w15 w16se w16cid w16 w16cex w16sdtdh w16sdtfl w16du wp14">
+<w:hdr xmlns:wpc="http://schemas.microsoft.com/office/word/2010/wordprocessingCanvas" xmlns:cx="http://schemas.microsoft.com/office/drawing/2014/chartex" xmlns:cx1="http://schemas.microsoft.com/office/drawing/2015/9/8/chartex" xmlns:cx2="http://schemas.microsoft.com/office/drawing/2015/10/21/chartex" xmlns:cx3="http://schemas.microsoft.com/office/drawing/2016/5/9/chartex" xmlns:cx4="http://schemas.microsoft.com/office/drawing/2016/5/10/chartex" xmlns:cx5="http://schemas.microsoft.com/office/drawing/2016/5/11/chartex" xmlns:cx6="http://schemas.microsoft.com/office/drawing/2016/5/12/chartex" xmlns:cx7="http://schemas.microsoft.com/office/drawing/2016/5/13/chartex" xmlns:cx8="http://schemas.microsoft.com/office/drawing/2016/5/14/chartex" xmlns:mc="http://schemas.openxmlformats.org/markup-compatibility/2006" xmlns:m="http://schemas.openxmlformats.org/officeDocument/2006/math" xmlns:aink="http://schemas.microsoft.com/office/drawing/2016/ink" xmlns:am3d="http://schemas.microsoft.com/office/drawing/2017/model3d" xmlns:oel="http://schemas.microsoft.com/office/2019/extlst" xmlns:r="http://schemas.openxmlformats.org/officeDocument/2006/relationships" xmlns:wp14="http://schemas.microsoft.com/office/word/2010/wordprocessingDrawing" xmlns:wp="http://schemas.openxmlformats.org/drawingml/2006/wordprocessingDrawing" xmlns:wpg="http://schemas.microsoft.com/office/word/2010/wordprocessingGroup" xmlns:wpi="http://schemas.microsoft.com/office/word/2010/wordprocessingInk" xmlns:wps="http://schemas.microsoft.com/office/word/2010/wordprocessingShape" xmlns:o="urn:schemas-microsoft-com:office:office" xmlns:v="urn:schemas-microsoft-com:vml" xmlns:w10="urn:schemas-microsoft-com:office:word" xmlns:w="http://schemas.openxmlformats.org/wordprocessingml/2006/main" xmlns:w14="http://schemas.microsoft.com/office/word/2010/wordml" xmlns:w15="http://schemas.microsoft.com/office/word/2012/wordml" xmlns:w16cex="http://schemas.microsoft.com/office/word/2018/wordml/cex" xmlns:w16cid="http://schemas.microsoft.com/office/word/2016/wordml/cid" xmlns:w16="http://schemas.microsoft.com/office/word/2018/wordml" xmlns:w16sdtdh="http://schemas.microsoft.com/office/word/2020/wordml/sdtdatahash" xmlns:w16sdtfl="http://schemas.microsoft.com/office/word/2024/wordml/sdtformatlock" xmlns:w16se="http://schemas.microsoft.com/office/word/2015/wordml/symex" xmlns:w16du="http://schemas.microsoft.com/office/word/2023/wordml/word16du" xmlns:wne="http://schemas.microsoft.com/office/word/2006/wordml" mc:Ignorable="w14 w15 w16se w16cid w16 w16cex w16sdtdh w16sdtfl w16du wp14">
   <w:p/>
 </w:hdr>
 </file>
 
 <file path=word/header4.xml><?xml version="1.0" encoding="utf-8"?>
-<w:hdr xmlns:wpc="http://schemas.microsoft.com/office/word/2010/wordprocessingCanvas" xmlns:cx="http://schemas.microsoft.com/office/drawing/2014/chartex" xmlns:cx1="http://schemas.microsoft.com/office/drawing/2015/9/8/chartex" xmlns:cx2="http://schemas.microsoft.com/office/drawing/2015/10/21/chartex" xmlns:cx3="http://schemas.microsoft.com/office/drawing/2016/5/9/chartex" xmlns:cx4="http://schemas.microsoft.com/office/drawing/2016/5/10/chartex" xmlns:cx5="http://schemas.microsoft.com/office/drawing/2016/5/11/chartex" xmlns:cx6="http://schemas.microsoft.com/office/drawing/2016/5/12/chartex" xmlns:cx7="http://schemas.microsoft.com/office/drawing/2016/5/13/chartex" xmlns:cx8="http://schemas.microsoft.com/office/drawing/2016/5/14/chartex" xmlns:mc="http://schemas.openxmlformats.org/markup-compatibility/2006" xmlns:aink="http://schemas.microsoft.com/office/drawing/2016/ink" xmlns:am3d="http://schemas.microsoft.com/office/drawing/2017/model3d" xmlns:o="urn:schemas-microsoft-com:office:office" xmlns:oel="http://schemas.microsoft.com/office/2019/extlst" xmlns:r="http://schemas.openxmlformats.org/officeDocument/2006/relationships" xmlns:m="http://schemas.openxmlformats.org/officeDocument/2006/math" xmlns:v="urn:schemas-microsoft-com:vml" xmlns:wp14="http://schemas.microsoft.com/office/word/2010/wordprocessingDrawing" xmlns:wp="http://schemas.openxmlformats.org/drawingml/2006/wordprocessingDrawing" xmlns:w10="urn:schemas-microsoft-com:office:word" xmlns:w="http://schemas.openxmlformats.org/wordprocessingml/2006/main" xmlns:w14="http://schemas.microsoft.com/office/word/2010/wordml" xmlns:w15="http://schemas.microsoft.com/office/word/2012/wordml" xmlns:w16cex="http://schemas.microsoft.com/office/word/2018/wordml/cex" xmlns:w16cid="http://schemas.microsoft.com/office/word/2016/wordml/cid" xmlns:w16="http://schemas.microsoft.com/office/word/2018/wordml" xmlns:w16du="http://schemas.microsoft.com/office/word/2023/wordml/word16du" xmlns:w16sdtdh="http://schemas.microsoft.com/office/word/2020/wordml/sdtdatahash" xmlns:w16sdtfl="http://schemas.microsoft.com/office/word/2024/wordml/sdtformatlock" xmlns:w16se="http://schemas.microsoft.com/office/word/2015/wordml/symex" xmlns:wpg="http://schemas.microsoft.com/office/word/2010/wordprocessingGroup" xmlns:wpi="http://schemas.microsoft.com/office/word/2010/wordprocessingInk" xmlns:wne="http://schemas.microsoft.com/office/word/2006/wordml" xmlns:wps="http://schemas.microsoft.com/office/word/2010/wordprocessingShape" mc:Ignorable="w14 w15 w16se w16cid w16 w16cex w16sdtdh w16sdtfl w16du wp14">
+<w:hdr xmlns:wpc="http://schemas.microsoft.com/office/word/2010/wordprocessingCanvas" xmlns:cx="http://schemas.microsoft.com/office/drawing/2014/chartex" xmlns:cx1="http://schemas.microsoft.com/office/drawing/2015/9/8/chartex" xmlns:cx2="http://schemas.microsoft.com/office/drawing/2015/10/21/chartex" xmlns:cx3="http://schemas.microsoft.com/office/drawing/2016/5/9/chartex" xmlns:cx4="http://schemas.microsoft.com/office/drawing/2016/5/10/chartex" xmlns:cx5="http://schemas.microsoft.com/office/drawing/2016/5/11/chartex" xmlns:cx6="http://schemas.microsoft.com/office/drawing/2016/5/12/chartex" xmlns:cx7="http://schemas.microsoft.com/office/drawing/2016/5/13/chartex" xmlns:cx8="http://schemas.microsoft.com/office/drawing/2016/5/14/chartex" xmlns:mc="http://schemas.openxmlformats.org/markup-compatibility/2006" xmlns:m="http://schemas.openxmlformats.org/officeDocument/2006/math" xmlns:aink="http://schemas.microsoft.com/office/drawing/2016/ink" xmlns:am3d="http://schemas.microsoft.com/office/drawing/2017/model3d" xmlns:oel="http://schemas.microsoft.com/office/2019/extlst" xmlns:r="http://schemas.openxmlformats.org/officeDocument/2006/relationships" xmlns:wp14="http://schemas.microsoft.com/office/word/2010/wordprocessingDrawing" xmlns:wp="http://schemas.openxmlformats.org/drawingml/2006/wordprocessingDrawing" xmlns:wpg="http://schemas.microsoft.com/office/word/2010/wordprocessingGroup" xmlns:wpi="http://schemas.microsoft.com/office/word/2010/wordprocessingInk" xmlns:wps="http://schemas.microsoft.com/office/word/2010/wordprocessingShape" xmlns:o="urn:schemas-microsoft-com:office:office" xmlns:v="urn:schemas-microsoft-com:vml" xmlns:w10="urn:schemas-microsoft-com:office:word" xmlns:w="http://schemas.openxmlformats.org/wordprocessingml/2006/main" xmlns:w14="http://schemas.microsoft.com/office/word/2010/wordml" xmlns:w15="http://schemas.microsoft.com/office/word/2012/wordml" xmlns:w16cex="http://schemas.microsoft.com/office/word/2018/wordml/cex" xmlns:w16cid="http://schemas.microsoft.com/office/word/2016/wordml/cid" xmlns:w16="http://schemas.microsoft.com/office/word/2018/wordml" xmlns:w16sdtdh="http://schemas.microsoft.com/office/word/2020/wordml/sdtdatahash" xmlns:w16sdtfl="http://schemas.microsoft.com/office/word/2024/wordml/sdtformatlock" xmlns:w16se="http://schemas.microsoft.com/office/word/2015/wordml/symex" xmlns:w16du="http://schemas.microsoft.com/office/word/2023/wordml/word16du" xmlns:wne="http://schemas.microsoft.com/office/word/2006/wordml" mc:Ignorable="w14 w15 w16se w16cid w16 w16cex w16sdtdh w16sdtfl w16du wp14">
   <w:p/>
 </w:hdr>
 </file>
 
 <file path=word/header5.xml><?xml version="1.0" encoding="utf-8"?>
-<w:hdr xmlns:wpc="http://schemas.microsoft.com/office/word/2010/wordprocessingCanvas" xmlns:cx="http://schemas.microsoft.com/office/drawing/2014/chartex" xmlns:cx1="http://schemas.microsoft.com/office/drawing/2015/9/8/chartex" xmlns:cx2="http://schemas.microsoft.com/office/drawing/2015/10/21/chartex" xmlns:cx3="http://schemas.microsoft.com/office/drawing/2016/5/9/chartex" xmlns:cx4="http://schemas.microsoft.com/office/drawing/2016/5/10/chartex" xmlns:cx5="http://schemas.microsoft.com/office/drawing/2016/5/11/chartex" xmlns:cx6="http://schemas.microsoft.com/office/drawing/2016/5/12/chartex" xmlns:cx7="http://schemas.microsoft.com/office/drawing/2016/5/13/chartex" xmlns:cx8="http://schemas.microsoft.com/office/drawing/2016/5/14/chartex" xmlns:mc="http://schemas.openxmlformats.org/markup-compatibility/2006" xmlns:aink="http://schemas.microsoft.com/office/drawing/2016/ink" xmlns:am3d="http://schemas.microsoft.com/office/drawing/2017/model3d" xmlns:o="urn:schemas-microsoft-com:office:office" xmlns:oel="http://schemas.microsoft.com/office/2019/extlst" xmlns:r="http://schemas.openxmlformats.org/officeDocument/2006/relationships" xmlns:m="http://schemas.openxmlformats.org/officeDocument/2006/math" xmlns:v="urn:schemas-microsoft-com:vml" xmlns:wp14="http://schemas.microsoft.com/office/word/2010/wordprocessingDrawing" xmlns:wp="http://schemas.openxmlformats.org/drawingml/2006/wordprocessingDrawing" xmlns:w10="urn:schemas-microsoft-com:office:word" xmlns:w="http://schemas.openxmlformats.org/wordprocessingml/2006/main" xmlns:w14="http://schemas.microsoft.com/office/word/2010/wordml" xmlns:w15="http://schemas.microsoft.com/office/word/2012/wordml" xmlns:w16cex="http://schemas.microsoft.com/office/word/2018/wordml/cex" xmlns:w16cid="http://schemas.microsoft.com/office/word/2016/wordml/cid" xmlns:w16="http://schemas.microsoft.com/office/word/2018/wordml" xmlns:w16du="http://schemas.microsoft.com/office/word/2023/wordml/word16du" xmlns:w16sdtdh="http://schemas.microsoft.com/office/word/2020/wordml/sdtdatahash" xmlns:w16sdtfl="http://schemas.microsoft.com/office/word/2024/wordml/sdtformatlock" xmlns:w16se="http://schemas.microsoft.com/office/word/2015/wordml/symex" xmlns:wpg="http://schemas.microsoft.com/office/word/2010/wordprocessingGroup" xmlns:wpi="http://schemas.microsoft.com/office/word/2010/wordprocessingInk" xmlns:wne="http://schemas.microsoft.com/office/word/2006/wordml" xmlns:wps="http://schemas.microsoft.com/office/word/2010/wordprocessingShape" mc:Ignorable="w14 w15 w16se w16cid w16 w16cex w16sdtdh w16sdtfl w16du wp14">
+<w:hdr xmlns:wpc="http://schemas.microsoft.com/office/word/2010/wordprocessingCanvas" xmlns:cx="http://schemas.microsoft.com/office/drawing/2014/chartex" xmlns:cx1="http://schemas.microsoft.com/office/drawing/2015/9/8/chartex" xmlns:cx2="http://schemas.microsoft.com/office/drawing/2015/10/21/chartex" xmlns:cx3="http://schemas.microsoft.com/office/drawing/2016/5/9/chartex" xmlns:cx4="http://schemas.microsoft.com/office/drawing/2016/5/10/chartex" xmlns:cx5="http://schemas.microsoft.com/office/drawing/2016/5/11/chartex" xmlns:cx6="http://schemas.microsoft.com/office/drawing/2016/5/12/chartex" xmlns:cx7="http://schemas.microsoft.com/office/drawing/2016/5/13/chartex" xmlns:cx8="http://schemas.microsoft.com/office/drawing/2016/5/14/chartex" xmlns:mc="http://schemas.openxmlformats.org/markup-compatibility/2006" xmlns:m="http://schemas.openxmlformats.org/officeDocument/2006/math" xmlns:aink="http://schemas.microsoft.com/office/drawing/2016/ink" xmlns:am3d="http://schemas.microsoft.com/office/drawing/2017/model3d" xmlns:oel="http://schemas.microsoft.com/office/2019/extlst" xmlns:r="http://schemas.openxmlformats.org/officeDocument/2006/relationships" xmlns:wp14="http://schemas.microsoft.com/office/word/2010/wordprocessingDrawing" xmlns:wp="http://schemas.openxmlformats.org/drawingml/2006/wordprocessingDrawing" xmlns:wpg="http://schemas.microsoft.com/office/word/2010/wordprocessingGroup" xmlns:wpi="http://schemas.microsoft.com/office/word/2010/wordprocessingInk" xmlns:wps="http://schemas.microsoft.com/office/word/2010/wordprocessingShape" xmlns:o="urn:schemas-microsoft-com:office:office" xmlns:v="urn:schemas-microsoft-com:vml" xmlns:w10="urn:schemas-microsoft-com:office:word" xmlns:w="http://schemas.openxmlformats.org/wordprocessingml/2006/main" xmlns:w14="http://schemas.microsoft.com/office/word/2010/wordml" xmlns:w15="http://schemas.microsoft.com/office/word/2012/wordml" xmlns:w16cex="http://schemas.microsoft.com/office/word/2018/wordml/cex" xmlns:w16cid="http://schemas.microsoft.com/office/word/2016/wordml/cid" xmlns:w16="http://schemas.microsoft.com/office/word/2018/wordml" xmlns:w16sdtdh="http://schemas.microsoft.com/office/word/2020/wordml/sdtdatahash" xmlns:w16sdtfl="http://schemas.microsoft.com/office/word/2024/wordml/sdtformatlock" xmlns:w16se="http://schemas.microsoft.com/office/word/2015/wordml/symex" xmlns:w16du="http://schemas.microsoft.com/office/word/2023/wordml/word16du" xmlns:wne="http://schemas.microsoft.com/office/word/2006/wordml" mc:Ignorable="w14 w15 w16se w16cid w16 w16cex w16sdtdh w16sdtfl w16du wp14">
   <w:p/>
 </w:hdr>
 </file>
 
 <file path=word/numbering.xml><?xml version="1.0" encoding="utf-8"?>
-<w:numbering xmlns:wpc="http://schemas.microsoft.com/office/word/2010/wordprocessingCanvas" xmlns:cx="http://schemas.microsoft.com/office/drawing/2014/chartex" xmlns:cx1="http://schemas.microsoft.com/office/drawing/2015/9/8/chartex" xmlns:cx2="http://schemas.microsoft.com/office/drawing/2015/10/21/chartex" xmlns:cx3="http://schemas.microsoft.com/office/drawing/2016/5/9/chartex" xmlns:cx4="http://schemas.microsoft.com/office/drawing/2016/5/10/chartex" xmlns:cx5="http://schemas.microsoft.com/office/drawing/2016/5/11/chartex" xmlns:cx6="http://schemas.microsoft.com/office/drawing/2016/5/12/chartex" xmlns:cx7="http://schemas.microsoft.com/office/drawing/2016/5/13/chartex" xmlns:cx8="http://schemas.microsoft.com/office/drawing/2016/5/14/chartex" xmlns:mc="http://schemas.openxmlformats.org/markup-compatibility/2006" xmlns:aink="http://schemas.microsoft.com/office/drawing/2016/ink" xmlns:am3d="http://schemas.microsoft.com/office/drawing/2017/model3d" xmlns:o="urn:schemas-microsoft-com:office:office" xmlns:oel="http://schemas.microsoft.com/office/2019/extlst" xmlns:r="http://schemas.openxmlformats.org/officeDocument/2006/relationships" xmlns:m="http://schemas.openxmlformats.org/officeDocument/2006/math" xmlns:v="urn:schemas-microsoft-com:vml" xmlns:wp14="http://schemas.microsoft.com/office/word/2010/wordprocessingDrawing" xmlns:wp="http://schemas.openxmlformats.org/drawingml/2006/wordprocessingDrawing" xmlns:w10="urn:schemas-microsoft-com:office:word" xmlns:w="http://schemas.openxmlformats.org/wordprocessingml/2006/main" xmlns:w14="http://schemas.microsoft.com/office/word/2010/wordml" xmlns:w15="http://schemas.microsoft.com/office/word/2012/wordml" xmlns:w16cex="http://schemas.microsoft.com/office/word/2018/wordml/cex" xmlns:w16cid="http://schemas.microsoft.com/office/word/2016/wordml/cid" xmlns:w16="http://schemas.microsoft.com/office/word/2018/wordml" xmlns:w16du="http://schemas.microsoft.com/office/word/2023/wordml/word16du" xmlns:w16sdtdh="http://schemas.microsoft.com/office/word/2020/wordml/sdtdatahash" xmlns:w16sdtfl="http://schemas.microsoft.com/office/word/2024/wordml/sdtformatlock" xmlns:w16se="http://schemas.microsoft.com/office/word/2015/wordml/symex" xmlns:wpg="http://schemas.microsoft.com/office/word/2010/wordprocessingGroup" xmlns:wpi="http://schemas.microsoft.com/office/word/2010/wordprocessingInk" xmlns:wne="http://schemas.microsoft.com/office/word/2006/wordml" xmlns:wps="http://schemas.microsoft.com/office/word/2010/wordprocessingShape" mc:Ignorable="w14 w15 w16se w16cid w16 w16cex w16sdtdh w16sdtfl w16du wp14">
+<w:numbering xmlns:wpc="http://schemas.microsoft.com/office/word/2010/wordprocessingCanvas" xmlns:cx="http://schemas.microsoft.com/office/drawing/2014/chartex" xmlns:cx1="http://schemas.microsoft.com/office/drawing/2015/9/8/chartex" xmlns:cx2="http://schemas.microsoft.com/office/drawing/2015/10/21/chartex" xmlns:cx3="http://schemas.microsoft.com/office/drawing/2016/5/9/chartex" xmlns:cx4="http://schemas.microsoft.com/office/drawing/2016/5/10/chartex" xmlns:cx5="http://schemas.microsoft.com/office/drawing/2016/5/11/chartex" xmlns:cx6="http://schemas.microsoft.com/office/drawing/2016/5/12/chartex" xmlns:cx7="http://schemas.microsoft.com/office/drawing/2016/5/13/chartex" xmlns:cx8="http://schemas.microsoft.com/office/drawing/2016/5/14/chartex" xmlns:mc="http://schemas.openxmlformats.org/markup-compatibility/2006" xmlns:m="http://schemas.openxmlformats.org/officeDocument/2006/math" xmlns:aink="http://schemas.microsoft.com/office/drawing/2016/ink" xmlns:am3d="http://schemas.microsoft.com/office/drawing/2017/model3d" xmlns:oel="http://schemas.microsoft.com/office/2019/extlst" xmlns:r="http://schemas.openxmlformats.org/officeDocument/2006/relationships" xmlns:wp14="http://schemas.microsoft.com/office/word/2010/wordprocessingDrawing" xmlns:wp="http://schemas.openxmlformats.org/drawingml/2006/wordprocessingDrawing" xmlns:wpg="http://schemas.microsoft.com/office/word/2010/wordprocessingGroup" xmlns:wpi="http://schemas.microsoft.com/office/word/2010/wordprocessingInk" xmlns:wps="http://schemas.microsoft.com/office/word/2010/wordprocessingShape" xmlns:o="urn:schemas-microsoft-com:office:office" xmlns:v="urn:schemas-microsoft-com:vml" xmlns:w10="urn:schemas-microsoft-com:office:word" xmlns:w="http://schemas.openxmlformats.org/wordprocessingml/2006/main" xmlns:w14="http://schemas.microsoft.com/office/word/2010/wordml" xmlns:w15="http://schemas.microsoft.com/office/word/2012/wordml" xmlns:w16cex="http://schemas.microsoft.com/office/word/2018/wordml/cex" xmlns:w16cid="http://schemas.microsoft.com/office/word/2016/wordml/cid" xmlns:w16="http://schemas.microsoft.com/office/word/2018/wordml" xmlns:w16sdtdh="http://schemas.microsoft.com/office/word/2020/wordml/sdtdatahash" xmlns:w16sdtfl="http://schemas.microsoft.com/office/word/2024/wordml/sdtformatlock" xmlns:w16se="http://schemas.microsoft.com/office/word/2015/wordml/symex" xmlns:w16du="http://schemas.microsoft.com/office/word/2023/wordml/word16du" xmlns:wne="http://schemas.microsoft.com/office/word/2006/wordml" mc:Ignorable="w14 w15 w16se w16cid w16 w16cex w16sdtdh w16sdtfl w16du wp14">
   <w:abstractNum w:abstractNumId="0" w15:restartNumberingAfterBreak="0">
     <w:nsid w:val="00000002"/>
     <w:multiLevelType w:val="singleLevel"/>
@@ -11091,6 +12265,232 @@
     </w:lvl>
   </w:abstractNum>
   <w:abstractNum w:abstractNumId="10" w15:restartNumberingAfterBreak="0">
+    <w:nsid w:val="0ECE2C46"/>
+    <w:multiLevelType w:val="hybridMultilevel"/>
+    <w:tmpl w:val="4A200502"/>
+    <w:lvl w:ilvl="0" w:tplc="04100001">
+      <w:start w:val="1"/>
+      <w:numFmt w:val="bullet"/>
+      <w:lvlText w:val=""/>
+      <w:lvlJc w:val="left"/>
+      <w:pPr>
+        <w:ind w:left="1429" w:hanging="360"/>
+      </w:pPr>
+      <w:rPr>
+        <w:rFonts w:ascii="Symbol" w:hAnsi="Symbol" w:hint="default"/>
+      </w:rPr>
+    </w:lvl>
+    <w:lvl w:ilvl="1" w:tplc="04100003" w:tentative="1">
+      <w:start w:val="1"/>
+      <w:numFmt w:val="bullet"/>
+      <w:lvlText w:val="o"/>
+      <w:lvlJc w:val="left"/>
+      <w:pPr>
+        <w:ind w:left="2149" w:hanging="360"/>
+      </w:pPr>
+      <w:rPr>
+        <w:rFonts w:ascii="Courier New" w:hAnsi="Courier New" w:cs="Courier New" w:hint="default"/>
+      </w:rPr>
+    </w:lvl>
+    <w:lvl w:ilvl="2" w:tplc="04100005" w:tentative="1">
+      <w:start w:val="1"/>
+      <w:numFmt w:val="bullet"/>
+      <w:lvlText w:val=""/>
+      <w:lvlJc w:val="left"/>
+      <w:pPr>
+        <w:ind w:left="2869" w:hanging="360"/>
+      </w:pPr>
+      <w:rPr>
+        <w:rFonts w:ascii="Wingdings" w:hAnsi="Wingdings" w:hint="default"/>
+      </w:rPr>
+    </w:lvl>
+    <w:lvl w:ilvl="3" w:tplc="04100001" w:tentative="1">
+      <w:start w:val="1"/>
+      <w:numFmt w:val="bullet"/>
+      <w:lvlText w:val=""/>
+      <w:lvlJc w:val="left"/>
+      <w:pPr>
+        <w:ind w:left="3589" w:hanging="360"/>
+      </w:pPr>
+      <w:rPr>
+        <w:rFonts w:ascii="Symbol" w:hAnsi="Symbol" w:hint="default"/>
+      </w:rPr>
+    </w:lvl>
+    <w:lvl w:ilvl="4" w:tplc="04100003" w:tentative="1">
+      <w:start w:val="1"/>
+      <w:numFmt w:val="bullet"/>
+      <w:lvlText w:val="o"/>
+      <w:lvlJc w:val="left"/>
+      <w:pPr>
+        <w:ind w:left="4309" w:hanging="360"/>
+      </w:pPr>
+      <w:rPr>
+        <w:rFonts w:ascii="Courier New" w:hAnsi="Courier New" w:cs="Courier New" w:hint="default"/>
+      </w:rPr>
+    </w:lvl>
+    <w:lvl w:ilvl="5" w:tplc="04100005" w:tentative="1">
+      <w:start w:val="1"/>
+      <w:numFmt w:val="bullet"/>
+      <w:lvlText w:val=""/>
+      <w:lvlJc w:val="left"/>
+      <w:pPr>
+        <w:ind w:left="5029" w:hanging="360"/>
+      </w:pPr>
+      <w:rPr>
+        <w:rFonts w:ascii="Wingdings" w:hAnsi="Wingdings" w:hint="default"/>
+      </w:rPr>
+    </w:lvl>
+    <w:lvl w:ilvl="6" w:tplc="04100001" w:tentative="1">
+      <w:start w:val="1"/>
+      <w:numFmt w:val="bullet"/>
+      <w:lvlText w:val=""/>
+      <w:lvlJc w:val="left"/>
+      <w:pPr>
+        <w:ind w:left="5749" w:hanging="360"/>
+      </w:pPr>
+      <w:rPr>
+        <w:rFonts w:ascii="Symbol" w:hAnsi="Symbol" w:hint="default"/>
+      </w:rPr>
+    </w:lvl>
+    <w:lvl w:ilvl="7" w:tplc="04100003" w:tentative="1">
+      <w:start w:val="1"/>
+      <w:numFmt w:val="bullet"/>
+      <w:lvlText w:val="o"/>
+      <w:lvlJc w:val="left"/>
+      <w:pPr>
+        <w:ind w:left="6469" w:hanging="360"/>
+      </w:pPr>
+      <w:rPr>
+        <w:rFonts w:ascii="Courier New" w:hAnsi="Courier New" w:cs="Courier New" w:hint="default"/>
+      </w:rPr>
+    </w:lvl>
+    <w:lvl w:ilvl="8" w:tplc="04100005" w:tentative="1">
+      <w:start w:val="1"/>
+      <w:numFmt w:val="bullet"/>
+      <w:lvlText w:val=""/>
+      <w:lvlJc w:val="left"/>
+      <w:pPr>
+        <w:ind w:left="7189" w:hanging="360"/>
+      </w:pPr>
+      <w:rPr>
+        <w:rFonts w:ascii="Wingdings" w:hAnsi="Wingdings" w:hint="default"/>
+      </w:rPr>
+    </w:lvl>
+  </w:abstractNum>
+  <w:abstractNum w:abstractNumId="11" w15:restartNumberingAfterBreak="0">
+    <w:nsid w:val="118725AE"/>
+    <w:multiLevelType w:val="multilevel"/>
+    <w:tmpl w:val="ACA262C4"/>
+    <w:lvl w:ilvl="0">
+      <w:start w:val="1"/>
+      <w:numFmt w:val="bullet"/>
+      <w:lvlText w:val=""/>
+      <w:lvlJc w:val="left"/>
+      <w:pPr>
+        <w:ind w:left="1429" w:hanging="360"/>
+      </w:pPr>
+      <w:rPr>
+        <w:rFonts w:ascii="Symbol" w:hAnsi="Symbol" w:hint="default"/>
+      </w:rPr>
+    </w:lvl>
+    <w:lvl w:ilvl="1" w:tentative="1">
+      <w:start w:val="1"/>
+      <w:numFmt w:val="decimal"/>
+      <w:lvlText w:val="%2."/>
+      <w:lvlJc w:val="left"/>
+      <w:pPr>
+        <w:tabs>
+          <w:tab w:val="num" w:pos="1440"/>
+        </w:tabs>
+        <w:ind w:left="1440" w:hanging="360"/>
+      </w:pPr>
+    </w:lvl>
+    <w:lvl w:ilvl="2" w:tentative="1">
+      <w:start w:val="1"/>
+      <w:numFmt w:val="decimal"/>
+      <w:lvlText w:val="%3."/>
+      <w:lvlJc w:val="left"/>
+      <w:pPr>
+        <w:tabs>
+          <w:tab w:val="num" w:pos="2160"/>
+        </w:tabs>
+        <w:ind w:left="2160" w:hanging="360"/>
+      </w:pPr>
+    </w:lvl>
+    <w:lvl w:ilvl="3" w:tentative="1">
+      <w:start w:val="1"/>
+      <w:numFmt w:val="decimal"/>
+      <w:lvlText w:val="%4."/>
+      <w:lvlJc w:val="left"/>
+      <w:pPr>
+        <w:tabs>
+          <w:tab w:val="num" w:pos="2880"/>
+        </w:tabs>
+        <w:ind w:left="2880" w:hanging="360"/>
+      </w:pPr>
+    </w:lvl>
+    <w:lvl w:ilvl="4" w:tentative="1">
+      <w:start w:val="1"/>
+      <w:numFmt w:val="decimal"/>
+      <w:lvlText w:val="%5."/>
+      <w:lvlJc w:val="left"/>
+      <w:pPr>
+        <w:tabs>
+          <w:tab w:val="num" w:pos="3600"/>
+        </w:tabs>
+        <w:ind w:left="3600" w:hanging="360"/>
+      </w:pPr>
+    </w:lvl>
+    <w:lvl w:ilvl="5" w:tentative="1">
+      <w:start w:val="1"/>
+      <w:numFmt w:val="decimal"/>
+      <w:lvlText w:val="%6."/>
+      <w:lvlJc w:val="left"/>
+      <w:pPr>
+        <w:tabs>
+          <w:tab w:val="num" w:pos="4320"/>
+        </w:tabs>
+        <w:ind w:left="4320" w:hanging="360"/>
+      </w:pPr>
+    </w:lvl>
+    <w:lvl w:ilvl="6" w:tentative="1">
+      <w:start w:val="1"/>
+      <w:numFmt w:val="decimal"/>
+      <w:lvlText w:val="%7."/>
+      <w:lvlJc w:val="left"/>
+      <w:pPr>
+        <w:tabs>
+          <w:tab w:val="num" w:pos="5040"/>
+        </w:tabs>
+        <w:ind w:left="5040" w:hanging="360"/>
+      </w:pPr>
+    </w:lvl>
+    <w:lvl w:ilvl="7" w:tentative="1">
+      <w:start w:val="1"/>
+      <w:numFmt w:val="decimal"/>
+      <w:lvlText w:val="%8."/>
+      <w:lvlJc w:val="left"/>
+      <w:pPr>
+        <w:tabs>
+          <w:tab w:val="num" w:pos="5760"/>
+        </w:tabs>
+        <w:ind w:left="5760" w:hanging="360"/>
+      </w:pPr>
+    </w:lvl>
+    <w:lvl w:ilvl="8" w:tentative="1">
+      <w:start w:val="1"/>
+      <w:numFmt w:val="decimal"/>
+      <w:lvlText w:val="%9."/>
+      <w:lvlJc w:val="left"/>
+      <w:pPr>
+        <w:tabs>
+          <w:tab w:val="num" w:pos="6480"/>
+        </w:tabs>
+        <w:ind w:left="6480" w:hanging="360"/>
+      </w:pPr>
+    </w:lvl>
+  </w:abstractNum>
+  <w:abstractNum w:abstractNumId="12" w15:restartNumberingAfterBreak="0">
     <w:nsid w:val="15C72A79"/>
     <w:multiLevelType w:val="hybridMultilevel"/>
     <w:tmpl w:val="38AEDCD4"/>
@@ -11203,7 +12603,7 @@
       </w:rPr>
     </w:lvl>
   </w:abstractNum>
-  <w:abstractNum w:abstractNumId="11" w15:restartNumberingAfterBreak="0">
+  <w:abstractNum w:abstractNumId="13" w15:restartNumberingAfterBreak="0">
     <w:nsid w:val="1F8433D7"/>
     <w:multiLevelType w:val="multilevel"/>
     <w:tmpl w:val="FB6871AA"/>
@@ -11293,7 +12693,7 @@
       </w:pPr>
     </w:lvl>
   </w:abstractNum>
-  <w:abstractNum w:abstractNumId="12" w15:restartNumberingAfterBreak="0">
+  <w:abstractNum w:abstractNumId="14" w15:restartNumberingAfterBreak="0">
     <w:nsid w:val="22901C07"/>
     <w:multiLevelType w:val="hybridMultilevel"/>
     <w:tmpl w:val="CA5A69A4"/>
@@ -11406,7 +12806,7 @@
       </w:rPr>
     </w:lvl>
   </w:abstractNum>
-  <w:abstractNum w:abstractNumId="13" w15:restartNumberingAfterBreak="0">
+  <w:abstractNum w:abstractNumId="15" w15:restartNumberingAfterBreak="0">
     <w:nsid w:val="287C4892"/>
     <w:multiLevelType w:val="hybridMultilevel"/>
     <w:tmpl w:val="58DE98D4"/>
@@ -11519,7 +12919,7 @@
       </w:rPr>
     </w:lvl>
   </w:abstractNum>
-  <w:abstractNum w:abstractNumId="14" w15:restartNumberingAfterBreak="0">
+  <w:abstractNum w:abstractNumId="16" w15:restartNumberingAfterBreak="0">
     <w:nsid w:val="31204FF6"/>
     <w:multiLevelType w:val="multilevel"/>
     <w:tmpl w:val="C8F4DA3C"/>
@@ -11641,7 +13041,7 @@
       </w:rPr>
     </w:lvl>
   </w:abstractNum>
-  <w:abstractNum w:abstractNumId="15" w15:restartNumberingAfterBreak="0">
+  <w:abstractNum w:abstractNumId="17" w15:restartNumberingAfterBreak="0">
     <w:nsid w:val="38C345BE"/>
     <w:multiLevelType w:val="hybridMultilevel"/>
     <w:tmpl w:val="4AD8CAA8"/>
@@ -11754,7 +13154,7 @@
       </w:rPr>
     </w:lvl>
   </w:abstractNum>
-  <w:abstractNum w:abstractNumId="16" w15:restartNumberingAfterBreak="0">
+  <w:abstractNum w:abstractNumId="18" w15:restartNumberingAfterBreak="0">
     <w:nsid w:val="3DD83E54"/>
     <w:multiLevelType w:val="hybridMultilevel"/>
     <w:tmpl w:val="1AA81754"/>
@@ -11867,7 +13267,7 @@
       </w:rPr>
     </w:lvl>
   </w:abstractNum>
-  <w:abstractNum w:abstractNumId="17" w15:restartNumberingAfterBreak="0">
+  <w:abstractNum w:abstractNumId="19" w15:restartNumberingAfterBreak="0">
     <w:nsid w:val="42F31A3D"/>
     <w:multiLevelType w:val="multilevel"/>
     <w:tmpl w:val="C8F4DA3C"/>
@@ -11988,7 +13388,7 @@
       </w:rPr>
     </w:lvl>
   </w:abstractNum>
-  <w:abstractNum w:abstractNumId="18" w15:restartNumberingAfterBreak="0">
+  <w:abstractNum w:abstractNumId="20" w15:restartNumberingAfterBreak="0">
     <w:nsid w:val="61C933EF"/>
     <w:multiLevelType w:val="multilevel"/>
     <w:tmpl w:val="747AD306"/>
@@ -12101,7 +13501,7 @@
       </w:pPr>
     </w:lvl>
   </w:abstractNum>
-  <w:abstractNum w:abstractNumId="19" w15:restartNumberingAfterBreak="0">
+  <w:abstractNum w:abstractNumId="21" w15:restartNumberingAfterBreak="0">
     <w:nsid w:val="637251A6"/>
     <w:multiLevelType w:val="multilevel"/>
     <w:tmpl w:val="345634D4"/>
@@ -12214,7 +13614,7 @@
       </w:pPr>
     </w:lvl>
   </w:abstractNum>
-  <w:abstractNum w:abstractNumId="20" w15:restartNumberingAfterBreak="0">
+  <w:abstractNum w:abstractNumId="22" w15:restartNumberingAfterBreak="0">
     <w:nsid w:val="67D07244"/>
     <w:multiLevelType w:val="hybridMultilevel"/>
     <w:tmpl w:val="D9F4121E"/>
@@ -12327,7 +13727,7 @@
       </w:rPr>
     </w:lvl>
   </w:abstractNum>
-  <w:abstractNum w:abstractNumId="21" w15:restartNumberingAfterBreak="0">
+  <w:abstractNum w:abstractNumId="23" w15:restartNumberingAfterBreak="0">
     <w:nsid w:val="6B9B6A93"/>
     <w:multiLevelType w:val="hybridMultilevel"/>
     <w:tmpl w:val="16286834"/>
@@ -12441,34 +13841,34 @@
     </w:lvl>
   </w:abstractNum>
   <w:num w:numId="1" w16cid:durableId="1681200572">
+    <w:abstractNumId w:val="19"/>
+  </w:num>
+  <w:num w:numId="2" w16cid:durableId="1540438857">
+    <w:abstractNumId w:val="13"/>
+  </w:num>
+  <w:num w:numId="3" w16cid:durableId="1758937890">
+    <w:abstractNumId w:val="16"/>
+  </w:num>
+  <w:num w:numId="4" w16cid:durableId="1870869743">
+    <w:abstractNumId w:val="23"/>
+  </w:num>
+  <w:num w:numId="5" w16cid:durableId="153184791">
     <w:abstractNumId w:val="17"/>
   </w:num>
-  <w:num w:numId="2" w16cid:durableId="1540438857">
-    <w:abstractNumId w:val="11"/>
-  </w:num>
-  <w:num w:numId="3" w16cid:durableId="1758937890">
-    <w:abstractNumId w:val="14"/>
-  </w:num>
-  <w:num w:numId="4" w16cid:durableId="1870869743">
-    <w:abstractNumId w:val="21"/>
-  </w:num>
-  <w:num w:numId="5" w16cid:durableId="153184791">
+  <w:num w:numId="6" w16cid:durableId="272713800">
     <w:abstractNumId w:val="15"/>
   </w:num>
-  <w:num w:numId="6" w16cid:durableId="272713800">
-    <w:abstractNumId w:val="13"/>
-  </w:num>
   <w:num w:numId="7" w16cid:durableId="1547715577">
-    <w:abstractNumId w:val="20"/>
+    <w:abstractNumId w:val="22"/>
   </w:num>
   <w:num w:numId="8" w16cid:durableId="1499729378">
-    <w:abstractNumId w:val="16"/>
+    <w:abstractNumId w:val="18"/>
   </w:num>
   <w:num w:numId="9" w16cid:durableId="176773706">
     <w:abstractNumId w:val="8"/>
   </w:num>
   <w:num w:numId="10" w16cid:durableId="1494024812">
-    <w:abstractNumId w:val="12"/>
+    <w:abstractNumId w:val="14"/>
   </w:num>
   <w:num w:numId="11" w16cid:durableId="446971133">
     <w:abstractNumId w:val="4"/>
@@ -12486,20 +13886,26 @@
     <w:abstractNumId w:val="7"/>
   </w:num>
   <w:num w:numId="16" w16cid:durableId="293028806">
-    <w:abstractNumId w:val="18"/>
+    <w:abstractNumId w:val="20"/>
   </w:num>
   <w:num w:numId="17" w16cid:durableId="349919370">
-    <w:abstractNumId w:val="19"/>
+    <w:abstractNumId w:val="21"/>
   </w:num>
   <w:num w:numId="18" w16cid:durableId="729614086">
+    <w:abstractNumId w:val="12"/>
+  </w:num>
+  <w:num w:numId="19" w16cid:durableId="1682780980">
     <w:abstractNumId w:val="10"/>
+  </w:num>
+  <w:num w:numId="20" w16cid:durableId="1144397757">
+    <w:abstractNumId w:val="11"/>
   </w:num>
   <w:numIdMacAtCleanup w:val="13"/>
 </w:numbering>
 </file>
 
 <file path=word/styles.xml><?xml version="1.0" encoding="utf-8"?>
-<w:styles xmlns:mc="http://schemas.openxmlformats.org/markup-compatibility/2006" xmlns:r="http://schemas.openxmlformats.org/officeDocument/2006/relationships" xmlns:w="http://schemas.openxmlformats.org/wordprocessingml/2006/main" xmlns:w14="http://schemas.microsoft.com/office/word/2010/wordml" xmlns:w15="http://schemas.microsoft.com/office/word/2012/wordml" xmlns:w16cex="http://schemas.microsoft.com/office/word/2018/wordml/cex" xmlns:w16cid="http://schemas.microsoft.com/office/word/2016/wordml/cid" xmlns:w16="http://schemas.microsoft.com/office/word/2018/wordml" xmlns:w16du="http://schemas.microsoft.com/office/word/2023/wordml/word16du" xmlns:w16sdtdh="http://schemas.microsoft.com/office/word/2020/wordml/sdtdatahash" xmlns:w16sdtfl="http://schemas.microsoft.com/office/word/2024/wordml/sdtformatlock" xmlns:w16se="http://schemas.microsoft.com/office/word/2015/wordml/symex" mc:Ignorable="w14 w15 w16se w16cid w16 w16cex w16sdtdh w16sdtfl w16du">
+<w:styles xmlns:mc="http://schemas.openxmlformats.org/markup-compatibility/2006" xmlns:r="http://schemas.openxmlformats.org/officeDocument/2006/relationships" xmlns:w="http://schemas.openxmlformats.org/wordprocessingml/2006/main" xmlns:w14="http://schemas.microsoft.com/office/word/2010/wordml" xmlns:w15="http://schemas.microsoft.com/office/word/2012/wordml" xmlns:w16cex="http://schemas.microsoft.com/office/word/2018/wordml/cex" xmlns:w16cid="http://schemas.microsoft.com/office/word/2016/wordml/cid" xmlns:w16="http://schemas.microsoft.com/office/word/2018/wordml" xmlns:w16sdtdh="http://schemas.microsoft.com/office/word/2020/wordml/sdtdatahash" xmlns:w16sdtfl="http://schemas.microsoft.com/office/word/2024/wordml/sdtformatlock" xmlns:w16se="http://schemas.microsoft.com/office/word/2015/wordml/symex" xmlns:w16du="http://schemas.microsoft.com/office/word/2023/wordml/word16du" mc:Ignorable="w14 w15 w16se w16cid w16 w16cex w16sdtdh w16sdtfl w16du">
   <w:docDefaults>
     <w:rPrDefault>
       <w:rPr>
@@ -14983,6 +16389,28 @@
       <w:shd w:val="clear" w:color="auto" w:fill="E1DFDD"/>
     </w:rPr>
   </w:style>
+  <w:style w:type="character" w:styleId="Enfasicorsivo">
+    <w:name w:val="Emphasis"/>
+    <w:basedOn w:val="Carpredefinitoparagrafo"/>
+    <w:uiPriority w:val="20"/>
+    <w:qFormat/>
+    <w:rsid w:val="009D6042"/>
+    <w:rPr>
+      <w:i/>
+      <w:iCs/>
+    </w:rPr>
+  </w:style>
+  <w:style w:type="character" w:styleId="Enfasigrassetto">
+    <w:name w:val="Strong"/>
+    <w:basedOn w:val="Carpredefinitoparagrafo"/>
+    <w:uiPriority w:val="22"/>
+    <w:qFormat/>
+    <w:rsid w:val="009D6042"/>
+    <w:rPr>
+      <w:b/>
+      <w:bCs/>
+    </w:rPr>
+  </w:style>
 </w:styles>
 </file>
 

</xml_diff>